<commit_message>
Rework chapters 3 and 4 of the AI-development process article
Replaces the four self-formulated value pairs with an argument that
agile is the only viable mode in AI-augmented development (chapter 3,
"Es geht nur agil"). Replaces the ten self-formulated principles with
a per-principle discussion of all twelve original Agile Manifesto
principles, explaining for each why it still holds and how the AI
context makes its implementation easier or what new caution is needed
(chapter 4, "Die zwölf Prinzipien im KI-Zeitalter").

Article now ~8100 words, ~28-33 pages.

Co-Authored-By: Claude Opus 4.7 <noreply@anthropic.com>
</commit_message>
<xml_diff>
--- a/docs/ki-entwicklungsprozess.docx
+++ b/docs/ki-entwicklungsprozess.docx
@@ -363,160 +363,115 @@
         <w:pageBreakBefore/>
       </w:pPr>
       <w:r>
-        <w:t xml:space="preserve">3. Werte</w:t>
-      </w:r>
-    </w:p>
-    <w:p>
-      <w:pPr>
-        <w:spacing w:after="120" w:line="300"/>
-        <w:jc w:val="both"/>
-      </w:pPr>
-      <w:r>
-        <w:t xml:space="preserve">Das Agile Manifest formuliert vier Wertepaare, bei denen die linke Seite über die rechte gewichtet wird, ohne dass die rechte Seite wertlos wäre. Dieser Prozess übernimmt dieses Muster und schlägt vier eigene Wertepaare vor, die für KI-augmentierte Entwicklung passender sind. Sie ersetzen die klassischen Werte nicht — sie ergänzen sie.</w:t>
-      </w:r>
-    </w:p>
-    <w:p>
-      <w:pPr>
-        <w:pStyle w:val="Heading2"/>
-        <w:spacing w:after="120" w:before="240"/>
-      </w:pPr>
-      <w:r>
-        <w:t xml:space="preserve">3.1 Klarheit vor Geschwindigkeit</w:t>
-      </w:r>
-    </w:p>
-    <w:p>
-      <w:pPr>
-        <w:spacing w:after="120" w:line="300"/>
-        <w:jc w:val="both"/>
-      </w:pPr>
-      <w:r>
-        <w:t xml:space="preserve">Die Kerneigenschaft eines modernen Sprachmodells ist seine Geschwindigkeit. Ein menschlicher Entwickler braucht Stunden für das, was die KI in Minuten ausspielt. Das macht Tempo zur billigsten Ressource, die jemals in einem Entwicklerteam zur Verfügung stand. Genau deshalb ist es nicht mehr die knappe Ressource.</w:t>
-      </w:r>
-    </w:p>
-    <w:p>
-      <w:pPr>
-        <w:spacing w:after="120" w:line="300"/>
-        <w:jc w:val="both"/>
-      </w:pPr>
-      <w:r>
-        <w:t xml:space="preserve">Knapp ist die Klarheit. Verstanden zu haben, was eigentlich gebaut werden soll. Erkannt zu haben, welche Annahme stillschweigend getroffen wird, sobald jemand sagt „mach mal X”. Geprüft zu haben, ob die Lösung, die die KI gleich liefert, das eigentliche Problem trifft oder eine plausibel klingende Variation davon. Wer in der KI-Ära schneller wirken will, muss langsamer denken.</w:t>
-      </w:r>
-    </w:p>
-    <w:p>
-      <w:pPr>
-        <w:spacing w:after="120" w:line="300"/>
-        <w:jc w:val="both"/>
-      </w:pPr>
-      <w:r>
-        <w:t xml:space="preserve">Praktisch heißt das: Pläne werden geschrieben, bevor Code geschrieben wird. Anforderungen werden in Issues überführt, bevor ein „GO” fällt. Fragen werden gestellt, statt geraten. Geschwindigkeit ist ein erfreulicher Nebeneffekt; Klarheit ist die Disziplin.</w:t>
-      </w:r>
-    </w:p>
-    <w:p>
-      <w:pPr>
-        <w:pStyle w:val="Heading2"/>
-        <w:spacing w:after="120" w:before="240"/>
-      </w:pPr>
-      <w:r>
-        <w:t xml:space="preserve">3.2 Das Issue über den Chat-Verlauf</w:t>
-      </w:r>
-    </w:p>
-    <w:p>
-      <w:pPr>
-        <w:spacing w:after="120" w:line="300"/>
-        <w:jc w:val="both"/>
-      </w:pPr>
-      <w:r>
-        <w:t xml:space="preserve">Eine Konversation mit einem Sprachmodell ist flüchtig. Sie scrollt weg, sie wird durch /clear zurückgesetzt, sie verschwindet zwischen Sessions. Was in einem Chat besprochen wird, ist nur dann verbindlich, wenn es woanders auch festgehalten ist. Genau dafür ist das Issue da.</w:t>
-      </w:r>
-    </w:p>
-    <w:p>
-      <w:pPr>
-        <w:spacing w:after="120" w:line="300"/>
-        <w:jc w:val="both"/>
-      </w:pPr>
-      <w:r>
-        <w:t xml:space="preserve">Das Issue ist die Quelle der Wahrheit. Was nicht im Issue steht, existiert nicht — auch wenn es im Chat tausendmal erwähnt wurde. Sobald eine Entscheidung im Chat fällt, muss sie ins Issue. Sobald eine Akzeptanzbedingung diskutiert wird, gehört sie ins Issue. Sobald die Implementierung beginnt, wird gegen das Issue gearbeitet, nicht gegen den Chat-Verlauf.</w:t>
-      </w:r>
-    </w:p>
-    <w:p>
-      <w:pPr>
-        <w:spacing w:after="120" w:line="300"/>
-        <w:jc w:val="both"/>
-      </w:pPr>
-      <w:r>
-        <w:t xml:space="preserve">Das ist nicht nur eine Frage der Disziplin, sondern eine technische Eigenschaft. Das Issue überlebt jede Session. Es kann durch ein anderes Modell gelesen werden. Es kann in sechs Monaten wiederverwendet werden, ohne dass irgendjemand die ursprüngliche Konversation rekonstruieren muss.</w:t>
-      </w:r>
-    </w:p>
-    <w:p>
-      <w:pPr>
-        <w:pStyle w:val="Heading2"/>
-        <w:spacing w:after="120" w:before="240"/>
-      </w:pPr>
-      <w:r>
-        <w:t xml:space="preserve">3.3 Explizite Trigger vor implizitem Vertrauen</w:t>
-      </w:r>
-    </w:p>
-    <w:p>
-      <w:pPr>
-        <w:spacing w:after="120" w:line="300"/>
-        <w:jc w:val="both"/>
-      </w:pPr>
-      <w:r>
-        <w:t xml:space="preserve">Ein Sprachmodell, das Code schreibt, ist sehr gut darin, Absichten zu interpretieren. Genau das macht es gefährlich, wenn es ohne klare Trigger handelt. Wenn „mach mal” als Freigabe verstanden wird, einen Branch zu pushen, dann wird irgendwann etwas in Produktion landen, das niemand bewusst freigegeben hat.</w:t>
-      </w:r>
-    </w:p>
-    <w:p>
-      <w:pPr>
-        <w:spacing w:after="120" w:line="300"/>
-        <w:jc w:val="both"/>
-      </w:pPr>
-      <w:r>
-        <w:t xml:space="preserve">Die Antwort darauf sind explizite Trigger-Phrasen. „Push main” bedeutet „push main”, und nichts sonst. „Merge production” bedeutet einen PR von main auf production, und nichts sonst. „GO” oder „implementiere alles in Ready” bedeutet, dass die Implementierung jetzt beginnen darf — vorher nicht. Diese Phrasen sind klein und prägnant; ihre Genauigkeit ist ihr Wert.</w:t>
-      </w:r>
-    </w:p>
-    <w:p>
-      <w:pPr>
-        <w:spacing w:after="120" w:line="300"/>
-        <w:jc w:val="both"/>
-      </w:pPr>
-      <w:r>
-        <w:t xml:space="preserve">Im Zweifel ist implizit zu wenig. Wenn der Mensch sich nicht erinnert, einen Push freigegeben zu haben, dann ist kein Push freigegeben. Die KI fragt lieber einmal zu viel als einmal zu wenig.</w:t>
-      </w:r>
-    </w:p>
-    <w:p>
-      <w:pPr>
-        <w:pStyle w:val="Heading2"/>
-        <w:spacing w:after="120" w:before="240"/>
-      </w:pPr>
-      <w:r>
-        <w:t xml:space="preserve">3.4 Persistenter Kontext vor Session-Gedächtnis</w:t>
-      </w:r>
-    </w:p>
-    <w:p>
-      <w:pPr>
-        <w:spacing w:after="120" w:line="300"/>
-        <w:jc w:val="both"/>
-      </w:pPr>
-      <w:r>
-        <w:t xml:space="preserve">Jeder, der über mehrere Tage mit einem Sprachmodell arbeitet, merkt schnell, dass das Session-Gedächtnis trügt. Was in Sitzung A entschieden wurde, ist in Sitzung B verloren. Was einmal als Konvention vereinbart wurde, muss in jedem neuen Chat wieder erklärt werden. Das ist nicht nur lästig — es ist eine Fehlerquelle.</w:t>
-      </w:r>
-    </w:p>
-    <w:p>
-      <w:pPr>
-        <w:spacing w:after="120" w:line="300"/>
-        <w:jc w:val="both"/>
-      </w:pPr>
-      <w:r>
-        <w:t xml:space="preserve">Die Lösung ist, das relevante Wissen aus dem Modell heraus in das Repository zu schreiben. CLAUDE.md im Projektroot beschreibt die projekt-spezifischen Regeln. CLAUDE-workflow.md beschreibt den Entwicklungsprozess. Technikspezifische Dateien wie CLAUDE-java.md oder CLAUDE-react.md sammeln die Konventionen pro Sprache und Framework. Persönliche Memory-Dateien im Workspace des Entwicklers ergänzen das mit Vorlieben und Routinen.</w:t>
-      </w:r>
-    </w:p>
-    <w:p>
-      <w:pPr>
-        <w:spacing w:after="120" w:line="300"/>
-        <w:jc w:val="both"/>
-      </w:pPr>
-      <w:r>
-        <w:t xml:space="preserve">Diese Dateien werden gepflegt wie Code. Sie haben einen Owner, sie werden review-bar geändert, sie werden mit dem Repo versioniert. Sie sind kein Schmierzettel, sondern Infrastruktur. Was hier steht, ist verbindlich. Was nicht hier steht, ist nicht verbindlich.</w:t>
+        <w:t xml:space="preserve">3. Es geht nur agil</w:t>
+      </w:r>
+    </w:p>
+    <w:p>
+      <w:pPr>
+        <w:spacing w:after="120" w:line="300"/>
+        <w:jc w:val="both"/>
+      </w:pPr>
+      <w:r>
+        <w:t xml:space="preserve">Wer heute eine Software entwickelt und dabei mit einem Sprachmodell arbeitet, hat keine echte Wahl bei der Methode. Klassische, schwergewichtige Vorgehensmodelle scheitern in der KI-augmentierten Welt schneller und gründlicher als sie es je in der rein menschlichen Welt getan haben. Wasserfall, V-Modell mit langen Implementierungsphasen, Phasen-Gate-Modelle mit halbjährlichen Release-Zyklen — diese Ansätze waren schon vor der KI brüchig. Im KI-Zeitalter sind sie unhaltbar.</w:t>
+      </w:r>
+    </w:p>
+    <w:p>
+      <w:pPr>
+        <w:spacing w:after="120" w:line="300"/>
+        <w:jc w:val="both"/>
+      </w:pPr>
+      <w:r>
+        <w:t xml:space="preserve">Der Grund ist nicht ideologisch, sondern praktisch. Schwergewichtige Methoden setzen auf Plan-Stabilität: man entscheidet einmal, dokumentiert ausführlich, implementiert lange. Diese Annahme funktioniert nur, wenn sich die Welt zwischen Plan und Auslieferung nicht zu schnell ändert. In einer Welt, in der Sprachmodelle ihre Fähigkeiten monatlich erweitern und in der eine sinnvolle Aufgabe oft in Stunden statt Tagen umsetzbar ist, ist Plan-Stabilität eine Illusion. Wer sich daran hält, baut Software, die schon beim Release veraltet ist.</w:t>
+      </w:r>
+    </w:p>
+    <w:p>
+      <w:pPr>
+        <w:pStyle w:val="Heading2"/>
+        <w:spacing w:after="120" w:before="240"/>
+      </w:pPr>
+      <w:r>
+        <w:t xml:space="preserve">3.1 Warum die Notwendigkeit zur Agilität wächst</w:t>
+      </w:r>
+    </w:p>
+    <w:p>
+      <w:pPr>
+        <w:spacing w:after="120" w:line="300"/>
+        <w:jc w:val="both"/>
+      </w:pPr>
+      <w:r>
+        <w:t xml:space="preserve">Drei Verschiebungen erzwingen Agilität. Erstens: die Implementierung wird billig. Wenn ein Sprachmodell in zwei Stunden produziert, wofür ein Team früher zwei Tage brauchte, dann ist Implementierung nicht mehr die knappe Ressource. Knapp sind nun das Verstehen, das Reviewen, das Entscheiden. Diese Tätigkeiten sind ihrer Natur nach iterativ — sie funktionieren in kurzen Schleifen mit Feedback, nicht in langen Phasen mit Übergaben.</w:t>
+      </w:r>
+    </w:p>
+    <w:p>
+      <w:pPr>
+        <w:spacing w:after="120" w:line="300"/>
+        <w:jc w:val="both"/>
+      </w:pPr>
+      <w:r>
+        <w:t xml:space="preserve">Zweitens: die Werkzeuglage ist dynamisch. Was heute mit dem einen Modell schwer ist, ist morgen mit einem neuen Modell trivial. Wer einen Sechs-Monats-Plan aufstellt, plant gegen eine Werkzeug-Generation, die zur Hälfte der Laufzeit überholt sein wird. Reaktion auf Veränderung ist keine Option, sondern eine Eigenschaft des Mediums.</w:t>
+      </w:r>
+    </w:p>
+    <w:p>
+      <w:pPr>
+        <w:spacing w:after="120" w:line="300"/>
+        <w:jc w:val="both"/>
+      </w:pPr>
+      <w:r>
+        <w:t xml:space="preserve">Drittens: die Erwartungen der Auftraggeber haben sich angepasst. Wer einen sichtbaren Prototyp innerhalb von Tagen erwarten kann, wird Wochen oder Monate nicht mehr tolerieren. Diese Erwartung ist nicht unrealistisch — sie ist eine direkte Folge dessen, was möglich geworden ist. Sie verlangt Cadences, die in klassischen Modellen nicht vorgesehen waren.</w:t>
+      </w:r>
+    </w:p>
+    <w:p>
+      <w:pPr>
+        <w:pStyle w:val="Heading2"/>
+        <w:spacing w:after="120" w:before="240"/>
+      </w:pPr>
+      <w:r>
+        <w:t xml:space="preserve">3.2 Was vom Manifest 2001 trägt</w:t>
+      </w:r>
+    </w:p>
+    <w:p>
+      <w:pPr>
+        <w:spacing w:after="120" w:line="300"/>
+        <w:jc w:val="both"/>
+      </w:pPr>
+      <w:r>
+        <w:t xml:space="preserve">Das Agile Manifest von 2001 formuliert vier Wertepaare und zwölf Prinzipien. Beide haben in der KI-Ära nichts an Gültigkeit verloren — im Gegenteil, ihre Notwendigkeit ist gewachsen. Individuen und Interaktionen über Prozesse und Werkzeuge: gerade weil das Werkzeug jetzt sehr stark geworden ist, ist die Frage, wie Menschen miteinander und mit dem Werkzeug interagieren, wichtiger denn je. Funktionierende Software über umfassende Dokumentation: gerade weil die KI Dokumentation auf Knopfdruck produziert, ist es wichtig, sie nicht zum Selbstzweck werden zu lassen. Zusammenarbeit mit dem Kunden über Vertragsverhandlung: gerade weil schneller Output das Risiko erhöht, am Kunden vorbei zu liefern. Reagieren auf Veränderung über das Befolgen eines Plans: gerade weil sich die Möglichkeiten monatlich verschieben.</w:t>
+      </w:r>
+    </w:p>
+    <w:p>
+      <w:pPr>
+        <w:spacing w:after="120" w:line="300"/>
+        <w:jc w:val="both"/>
+      </w:pPr>
+      <w:r>
+        <w:t xml:space="preserve">Dieser Text übernimmt das Manifest deshalb nicht in geänderter Form. Es braucht keine Umformulierung; es braucht eine Begründung, warum es im KI-Zeitalter eher leichter als schwerer einzuhalten ist. Das ist das Thema des folgenden Kapitels.</w:t>
+      </w:r>
+    </w:p>
+    <w:p>
+      <w:pPr>
+        <w:pStyle w:val="Heading2"/>
+        <w:spacing w:after="120" w:before="240"/>
+      </w:pPr>
+      <w:r>
+        <w:t xml:space="preserve">3.3 Was sich verschiebt, ohne den Kern zu treffen</w:t>
+      </w:r>
+    </w:p>
+    <w:p>
+      <w:pPr>
+        <w:spacing w:after="120" w:line="300"/>
+        <w:jc w:val="both"/>
+      </w:pPr>
+      <w:r>
+        <w:t xml:space="preserve">Einiges am ursprünglichen Manifest fühlt sich beim Wiederlesen historisch an. Die Annahme, dass alle Teammitglieder im selben Raum sitzen sollten — fünfzes Prinzip — passt nicht in eine Welt mit Remote-Arbeit und KI-Werkzeugen. Die Schätzung, dass funktionierende Software in Wochen bis Monaten ausgeliefert werden soll — drittes Prinzip — wirkt langsam, wenn die KI-Cadence Tage zulässt. Diese Verschiebungen verlangen aber keine Ersetzung der Prinzipien, sondern eine Neukalibrierung ihrer Skala.</w:t>
+      </w:r>
+    </w:p>
+    <w:p>
+      <w:pPr>
+        <w:spacing w:after="120" w:line="300"/>
+        <w:jc w:val="both"/>
+      </w:pPr>
+      <w:r>
+        <w:t xml:space="preserve">Der hier vorgeschlagene Prozess hält an den zwölf Prinzipien fest und beschreibt im nächsten Kapitel, wie jedes einzelne im KI-augmentierten Modus konkret aussieht — was es weiter zu leisten hat, was leichter wird, und an welcher Stelle eine neue Vorsicht nötig ist.</w:t>
       </w:r>
     </w:p>
     <w:p>
@@ -525,146 +480,367 @@
         <w:pageBreakBefore/>
       </w:pPr>
       <w:r>
-        <w:t xml:space="preserve">4. Prinzipien</w:t>
-      </w:r>
-    </w:p>
-    <w:p>
-      <w:pPr>
-        <w:spacing w:after="120" w:line="300"/>
-        <w:jc w:val="both"/>
-      </w:pPr>
-      <w:r>
-        <w:t xml:space="preserve">Die zehn folgenden Prinzipien konkretisieren die Werte. Sie sind als Sätze formuliert, die in einem Team an die Wand gehängt werden können. Sie sind nicht erschöpfend; sie sind die Mindestbasis, auf der ein KI-augmentiertes Team operiert.</w:t>
-      </w:r>
-    </w:p>
-    <w:p>
-      <w:pPr>
-        <w:pStyle w:val="ListParagraph"/>
-        <w:numPr>
-          <w:ilvl w:val="0"/>
-          <w:numId w:val="2"/>
-        </w:numPr>
-        <w:spacing w:after="100"/>
-      </w:pPr>
-      <w:r>
-        <w:t xml:space="preserve">Die Verantwortung für die Software trägt der Mensch. Die KI kann sehr viel — sie kann aber nichts verantworten. Jede Zeile Code, die in Produktion läuft, ist die Verantwortung eines Menschen, der sie freigegeben hat. Wenn niemand sich verantwortlich fühlt, ist der Prozess kaputt.</w:t>
-      </w:r>
-    </w:p>
-    <w:p>
-      <w:pPr>
-        <w:pStyle w:val="ListParagraph"/>
-        <w:numPr>
-          <w:ilvl w:val="0"/>
-          <w:numId w:val="2"/>
-        </w:numPr>
-        <w:spacing w:after="100"/>
-      </w:pPr>
-      <w:r>
-        <w:t xml:space="preserve">Jeder Implementierungsschritt beginnt mit einem freigegebenen Issue. Es gibt keine Code-Änderung ohne Issue. Das gilt auch für vermeintlich triviale Änderungen — gerade da, weil dort die Disziplin am leichtesten erodiert.</w:t>
-      </w:r>
-    </w:p>
-    <w:p>
-      <w:pPr>
-        <w:pStyle w:val="ListParagraph"/>
-        <w:numPr>
-          <w:ilvl w:val="0"/>
-          <w:numId w:val="2"/>
-        </w:numPr>
-        <w:spacing w:after="100"/>
-      </w:pPr>
-      <w:r>
-        <w:t xml:space="preserve">Plan-Approval ist kein Implementierungs-GO. Diese Trennung ist die zentrale Sicherheitsschwelle des Prozesses. Wer einen Plan akzeptiert, sagt nicht „mach das”, sondern „der Plan ist sinnvoll”. Die eigentliche Freigabe ist ein zweiter, expliziter Schritt.</w:t>
-      </w:r>
-    </w:p>
-    <w:p>
-      <w:pPr>
-        <w:pStyle w:val="ListParagraph"/>
-        <w:numPr>
-          <w:ilvl w:val="0"/>
-          <w:numId w:val="2"/>
-        </w:numPr>
-        <w:spacing w:after="100"/>
-      </w:pPr>
-      <w:r>
-        <w:t xml:space="preserve">Die KI erzeugt Code; die menschliche Review macht ihn zur Wahrheit. Nicht jeder erzeugte Code wird übernommen. Was die KI vorschlägt, ist ein Vorschlag — bis ein Mensch ihn geprüft, gegebenenfalls geändert und schließlich akzeptiert hat. Diese Akzeptanz darf nicht stillschweigend erfolgen.</w:t>
-      </w:r>
-    </w:p>
-    <w:p>
-      <w:pPr>
-        <w:pStyle w:val="ListParagraph"/>
-        <w:numPr>
-          <w:ilvl w:val="0"/>
-          <w:numId w:val="2"/>
-        </w:numPr>
-        <w:spacing w:after="100"/>
-      </w:pPr>
-      <w:r>
-        <w:t xml:space="preserve">Push und Deploy sind Release-Schritte, keine Implementations-Details. Jeder Push verändert die Realität für andere — andere Entwickler, ein Test-Server, am Ende Kunden. Diese Schritte sind nie automatisch, sie sind nie selbstverständlich, sie brauchen jeweils eine eigene, explizite Freigabe.</w:t>
-      </w:r>
-    </w:p>
-    <w:p>
-      <w:pPr>
-        <w:pStyle w:val="ListParagraph"/>
-        <w:numPr>
-          <w:ilvl w:val="0"/>
-          <w:numId w:val="2"/>
-        </w:numPr>
-        <w:spacing w:after="100"/>
-      </w:pPr>
-      <w:r>
-        <w:t xml:space="preserve">Zwei Modelle reviewen besser als eines. Ein Modell, das selbst Code geschrieben hat, ist seinem eigenen Werk gegenüber zu wohlwollend. Ein zweites Modell mit anderer Architektur und anderem Trainingskorpus findet Probleme, die das erste übersieht. Vier-Augen-Prinzip funktioniert mit künstlichen Augen genauso wie mit menschlichen.</w:t>
-      </w:r>
-    </w:p>
-    <w:p>
-      <w:pPr>
-        <w:pStyle w:val="ListParagraph"/>
-        <w:numPr>
-          <w:ilvl w:val="0"/>
-          <w:numId w:val="2"/>
-        </w:numPr>
-        <w:spacing w:after="100"/>
-      </w:pPr>
-      <w:r>
-        <w:t xml:space="preserve">Tests gehören vor den Code, nicht danach. Die Geschwindigkeit der KI verleitet dazu, Tests „später” nachzureichen. Später kommt selten. Test-First ist nicht nur Disziplin, sondern auch der einzige Weg, die KI an einen klaren Output-Vertrag zu binden.</w:t>
-      </w:r>
-    </w:p>
-    <w:p>
-      <w:pPr>
-        <w:pStyle w:val="ListParagraph"/>
-        <w:numPr>
-          <w:ilvl w:val="0"/>
-          <w:numId w:val="2"/>
-        </w:numPr>
-        <w:spacing w:after="100"/>
-      </w:pPr>
-      <w:r>
-        <w:t xml:space="preserve">Kleinteilige Issues schlagen ambitionierte Tickets. Ein Issue, das in einer Iteration komplett umgesetzt werden kann, ist besser als ein Issue, das drei Tage läuft. Kleine Issues sind reviewbar, klein-batchbar, klein-rollbackbar.</w:t>
-      </w:r>
-    </w:p>
-    <w:p>
-      <w:pPr>
-        <w:pStyle w:val="ListParagraph"/>
-        <w:numPr>
-          <w:ilvl w:val="0"/>
-          <w:numId w:val="2"/>
-        </w:numPr>
-        <w:spacing w:after="100"/>
-      </w:pPr>
-      <w:r>
-        <w:t xml:space="preserve">Was nicht im Issue steht, existiert nicht. Spontane Hinzufügungen während der Implementierung sind ein Anti-Pattern. Wenn etwas dazukommen muss, wird das Issue aktualisiert oder ein neues Issue erstellt — vorher passiert nichts.</w:t>
-      </w:r>
-    </w:p>
-    <w:p>
-      <w:pPr>
-        <w:pStyle w:val="ListParagraph"/>
-        <w:numPr>
-          <w:ilvl w:val="0"/>
-          <w:numId w:val="2"/>
-        </w:numPr>
-        <w:spacing w:after="100"/>
-      </w:pPr>
-      <w:r>
-        <w:t xml:space="preserve">Retrospektiven der Mensch-KI-Zusammenarbeit sind eigenständig zu halten. Sie sind kein Tagesordnungspunkt der Team-Retrospektive, sondern ein eigenes Ereignis. Andere Themen, andere Fragen, andere Maßnahmen.</w:t>
+        <w:t xml:space="preserve">4. Die zwölf Prinzipien im KI-Zeitalter</w:t>
+      </w:r>
+    </w:p>
+    <w:p>
+      <w:pPr>
+        <w:spacing w:after="120" w:line="300"/>
+        <w:jc w:val="both"/>
+      </w:pPr>
+      <w:r>
+        <w:t xml:space="preserve">Das Agile Manifest hängt an zwölf Prinzipien</w:t>
+      </w:r>
+      <w:r>
+        <w:rPr>
+          <w:rStyle w:val="FootnoteReference"/>
+        </w:rPr>
+        <w:footnoteReference w:id="7"/>
+      </w:r>
+      <w:r>
+        <w:t xml:space="preserve">. Sie sind 2001 als operative Konkretisierung der vier Wertepaare entstanden und haben sich über zwei Jahrzehnte gehalten. In diesem Kapitel wird jedes Prinzip einzeln betrachtet — was es weiterhin verlangt, wie eine KI-augmentierte Praxis seine Umsetzung erleichtert oder verbessert, und wo eine neue Vorsicht nötig ist. Das Ergebnis: die Prinzipien sind nicht nur weiterhin gültig, ihre Umsetzung ist heute oft deutlich leichter als 2001. Wer sie schon damals ernst genommen hat, hat im KI-Zeitalter einen guten Startpunkt.</w:t>
+      </w:r>
+    </w:p>
+    <w:p>
+      <w:pPr>
+        <w:pStyle w:val="Heading2"/>
+        <w:spacing w:after="120" w:before="240"/>
+      </w:pPr>
+      <w:r>
+        <w:t xml:space="preserve">4.1 Frühe und kontinuierliche Auslieferung wertvoller Software</w:t>
+      </w:r>
+    </w:p>
+    <w:p>
+      <w:pPr>
+        <w:spacing w:after="120" w:line="300"/>
+        <w:jc w:val="both"/>
+      </w:pPr>
+      <w:r>
+        <w:t xml:space="preserve">Das erste Prinzip stellt Kundenwert als oberstes Ziel über alles. Es verlangt früh und kontinuierlich auszuliefern, nicht spät und auf einen Schlag. Das gilt unverändert: die Zufriedenheit des Auftraggebers entsteht aus Stücken, die er sehen, anfassen, testen kann — nicht aus Planungs-Slideshows.</w:t>
+      </w:r>
+    </w:p>
+    <w:p>
+      <w:pPr>
+        <w:spacing w:after="120" w:line="300"/>
+        <w:jc w:val="both"/>
+      </w:pPr>
+      <w:r>
+        <w:t xml:space="preserve">In der KI-Ära wird die Umsetzung dieses Prinzips drastisch leichter. Was früher Sprint-Cadences mit zweiwöchigen Releases bedeutete, kann heute tägliche Auslieferung sein. Ein Issue, das morgens geklärt wird, kann nachmittags auf dem Test-Server stehen. Die Maschinerie aus Build-Pipeline und Continuous Delivery, die schon vor der KI existierte, bekommt nun einen Implementierungsmotor an die Spitze gestellt, der das Tempo annimmt, das die Pipeline ohnehin verkraftet hätte. Die Voraussetzung dafür ist Disziplin: kontinuierliche Auslieferung darf nicht zu unverstandener Auslieferung werden. Push und Deploy bleiben menschlich freigegebene Schritte, kein Automatismus.</w:t>
+      </w:r>
+    </w:p>
+    <w:p>
+      <w:pPr>
+        <w:pStyle w:val="Heading2"/>
+        <w:spacing w:after="120" w:before="240"/>
+      </w:pPr>
+      <w:r>
+        <w:t xml:space="preserve">4.2 Anforderungsänderungen sind willkommen, auch spät</w:t>
+      </w:r>
+    </w:p>
+    <w:p>
+      <w:pPr>
+        <w:spacing w:after="120" w:line="300"/>
+        <w:jc w:val="both"/>
+      </w:pPr>
+      <w:r>
+        <w:t xml:space="preserve">Das zweite Prinzip macht aus dem klassischen Risiko — späten Änderungen — einen Wettbewerbsvorteil. Es verlangt, agile Prozesse so zu bauen, dass Veränderungen nicht zur Krise werden. Auch das gilt weiterhin: der Kunde, der spät umdenkt, hat oft einen guten Grund — meistens, weil er erst jetzt versteht, was er wirklich braucht.</w:t>
+      </w:r>
+    </w:p>
+    <w:p>
+      <w:pPr>
+        <w:spacing w:after="120" w:line="300"/>
+        <w:jc w:val="both"/>
+      </w:pPr>
+      <w:r>
+        <w:t xml:space="preserve">Mit der KI wird die Reaktion auf späte Änderungen substantiell günstiger. Ein Refactoring, das früher zwei Tage Konzentration verlangte, kann mit gut formulierten Issues und einem zweiten Modell als Review in wenigen Stunden vollzogen sein. Eine Änderung an einem Domain-Modell, die sich durch drei Schichten zieht, ist mit KI-Unterstützung in einem überschaubaren Aufwand zu machen. Die Voraussetzung ist, dass die Änderung disziplinarisch eingespeist wird: das Issue wird angepasst, nicht der Chat-Verlauf; die neue Akzeptanzbedingung wird ergänzt, nicht stillschweigend angenommen. Späte Änderungen, die im Chat liegen bleiben und nicht ins Issue wandern, sind im KI-Modus so gefährlich wie immer.</w:t>
+      </w:r>
+    </w:p>
+    <w:p>
+      <w:pPr>
+        <w:pStyle w:val="Heading2"/>
+        <w:spacing w:after="120" w:before="240"/>
+      </w:pPr>
+      <w:r>
+        <w:t xml:space="preserve">4.3 Funktionierende Software wird häufig ausgeliefert</w:t>
+      </w:r>
+    </w:p>
+    <w:p>
+      <w:pPr>
+        <w:spacing w:after="120" w:line="300"/>
+        <w:jc w:val="both"/>
+      </w:pPr>
+      <w:r>
+        <w:t xml:space="preserve">Das dritte Prinzip nennt ursprünglich Wochen bis Monate als Cadence, mit Vorzug für die kürzeren Skalen. Der Kern ist: häufig liefern, damit Feedback früh ist und Korrekturen klein. Dieser Kern gilt weiterhin.</w:t>
+      </w:r>
+    </w:p>
+    <w:p>
+      <w:pPr>
+        <w:spacing w:after="120" w:line="300"/>
+        <w:jc w:val="both"/>
+      </w:pPr>
+      <w:r>
+        <w:t xml:space="preserve">Was sich verschiebt, ist die Skala. Daily-Iterationen sind die neue Norm, Vier-Stunden-Iterationen sind für klar abgegrenzte Aufgaben realistisch. Was 2001 als ambitionierte Cadence galt, ist heute ein Default. Eine ganze Klasse von Verzögerungen — Build-Zeiten, manuelle Tests, Hand-Offs zwischen Rollen — ist durch Automatisierung und KI-Unterstützung in den Hintergrund gerückt. Das Risiko ist die andere Seite: häufige Auslieferung ohne Disziplin produziert eine Folge halbgarer Releases. Test-First, manuelle UI-Verifikation, Security-Gates sind kein optionaler Zusatzaufwand, sondern die Bedingung, unter der häufige Auslieferung verantwortbar ist.</w:t>
+      </w:r>
+    </w:p>
+    <w:p>
+      <w:pPr>
+        <w:pStyle w:val="Heading2"/>
+        <w:spacing w:after="120" w:before="240"/>
+      </w:pPr>
+      <w:r>
+        <w:t xml:space="preserve">4.4 Fachseite und Entwicklung arbeiten täglich zusammen</w:t>
+      </w:r>
+    </w:p>
+    <w:p>
+      <w:pPr>
+        <w:spacing w:after="120" w:line="300"/>
+        <w:jc w:val="both"/>
+      </w:pPr>
+      <w:r>
+        <w:t xml:space="preserve">Das vierte Prinzip verlangt tägliche Zusammenarbeit zwischen Business und Entwicklung. Das galt 2001 für viele Organisationen schon als ambitioniert; in vielen Unternehmen ist es bis heute eher Wunschvorstellung als Realität.</w:t>
+      </w:r>
+    </w:p>
+    <w:p>
+      <w:pPr>
+        <w:spacing w:after="120" w:line="300"/>
+        <w:jc w:val="both"/>
+      </w:pPr>
+      <w:r>
+        <w:t xml:space="preserve">Die KI macht diese Zusammenarbeit konkreter. Wenn die Fachseite eine Anforderung diktiert und der Senior Developer sie in ein Issue überführt, kann die KI noch am selben Tag einen ersten Prototyp liefern. Die Diskussion zwischen Fach und Entwicklung springt damit aus der abstrakten in die konkrete Phase: nicht „könnte man das so meinen?” sondern „so sieht es aus, passt das?”. Die menschliche Diskussion wird damit nicht ersetzt, sondern verstärkt. Die KI ist Beschleuniger, nicht Ersatz.</w:t>
+      </w:r>
+    </w:p>
+    <w:p>
+      <w:pPr>
+        <w:pStyle w:val="Heading2"/>
+        <w:spacing w:after="120" w:before="240"/>
+      </w:pPr>
+      <w:r>
+        <w:t xml:space="preserve">4.5 Motivierte Individuen mit Umgebung und Vertrauen</w:t>
+      </w:r>
+    </w:p>
+    <w:p>
+      <w:pPr>
+        <w:spacing w:after="120" w:line="300"/>
+        <w:jc w:val="both"/>
+      </w:pPr>
+      <w:r>
+        <w:t xml:space="preserve">Das fünfte Prinzip ist ein Bekenntnis zum Menschen: Projekte werden um motivierte Menschen herum gebaut, die das Vertrauen bekommen, ihre Arbeit zu tun. Vertrauen ist hier nicht naiv — es ist die einzige tragfähige Basis, weil Mikromanagement in Wissensarbeit nicht funktioniert.</w:t>
+      </w:r>
+    </w:p>
+    <w:p>
+      <w:pPr>
+        <w:spacing w:after="120" w:line="300"/>
+        <w:jc w:val="both"/>
+      </w:pPr>
+      <w:r>
+        <w:t xml:space="preserve">In der KI-Ära steigt der Anspruch an die Menschen, nicht der Bedarf an Mikromanagement. Wer mit Sprachmodellen arbeitet, muss kritisch denken, plausible Ergebnisse von korrekten unterscheiden, Architektur-Entscheidungen verantworten. Diese Tätigkeiten sind anspruchsvoller als das, was sie ersetzen — und sie verlangen Motivation, Konzentration und ein Umfeld, das beides ermöglicht. Eine Organisation, die das fünfte Prinzip 2001 verletzt hat, wird im KI-Zeitalter besonders schnell merken, dass demotivierte Menschen mit mächtigen Werkzeugen schneller Schaden anrichten.</w:t>
+      </w:r>
+    </w:p>
+    <w:p>
+      <w:pPr>
+        <w:pStyle w:val="Heading2"/>
+        <w:spacing w:after="120" w:before="240"/>
+      </w:pPr>
+      <w:r>
+        <w:t xml:space="preserve">4.6 Direkte Kommunikation als effektivste Methode</w:t>
+      </w:r>
+    </w:p>
+    <w:p>
+      <w:pPr>
+        <w:spacing w:after="120" w:line="300"/>
+        <w:jc w:val="both"/>
+      </w:pPr>
+      <w:r>
+        <w:t xml:space="preserve">Das sechste Prinzip behauptet, dass Auge-zu-Auge-Gespräche die effektivste Form der Informationsübertragung in einem Entwicklungsteam sind. Es ist das Prinzip, dem die KI-Ära am sichtbarsten widerspricht — und das gleichzeitig nicht widerlegt, sondern neu eingeordnet wird.</w:t>
+      </w:r>
+    </w:p>
+    <w:p>
+      <w:pPr>
+        <w:spacing w:after="120" w:line="300"/>
+        <w:jc w:val="both"/>
+      </w:pPr>
+      <w:r>
+        <w:t xml:space="preserve">Zwischen Menschen bleibt direkte Kommunikation überlegen. Im Daily-Standup, im Stakeholder-Review, in der KI-Retrospektive — das menschliche Gespräch trägt weiterhin am meisten Information pro Minute. Was sich verschiebt, ist der Anteil der Kommunikation, der zwischen Mensch und KI stattfindet. Diese kann nicht von Angesicht zu Angesicht sein; sie ist notwendig schriftlich. Daraus folgt eine pragmatische Konsequenz: alles, was die KI wissen muss, gehört in ein Issue, in CLAUDE-Dateien oder in Memory-Notizen. Das Gespräch zwischen Menschen darf dadurch nicht verarmen. Die Versuchung, alles in Schriftform zu pressen, weil die KI das gut liest, wäre eine Verletzung dieses Prinzips.</w:t>
+      </w:r>
+    </w:p>
+    <w:p>
+      <w:pPr>
+        <w:pStyle w:val="Heading2"/>
+        <w:spacing w:after="120" w:before="240"/>
+      </w:pPr>
+      <w:r>
+        <w:t xml:space="preserve">4.7 Funktionierende Software als wichtigstes Fortschrittsmaß</w:t>
+      </w:r>
+    </w:p>
+    <w:p>
+      <w:pPr>
+        <w:spacing w:after="120" w:line="300"/>
+        <w:jc w:val="both"/>
+      </w:pPr>
+      <w:r>
+        <w:t xml:space="preserve">Das siebte Prinzip ist möglicherweise das wichtigste im KI-Zeitalter. Es verwirft alle Stellvertretermessgrößen — Velocity-Punkte, Lines-of-Code, Anzahl der PRs — und sagt: das einzige Maß ist funktionierende Software.</w:t>
+      </w:r>
+    </w:p>
+    <w:p>
+      <w:pPr>
+        <w:spacing w:after="120" w:line="300"/>
+        <w:jc w:val="both"/>
+      </w:pPr>
+      <w:r>
+        <w:t xml:space="preserve">Die KI macht diese Frage drängender als je zuvor. Ein Modell produziert in einer Stunde mehr Code als ein menschlicher Entwickler an einem Tag. Wenn das Maß die Menge wäre, sähe alles großartig aus. Das Maß ist aber, ob diese Menge etwas Funktionierendes ergibt. Funktionierend heißt: Tests grün, Akzeptanzkriterien erfüllt, manuelle Verifikation bestanden, Stakeholder zufrieden. Wer im KI-Modus mit anderen Metriken arbeitet, baut Velocity-Charts, die im Burnout enden. Die einzige tragfähige Metrik ist die alte: läuft es?</w:t>
+      </w:r>
+    </w:p>
+    <w:p>
+      <w:pPr>
+        <w:pStyle w:val="Heading2"/>
+        <w:spacing w:after="120" w:before="240"/>
+      </w:pPr>
+      <w:r>
+        <w:t xml:space="preserve">4.8 Nachhaltige Geschwindigkeit</w:t>
+      </w:r>
+    </w:p>
+    <w:p>
+      <w:pPr>
+        <w:spacing w:after="120" w:line="300"/>
+        <w:jc w:val="both"/>
+      </w:pPr>
+      <w:r>
+        <w:t xml:space="preserve">Das achte Prinzip verlangt eine Geschwindigkeit, die unendlich lange durchgehalten werden kann. Es richtet sich gegen Death-Marches und Endspurts, die in klassischen Sprints häufig waren.</w:t>
+      </w:r>
+    </w:p>
+    <w:p>
+      <w:pPr>
+        <w:spacing w:after="120" w:line="300"/>
+        <w:jc w:val="both"/>
+      </w:pPr>
+      <w:r>
+        <w:t xml:space="preserve">Die KI verändert die Dynamik dieses Prinzips. Auf der einen Seite ist Sustainable Pace leichter, weil viele lästige Tätigkeiten (Boilerplate, Tests-Schreiben für offensichtliche Fälle, Dokumentation) der KI übergeben werden können. Auf der anderen Seite ist die Versuchung größer, weil die KI nie müde wird. Wer sich von der KI tempotreiben lässt, läuft schneller in den Burnout als ohne sie. Die menschliche Reviewerkapazität wird zur knappen Ressource. Eine Daily-Iteration, in der die KI zwölf Issues abarbeitet und ein Mensch alle zwölf reviewen soll, ist nicht nachhaltig. Sustainable Pace heißt im KI-Modus: die Cadence wird vom langsamsten menschlichen Schritt bestimmt, nicht vom schnellsten Werkzeug-Schritt.</w:t>
+      </w:r>
+    </w:p>
+    <w:p>
+      <w:pPr>
+        <w:pStyle w:val="Heading2"/>
+        <w:spacing w:after="120" w:before="240"/>
+      </w:pPr>
+      <w:r>
+        <w:t xml:space="preserve">4.9 Ständige Aufmerksamkeit auf technische Exzellenz</w:t>
+      </w:r>
+    </w:p>
+    <w:p>
+      <w:pPr>
+        <w:spacing w:after="120" w:line="300"/>
+        <w:jc w:val="both"/>
+      </w:pPr>
+      <w:r>
+        <w:t xml:space="preserve">Das neunte Prinzip verlangt anhaltende Konzentration auf technische Qualität und gutes Design. Wer das schleifen lässt, baut technische Schuld auf, die die spätere Agilität auffrisst.</w:t>
+      </w:r>
+    </w:p>
+    <w:p>
+      <w:pPr>
+        <w:spacing w:after="120" w:line="300"/>
+        <w:jc w:val="both"/>
+      </w:pPr>
+      <w:r>
+        <w:t xml:space="preserve">Die KI verstärkt dieses Prinzip in beide Richtungen. Wer mit Architektur-Verständnis und Senior-Erfahrung arbeitet, kann mit KI sehr saubere Lösungen sehr schnell erzeugen. Wer ohne Architektur-Verständnis arbeitet, baut mit KI sehr schnelle Stapel schlechten Codes. Senior-Developer-Rolle und Qualitätsexperte werden nicht überflüssig — im Gegenteil, ihre Bedeutung wächst. Plus: KI-generierter Code hat oft eine plausible Form, aber subtile Inkonsistenzen, die kein Test sofort aufdeckt. Continuous Refactoring, ArchUnit-Regeln und ein zweites Modell beim Review sind die operativen Mittel, mit denen dieses Prinzip im KI-Modus gehalten wird.</w:t>
+      </w:r>
+    </w:p>
+    <w:p>
+      <w:pPr>
+        <w:pStyle w:val="Heading2"/>
+        <w:spacing w:after="120" w:before="240"/>
+      </w:pPr>
+      <w:r>
+        <w:t xml:space="preserve">4.10 Einfachheit — die Kunst, nicht zu tun</w:t>
+      </w:r>
+    </w:p>
+    <w:p>
+      <w:pPr>
+        <w:spacing w:after="120" w:line="300"/>
+        <w:jc w:val="both"/>
+      </w:pPr>
+      <w:r>
+        <w:t xml:space="preserve">Das zehnte Prinzip lobt das Maximieren der nicht gemachten Arbeit. Es ist das einzige Prinzip, das explizit gegen Übereifer warnt — und damit eines der schwersten zu leben.</w:t>
+      </w:r>
+    </w:p>
+    <w:p>
+      <w:pPr>
+        <w:spacing w:after="120" w:line="300"/>
+        <w:jc w:val="both"/>
+      </w:pPr>
+      <w:r>
+        <w:t xml:space="preserve">Mit der KI wird Einfachheit schwerer einzuhalten, weil das Hinzufügen so billig wird. Ein zusätzliches Feature, eine zusätzliche Option, eine zusätzliche Validierung — alles kostet die KI fast nichts an Aufwand. Die Disziplin liegt darin, das Generieren zu unterlassen. Issues setzen Scope-Grenzen; die KI darf nichts hinzufügen, was nicht im Issue steht. Senior-Developer prüfen, ob ein KI-Vorschlag das eigentliche Problem löst oder Nebenkriegsschauplätze produziert. Das alte „you ain't gonna need it” ist im KI-Zeitalter ein zentrales Korrektiv geworden — gerade weil die Versuchung größer ist denn je.</w:t>
+      </w:r>
+    </w:p>
+    <w:p>
+      <w:pPr>
+        <w:pStyle w:val="Heading2"/>
+        <w:spacing w:after="120" w:before="240"/>
+      </w:pPr>
+      <w:r>
+        <w:t xml:space="preserve">4.11 Selbstorganisierende Teams</w:t>
+      </w:r>
+    </w:p>
+    <w:p>
+      <w:pPr>
+        <w:spacing w:after="120" w:line="300"/>
+        <w:jc w:val="both"/>
+      </w:pPr>
+      <w:r>
+        <w:t xml:space="preserve">Das elfte Prinzip behauptet, dass die besten Architekturen, Anforderungen und Designs aus selbstorganisierenden Teams entstehen. Es ist ein Bekenntnis gegen Top-Down-Anweisung und für die Reife der Beteiligten.</w:t>
+      </w:r>
+    </w:p>
+    <w:p>
+      <w:pPr>
+        <w:spacing w:after="120" w:line="300"/>
+        <w:jc w:val="both"/>
+      </w:pPr>
+      <w:r>
+        <w:t xml:space="preserve">Selbstorganisation funktioniert zwischen Menschen. Die KI ist nicht Teil dieser Selbstorganisation. Sie wählt nicht aus, an welchem Issue sie arbeitet; sie definiert nicht die Architektur; sie verhandelt nicht mit dem Stakeholder. Sie ist Werkzeug. Was sich verschiebt, ist die Form der Selbstorganisation: weniger Stand-ups, mehr asynchrone Koordination über Issue und Board; weniger Pair-Programming, mehr Mensch-KI-Pair mit menschlichem Review. Die Senior-Developer-Rolle wird zur Architektur-Ankerin, weil die KI alleine keine kohärente Architektur erzeugt. Selbstorganisation darf nicht heißen, dass die KI ein gleichberechtigtes Teammitglied wird — sonst verliert das Prinzip seinen Sinn.</w:t>
+      </w:r>
+    </w:p>
+    <w:p>
+      <w:pPr>
+        <w:pStyle w:val="Heading2"/>
+        <w:spacing w:after="120" w:before="240"/>
+      </w:pPr>
+      <w:r>
+        <w:t xml:space="preserve">4.12 Regelmäßige Reflexion und Anpassung</w:t>
+      </w:r>
+    </w:p>
+    <w:p>
+      <w:pPr>
+        <w:spacing w:after="120" w:line="300"/>
+        <w:jc w:val="both"/>
+      </w:pPr>
+      <w:r>
+        <w:t xml:space="preserve">Das zwölfte Prinzip verlangt, dass das Team in regelmäßigen Abständen reflektiert, wie es effektiver werden kann, und sein Verhalten entsprechend anpasst. Die Retrospektive ist seine Veranstaltung.</w:t>
+      </w:r>
+    </w:p>
+    <w:p>
+      <w:pPr>
+        <w:spacing w:after="120" w:line="300"/>
+        <w:jc w:val="both"/>
+      </w:pPr>
+      <w:r>
+        <w:t xml:space="preserve">Im KI-Modus tritt zur klassischen Team-Retrospektive die KI-Retrospektive als eigenständiges Format hinzu (siehe Kapitel 7.5). Sie ist nicht Tagesordnungspunkt der allgemeinen Retro, sondern ein eigenes Event. Drei Fragen führen sie: Wo hat die Mensch-KI-Zusammenarbeit gehakt? Welche Memory-Einträge sind veraltet? Welche Workflow-Regel braucht eine Schärfung? Die Antworten produzieren konkrete Änderungen an CLAUDE-Dateien, Memory-Files und der Prompt-Bibliothek. Das Prinzip wird damit stärker, weil es eine zweite Reflexionsebene bekommt. Wer in der KI-Ära nicht regelmäßig reflektiert, sammelt Memory-Drift an: alte Regeln, neue Realität, wachsende Reibung.</w:t>
+      </w:r>
+    </w:p>
+    <w:p>
+      <w:pPr>
+        <w:pStyle w:val="Heading2"/>
+        <w:spacing w:after="120" w:before="240"/>
+      </w:pPr>
+      <w:r>
+        <w:t xml:space="preserve">4.13 Zwischenbilanz</w:t>
+      </w:r>
+    </w:p>
+    <w:p>
+      <w:pPr>
+        <w:spacing w:after="120" w:line="300"/>
+        <w:jc w:val="both"/>
+      </w:pPr>
+      <w:r>
+        <w:t xml:space="preserve">Alle zwölf Prinzipien gelten unverändert. Bei keinem ist die Umsetzung im KI-Modus schwerer geworden — bei den meisten ist sie leichter, bei einigen verschiebt sich die Skala oder die Form. Wer das Manifest 2001 ernst genommen hat, ist im KI-Zeitalter gut gerüstet. Wer es als Lippenbekenntnis behandelte, wird seine Versäumnisse jetzt deutlicher merken: die KI verstärkt sowohl gute als auch schlechte Gewohnheiten. Diese Verstärkung ist der eigentliche Hebel der KI-augmentierten Entwicklung.</w:t>
       </w:r>
     </w:p>
     <w:p>
@@ -1136,7 +1312,7 @@
         <w:footnoteReference w:id="4"/>
       </w:r>
       <w:r>
-        <w:t xml:space="preserve"> schlägt drei KI-Assistenzrollen vor: AI Product Owner Assistant, AI Quality Assurance Partner, AI Pair Programming Partner. Diese können im hier vorgeschlagenen Prozess als spezialisierte Werkzeuge eingesetzt werden — beispielsweise als Hilfsmittel beim Backlog-Refinement oder bei der Test-Generierung. Wichtig ist, dass sie als Werkzeuge sichtbar bleiben. Sobald ein „AI PO Assistant” beginnt, eigenständig Tickets zu schreiben, ohne dass ein Mensch sie freigibt, wird aus dem Werkzeug eine Rolle — und die Verantwortungskette bricht.</w:t>
+        <w:t xml:space="preserve"> schlägt drei KI-Assistenzrollen vor: AI Product Owner Assistant, AI Quality Assurance Partner, AI Pair Programming Partner. Diese können im hier vorgeschlagenen Prozess als spezialisierte Werkzeuge eingesetzt werden — beispielsweise als Hilfsmittel beim Backlog-Refinement oder bei der Test-Generierung. Wichtig ist, dass sie als Werkzeuge sichtbar bleiben. Sobald ein AI PO Assistant beginnt, eigenständig Tickets zu schreiben, ohne dass ein Mensch sie freigibt, wird aus dem Werkzeug eine Rolle — und die Verantwortungskette bricht.</w:t>
       </w:r>
     </w:p>
     <w:p>
@@ -1801,7 +1977,7 @@
         <w:pStyle w:val="ListParagraph"/>
         <w:numPr>
           <w:ilvl w:val="0"/>
-          <w:numId w:val="3"/>
+          <w:numId w:val="2"/>
         </w:numPr>
         <w:spacing w:after="80"/>
       </w:pPr>
@@ -1814,7 +1990,7 @@
         <w:pStyle w:val="ListParagraph"/>
         <w:numPr>
           <w:ilvl w:val="0"/>
-          <w:numId w:val="3"/>
+          <w:numId w:val="2"/>
         </w:numPr>
         <w:spacing w:after="80"/>
       </w:pPr>
@@ -1827,7 +2003,7 @@
         <w:pStyle w:val="ListParagraph"/>
         <w:numPr>
           <w:ilvl w:val="0"/>
-          <w:numId w:val="3"/>
+          <w:numId w:val="2"/>
         </w:numPr>
         <w:spacing w:after="80"/>
       </w:pPr>
@@ -1840,7 +2016,7 @@
         <w:pStyle w:val="ListParagraph"/>
         <w:numPr>
           <w:ilvl w:val="0"/>
-          <w:numId w:val="3"/>
+          <w:numId w:val="2"/>
         </w:numPr>
         <w:spacing w:after="80"/>
       </w:pPr>
@@ -1853,7 +2029,7 @@
         <w:pStyle w:val="ListParagraph"/>
         <w:numPr>
           <w:ilvl w:val="0"/>
-          <w:numId w:val="3"/>
+          <w:numId w:val="2"/>
         </w:numPr>
         <w:spacing w:after="80"/>
       </w:pPr>
@@ -3221,7 +3397,7 @@
         <w:pStyle w:val="ListParagraph"/>
         <w:numPr>
           <w:ilvl w:val="0"/>
-          <w:numId w:val="3"/>
+          <w:numId w:val="2"/>
         </w:numPr>
         <w:spacing w:after="80"/>
       </w:pPr>
@@ -3234,7 +3410,7 @@
         <w:pStyle w:val="ListParagraph"/>
         <w:numPr>
           <w:ilvl w:val="0"/>
-          <w:numId w:val="3"/>
+          <w:numId w:val="2"/>
         </w:numPr>
         <w:spacing w:after="80"/>
       </w:pPr>
@@ -3247,7 +3423,7 @@
         <w:pStyle w:val="ListParagraph"/>
         <w:numPr>
           <w:ilvl w:val="0"/>
-          <w:numId w:val="3"/>
+          <w:numId w:val="2"/>
         </w:numPr>
         <w:spacing w:after="80"/>
       </w:pPr>
@@ -3260,7 +3436,7 @@
         <w:pStyle w:val="ListParagraph"/>
         <w:numPr>
           <w:ilvl w:val="0"/>
-          <w:numId w:val="3"/>
+          <w:numId w:val="2"/>
         </w:numPr>
         <w:spacing w:after="80"/>
       </w:pPr>
@@ -3273,7 +3449,7 @@
         <w:pStyle w:val="ListParagraph"/>
         <w:numPr>
           <w:ilvl w:val="0"/>
-          <w:numId w:val="3"/>
+          <w:numId w:val="2"/>
         </w:numPr>
         <w:spacing w:after="80"/>
       </w:pPr>
@@ -3286,7 +3462,7 @@
         <w:pStyle w:val="ListParagraph"/>
         <w:numPr>
           <w:ilvl w:val="0"/>
-          <w:numId w:val="3"/>
+          <w:numId w:val="2"/>
         </w:numPr>
         <w:spacing w:after="80"/>
       </w:pPr>
@@ -3317,7 +3493,7 @@
         <w:pStyle w:val="ListParagraph"/>
         <w:numPr>
           <w:ilvl w:val="0"/>
-          <w:numId w:val="3"/>
+          <w:numId w:val="2"/>
         </w:numPr>
         <w:spacing w:after="80"/>
       </w:pPr>
@@ -3330,7 +3506,7 @@
         <w:pStyle w:val="ListParagraph"/>
         <w:numPr>
           <w:ilvl w:val="0"/>
-          <w:numId w:val="3"/>
+          <w:numId w:val="2"/>
         </w:numPr>
         <w:spacing w:after="80"/>
       </w:pPr>
@@ -3343,7 +3519,7 @@
         <w:pStyle w:val="ListParagraph"/>
         <w:numPr>
           <w:ilvl w:val="0"/>
-          <w:numId w:val="3"/>
+          <w:numId w:val="2"/>
         </w:numPr>
         <w:spacing w:after="80"/>
       </w:pPr>
@@ -3356,7 +3532,7 @@
         <w:pStyle w:val="ListParagraph"/>
         <w:numPr>
           <w:ilvl w:val="0"/>
-          <w:numId w:val="3"/>
+          <w:numId w:val="2"/>
         </w:numPr>
         <w:spacing w:after="80"/>
       </w:pPr>
@@ -3369,7 +3545,7 @@
         <w:pStyle w:val="ListParagraph"/>
         <w:numPr>
           <w:ilvl w:val="0"/>
-          <w:numId w:val="3"/>
+          <w:numId w:val="2"/>
         </w:numPr>
         <w:spacing w:after="80"/>
       </w:pPr>
@@ -3598,7 +3774,7 @@
         <w:pStyle w:val="ListParagraph"/>
         <w:numPr>
           <w:ilvl w:val="0"/>
-          <w:numId w:val="3"/>
+          <w:numId w:val="2"/>
         </w:numPr>
         <w:spacing w:after="80"/>
       </w:pPr>
@@ -3611,7 +3787,7 @@
         <w:pStyle w:val="ListParagraph"/>
         <w:numPr>
           <w:ilvl w:val="0"/>
-          <w:numId w:val="3"/>
+          <w:numId w:val="2"/>
         </w:numPr>
         <w:spacing w:after="80"/>
       </w:pPr>
@@ -3624,7 +3800,7 @@
         <w:pStyle w:val="ListParagraph"/>
         <w:numPr>
           <w:ilvl w:val="0"/>
-          <w:numId w:val="3"/>
+          <w:numId w:val="2"/>
         </w:numPr>
         <w:spacing w:after="80"/>
       </w:pPr>
@@ -3637,7 +3813,7 @@
         <w:pStyle w:val="ListParagraph"/>
         <w:numPr>
           <w:ilvl w:val="0"/>
-          <w:numId w:val="3"/>
+          <w:numId w:val="2"/>
         </w:numPr>
         <w:spacing w:after="80"/>
       </w:pPr>
@@ -4001,7 +4177,7 @@
         <w:pStyle w:val="ListParagraph"/>
         <w:numPr>
           <w:ilvl w:val="0"/>
-          <w:numId w:val="3"/>
+          <w:numId w:val="2"/>
         </w:numPr>
         <w:spacing w:after="80"/>
       </w:pPr>
@@ -4024,14 +4200,14 @@
         <w:pStyle w:val="ListParagraph"/>
         <w:numPr>
           <w:ilvl w:val="0"/>
-          <w:numId w:val="3"/>
+          <w:numId w:val="2"/>
         </w:numPr>
         <w:spacing w:after="80"/>
       </w:pPr>
       <w:r>
         <w:t xml:space="preserve">[2] „The AI-Native Software Development Lifecycle: A Theoretical and Practical New Methodology”, arXiv-Preprint 2408.03416. </w:t>
       </w:r>
-      <w:hyperlink w:history="1" r:id="rId3rrd0vkvl5z2wuhls1dtv">
+      <w:hyperlink w:history="1" r:id="rIdpkn8dajsorzcbrvhmf-ua">
         <w:r>
           <w:rPr>
             <w:rStyle w:val="Hyperlink"/>
@@ -4045,14 +4221,14 @@
         <w:pStyle w:val="ListParagraph"/>
         <w:numPr>
           <w:ilvl w:val="0"/>
-          <w:numId w:val="3"/>
+          <w:numId w:val="2"/>
         </w:numPr>
         <w:spacing w:after="80"/>
       </w:pPr>
       <w:r>
         <w:t xml:space="preserve">[3] „Agentsway: Software Development Methodology for AI Agents-based Teams”, arXiv-Preprint 2510.23664. </w:t>
       </w:r>
-      <w:hyperlink w:history="1" r:id="rId5akfyrsr6meuikwpnai7s">
+      <w:hyperlink w:history="1" r:id="rId5o3cuanycpvbvtb4jmutp">
         <w:r>
           <w:rPr>
             <w:rStyle w:val="Hyperlink"/>
@@ -4066,14 +4242,14 @@
         <w:pStyle w:val="ListParagraph"/>
         <w:numPr>
           <w:ilvl w:val="0"/>
-          <w:numId w:val="3"/>
+          <w:numId w:val="2"/>
         </w:numPr>
         <w:spacing w:after="80"/>
       </w:pPr>
       <w:r>
         <w:t xml:space="preserve">[4] „AI and Agile Software Development: A Research Roadmap from the XP2025 Workshop”, arXiv-Preprint 2508.20563. </w:t>
       </w:r>
-      <w:hyperlink w:history="1" r:id="rIdlvy9ohf3nsrj6-y6nxh4r">
+      <w:hyperlink w:history="1" r:id="rIdneerinizp5sluwlija358">
         <w:r>
           <w:rPr>
             <w:rStyle w:val="Hyperlink"/>
@@ -4087,14 +4263,14 @@
         <w:pStyle w:val="ListParagraph"/>
         <w:numPr>
           <w:ilvl w:val="0"/>
-          <w:numId w:val="3"/>
+          <w:numId w:val="2"/>
         </w:numPr>
         <w:spacing w:after="80"/>
       </w:pPr>
       <w:r>
         <w:t xml:space="preserve">[5] „Continuous AI in practice: What developers can automate today with agentic CI”, GitHub Blog. </w:t>
       </w:r>
-      <w:hyperlink w:history="1" r:id="rIdwvfqei2s-k6t-irzmaido">
+      <w:hyperlink w:history="1" r:id="rIdzb0fsvw88idmdpblnoqsb">
         <w:r>
           <w:rPr>
             <w:rStyle w:val="Hyperlink"/>
@@ -4108,14 +4284,14 @@
         <w:pStyle w:val="ListParagraph"/>
         <w:numPr>
           <w:ilvl w:val="0"/>
-          <w:numId w:val="3"/>
+          <w:numId w:val="2"/>
         </w:numPr>
         <w:spacing w:after="80"/>
       </w:pPr>
       <w:r>
         <w:t xml:space="preserve">[6] Wolff, Manfred: „Wie ich mit KI arbeite — mein Workflow vom Gedanken bis zur Produktion”, Blog mwolff.org. </w:t>
       </w:r>
-      <w:hyperlink w:history="1" r:id="rIdt0y9wt_zlhb99fc6uaea9">
+      <w:hyperlink w:history="1" r:id="rIdk0g-g1mx3jkix5rpd74oc">
         <w:r>
           <w:rPr>
             <w:rStyle w:val="Hyperlink"/>
@@ -4129,7 +4305,7 @@
         <w:pStyle w:val="ListParagraph"/>
         <w:numPr>
           <w:ilvl w:val="0"/>
-          <w:numId w:val="3"/>
+          <w:numId w:val="2"/>
         </w:numPr>
         <w:spacing w:after="80"/>
       </w:pPr>
@@ -4146,7 +4322,7 @@
       <w:r>
         <w:t xml:space="preserve">, 2001. </w:t>
       </w:r>
-      <w:hyperlink w:history="1" r:id="rIduk-vzmwk9yvkz0oe2yfzf">
+      <w:hyperlink w:history="1" r:id="rIdpdrt4rhh6vxeveaqnx_ti">
         <w:r>
           <w:rPr>
             <w:rStyle w:val="Hyperlink"/>
@@ -4445,12 +4621,6 @@
     </w:lvlOverride>
   </w:num>
   <w:num w:numId="2">
-    <w:abstractNumId w:val="3"/>
-    <w:lvlOverride w:ilvl="0">
-      <w:startOverride w:val="1"/>
-    </w:lvlOverride>
-  </w:num>
-  <w:num w:numId="3">
     <w:abstractNumId w:val="2"/>
     <w:lvlOverride w:ilvl="0">
       <w:startOverride w:val="1"/>

</xml_diff>

<commit_message>
Smooth article: remove em-dashes, gender-neutral terms, fix footnotes
Four editorial passes on docs/ki-entwicklungsprozess.docx:

- Em-dashes (U+2014) replaced with commas throughout; en-dashes in
  ranges (8-64) kept.
- Gender-neutral wording where possible: participle forms (Entwickelnde,
  Auftraggebende, Reviewende, Implementierende). Anglicisms get :innen
  (Senior-Developer:in, Engineering Manager:innen). Singular forms
  rephrased ("die auftraggebende Person") where a participle did not
  flow naturally.
- Footnotes 1-7 now carry full bibliographic entries with clickable
  arXiv and blog URLs; the previously missing footnote 7 (Manifesto
  2001) is added.
- Chapter 4 intro and conclusion explicitly state that this chapter
  discusses the original twelve principles, neither replaces them nor
  proposes new ones, to avoid any "rewriting the manifesto" impression.

Co-Authored-By: Claude Opus 4.7 <noreply@anthropic.com>
</commit_message>
<xml_diff>
--- a/docs/ki-entwicklungsprozess.docx
+++ b/docs/ki-entwicklungsprozess.docx
@@ -109,7 +109,7 @@
         <w:jc w:val="both"/>
       </w:pPr>
       <w:r>
-        <w:t xml:space="preserve">Die Softwareentwicklung hat in den letzten Jahren eine Verschiebung erlebt, die sich nicht in der Sprache klassischer agiler Methoden beschreiben lässt. Generative Sprachmodelle und agentenbasierte Werkzeuge haben die Frage, wer im Team eigentlich Code schreibt, neu aufgeworfen. Ein menschlicher Entwickler, der mit einem solchen Werkzeug arbeitet, ist nicht mehr nur Autor seines Codes; er ist gleichzeitig dessen erster Reviewer, dessen Architekt und dessen Verantwortlicher. Das ist keine kleine Anpassung des Tagesgeschäfts, sondern eine andere Art zu arbeiten.</w:t>
+        <w:t xml:space="preserve">Die Softwareentwicklung hat in den letzten Jahren eine Verschiebung erlebt, die sich nicht in der Sprache klassischer agiler Methoden beschreiben lässt. Generative Sprachmodelle und agentenbasierte Werkzeuge haben die Frage, wer im Team eigentlich Code schreibt, neu aufgeworfen. Eine entwickelnde Person, die mit einem solchen Werkzeug arbeitet, ist nicht mehr nur Autor:in ihres Codes; sie ist gleichzeitig erste Review-Instanz, verantwortet die Architektur und trägt die Endverantwortung. Das ist keine kleine Anpassung des Tagesgeschäfts, sondern eine andere Art zu arbeiten.</w:t>
       </w:r>
     </w:p>
     <w:p>
@@ -127,7 +127,7 @@
         <w:jc w:val="both"/>
       </w:pPr>
       <w:r>
-        <w:t xml:space="preserve">Trotzdem wäre es ein Fehler, das Agile Manifest pauschal für überholt zu erklären. Vieles bleibt richtig. Individuen und Interaktionen über Prozesse und Werkzeuge — gerade weil das Werkzeug jetzt eine eigene Stimme hat. Funktionierende Software über umfassende Dokumentation — gerade weil Dokumentation leicht generiert wird. Kundennähe über Vertragsverhandlung — gerade weil schneller Output die Versuchung erhöht, am Kunden vorbei zu liefern. Und Reaktion auf Veränderung über das Befolgen eines Plans — gerade weil die Werkzeug-Möglichkeiten sich monatlich verschieben.</w:t>
+        <w:t xml:space="preserve">Trotzdem wäre es ein Fehler, das Agile Manifest pauschal für überholt zu erklären. Vieles bleibt richtig. Individuen und Interaktionen über Prozesse und Werkzeuge, gerade weil das Werkzeug jetzt eine eigene Stimme hat. Funktionierende Software über umfassende Dokumentation, gerade weil Dokumentation leicht generiert wird. Kundennähe über Vertragsverhandlung, gerade weil schneller Output die Versuchung erhöht, an der Kundschaft vorbei zu liefern. Und Reaktion auf Veränderung über das Befolgen eines Plans, gerade weil die Werkzeug-Möglichkeiten sich monatlich verschieben.</w:t>
       </w:r>
     </w:p>
     <w:p>
@@ -154,16 +154,16 @@
         <w:jc w:val="both"/>
       </w:pPr>
       <w:r>
-        <w:t xml:space="preserve">Dieser Text richtet sich an drei Lesergruppen. Erstens an KI-augmentierte Entwicklungsteams, die ihre tägliche Praxis explizit machen wollen, statt sie aus Tradition fortzuschreiben. Zweitens an Einzelentwickler, die mit einem KI-Pair arbeiten und nach einer Struktur suchen, die ihre Verantwortung nicht verwässert. Drittens an Tech Leads und Engineering Manager, die ihre Organisation auf einen Modus umstellen wollen, in dem die KI als ernstzunehmendes Werkzeug eingebunden ist, ohne dass sie zur Quelle der Wahrheit wird.</w:t>
-      </w:r>
-    </w:p>
-    <w:p>
-      <w:pPr>
-        <w:spacing w:after="120" w:line="300"/>
-        <w:jc w:val="both"/>
-      </w:pPr>
-      <w:r>
-        <w:t xml:space="preserve">Der Text ist als verbindlicher Vorschlag formuliert, nicht als Wunschliste. Wo eine Regel steht, ist sie als Default gemeint, von dem nur mit guter Begründung abgewichen werden sollte. Das ist nicht Bürokratie um ihrer selbst willen — es ist die Anerkennung, dass eine sehr schnelle Werkzeug-Maschine sehr klare Leitplanken braucht.</w:t>
+        <w:t xml:space="preserve">Dieser Text richtet sich an drei Lesergruppen. Erstens an KI-augmentierte Entwicklungsteams, die ihre tägliche Praxis explizit machen wollen, statt sie aus Tradition fortzuschreiben. Zweitens an Einzel-Entwickelnde, die mit einem KI-Pair arbeiten und nach einer Struktur suchen, die ihre Verantwortung nicht verwässert. Drittens an Tech-Leads und Engineering Manager:innen, die ihre Organisation auf einen Modus umstellen wollen, in dem die KI als ernstzunehmendes Werkzeug eingebunden ist, ohne dass sie zur Quelle der Wahrheit wird.</w:t>
+      </w:r>
+    </w:p>
+    <w:p>
+      <w:pPr>
+        <w:spacing w:after="120" w:line="300"/>
+        <w:jc w:val="both"/>
+      </w:pPr>
+      <w:r>
+        <w:t xml:space="preserve">Der Text ist als verbindlicher Vorschlag formuliert, nicht als Wunschliste. Wo eine Regel steht, ist sie als Default gemeint, von dem nur mit guter Begründung abgewichen werden sollte. Das ist nicht Bürokratie um ihrer selbst willen, es ist die Anerkennung, dass eine sehr schnelle Werkzeug-Maschine sehr klare Leitplanken braucht.</w:t>
       </w:r>
     </w:p>
     <w:p>
@@ -245,7 +245,7 @@
         <w:footnoteReference w:id="2"/>
       </w:r>
       <w:r>
-        <w:t xml:space="preserve"> ist eine Variante des klassischen V-Modells, in der die Implementierungsphase durch die KI dramatisch verkürzt wird. Was übrig bleibt — und damit aufgewertet wird — sind die Phasen davor und danach: Anforderungsklärung, Architektur, Validierung. Die Rolle des Menschen verschiebt sich vom primären Implementierer zum primären Validator. Die KI wird zur Implementations-Engine. Dieser Begriff ist im Folgenden konsistent verwendet, weil er die Beziehung zwischen Mensch und Werkzeug am treffendsten beschreibt: ein leistungsstarker Motor, der eine Hand am Steuer braucht.</w:t>
+        <w:t xml:space="preserve"> ist eine Variante des klassischen V-Modells, in der die Implementierungsphase durch die KI dramatisch verkürzt wird. Was übrig bleibt, und damit aufgewertet wird, sind die Phasen davor und danach: Anforderungsklärung, Architektur, Validierung. Die Rolle des Menschen verschiebt sich vom primären Implementieren zum primären Validieren. Die KI wird zur Implementations-Engine. Dieser Begriff ist im Folgenden konsistent verwendet, weil er die Beziehung zwischen Mensch und Werkzeug am treffendsten beschreibt: ein leistungsstarker Motor, der eine Hand am Steuer braucht.</w:t>
       </w:r>
     </w:p>
     <w:p>
@@ -336,7 +336,7 @@
         <w:footnoteReference w:id="5"/>
       </w:r>
       <w:r>
-        <w:t xml:space="preserve"> beschreibt Hintergrund-Loops, in denen Agenten täglich kleine Pull Requests erzeugen — für Triage, Dokumentationspflege, kleine Qualitätsverbesserungen. Diese Idee ist die Ergänzung des hier vorgeschlagenen Prozesses, nicht sein Ersatz. Continuous-AI-Loops eignen sich für klar abgegrenzte Aufgaben, die kein menschliches Urteil im Moment der Entstehung brauchen. Alles, was Architektur-Entscheidungen, Sicherheitsabwägungen oder Stakeholder-Kommunikation berührt, gehört in die menschlich getaktete Iteration.</w:t>
+        <w:t xml:space="preserve"> beschreibt Hintergrund-Loops, in denen Agenten täglich kleine Pull Requests erzeugen, für Triage, Dokumentationspflege, kleine Qualitätsverbesserungen. Diese Idee ist die Ergänzung des hier vorgeschlagenen Prozesses, nicht sein Ersatz. Continuous-AI-Loops eignen sich für klar abgegrenzte Aufgaben, die kein menschliches Urteil im Moment der Entstehung brauchen. Alles, was Architektur-Entscheidungen, Sicherheitsabwägungen oder Stakeholder-Kommunikation berührt, gehört in die menschlich getaktete Iteration.</w:t>
       </w:r>
     </w:p>
     <w:p>
@@ -372,7 +372,7 @@
         <w:jc w:val="both"/>
       </w:pPr>
       <w:r>
-        <w:t xml:space="preserve">Wer heute eine Software entwickelt und dabei mit einem Sprachmodell arbeitet, hat keine echte Wahl bei der Methode. Klassische, schwergewichtige Vorgehensmodelle scheitern in der KI-augmentierten Welt schneller und gründlicher als sie es je in der rein menschlichen Welt getan haben. Wasserfall, V-Modell mit langen Implementierungsphasen, Phasen-Gate-Modelle mit halbjährlichen Release-Zyklen — diese Ansätze waren schon vor der KI brüchig. Im KI-Zeitalter sind sie unhaltbar.</w:t>
+        <w:t xml:space="preserve">Wer heute eine Software entwickelt und dabei mit einem Sprachmodell arbeitet, hat keine echte Wahl bei der Methode. Klassische, schwergewichtige Vorgehensmodelle scheitern in der KI-augmentierten Welt schneller und gründlicher als sie es je in der rein menschlichen Welt getan haben. Wasserfall, V-Modell mit langen Implementierungsphasen, Phasen-Gate-Modelle mit halbjährlichen Release-Zyklen, diese Ansätze waren schon vor der KI brüchig. Im KI-Zeitalter sind sie unhaltbar.</w:t>
       </w:r>
     </w:p>
     <w:p>
@@ -399,7 +399,7 @@
         <w:jc w:val="both"/>
       </w:pPr>
       <w:r>
-        <w:t xml:space="preserve">Drei Verschiebungen erzwingen Agilität. Erstens: die Implementierung wird billig. Wenn ein Sprachmodell in zwei Stunden produziert, wofür ein Team früher zwei Tage brauchte, dann ist Implementierung nicht mehr die knappe Ressource. Knapp sind nun das Verstehen, das Reviewen, das Entscheiden. Diese Tätigkeiten sind ihrer Natur nach iterativ — sie funktionieren in kurzen Schleifen mit Feedback, nicht in langen Phasen mit Übergaben.</w:t>
+        <w:t xml:space="preserve">Drei Verschiebungen erzwingen Agilität. Erstens: die Implementierung wird billig. Wenn ein Sprachmodell in zwei Stunden produziert, wofür ein Team früher zwei Tage brauchte, dann ist Implementierung nicht mehr die knappe Ressource. Knapp sind nun das Verstehen, das Reviewen, das Entscheiden. Diese Tätigkeiten sind ihrer Natur nach iterativ, sie funktionieren in kurzen Schleifen mit Feedback, nicht in langen Phasen mit Übergaben.</w:t>
       </w:r>
     </w:p>
     <w:p>
@@ -417,7 +417,7 @@
         <w:jc w:val="both"/>
       </w:pPr>
       <w:r>
-        <w:t xml:space="preserve">Drittens: die Erwartungen der Auftraggeber haben sich angepasst. Wer einen sichtbaren Prototyp innerhalb von Tagen erwarten kann, wird Wochen oder Monate nicht mehr tolerieren. Diese Erwartung ist nicht unrealistisch — sie ist eine direkte Folge dessen, was möglich geworden ist. Sie verlangt Cadences, die in klassischen Modellen nicht vorgesehen waren.</w:t>
+        <w:t xml:space="preserve">Drittens: die Erwartungen der Auftraggebenden haben sich angepasst. Wer einen sichtbaren Prototyp innerhalb von Tagen erwarten kann, wird Wochen oder Monate nicht mehr tolerieren. Diese Erwartung ist nicht unrealistisch, sie ist eine direkte Folge dessen, was möglich geworden ist. Sie verlangt Cadences, die in klassischen Modellen nicht vorgesehen waren.</w:t>
       </w:r>
     </w:p>
     <w:p>
@@ -435,7 +435,7 @@
         <w:jc w:val="both"/>
       </w:pPr>
       <w:r>
-        <w:t xml:space="preserve">Das Agile Manifest von 2001 formuliert vier Wertepaare und zwölf Prinzipien. Beide haben in der KI-Ära nichts an Gültigkeit verloren — im Gegenteil, ihre Notwendigkeit ist gewachsen. Individuen und Interaktionen über Prozesse und Werkzeuge: gerade weil das Werkzeug jetzt sehr stark geworden ist, ist die Frage, wie Menschen miteinander und mit dem Werkzeug interagieren, wichtiger denn je. Funktionierende Software über umfassende Dokumentation: gerade weil die KI Dokumentation auf Knopfdruck produziert, ist es wichtig, sie nicht zum Selbstzweck werden zu lassen. Zusammenarbeit mit dem Kunden über Vertragsverhandlung: gerade weil schneller Output das Risiko erhöht, am Kunden vorbei zu liefern. Reagieren auf Veränderung über das Befolgen eines Plans: gerade weil sich die Möglichkeiten monatlich verschieben.</w:t>
+        <w:t xml:space="preserve">Das Agile Manifest von 2001 formuliert vier Wertepaare und zwölf Prinzipien. Beide haben in der KI-Ära nichts an Gültigkeit verloren, im Gegenteil, ihre Notwendigkeit ist gewachsen. Individuen und Interaktionen über Prozesse und Werkzeuge: gerade weil das Werkzeug jetzt sehr stark geworden ist, ist die Frage, wie Menschen miteinander und mit dem Werkzeug interagieren, wichtiger denn je. Funktionierende Software über umfassende Dokumentation: gerade weil die KI Dokumentation auf Knopfdruck produziert, ist es wichtig, sie nicht zum Selbstzweck werden zu lassen. Zusammenarbeit mit der Kundschaft über Vertragsverhandlung: gerade weil schneller Output das Risiko erhöht, an der Kundschaft vorbei zu liefern. Reagieren auf Veränderung über das Befolgen eines Plans: gerade weil sich die Möglichkeiten monatlich verschieben.</w:t>
       </w:r>
     </w:p>
     <w:p>
@@ -462,16 +462,16 @@
         <w:jc w:val="both"/>
       </w:pPr>
       <w:r>
-        <w:t xml:space="preserve">Einiges am ursprünglichen Manifest fühlt sich beim Wiederlesen historisch an. Die Annahme, dass alle Teammitglieder im selben Raum sitzen sollten — fünfzes Prinzip — passt nicht in eine Welt mit Remote-Arbeit und KI-Werkzeugen. Die Schätzung, dass funktionierende Software in Wochen bis Monaten ausgeliefert werden soll — drittes Prinzip — wirkt langsam, wenn die KI-Cadence Tage zulässt. Diese Verschiebungen verlangen aber keine Ersetzung der Prinzipien, sondern eine Neukalibrierung ihrer Skala.</w:t>
-      </w:r>
-    </w:p>
-    <w:p>
-      <w:pPr>
-        <w:spacing w:after="120" w:line="300"/>
-        <w:jc w:val="both"/>
-      </w:pPr>
-      <w:r>
-        <w:t xml:space="preserve">Der hier vorgeschlagene Prozess hält an den zwölf Prinzipien fest und beschreibt im nächsten Kapitel, wie jedes einzelne im KI-augmentierten Modus konkret aussieht — was es weiter zu leisten hat, was leichter wird, und an welcher Stelle eine neue Vorsicht nötig ist.</w:t>
+        <w:t xml:space="preserve">Einiges am ursprünglichen Manifest fühlt sich beim Wiederlesen historisch an. Die Annahme, dass alle Teammitglieder im selben Raum sitzen sollten, fünfzes Prinzip, passt nicht in eine Welt mit Remote-Arbeit und KI-Werkzeugen. Die Schätzung, dass funktionierende Software in Wochen bis Monaten ausgeliefert werden soll, drittes Prinzip, wirkt langsam, wenn die KI-Cadence Tage zulässt. Diese Verschiebungen verlangen aber keine Ersetzung der Prinzipien, sondern eine Neukalibrierung ihrer Skala.</w:t>
+      </w:r>
+    </w:p>
+    <w:p>
+      <w:pPr>
+        <w:spacing w:after="120" w:line="300"/>
+        <w:jc w:val="both"/>
+      </w:pPr>
+      <w:r>
+        <w:t xml:space="preserve">Der hier vorgeschlagene Prozess hält an den zwölf Prinzipien fest und beschreibt im nächsten Kapitel, wie jedes einzelne im KI-augmentierten Modus konkret aussieht, was es weiter zu leisten hat, was leichter wird, und an welcher Stelle eine neue Vorsicht nötig ist.</w:t>
       </w:r>
     </w:p>
     <w:p>
@@ -498,7 +498,7 @@
         <w:footnoteReference w:id="7"/>
       </w:r>
       <w:r>
-        <w:t xml:space="preserve">. Sie sind 2001 als operative Konkretisierung der vier Wertepaare entstanden und haben sich über zwei Jahrzehnte gehalten. In diesem Kapitel wird jedes Prinzip einzeln betrachtet — was es weiterhin verlangt, wie eine KI-augmentierte Praxis seine Umsetzung erleichtert oder verbessert, und wo eine neue Vorsicht nötig ist. Das Ergebnis: die Prinzipien sind nicht nur weiterhin gültig, ihre Umsetzung ist heute oft deutlich leichter als 2001. Wer sie schon damals ernst genommen hat, hat im KI-Zeitalter einen guten Startpunkt.</w:t>
+        <w:t xml:space="preserve">. Sie sind 2001 als operative Konkretisierung der vier Wertepaare entstanden und haben sich über zwei Jahrzehnte gehalten. Dieses Kapitel formuliert keine neuen Prinzipien und beansprucht auch keine Aktualisierung des Manifests. Es nimmt die zwölf originalen Sätze, einen nach dem anderen, und fragt: was verlangen sie weiterhin, was wird in der KI-augmentierten Praxis bei ihrer Umsetzung leichter, und wo ist eine neue Vorsicht nötig? Das Ergebnis: die Prinzipien sind nicht nur weiterhin gültig, ihre Umsetzung ist heute oft deutlich leichter als 2001. Wer sie schon damals ernst genommen hat, hat im KI-Zeitalter einen guten Startpunkt.</w:t>
       </w:r>
     </w:p>
     <w:p>
@@ -516,7 +516,7 @@
         <w:jc w:val="both"/>
       </w:pPr>
       <w:r>
-        <w:t xml:space="preserve">Das erste Prinzip stellt Kundenwert als oberstes Ziel über alles. Es verlangt früh und kontinuierlich auszuliefern, nicht spät und auf einen Schlag. Das gilt unverändert: die Zufriedenheit des Auftraggebers entsteht aus Stücken, die er sehen, anfassen, testen kann — nicht aus Planungs-Slideshows.</w:t>
+        <w:t xml:space="preserve">Das erste Prinzip stellt Kundenwert als oberstes Ziel über alles. Es verlangt früh und kontinuierlich auszuliefern, nicht spät und auf einen Schlag. Das gilt unverändert: die Zufriedenheit der auftraggebenden Person entsteht aus Stücken, die sie sehen, anfassen, testen kann, nicht aus Planungs-Slideshows.</w:t>
       </w:r>
     </w:p>
     <w:p>
@@ -543,7 +543,7 @@
         <w:jc w:val="both"/>
       </w:pPr>
       <w:r>
-        <w:t xml:space="preserve">Das zweite Prinzip macht aus dem klassischen Risiko — späten Änderungen — einen Wettbewerbsvorteil. Es verlangt, agile Prozesse so zu bauen, dass Veränderungen nicht zur Krise werden. Auch das gilt weiterhin: der Kunde, der spät umdenkt, hat oft einen guten Grund — meistens, weil er erst jetzt versteht, was er wirklich braucht.</w:t>
+        <w:t xml:space="preserve">Das zweite Prinzip macht aus dem klassischen Risiko, späten Änderungen, einen Wettbewerbsvorteil. Es verlangt, agile Prozesse so zu bauen, dass Veränderungen nicht zur Krise werden. Auch das gilt weiterhin: wer spät umdenkt, hat oft einen guten Grund, meistens, weil sich erst jetzt zeigt, was wirklich gebraucht wird.</w:t>
       </w:r>
     </w:p>
     <w:p>
@@ -579,7 +579,7 @@
         <w:jc w:val="both"/>
       </w:pPr>
       <w:r>
-        <w:t xml:space="preserve">Was sich verschiebt, ist die Skala. Daily-Iterationen sind die neue Norm, Vier-Stunden-Iterationen sind für klar abgegrenzte Aufgaben realistisch. Was 2001 als ambitionierte Cadence galt, ist heute ein Default. Eine ganze Klasse von Verzögerungen — Build-Zeiten, manuelle Tests, Hand-Offs zwischen Rollen — ist durch Automatisierung und KI-Unterstützung in den Hintergrund gerückt. Das Risiko ist die andere Seite: häufige Auslieferung ohne Disziplin produziert eine Folge halbgarer Releases. Test-First, manuelle UI-Verifikation, Security-Gates sind kein optionaler Zusatzaufwand, sondern die Bedingung, unter der häufige Auslieferung verantwortbar ist.</w:t>
+        <w:t xml:space="preserve">Was sich verschiebt, ist die Skala. Daily-Iterationen sind die neue Norm, Vier-Stunden-Iterationen sind für klar abgegrenzte Aufgaben realistisch. Was 2001 als ambitionierte Cadence galt, ist heute ein Default. Eine ganze Klasse von Verzögerungen, Build-Zeiten, manuelle Tests, Hand-Offs zwischen Rollen, ist durch Automatisierung und KI-Unterstützung in den Hintergrund gerückt. Das Risiko ist die andere Seite: häufige Auslieferung ohne Disziplin produziert eine Folge halbgarer Releases. Test-First, manuelle UI-Verifikation, Security-Gates sind kein optionaler Zusatzaufwand, sondern die Bedingung, unter der häufige Auslieferung verantwortbar ist.</w:t>
       </w:r>
     </w:p>
     <w:p>
@@ -606,7 +606,7 @@
         <w:jc w:val="both"/>
       </w:pPr>
       <w:r>
-        <w:t xml:space="preserve">Die KI macht diese Zusammenarbeit konkreter. Wenn die Fachseite eine Anforderung diktiert und der Senior Developer sie in ein Issue überführt, kann die KI noch am selben Tag einen ersten Prototyp liefern. Die Diskussion zwischen Fach und Entwicklung springt damit aus der abstrakten in die konkrete Phase: nicht „könnte man das so meinen?” sondern „so sieht es aus, passt das?”. Die menschliche Diskussion wird damit nicht ersetzt, sondern verstärkt. Die KI ist Beschleuniger, nicht Ersatz.</w:t>
+        <w:t xml:space="preserve">Die KI macht diese Zusammenarbeit konkreter. Wenn die Fachseite eine Anforderung diktiert und ein:e Senior-Developer:in sie in ein Issue überführt, kann die KI noch am selben Tag einen ersten Prototyp liefern. Die Diskussion zwischen Fach und Entwicklung springt damit aus der abstrakten in die konkrete Phase: nicht „könnte man das so meinen?” sondern „so sieht es aus, passt das?”. Die menschliche Diskussion wird damit nicht ersetzt, sondern verstärkt. Die KI ist Beschleuniger, nicht Ersatz.</w:t>
       </w:r>
     </w:p>
     <w:p>
@@ -624,16 +624,16 @@
         <w:jc w:val="both"/>
       </w:pPr>
       <w:r>
-        <w:t xml:space="preserve">Das fünfte Prinzip ist ein Bekenntnis zum Menschen: Projekte werden um motivierte Menschen herum gebaut, die das Vertrauen bekommen, ihre Arbeit zu tun. Vertrauen ist hier nicht naiv — es ist die einzige tragfähige Basis, weil Mikromanagement in Wissensarbeit nicht funktioniert.</w:t>
-      </w:r>
-    </w:p>
-    <w:p>
-      <w:pPr>
-        <w:spacing w:after="120" w:line="300"/>
-        <w:jc w:val="both"/>
-      </w:pPr>
-      <w:r>
-        <w:t xml:space="preserve">In der KI-Ära steigt der Anspruch an die Menschen, nicht der Bedarf an Mikromanagement. Wer mit Sprachmodellen arbeitet, muss kritisch denken, plausible Ergebnisse von korrekten unterscheiden, Architektur-Entscheidungen verantworten. Diese Tätigkeiten sind anspruchsvoller als das, was sie ersetzen — und sie verlangen Motivation, Konzentration und ein Umfeld, das beides ermöglicht. Eine Organisation, die das fünfte Prinzip 2001 verletzt hat, wird im KI-Zeitalter besonders schnell merken, dass demotivierte Menschen mit mächtigen Werkzeugen schneller Schaden anrichten.</w:t>
+        <w:t xml:space="preserve">Das fünfte Prinzip ist ein Bekenntnis zum Menschen: Projekte werden um motivierte Menschen herum gebaut, die das Vertrauen bekommen, ihre Arbeit zu tun. Vertrauen ist hier nicht naiv, es ist die einzige tragfähige Basis, weil Mikromanagement in Wissensarbeit nicht funktioniert.</w:t>
+      </w:r>
+    </w:p>
+    <w:p>
+      <w:pPr>
+        <w:spacing w:after="120" w:line="300"/>
+        <w:jc w:val="both"/>
+      </w:pPr>
+      <w:r>
+        <w:t xml:space="preserve">In der KI-Ära steigt der Anspruch an die Menschen, nicht der Bedarf an Mikromanagement. Wer mit Sprachmodellen arbeitet, muss kritisch denken, plausible Ergebnisse von korrekten unterscheiden, Architektur-Entscheidungen verantworten. Diese Tätigkeiten sind anspruchsvoller als das, was sie ersetzen, und sie verlangen Motivation, Konzentration und ein Umfeld, das beides ermöglicht. Eine Organisation, die das fünfte Prinzip 2001 verletzt hat, wird im KI-Zeitalter besonders schnell merken, dass demotivierte Menschen mit mächtigen Werkzeugen schneller Schaden anrichten.</w:t>
       </w:r>
     </w:p>
     <w:p>
@@ -651,16 +651,16 @@
         <w:jc w:val="both"/>
       </w:pPr>
       <w:r>
-        <w:t xml:space="preserve">Das sechste Prinzip behauptet, dass Auge-zu-Auge-Gespräche die effektivste Form der Informationsübertragung in einem Entwicklungsteam sind. Es ist das Prinzip, dem die KI-Ära am sichtbarsten widerspricht — und das gleichzeitig nicht widerlegt, sondern neu eingeordnet wird.</w:t>
-      </w:r>
-    </w:p>
-    <w:p>
-      <w:pPr>
-        <w:spacing w:after="120" w:line="300"/>
-        <w:jc w:val="both"/>
-      </w:pPr>
-      <w:r>
-        <w:t xml:space="preserve">Zwischen Menschen bleibt direkte Kommunikation überlegen. Im Daily-Standup, im Stakeholder-Review, in der KI-Retrospektive — das menschliche Gespräch trägt weiterhin am meisten Information pro Minute. Was sich verschiebt, ist der Anteil der Kommunikation, der zwischen Mensch und KI stattfindet. Diese kann nicht von Angesicht zu Angesicht sein; sie ist notwendig schriftlich. Daraus folgt eine pragmatische Konsequenz: alles, was die KI wissen muss, gehört in ein Issue, in CLAUDE-Dateien oder in Memory-Notizen. Das Gespräch zwischen Menschen darf dadurch nicht verarmen. Die Versuchung, alles in Schriftform zu pressen, weil die KI das gut liest, wäre eine Verletzung dieses Prinzips.</w:t>
+        <w:t xml:space="preserve">Das sechste Prinzip behauptet, dass Auge-zu-Auge-Gespräche die effektivste Form der Informationsübertragung in einem Entwicklungsteam sind. Es ist das Prinzip, dem die KI-Ära am sichtbarsten widerspricht, und das gleichzeitig nicht widerlegt, sondern neu eingeordnet wird.</w:t>
+      </w:r>
+    </w:p>
+    <w:p>
+      <w:pPr>
+        <w:spacing w:after="120" w:line="300"/>
+        <w:jc w:val="both"/>
+      </w:pPr>
+      <w:r>
+        <w:t xml:space="preserve">Zwischen Menschen bleibt direkte Kommunikation überlegen. Im Daily-Standup, im Stakeholder-Review, in der KI-Retrospektive, das menschliche Gespräch trägt weiterhin am meisten Information pro Minute. Was sich verschiebt, ist der Anteil der Kommunikation, der zwischen Mensch und KI stattfindet. Diese kann nicht von Angesicht zu Angesicht sein; sie ist notwendig schriftlich. Daraus folgt eine pragmatische Konsequenz: alles, was die KI wissen muss, gehört in ein Issue, in CLAUDE-Dateien oder in Memory-Notizen. Das Gespräch zwischen Menschen darf dadurch nicht verarmen. Die Versuchung, alles in Schriftform zu pressen, weil die KI das gut liest, wäre eine Verletzung dieses Prinzips.</w:t>
       </w:r>
     </w:p>
     <w:p>
@@ -678,16 +678,16 @@
         <w:jc w:val="both"/>
       </w:pPr>
       <w:r>
-        <w:t xml:space="preserve">Das siebte Prinzip ist möglicherweise das wichtigste im KI-Zeitalter. Es verwirft alle Stellvertretermessgrößen — Velocity-Punkte, Lines-of-Code, Anzahl der PRs — und sagt: das einzige Maß ist funktionierende Software.</w:t>
-      </w:r>
-    </w:p>
-    <w:p>
-      <w:pPr>
-        <w:spacing w:after="120" w:line="300"/>
-        <w:jc w:val="both"/>
-      </w:pPr>
-      <w:r>
-        <w:t xml:space="preserve">Die KI macht diese Frage drängender als je zuvor. Ein Modell produziert in einer Stunde mehr Code als ein menschlicher Entwickler an einem Tag. Wenn das Maß die Menge wäre, sähe alles großartig aus. Das Maß ist aber, ob diese Menge etwas Funktionierendes ergibt. Funktionierend heißt: Tests grün, Akzeptanzkriterien erfüllt, manuelle Verifikation bestanden, Stakeholder zufrieden. Wer im KI-Modus mit anderen Metriken arbeitet, baut Velocity-Charts, die im Burnout enden. Die einzige tragfähige Metrik ist die alte: läuft es?</w:t>
+        <w:t xml:space="preserve">Das siebte Prinzip ist möglicherweise das wichtigste im KI-Zeitalter. Es verwirft alle Stellvertretermessgrößen, Velocity-Punkte, Lines-of-Code, Anzahl der PRs, und sagt: das einzige Maß ist funktionierende Software.</w:t>
+      </w:r>
+    </w:p>
+    <w:p>
+      <w:pPr>
+        <w:spacing w:after="120" w:line="300"/>
+        <w:jc w:val="both"/>
+      </w:pPr>
+      <w:r>
+        <w:t xml:space="preserve">Die KI macht diese Frage drängender als je zuvor. Ein Modell produziert in einer Stunde mehr Code als eine entwickelnde Person an einem Tag. Wenn das Maß die Menge wäre, sähe alles großartig aus. Das Maß ist aber, ob diese Menge etwas Funktionierendes ergibt. Funktionierend heißt: Tests grün, Akzeptanzkriterien erfüllt, manuelle Verifikation bestanden, Stakeholder zufrieden. Wer im KI-Modus mit anderen Metriken arbeitet, baut Velocity-Charts, die im Burnout enden. Die einzige tragfähige Metrik ist die alte: läuft es?</w:t>
       </w:r>
     </w:p>
     <w:p>
@@ -714,7 +714,7 @@
         <w:jc w:val="both"/>
       </w:pPr>
       <w:r>
-        <w:t xml:space="preserve">Die KI verändert die Dynamik dieses Prinzips. Auf der einen Seite ist Sustainable Pace leichter, weil viele lästige Tätigkeiten (Boilerplate, Tests-Schreiben für offensichtliche Fälle, Dokumentation) der KI übergeben werden können. Auf der anderen Seite ist die Versuchung größer, weil die KI nie müde wird. Wer sich von der KI tempotreiben lässt, läuft schneller in den Burnout als ohne sie. Die menschliche Reviewerkapazität wird zur knappen Ressource. Eine Daily-Iteration, in der die KI zwölf Issues abarbeitet und ein Mensch alle zwölf reviewen soll, ist nicht nachhaltig. Sustainable Pace heißt im KI-Modus: die Cadence wird vom langsamsten menschlichen Schritt bestimmt, nicht vom schnellsten Werkzeug-Schritt.</w:t>
+        <w:t xml:space="preserve">Die KI verändert die Dynamik dieses Prinzips. Auf der einen Seite ist Sustainable Pace leichter, weil viele lästige Tätigkeiten (Boilerplate, Tests-Schreiben für offensichtliche Fälle, Dokumentation) der KI übergeben werden können. Auf der anderen Seite ist die Versuchung größer, weil die KI nie müde wird. Wer sich von der KI tempotreiben lässt, läuft schneller in den Burnout als ohne sie. Die menschliche Review-Kapazität wird zur knappen Ressource. Eine Daily-Iteration, in der die KI zwölf Issues abarbeitet und ein Mensch alle zwölf reviewen soll, ist nicht nachhaltig. Sustainable Pace heißt im KI-Modus: die Cadence wird vom langsamsten menschlichen Schritt bestimmt, nicht vom schnellsten Werkzeug-Schritt.</w:t>
       </w:r>
     </w:p>
     <w:p>
@@ -741,34 +741,34 @@
         <w:jc w:val="both"/>
       </w:pPr>
       <w:r>
-        <w:t xml:space="preserve">Die KI verstärkt dieses Prinzip in beide Richtungen. Wer mit Architektur-Verständnis und Senior-Erfahrung arbeitet, kann mit KI sehr saubere Lösungen sehr schnell erzeugen. Wer ohne Architektur-Verständnis arbeitet, baut mit KI sehr schnelle Stapel schlechten Codes. Senior-Developer-Rolle und Qualitätsexperte werden nicht überflüssig — im Gegenteil, ihre Bedeutung wächst. Plus: KI-generierter Code hat oft eine plausible Form, aber subtile Inkonsistenzen, die kein Test sofort aufdeckt. Continuous Refactoring, ArchUnit-Regeln und ein zweites Modell beim Review sind die operativen Mittel, mit denen dieses Prinzip im KI-Modus gehalten wird.</w:t>
-      </w:r>
-    </w:p>
-    <w:p>
-      <w:pPr>
-        <w:pStyle w:val="Heading2"/>
-        <w:spacing w:after="120" w:before="240"/>
-      </w:pPr>
-      <w:r>
-        <w:t xml:space="preserve">4.10 Einfachheit — die Kunst, nicht zu tun</w:t>
-      </w:r>
-    </w:p>
-    <w:p>
-      <w:pPr>
-        <w:spacing w:after="120" w:line="300"/>
-        <w:jc w:val="both"/>
-      </w:pPr>
-      <w:r>
-        <w:t xml:space="preserve">Das zehnte Prinzip lobt das Maximieren der nicht gemachten Arbeit. Es ist das einzige Prinzip, das explizit gegen Übereifer warnt — und damit eines der schwersten zu leben.</w:t>
-      </w:r>
-    </w:p>
-    <w:p>
-      <w:pPr>
-        <w:spacing w:after="120" w:line="300"/>
-        <w:jc w:val="both"/>
-      </w:pPr>
-      <w:r>
-        <w:t xml:space="preserve">Mit der KI wird Einfachheit schwerer einzuhalten, weil das Hinzufügen so billig wird. Ein zusätzliches Feature, eine zusätzliche Option, eine zusätzliche Validierung — alles kostet die KI fast nichts an Aufwand. Die Disziplin liegt darin, das Generieren zu unterlassen. Issues setzen Scope-Grenzen; die KI darf nichts hinzufügen, was nicht im Issue steht. Senior-Developer prüfen, ob ein KI-Vorschlag das eigentliche Problem löst oder Nebenkriegsschauplätze produziert. Das alte „you ain't gonna need it” ist im KI-Zeitalter ein zentrales Korrektiv geworden — gerade weil die Versuchung größer ist denn je.</w:t>
+        <w:t xml:space="preserve">Die KI verstärkt dieses Prinzip in beide Richtungen. Wer mit Architektur-Verständnis und Senior-Erfahrung arbeitet, kann mit KI sehr saubere Lösungen sehr schnell erzeugen. Wer ohne Architektur-Verständnis arbeitet, baut mit KI sehr schnelle Stapel schlechten Codes. Senior-Developer-Rolle und Qualitätsexperte werden nicht überflüssig, im Gegenteil, ihre Bedeutung wächst. Plus: KI-generierter Code hat oft eine plausible Form, aber subtile Inkonsistenzen, die kein Test sofort aufdeckt. Continuous Refactoring, ArchUnit-Regeln und ein zweites Modell beim Review sind die operativen Mittel, mit denen dieses Prinzip im KI-Modus gehalten wird.</w:t>
+      </w:r>
+    </w:p>
+    <w:p>
+      <w:pPr>
+        <w:pStyle w:val="Heading2"/>
+        <w:spacing w:after="120" w:before="240"/>
+      </w:pPr>
+      <w:r>
+        <w:t xml:space="preserve">4.10 Einfachheit, die Kunst, nicht zu tun</w:t>
+      </w:r>
+    </w:p>
+    <w:p>
+      <w:pPr>
+        <w:spacing w:after="120" w:line="300"/>
+        <w:jc w:val="both"/>
+      </w:pPr>
+      <w:r>
+        <w:t xml:space="preserve">Das zehnte Prinzip lobt das Maximieren der nicht gemachten Arbeit. Es ist das einzige Prinzip, das explizit gegen Übereifer warnt, und damit eines der schwersten zu leben.</w:t>
+      </w:r>
+    </w:p>
+    <w:p>
+      <w:pPr>
+        <w:spacing w:after="120" w:line="300"/>
+        <w:jc w:val="both"/>
+      </w:pPr>
+      <w:r>
+        <w:t xml:space="preserve">Mit der KI wird Einfachheit schwerer einzuhalten, weil das Hinzufügen so billig wird. Ein zusätzliches Feature, eine zusätzliche Option, eine zusätzliche Validierung, alles kostet die KI fast nichts an Aufwand. Die Disziplin liegt darin, das Generieren zu unterlassen. Issues setzen Scope-Grenzen; die KI darf nichts hinzufügen, was nicht im Issue steht. Senior-Developer prüfen, ob ein KI-Vorschlag das eigentliche Problem löst oder Nebenkriegsschauplätze produziert. Das alte „you ain't gonna need it” ist im KI-Zeitalter ein zentrales Korrektiv geworden, gerade weil die Versuchung größer ist denn je.</w:t>
       </w:r>
     </w:p>
     <w:p>
@@ -795,7 +795,7 @@
         <w:jc w:val="both"/>
       </w:pPr>
       <w:r>
-        <w:t xml:space="preserve">Selbstorganisation funktioniert zwischen Menschen. Die KI ist nicht Teil dieser Selbstorganisation. Sie wählt nicht aus, an welchem Issue sie arbeitet; sie definiert nicht die Architektur; sie verhandelt nicht mit dem Stakeholder. Sie ist Werkzeug. Was sich verschiebt, ist die Form der Selbstorganisation: weniger Stand-ups, mehr asynchrone Koordination über Issue und Board; weniger Pair-Programming, mehr Mensch-KI-Pair mit menschlichem Review. Die Senior-Developer-Rolle wird zur Architektur-Ankerin, weil die KI alleine keine kohärente Architektur erzeugt. Selbstorganisation darf nicht heißen, dass die KI ein gleichberechtigtes Teammitglied wird — sonst verliert das Prinzip seinen Sinn.</w:t>
+        <w:t xml:space="preserve">Selbstorganisation funktioniert zwischen Menschen. Die KI ist nicht Teil dieser Selbstorganisation. Sie wählt nicht aus, an welchem Issue sie arbeitet; sie definiert nicht die Architektur; sie verhandelt nicht mit Stakeholder:innen. Sie ist Werkzeug. Was sich verschiebt, ist die Form der Selbstorganisation: weniger Stand-ups, mehr asynchrone Koordination über Issue und Board; weniger Pair-Programming, mehr Mensch-KI-Pair mit menschlichem Review. Die Senior-Developer-Rolle wird zur Architektur-Ankerin, weil die KI alleine keine kohärente Architektur erzeugt. Selbstorganisation darf nicht heißen, dass die KI ein gleichberechtigtes Teammitglied wird, sonst verliert das Prinzip seinen Sinn.</w:t>
       </w:r>
     </w:p>
     <w:p>
@@ -840,7 +840,7 @@
         <w:jc w:val="both"/>
       </w:pPr>
       <w:r>
-        <w:t xml:space="preserve">Alle zwölf Prinzipien gelten unverändert. Bei keinem ist die Umsetzung im KI-Modus schwerer geworden — bei den meisten ist sie leichter, bei einigen verschiebt sich die Skala oder die Form. Wer das Manifest 2001 ernst genommen hat, ist im KI-Zeitalter gut gerüstet. Wer es als Lippenbekenntnis behandelte, wird seine Versäumnisse jetzt deutlicher merken: die KI verstärkt sowohl gute als auch schlechte Gewohnheiten. Diese Verstärkung ist der eigentliche Hebel der KI-augmentierten Entwicklung.</w:t>
+        <w:t xml:space="preserve">Alle zwölf Prinzipien gelten unverändert. Bei keinem ist die Umsetzung im KI-Modus schwerer geworden, bei den meisten ist sie leichter, bei einigen verschiebt sich die Skala oder die Form. Das Manifest schreibt sich nicht neu, es wird im KI-Zeitalter nur deutlicher lesbar. Wer es 2001 ernst genommen hat, ist heute gut gerüstet. Wer es als Lippenbekenntnis behandelte, wird seine Versäumnisse jetzt deutlicher merken: die KI verstärkt sowohl gute als auch schlechte Gewohnheiten. Diese Verstärkung ist der eigentliche Hebel der KI-augmentierten Entwicklung.</w:t>
       </w:r>
     </w:p>
     <w:p>
@@ -876,7 +876,7 @@
         <w:jc w:val="both"/>
       </w:pPr>
       <w:r>
-        <w:t xml:space="preserve">Der Product Owner verantwortet das Was. Er definiert Anforderungen, priorisiert sie, formuliert Issues oder lässt sie nach Diktat formulieren. Er entscheidet, welches Issue als nächstes umgesetzt wird und welches warten muss. Er gibt das GO zur Implementierung und die Trigger-Phrasen für Push und Merge. Wenn das Team ein Kanban-Board nutzt, ist er es, der Issues nach Ready zieht — niemals die KI.</w:t>
+        <w:t xml:space="preserve">Der Product Owner verantwortet das Was. Er definiert Anforderungen, priorisiert sie, formuliert Issues oder lässt sie nach Diktat formulieren. Er entscheidet, welches Issue als nächstes umgesetzt wird und welches warten muss. Er gibt das GO zur Implementierung und die Trigger-Phrasen für Push und Merge. Wenn das Team ein Kanban-Board nutzt, ist er es, der Issues nach Ready zieht, niemals die KI.</w:t>
       </w:r>
     </w:p>
     <w:p>
@@ -903,16 +903,16 @@
         <w:jc w:val="both"/>
       </w:pPr>
       <w:r>
-        <w:t xml:space="preserve">Der Senior Developer verantwortet das Wie. Er prüft Architektur-Vorschläge der KI, bevor sie in Code übergehen. Er hat ein Veto auf jedes Issue, das technisch unausgegoren ist. Er entscheidet, wann ein Refactoring nötig ist und wann ein vorhandenes Muster gerade ausreicht. Er sorgt dafür, dass die KI nicht in eine eigene Designwelt abdriftet, die zwar funktionierenden, aber inkonsistenten Code produziert.</w:t>
-      </w:r>
-    </w:p>
-    <w:p>
-      <w:pPr>
-        <w:spacing w:after="120" w:line="300"/>
-        <w:jc w:val="both"/>
-      </w:pPr>
-      <w:r>
-        <w:t xml:space="preserve">Diese Rolle ist im KI-Zeitalter eher anspruchsvoller als entspannter geworden. Wer zehn Jahre Erfahrung mit einem Tech-Stack hat, kann mit der KI in Stunden Dinge produzieren, für die er früher Tage gebraucht hätte. Wer drei Monate Erfahrung hat, kann mit derselben KI Dinge produzieren, die plausibel aussehen, aber subtil falsch sind. Senior Developer in dieser Welt zu sein, bedeutet, das Plausible vom Korrekten unterscheiden zu können.</w:t>
+        <w:t xml:space="preserve">Die Senior-Developer-Rolle verantwortet das Wie. Sie prüft Architektur-Vorschläge der KI, bevor sie in Code übergehen. Sie hat ein Veto auf jedes Issue, das technisch unausgegoren ist. Sie entscheidet, wann ein Refactoring nötig ist und wann ein vorhandenes Muster gerade ausreicht. Sie sorgt dafür, dass die KI nicht in eine eigene Designwelt abdriftet, die zwar funktionierenden, aber inkonsistenten Code produziert.</w:t>
+      </w:r>
+    </w:p>
+    <w:p>
+      <w:pPr>
+        <w:spacing w:after="120" w:line="300"/>
+        <w:jc w:val="both"/>
+      </w:pPr>
+      <w:r>
+        <w:t xml:space="preserve">Diese Rolle ist im KI-Zeitalter eher anspruchsvoller als entspannter geworden. Wer zehn Jahre Erfahrung mit einem Tech-Stack hat, kann mit der KI in Stunden Dinge produzieren, für die früher Tage nötig gewesen wären. Wer drei Monate Erfahrung hat, kann mit derselben KI Dinge produzieren, die plausibel aussehen, aber subtil falsch sind. In dieser Welt Senior-Developer:in zu sein, bedeutet, das Plausible vom Korrekten unterscheiden zu können.</w:t>
       </w:r>
     </w:p>
     <w:p>
@@ -930,16 +930,16 @@
         <w:jc w:val="both"/>
       </w:pPr>
       <w:r>
-        <w:t xml:space="preserve">Der Qualitätsexperte verantwortet die Verifizierung. Er führt die Code-Reviews durch das zweite Modell — etwa OpenAI Codex, wenn das Implementations-Modell Claude ist, oder umgekehrt. Er prüft Coverage- und Mutation-Scores. Er führt Security-Reviews durch und stellt sicher, dass Secrets nicht ins Repository wandern, dass SQL-Queries parametrisiert sind, dass DTOs validiert werden.</w:t>
-      </w:r>
-    </w:p>
-    <w:p>
-      <w:pPr>
-        <w:spacing w:after="120" w:line="300"/>
-        <w:jc w:val="both"/>
-      </w:pPr>
-      <w:r>
-        <w:t xml:space="preserve">Diese Rolle muss nicht hauptamtlich besetzt sein. In einem kleinen Team kann sie der Senior Developer mitmachen. Wichtig ist, dass sie explizit existiert und nicht stillschweigend bei einem Generalisten landet. Die KI ist gut darin, Codes-Smells zu übersehen, die ihr selbst beim Generieren unterlaufen sind.</w:t>
+        <w:t xml:space="preserve">Der Qualitätsexperte verantwortet die Verifizierung. Er führt die Code-Reviews durch das zweite Modell, etwa OpenAI Codex, wenn das Implementations-Modell Claude ist, oder umgekehrt. Er prüft Coverage- und Mutation-Scores. Er führt Security-Reviews durch und stellt sicher, dass Secrets nicht ins Repository wandern, dass SQL-Queries parametrisiert sind, dass DTOs validiert werden.</w:t>
+      </w:r>
+    </w:p>
+    <w:p>
+      <w:pPr>
+        <w:spacing w:after="120" w:line="300"/>
+        <w:jc w:val="both"/>
+      </w:pPr>
+      <w:r>
+        <w:t xml:space="preserve">Diese Rolle muss nicht hauptamtlich besetzt sein. In einem kleinen Team kann sie die Senior-Developer-Rolle mitübernehmen. Wichtig ist, dass sie explizit existiert und nicht stillschweigend bei einer generalistisch arbeitenden Person landet. Die KI ist gut darin, Codes-Smells zu übersehen, die ihr selbst beim Generieren unterlaufen sind.</w:t>
       </w:r>
     </w:p>
     <w:p>
@@ -1312,7 +1312,7 @@
         <w:footnoteReference w:id="4"/>
       </w:r>
       <w:r>
-        <w:t xml:space="preserve"> schlägt drei KI-Assistenzrollen vor: AI Product Owner Assistant, AI Quality Assurance Partner, AI Pair Programming Partner. Diese können im hier vorgeschlagenen Prozess als spezialisierte Werkzeuge eingesetzt werden — beispielsweise als Hilfsmittel beim Backlog-Refinement oder bei der Test-Generierung. Wichtig ist, dass sie als Werkzeuge sichtbar bleiben. Sobald ein AI PO Assistant beginnt, eigenständig Tickets zu schreiben, ohne dass ein Mensch sie freigibt, wird aus dem Werkzeug eine Rolle — und die Verantwortungskette bricht.</w:t>
+        <w:t xml:space="preserve"> schlägt drei KI-Assistenzrollen vor: AI Product Owner Assistant, AI Quality Assurance Partner, AI Pair Programming Partner. Diese können im hier vorgeschlagenen Prozess als spezialisierte Werkzeuge eingesetzt werden, beispielsweise als Hilfsmittel beim Backlog-Refinement oder bei der Test-Generierung. Wichtig ist, dass sie als Werkzeuge sichtbar bleiben. Sobald ein AI PO Assistant beginnt, eigenständig Tickets zu schreiben, ohne dass ein Mensch sie freigibt, wird aus dem Werkzeug eine Rolle, und die Verantwortungskette bricht.</w:t>
       </w:r>
     </w:p>
     <w:p>
@@ -1375,7 +1375,7 @@
         <w:jc w:val="both"/>
       </w:pPr>
       <w:r>
-        <w:t xml:space="preserve">Das Kanban-Board mit fünf Spalten ist der zentrale Statusträger. Es macht für alle Beteiligten — Menschen wie KI — sichtbar, wo ein Issue gerade steht.</w:t>
+        <w:t xml:space="preserve">Das Kanban-Board mit fünf Spalten ist der zentrale Statusträger. Es macht für alle Beteiligten, Menschen wie KI, sichtbar, wo ein Issue gerade steht.</w:t>
       </w:r>
     </w:p>
     <w:tbl>
@@ -1942,7 +1942,7 @@
         <w:jc w:val="both"/>
       </w:pPr>
       <w:r>
-        <w:t xml:space="preserve">Die Ready-Spalte ist der Kern des Boards. Ein Issue in Ready ist mit allem Notwendigen ausgestattet, um sofort umgesetzt zu werden. Die Bewegung von Backlog nach Ready ist eine bewusste Entscheidung des Menschen — nie eine stillschweigende Verschiebung der KI. Innerhalb der Ready-Spalte gilt eine klare Reihenfolge: aufsteigend nach Issue-Nummer wird abgearbeitet. Diese Konvention spiegelt die Erstellungsreihenfolge und macht Abhängigkeiten von älteren zu neueren Issues transparent.</w:t>
+        <w:t xml:space="preserve">Die Ready-Spalte ist der Kern des Boards. Ein Issue in Ready ist mit allem Notwendigen ausgestattet, um sofort umgesetzt zu werden. Die Bewegung von Backlog nach Ready ist eine bewusste Entscheidung des Menschen, nie eine stillschweigende Verschiebung der KI. Innerhalb der Ready-Spalte gilt eine klare Reihenfolge: aufsteigend nach Issue-Nummer wird abgearbeitet. Diese Konvention spiegelt die Erstellungsreihenfolge und macht Abhängigkeiten von älteren zu neueren Issues transparent.</w:t>
       </w:r>
     </w:p>
     <w:p>
@@ -2034,7 +2034,7 @@
         <w:spacing w:after="80"/>
       </w:pPr>
       <w:r>
-        <w:t xml:space="preserve">Persönliche Memory-Dateien im Workspace des Entwicklers ergänzen das um individuelle Vorlieben — bevorzugte Tools, Sprachpräferenz, persönliche Routinen.</w:t>
+        <w:t xml:space="preserve">Persönliche Memory-Dateien im Workspace der entwickelnden Person ergänzen das um individuelle Vorlieben, bevorzugte Tools, Sprachpräferenz, persönliche Routinen.</w:t>
       </w:r>
     </w:p>
     <w:p>
@@ -2061,16 +2061,16 @@
         <w:jc w:val="both"/>
       </w:pPr>
       <w:r>
-        <w:t xml:space="preserve">Wiederverwendbare Anweisungen an die KI werden im Repository gepflegt — als kleine Dateien oder als Sektionen in den CLAUDE-Dateien. Ein gut gepflegter Prompt für die Erstellung eines neuen Issues, ein Prompt für ein Code-Review, ein Prompt für die Konsolidierung von Memory-Dateien: solche Bausteine sparen Sitzungen ein und sorgen für Konsistenz.</w:t>
-      </w:r>
-    </w:p>
-    <w:p>
-      <w:pPr>
-        <w:spacing w:after="120" w:line="300"/>
-        <w:jc w:val="both"/>
-      </w:pPr>
-      <w:r>
-        <w:t xml:space="preserve">Die Prompt-Bibliothek ist nicht trivial zu pflegen. Sie veraltet schnell, weil sich die Modelle weiterentwickeln und manche Formulierung obsolet wird. Eine regelmäßige Inspektion — etwa monatlich — gehört zur Hygiene.</w:t>
+        <w:t xml:space="preserve">Wiederverwendbare Anweisungen an die KI werden im Repository gepflegt, als kleine Dateien oder als Sektionen in den CLAUDE-Dateien. Ein gut gepflegter Prompt für die Erstellung eines neuen Issues, ein Prompt für ein Code-Review, ein Prompt für die Konsolidierung von Memory-Dateien: solche Bausteine sparen Sitzungen ein und sorgen für Konsistenz.</w:t>
+      </w:r>
+    </w:p>
+    <w:p>
+      <w:pPr>
+        <w:spacing w:after="120" w:line="300"/>
+        <w:jc w:val="both"/>
+      </w:pPr>
+      <w:r>
+        <w:t xml:space="preserve">Die Prompt-Bibliothek ist nicht trivial zu pflegen. Sie veraltet schnell, weil sich die Modelle weiterentwickeln und manche Formulierung obsolet wird. Eine regelmäßige Inspektion, etwa monatlich, gehört zur Hygiene.</w:t>
       </w:r>
     </w:p>
     <w:p>
@@ -2088,7 +2088,7 @@
         <w:jc w:val="both"/>
       </w:pPr>
       <w:r>
-        <w:t xml:space="preserve">Jeder Commit hat einen aussagekräftigen Subject, eine Body-Begründung, einen Bezug zum Issue (typischerweise „Closes #N”) und eine Co-Authored-By-Zeile, wenn die KI substanziell beteiligt war. Diese Konvention ist nicht Selbstzweck — sie macht den Verlauf nachvollziehbar, auch nach Monaten.</w:t>
+        <w:t xml:space="preserve">Jeder Commit hat einen aussagekräftigen Subject, eine Body-Begründung, einen Bezug zum Issue (typischerweise „Closes #N”) und eine Co-Authored-By-Zeile, wenn die KI substanziell beteiligt war. Diese Konvention ist nicht Selbstzweck, sie macht den Verlauf nachvollziehbar, auch nach Monaten.</w:t>
       </w:r>
     </w:p>
     <w:p>
@@ -2867,7 +2867,7 @@
         <w:jc w:val="both"/>
       </w:pPr>
       <w:r>
-        <w:t xml:space="preserve">Die KI nimmt am Daily nicht teil. Das ist keine Bevormundung — es ist eine pragmatische Entscheidung. Das Daily dient der Koordination zwischen Menschen, die Verantwortung tragen. Die KI hat keine eigene Tageslage, kein Gefühl für Stakeholder-Druck, keinen Kalender. Was sie zu wissen braucht, steht in den Issues, im Board, in den CLAUDE-Dateien.</w:t>
+        <w:t xml:space="preserve">Die KI nimmt am Daily nicht teil. Das ist keine Bevormundung, es ist eine pragmatische Entscheidung. Das Daily dient der Koordination zwischen Menschen, die Verantwortung tragen. Die KI hat keine eigene Tageslage, kein Gefühl für Stakeholder-Druck, keinen Kalender. Was sie zu wissen braucht, steht in den Issues, im Board, in den CLAUDE-Dateien.</w:t>
       </w:r>
     </w:p>
     <w:p>
@@ -2885,16 +2885,16 @@
         <w:jc w:val="both"/>
       </w:pPr>
       <w:r>
-        <w:t xml:space="preserve">Issue-Grooming ist kein eigenes Meeting, sondern eine kontinuierliche Tätigkeit. Mindestens einmal pro Tag — typischerweise als Teil der Morgens-Routine — geht der Product Owner durch das Backlog. Welche Issues haben offene Designfragen, die heute geklärt werden können? Welche sind reif, in Ready zu wandern? Welche sind veraltet und sollten geschlossen werden?</w:t>
-      </w:r>
-    </w:p>
-    <w:p>
-      <w:pPr>
-        <w:spacing w:after="120" w:line="300"/>
-        <w:jc w:val="both"/>
-      </w:pPr>
-      <w:r>
-        <w:t xml:space="preserve">Die KI kann beim Grooming sehr nützlich sein: Issues nach Diktat formulieren, Akzeptanzkriterien vorschlagen, Designfragen aufdecken, die nicht offensichtlich sind. Was sie nicht tut, ist die Bewegung nach Ready. Diese Bewegung ist der Moment, in dem ein Issue zum verbindlichen Auftrag wird — und das bleibt menschliche Verantwortung.</w:t>
+        <w:t xml:space="preserve">Issue-Grooming ist kein eigenes Meeting, sondern eine kontinuierliche Tätigkeit. Mindestens einmal pro Tag, typischerweise als Teil der Morgens-Routine, geht der Product Owner durch das Backlog. Welche Issues haben offene Designfragen, die heute geklärt werden können? Welche sind reif, in Ready zu wandern? Welche sind veraltet und sollten geschlossen werden?</w:t>
+      </w:r>
+    </w:p>
+    <w:p>
+      <w:pPr>
+        <w:spacing w:after="120" w:line="300"/>
+        <w:jc w:val="both"/>
+      </w:pPr>
+      <w:r>
+        <w:t xml:space="preserve">Die KI kann beim Grooming sehr nützlich sein: Issues nach Diktat formulieren, Akzeptanzkriterien vorschlagen, Designfragen aufdecken, die nicht offensichtlich sind. Was sie nicht tut, ist die Bewegung nach Ready. Diese Bewegung ist der Moment, in dem ein Issue zum verbindlichen Auftrag wird, und das bleibt menschliche Verantwortung.</w:t>
       </w:r>
     </w:p>
     <w:p>
@@ -2912,7 +2912,7 @@
         <w:jc w:val="both"/>
       </w:pPr>
       <w:r>
-        <w:t xml:space="preserve">Die Implementations-Iteration ist das zentrale Arbeits-Event. Sie beginnt mit einer Trigger-Phrase wie „implementiere alles in Ready” — dem pauschalen GO. Von dort arbeitet die KI Issue für Issue durch, in der Reihenfolge der aufsteigenden Issue-Nummern. Jedes Issue durchläuft die fünf Schritte: Bewegung nach In progress, Implementierung gegen das Issue, lokaler Commit ohne Push, Bewegung nach In review, dann das nächste Issue.</w:t>
+        <w:t xml:space="preserve">Die Implementations-Iteration ist das zentrale Arbeits-Event. Sie beginnt mit einer Trigger-Phrase wie „implementiere alles in Ready”, dem pauschalen GO. Von dort arbeitet die KI Issue für Issue durch, in der Reihenfolge der aufsteigenden Issue-Nummern. Jedes Issue durchläuft die fünf Schritte: Bewegung nach In progress, Implementierung gegen das Issue, lokaler Commit ohne Push, Bewegung nach In review, dann das nächste Issue.</w:t>
       </w:r>
     </w:p>
     <w:p>
@@ -2948,7 +2948,7 @@
         <w:jc w:val="both"/>
       </w:pPr>
       <w:r>
-        <w:t xml:space="preserve">Das Stakeholder-Review ist ein wöchentliches Ereignis, in dem das Team dem Auftraggeber zeigt, was entstanden ist. Es kann auf dem Test-Server stattfinden, auf dem die main-Branch deployed ist. Es ist die Stelle, an der „funktionierende Software über umfassende Dokumentation” konkret wird: nicht ein Slide-Deck wird gezeigt, sondern eine laufende Applikation, in der die letzten Tage Arbeit greifbar sind.</w:t>
+        <w:t xml:space="preserve">Das Stakeholder-Review ist ein wöchentliches Ereignis, in dem das Team der auftraggebenden Person zeigt, was entstanden ist. Es kann auf dem Test-Server stattfinden, auf dem die main-Branch deployed ist. Es ist die Stelle, an der „funktionierende Software über umfassende Dokumentation” konkret wird: nicht ein Slide-Deck wird gezeigt, sondern eine laufende Applikation, in der die letzten Tage Arbeit greifbar sind.</w:t>
       </w:r>
     </w:p>
     <w:p>
@@ -3029,7 +3029,7 @@
         <w:jc w:val="both"/>
       </w:pPr>
       <w:r>
-        <w:t xml:space="preserve">Diese Cadence hat zwei Vorteile. Sie ist überschaubar — ein Mensch kann am Abend ehrlich beurteilen, was am Morgen versprochen wurde. Und sie produziert täglich Output auf dem Test-Server, was Stakeholder-Vertrauen aufbaut. Wer mit weniger Cadence arbeitet, läuft Gefahr, dass die KI im Hintergrund Dinge baut, die niemand mehr nachvollziehen kann.</w:t>
+        <w:t xml:space="preserve">Diese Cadence hat zwei Vorteile. Sie ist überschaubar, ein Mensch kann am Abend ehrlich beurteilen, was am Morgen versprochen wurde. Und sie produziert täglich Output auf dem Test-Server, was Stakeholder-Vertrauen aufbaut. Wer mit weniger Cadence arbeitet, läuft Gefahr, dass die KI im Hintergrund Dinge baut, die niemand mehr nachvollziehen kann.</w:t>
       </w:r>
     </w:p>
     <w:p>
@@ -3047,16 +3047,16 @@
         <w:jc w:val="both"/>
       </w:pPr>
       <w:r>
-        <w:t xml:space="preserve">Schnellere Iterationen — etwa alle vier Stunden — sind möglich, aber nicht für alle Arbeitsarten geeignet. Sie passen zu klar abgegrenzten Mikro-Features, etwa kleinen UI-Verbesserungen oder Bugfixes, bei denen Stakeholder-Feedback unmittelbar einfließen soll. Sie passen, wenn das Team in einem engen Austausch mit dem Auftraggeber steht und mehrfach täglich eine neue Version sehen will.</w:t>
-      </w:r>
-    </w:p>
-    <w:p>
-      <w:pPr>
-        <w:spacing w:after="120" w:line="300"/>
-        <w:jc w:val="both"/>
-      </w:pPr>
-      <w:r>
-        <w:t xml:space="preserve">Sie passen nicht für Architektur-Arbeit. Ein neues Modul, ein größeres Refactoring, eine Schemaerweiterung in der Datenbank — solche Aufgaben brauchen Denkzeit, in der nicht alle vier Stunden ein Zwischenstand erzwungen wird. Wer hier in zu enge Cadences zwingt, bekommt eine Folge halbgarer Pushes, von denen jeder einzeln den Test-Server destabilisiert.</w:t>
+        <w:t xml:space="preserve">Schnellere Iterationen, etwa alle vier Stunden, sind möglich, aber nicht für alle Arbeitsarten geeignet. Sie passen zu klar abgegrenzten Mikro-Features, etwa kleinen UI-Verbesserungen oder Bugfixes, bei denen Stakeholder-Feedback unmittelbar einfließen soll. Sie passen, wenn das Team in einem engen Austausch mit der auftraggebenden Person steht und mehrfach täglich eine neue Version sehen will.</w:t>
+      </w:r>
+    </w:p>
+    <w:p>
+      <w:pPr>
+        <w:spacing w:after="120" w:line="300"/>
+        <w:jc w:val="both"/>
+      </w:pPr>
+      <w:r>
+        <w:t xml:space="preserve">Sie passen nicht für Architektur-Arbeit. Ein neues Modul, ein größeres Refactoring, eine Schemaerweiterung in der Datenbank, solche Aufgaben brauchen Denkzeit, in der nicht alle vier Stunden ein Zwischenstand erzwungen wird. Wer hier in zu enge Cadences zwingt, bekommt eine Folge halbgarer Pushes, von denen jeder einzeln den Test-Server destabilisiert.</w:t>
       </w:r>
     </w:p>
     <w:p>
@@ -3092,7 +3092,7 @@
         <w:jc w:val="both"/>
       </w:pPr>
       <w:r>
-        <w:t xml:space="preserve">Continuous AI ist eine sehr gute Ergänzung — aber kein Ersatz für die menschliche Iteration. Was die Hintergrund-Agenten produzieren, muss reviewbar sein und muss durch dieselbe menschliche Freigabe gehen wie alle anderen Pushes. Wer Continuous AI ohne diese Disziplin einsetzt, läuft Gefahr, dass das Repository sich in eine Richtung entwickelt, die niemand bewusst gewählt hat.</w:t>
+        <w:t xml:space="preserve">Continuous AI ist eine sehr gute Ergänzung, aber kein Ersatz für die menschliche Iteration. Was die Hintergrund-Agenten produzieren, muss reviewbar sein und muss durch dieselbe menschliche Freigabe gehen wie alle anderen Pushes. Wer Continuous AI ohne diese Disziplin einsetzt, läuft Gefahr, dass das Repository sich in eine Richtung entwickelt, die niemand bewusst gewählt hat.</w:t>
       </w:r>
     </w:p>
     <w:p>
@@ -3119,7 +3119,7 @@
         <w:jc w:val="both"/>
       </w:pPr>
       <w:r>
-        <w:t xml:space="preserve">Für KI-augmentierte Entwicklung ist der Flow meist passender. Issues sind kleinteilig, ihre Bearbeitung dauert Stunden statt Tage. Ein Zwei-Wochen-Sprint, der mit dreißig Issues geplant wird, ist eher Bürokratie als Hilfsmittel. Ein Kanban-Board mit Ready-Reihenfolge ist die natürliche Form. Sprints behalten ihren Sinn dort, wo eine externe Cadence sie erzwingt — etwa eine zweiwöchige Release-Vorgabe oder eine fixierte Stakeholder-Review-Cadence.</w:t>
+        <w:t xml:space="preserve">Für KI-augmentierte Entwicklung ist der Flow meist passender. Issues sind kleinteilig, ihre Bearbeitung dauert Stunden statt Tage. Ein Zwei-Wochen-Sprint, der mit dreißig Issues geplant wird, ist eher Bürokratie als Hilfsmittel. Ein Kanban-Board mit Ready-Reihenfolge ist die natürliche Form. Sprints behalten ihren Sinn dort, wo eine externe Cadence sie erzwingt, etwa eine zweiwöchige Release-Vorgabe oder eine fixierte Stakeholder-Review-Cadence.</w:t>
       </w:r>
     </w:p>
     <w:p>
@@ -3146,16 +3146,16 @@
         <w:spacing w:after="100" w:before="180"/>
       </w:pPr>
       <w:r>
-        <w:t xml:space="preserve">Schritt 1 — Anforderungsdefinition</w:t>
-      </w:r>
-    </w:p>
-    <w:p>
-      <w:pPr>
-        <w:spacing w:after="120" w:line="300"/>
-        <w:jc w:val="both"/>
-      </w:pPr>
-      <w:r>
-        <w:t xml:space="preserve">Der Auftraggeber formuliert oder diktiert eine Anforderung. Wenn ein Satz abbricht oder mehrdeutig bleibt, wird nachgefragt, nicht geraten. Output: eine knappe, verständliche Beschreibung dessen, was gebaut werden soll.</w:t>
+        <w:t xml:space="preserve">Schritt 1, Anforderungsdefinition</w:t>
+      </w:r>
+    </w:p>
+    <w:p>
+      <w:pPr>
+        <w:spacing w:after="120" w:line="300"/>
+        <w:jc w:val="both"/>
+      </w:pPr>
+      <w:r>
+        <w:t xml:space="preserve">Die auftraggebende Person formuliert oder diktiert eine Anforderung. Wenn ein Satz abbricht oder mehrdeutig bleibt, wird nachgefragt, nicht geraten. Output: eine knappe, verständliche Beschreibung dessen, was gebaut werden soll.</w:t>
       </w:r>
     </w:p>
     <w:p>
@@ -3164,7 +3164,7 @@
         <w:spacing w:after="100" w:before="180"/>
       </w:pPr>
       <w:r>
-        <w:t xml:space="preserve">Schritt 2 — Plan</w:t>
+        <w:t xml:space="preserve">Schritt 2, Plan</w:t>
       </w:r>
     </w:p>
     <w:p>
@@ -3182,7 +3182,7 @@
         <w:spacing w:after="100" w:before="180"/>
       </w:pPr>
       <w:r>
-        <w:t xml:space="preserve">Schritt 3 — Plan zu Issues</w:t>
+        <w:t xml:space="preserve">Schritt 3, Plan zu Issues</w:t>
       </w:r>
     </w:p>
     <w:p>
@@ -3200,16 +3200,16 @@
         <w:spacing w:after="100" w:before="180"/>
       </w:pPr>
       <w:r>
-        <w:t xml:space="preserve">Schritt 4 — GO</w:t>
-      </w:r>
-    </w:p>
-    <w:p>
-      <w:pPr>
-        <w:spacing w:after="120" w:line="300"/>
-        <w:jc w:val="both"/>
-      </w:pPr>
-      <w:r>
-        <w:t xml:space="preserve">Der Auftraggeber gibt das GO. Bei Kanban-Nutzung geschieht das durch Verschieben des Issues nach Ready. Eine Plan-Akzeptanz allein reicht nicht — das GO ist ein separater, expliziter Schritt. Output: ein freigegebenes Issue.</w:t>
+        <w:t xml:space="preserve">Schritt 4, GO</w:t>
+      </w:r>
+    </w:p>
+    <w:p>
+      <w:pPr>
+        <w:spacing w:after="120" w:line="300"/>
+        <w:jc w:val="both"/>
+      </w:pPr>
+      <w:r>
+        <w:t xml:space="preserve">Die auftraggebende Person gibt das GO. Bei Kanban-Nutzung geschieht das durch Verschieben des Issues nach Ready. Eine Plan-Akzeptanz allein reicht nicht, das GO ist ein separater, expliziter Schritt. Output: ein freigegebenes Issue.</w:t>
       </w:r>
     </w:p>
     <w:p>
@@ -3218,7 +3218,7 @@
         <w:spacing w:after="100" w:before="180"/>
       </w:pPr>
       <w:r>
-        <w:t xml:space="preserve">Schritt 5 — Implementierung</w:t>
+        <w:t xml:space="preserve">Schritt 5, Implementierung</w:t>
       </w:r>
     </w:p>
     <w:p>
@@ -3236,16 +3236,16 @@
         <w:spacing w:after="100" w:before="180"/>
       </w:pPr>
       <w:r>
-        <w:t xml:space="preserve">Schritt 6 — Lokale Prüfung</w:t>
-      </w:r>
-    </w:p>
-    <w:p>
-      <w:pPr>
-        <w:spacing w:after="120" w:line="300"/>
-        <w:jc w:val="both"/>
-      </w:pPr>
-      <w:r>
-        <w:t xml:space="preserve">Tests laufen grün — Unit, Slice, Integration. Builds laufen grün — Backend und Frontend. Bei UI-Änderungen wird der Dev-Server gestartet und das Feature im Browser durchgeklickt. Coverage- und Mutationsschwellen werden erreicht. Output: eine grüne Pflicht-Check-Liste.</w:t>
+        <w:t xml:space="preserve">Schritt 6, Lokale Prüfung</w:t>
+      </w:r>
+    </w:p>
+    <w:p>
+      <w:pPr>
+        <w:spacing w:after="120" w:line="300"/>
+        <w:jc w:val="both"/>
+      </w:pPr>
+      <w:r>
+        <w:t xml:space="preserve">Tests laufen grün, Unit, Slice, Integration. Builds laufen grün, Backend und Frontend. Bei UI-Änderungen wird der Dev-Server gestartet und das Feature im Browser durchgeklickt. Coverage- und Mutationsschwellen werden erreicht. Output: eine grüne Pflicht-Check-Liste.</w:t>
       </w:r>
     </w:p>
     <w:p>
@@ -3254,7 +3254,7 @@
         <w:spacing w:after="100" w:before="180"/>
       </w:pPr>
       <w:r>
-        <w:t xml:space="preserve">Schritt 7 — Code-Review durch zweites Modell</w:t>
+        <w:t xml:space="preserve">Schritt 7, Code-Review durch zweites Modell</w:t>
       </w:r>
     </w:p>
     <w:p>
@@ -3272,16 +3272,16 @@
         <w:spacing w:after="100" w:before="180"/>
       </w:pPr>
       <w:r>
-        <w:t xml:space="preserve">Schritt 8 — Push</w:t>
-      </w:r>
-    </w:p>
-    <w:p>
-      <w:pPr>
-        <w:spacing w:after="120" w:line="300"/>
-        <w:jc w:val="both"/>
-      </w:pPr>
-      <w:r>
-        <w:t xml:space="preserve">Der Auftraggeber sagt „push main”. Die KI pusht — den aktuellen Commit-Batch, nicht mehr. Eine frühere Push-Freigabe in derselben Session gilt nicht für neue Commits. Output: ein neuer Stand auf origin/main.</w:t>
+        <w:t xml:space="preserve">Schritt 8, Push</w:t>
+      </w:r>
+    </w:p>
+    <w:p>
+      <w:pPr>
+        <w:spacing w:after="120" w:line="300"/>
+        <w:jc w:val="both"/>
+      </w:pPr>
+      <w:r>
+        <w:t xml:space="preserve">Die auftraggebende Person sagt „push main”. Die KI pusht, den aktuellen Commit-Batch, nicht mehr. Eine frühere Push-Freigabe in derselben Session gilt nicht für neue Commits. Output: ein neuer Stand auf origin/main.</w:t>
       </w:r>
     </w:p>
     <w:p>
@@ -3290,16 +3290,16 @@
         <w:spacing w:after="100" w:before="180"/>
       </w:pPr>
       <w:r>
-        <w:t xml:space="preserve">Schritt 9 — Deployment und Pull Request</w:t>
-      </w:r>
-    </w:p>
-    <w:p>
-      <w:pPr>
-        <w:spacing w:after="120" w:line="300"/>
-        <w:jc w:val="both"/>
-      </w:pPr>
-      <w:r>
-        <w:t xml:space="preserve">Der Test-Server zieht main automatisch. Der Auftraggeber prüft auf dem Server. Wenn die Prüfung erfolgreich ist, wird ein PR von main nach production erstellt — entweder vom Auftraggeber direkt oder nach einer expliziten Trigger-Phrase „merge production” durch die KI. Der PR wird vom Auftraggeber gemerged. Output: ein Release in Produktion.</w:t>
+        <w:t xml:space="preserve">Schritt 9, Deployment und Pull Request</w:t>
+      </w:r>
+    </w:p>
+    <w:p>
+      <w:pPr>
+        <w:spacing w:after="120" w:line="300"/>
+        <w:jc w:val="both"/>
+      </w:pPr>
+      <w:r>
+        <w:t xml:space="preserve">Der Test-Server zieht main automatisch. Die auftraggebende Person prüft auf dem Server. Wenn die Prüfung erfolgreich ist, wird ein PR von main nach production erstellt, entweder direkt oder nach einer expliziten Trigger-Phrase „merge production” durch die KI. Der PR wird durch die auftraggebende Person gemerged. Output: ein Release in Produktion.</w:t>
       </w:r>
     </w:p>
     <w:p>
@@ -3344,7 +3344,7 @@
         <w:jc w:val="both"/>
       </w:pPr>
       <w:r>
-        <w:t xml:space="preserve">Test-First mit KI ist nicht langsamer — es ist die einzige Möglichkeit, das KI-Tempo verantwortbar zu nutzen. Tests sind die Stelle, an der das Modell an die Realität gebunden wird.</w:t>
+        <w:t xml:space="preserve">Test-First mit KI ist nicht langsamer, es ist die einzige Möglichkeit, das KI-Tempo verantwortbar zu nutzen. Tests sind die Stelle, an der das Modell an die Realität gebunden wird.</w:t>
       </w:r>
     </w:p>
     <w:p>
@@ -3362,16 +3362,16 @@
         <w:jc w:val="both"/>
       </w:pPr>
       <w:r>
-        <w:t xml:space="preserve">Ein Modell ist seiner eigenen Lösung gegenüber unkritisch. Es hat die Lösung soeben selbst formuliert; es würde dieselben Vereinfachungen jetzt nochmal vornehmen. Ein zweites Modell — mit anderer Architektur, anderem Trainingskorpus, anderen Eigenheiten — bringt einen frischen Blick. Es findet andere Fehler. Es macht andere Vorschläge.</w:t>
-      </w:r>
-    </w:p>
-    <w:p>
-      <w:pPr>
-        <w:spacing w:after="120" w:line="300"/>
-        <w:jc w:val="both"/>
-      </w:pPr>
-      <w:r>
-        <w:t xml:space="preserve">Praktisch heißt das: wenn das implementierende Modell Claude ist, reviewt OpenAI Codex (oder ein vergleichbares Tool). Wenn das implementierende Modell GPT ist, reviewt Claude. Der Effekt ist messbar — die Fehlerrate sinkt deutlich.</w:t>
+        <w:t xml:space="preserve">Ein Modell ist seiner eigenen Lösung gegenüber unkritisch. Es hat die Lösung soeben selbst formuliert; es würde dieselben Vereinfachungen jetzt nochmal vornehmen. Ein zweites Modell, mit anderer Architektur, anderem Trainingskorpus, anderen Eigenheiten, bringt einen frischen Blick. Es findet andere Fehler. Es macht andere Vorschläge.</w:t>
+      </w:r>
+    </w:p>
+    <w:p>
+      <w:pPr>
+        <w:spacing w:after="120" w:line="300"/>
+        <w:jc w:val="both"/>
+      </w:pPr>
+      <w:r>
+        <w:t xml:space="preserve">Praktisch heißt das: wenn das implementierende Modell Claude ist, reviewt OpenAI Codex (oder ein vergleichbares Tool). Wenn das implementierende Modell GPT ist, reviewt Claude. Der Effekt ist messbar, die Fehlerrate sinkt deutlich.</w:t>
       </w:r>
     </w:p>
     <w:p>
@@ -3428,7 +3428,7 @@
         <w:spacing w:after="80"/>
       </w:pPr>
       <w:r>
-        <w:t xml:space="preserve">ArchUnit-Tests: grün — die Architektur-Regeln werden eingehalten.</w:t>
+        <w:t xml:space="preserve">ArchUnit-Tests: grün, die Architektur-Regeln werden eingehalten.</w:t>
       </w:r>
     </w:p>
     <w:p>
@@ -3498,7 +3498,7 @@
         <w:spacing w:after="80"/>
       </w:pPr>
       <w:r>
-        <w:t xml:space="preserve">Keine Secrets im Diff — keine API-Keys, keine Passwörter, keine privaten Zertifikate.</w:t>
+        <w:t xml:space="preserve">Keine Secrets im Diff, keine API-Keys, keine Passwörter, keine privaten Zertifikate.</w:t>
       </w:r>
     </w:p>
     <w:p>
@@ -3568,16 +3568,16 @@
         <w:jc w:val="both"/>
       </w:pPr>
       <w:r>
-        <w:t xml:space="preserve">Die KI kann viel — sie kann nicht im Browser klicken. Bei jeder Frontend-Änderung gehört eine manuelle Verifikation in das Schritt-6-Pflichtset. Der Dev-Server wird gestartet, das Feature wird durchgeklickt, der Golden Path und mindestens ein Edge Case werden geprüft.</w:t>
-      </w:r>
-    </w:p>
-    <w:p>
-      <w:pPr>
-        <w:spacing w:after="120" w:line="300"/>
-        <w:jc w:val="both"/>
-      </w:pPr>
-      <w:r>
-        <w:t xml:space="preserve">Wenn diese Verifikation nicht möglich ist — kein Docker-Daemon, kein lokaler Build erreichbar — wird das im Abschlussbericht explizit vermerkt. Es ist keine Schande, einen Schritt nicht ausführen zu können; es ist eine Schande, dies zu verschweigen.</w:t>
+        <w:t xml:space="preserve">Die KI kann viel, sie kann nicht im Browser klicken. Bei jeder Frontend-Änderung gehört eine manuelle Verifikation in das Schritt-6-Pflichtset. Der Dev-Server wird gestartet, das Feature wird durchgeklickt, der Golden Path und mindestens ein Edge Case werden geprüft.</w:t>
+      </w:r>
+    </w:p>
+    <w:p>
+      <w:pPr>
+        <w:spacing w:after="120" w:line="300"/>
+        <w:jc w:val="both"/>
+      </w:pPr>
+      <w:r>
+        <w:t xml:space="preserve">Wenn diese Verifikation nicht möglich ist, kein Docker-Daemon, kein lokaler Build erreichbar, wird das im Abschlussbericht explizit vermerkt. Es ist keine Schande, einen Schritt nicht ausführen zu können; es ist eine Schande, dies zu verschweigen.</w:t>
       </w:r>
     </w:p>
     <w:p>
@@ -3613,7 +3613,7 @@
         <w:jc w:val="both"/>
       </w:pPr>
       <w:r>
-        <w:t xml:space="preserve">Die häufigste Verletzung. Ein Plan wird akzeptiert; die KI interpretiert das als Implementierungsfreigabe und beginnt zu coden. Plan-Approval ist Schritt 2 des Prozesses, GO ist Schritt 4. Sie sind nicht dasselbe. Die Trennung ist die zentrale Sicherheitsschwelle — wer sie aufweicht, kann den ganzen Rest auch streichen.</w:t>
+        <w:t xml:space="preserve">Die häufigste Verletzung. Ein Plan wird akzeptiert; die KI interpretiert das als Implementierungsfreigabe und beginnt zu coden. Plan-Approval ist Schritt 2 des Prozesses, GO ist Schritt 4. Sie sind nicht dasselbe. Die Trennung ist die zentrale Sicherheitsschwelle, wer sie aufweicht, kann den ganzen Rest auch streichen.</w:t>
       </w:r>
     </w:p>
     <w:p>
@@ -3649,7 +3649,7 @@
         <w:jc w:val="both"/>
       </w:pPr>
       <w:r>
-        <w:t xml:space="preserve">Sie folgen nicht. Was später erledigt werden soll, wird nicht erledigt. Wer Test-First aufschiebt, hat im Endeffekt Test-Never. Wer Geschwindigkeit gewinnen will, muss früh investieren — der Test ist die billigste Versicherung gegen Regressionen.</w:t>
+        <w:t xml:space="preserve">Sie folgen nicht. Was später erledigt werden soll, wird nicht erledigt. Wer Test-First aufschiebt, hat im Endeffekt Test-Never. Wer Geschwindigkeit gewinnen will, muss früh investieren, der Test ist die billigste Versicherung gegen Regressionen.</w:t>
       </w:r>
     </w:p>
     <w:p>
@@ -3667,7 +3667,7 @@
         <w:jc w:val="both"/>
       </w:pPr>
       <w:r>
-        <w:t xml:space="preserve">Coverage ist ein Stellvertreterwert. Sie zeigt, ob ein Test über jede Code-Zeile gelaufen ist — nicht, ob der Test diesen Code wirklich geprüft hat. Mutation Testing schließt diese Lücke. 98 Prozent Coverage mit 70 Prozent Mutation Score ist schlechter als 95 Prozent Coverage mit 98 Prozent Mutation Score. 100 Prozent oder begründeter Ausschluss ist die einzige sinnvolle Linie.</w:t>
+        <w:t xml:space="preserve">Coverage ist ein Stellvertreterwert. Sie zeigt, ob ein Test über jede Code-Zeile gelaufen ist, nicht, ob der Test diesen Code wirklich geprüft hat. Mutation Testing schließt diese Lücke. 98 Prozent Coverage mit 70 Prozent Mutation Score ist schlechter als 95 Prozent Coverage mit 98 Prozent Mutation Score. 100 Prozent oder begründeter Ausschluss ist die einzige sinnvolle Linie.</w:t>
       </w:r>
     </w:p>
     <w:p>
@@ -3739,7 +3739,7 @@
         <w:jc w:val="both"/>
       </w:pPr>
       <w:r>
-        <w:t xml:space="preserve">Continuous AI ist sehr verlockend — Agenten arbeiten nachts, das Repository entwickelt sich von selbst weiter. Was fehlt, sind Stop-Punkte. Wer einen Hintergrund-Agenten startet, der für jedes neue Issue eigenständig einen Branch öffnet, Code schreibt, Tests grün macht und einen PR aufmacht, verliert die menschliche Kontrolle. Stop-Punkte sind keine Bequemlichkeitseinschränkung, sondern Strukturelement.</w:t>
+        <w:t xml:space="preserve">Continuous AI ist sehr verlockend, Agenten arbeiten nachts, das Repository entwickelt sich von selbst weiter. Was fehlt, sind Stop-Punkte. Wer einen Hintergrund-Agenten startet, der für jedes neue Issue eigenständig einen Branch öffnet, Code schreibt, Tests grün macht und einen PR aufmacht, verliert die menschliche Kontrolle. Stop-Punkte sind keine Bequemlichkeitseinschränkung, sondern Strukturelement.</w:t>
       </w:r>
     </w:p>
     <w:p>
@@ -3757,7 +3757,7 @@
         <w:jc w:val="both"/>
       </w:pPr>
       <w:r>
-        <w:t xml:space="preserve">Wer den Prozess in einem neuen Team einführen will, kann das an einem Vormittag tun. Die folgende Bootstrapping-Checkliste ist die Minimalausstattung. Vieles davon ist nicht spektakulär — aber es macht den Unterschied zwischen einem Team, das mit KI arbeitet, und einem Team, das von der KI bearbeitet wird.</w:t>
+        <w:t xml:space="preserve">Wer den Prozess in einem neuen Team einführen will, kann das an einem Vormittag tun. Die folgende Bootstrapping-Checkliste ist die Minimalausstattung. Vieles davon ist nicht spektakulär, aber es macht den Unterschied zwischen einem Team, das mit KI arbeitet, und einem Team, das von der KI bearbeitet wird.</w:t>
       </w:r>
     </w:p>
     <w:p>
@@ -3779,7 +3779,7 @@
         <w:spacing w:after="80"/>
       </w:pPr>
       <w:r>
-        <w:t xml:space="preserve">CLAUDE.md als zentrale Projekt-Doku — was tut das Projekt, welche Standards gelten.</w:t>
+        <w:t xml:space="preserve">CLAUDE.md als zentrale Projekt-Doku, was tut das Projekt, welche Standards gelten.</w:t>
       </w:r>
     </w:p>
     <w:p>
@@ -3805,7 +3805,7 @@
         <w:spacing w:after="80"/>
       </w:pPr>
       <w:r>
-        <w:t xml:space="preserve">Tech-spezifische Dateien je nach Stack — CLAUDE-java.md, CLAUDE-react.md, CLAUDE-python.md.</w:t>
+        <w:t xml:space="preserve">Tech-spezifische Dateien je nach Stack, CLAUDE-java.md, CLAUDE-react.md, CLAUDE-python.md.</w:t>
       </w:r>
     </w:p>
     <w:p>
@@ -3881,7 +3881,7 @@
         <w:jc w:val="both"/>
       </w:pPr>
       <w:r>
-        <w:t xml:space="preserve">Das erste Issue in einem neuen Projekt sollte das Setup der genannten Konventionen sein. Klingt rekursiv — ist es auch. Es ist gleichzeitig der erste Praxis-Test des Prozesses: Plan, Issue, GO, Implementierung, Review, Push. Wer hier durchläuft, kennt den Prozess vom ersten Tag an.</w:t>
+        <w:t xml:space="preserve">Das erste Issue in einem neuen Projekt sollte das Setup der genannten Konventionen sein. Klingt rekursiv, ist es auch. Es ist gleichzeitig der erste Praxis-Test des Prozesses: Plan, Issue, GO, Implementierung, Review, Push. Wer hier durchläuft, kennt den Prozess vom ersten Tag an.</w:t>
       </w:r>
     </w:p>
     <w:p>
@@ -3953,7 +3953,7 @@
         <w:footnoteReference w:id="3"/>
       </w:r>
       <w:r>
-        <w:t xml:space="preserve"> beschreibt. Ein Planning-Agent, ein Coding-Agent, ein Testing-Agent, ein Documentation-Agent — orchestriert von einem menschlichen Operator. Der hier formulierte Prozess ist auch in einer solchen Welt anwendbar; er muss nur in einigen Rollen anders besetzt werden.</w:t>
+        <w:t xml:space="preserve"> beschreibt. Ein Planning-Agent, ein Coding-Agent, ein Testing-Agent, ein Documentation-Agent, orchestriert von einer menschlichen orchestrierenden Person. Der hier formulierte Prozess ist auch in einer solchen Welt anwendbar; er muss nur in einigen Rollen anders besetzt werden.</w:t>
       </w:r>
     </w:p>
     <w:p>
@@ -3998,7 +3998,7 @@
         <w:jc w:val="both"/>
       </w:pPr>
       <w:r>
-        <w:t xml:space="preserve">Die Grundregel bleibt: je autonomer die KI, desto strenger müssen die menschlichen Kontrollpunkte sein. Wer das vergisst, baut Software, die niemand verantwortet — und niemand verantwortete Software hat eine Lebenserwartung, die in Wochen zu rechnen ist.</w:t>
+        <w:t xml:space="preserve">Die Grundregel bleibt: je autonomer die KI, desto strenger müssen die menschlichen Kontrollpunkte sein. Wer das vergisst, baut Software, die niemand verantwortet, und niemand verantwortete Software hat eine Lebenserwartung, die in Wochen zu rechnen ist.</w:t>
       </w:r>
     </w:p>
     <w:p>
@@ -4016,7 +4016,7 @@
         <w:jc w:val="both"/>
       </w:pPr>
       <w:r>
-        <w:t xml:space="preserve">Der hier beschriebene Prozess ist nicht theoretisch. Er wird in einem konkreten Projekt gelebt, das im Folgenden als Fallstudie skizziert ist. Das Projekt ist überschaubar — ein Einzel-Entwickler mit KI-Pair — und damit eine gute Testumgebung für den Prozess. Wo der Prozess in einem solchen Setup nicht hält, hält er in größeren Setups erst recht nicht.</w:t>
+        <w:t xml:space="preserve">Der hier beschriebene Prozess ist nicht theoretisch. Er wird in einem konkreten Projekt gelebt, das im Folgenden als Fallstudie skizziert ist. Das Projekt ist überschaubar, eine einzelne entwickelnde Person mit KI-Pair, und damit eine gute Testumgebung für den Prozess. Wo der Prozess in einem solchen Setup nicht hält, hält er in größeren Setups erst recht nicht.</w:t>
       </w:r>
     </w:p>
     <w:p>
@@ -4043,7 +4043,7 @@
         <w:jc w:val="both"/>
       </w:pPr>
       <w:r>
-        <w:t xml:space="preserve">Der Stack besteht aus drei Komponenten. Ein Java-21-Spring-Boot-Backend liefert die REST-API und stellt das gebaute Frontend aus. Ein React-Frontend (Vite, TypeScript, MUI) bietet die Bedienoberfläche. Ein FastAPI-basierter Python-Service (python-tools) kapselt die schweren Bildverarbeitungs-Abhängigkeiten — Pillow, rembg mit Numba-JIT, colorthief. Spring proxyt die Anfragen an den Python-Service über HTTP/1.1.</w:t>
+        <w:t xml:space="preserve">Der Stack besteht aus drei Komponenten. Ein Java-21-Spring-Boot-Backend liefert die REST-API und stellt das gebaute Frontend aus. Ein React-Frontend (Vite, TypeScript, MUI) bietet die Bedienoberfläche. Ein FastAPI-basierter Python-Service (python-tools) kapselt die schweren Bildverarbeitungs-Abhängigkeiten, Pillow, rembg mit Numba-JIT, colorthief. Spring proxyt die Anfragen an den Python-Service über HTTP/1.1.</w:t>
       </w:r>
     </w:p>
     <w:p>
@@ -4061,16 +4061,16 @@
         <w:jc w:val="both"/>
       </w:pPr>
       <w:r>
-        <w:t xml:space="preserve">Das Projekt nutzt ein GitHub-Project-Board mit den fünf Standard-Spalten. Memory-Dateien im persönlichen Workspace tragen die nicht-projekt-spezifischen Konventionen — Sprach-Präferenz, Branch-Politik, Detail-Vorlieben. CLAUDE.md im Repo-Root beschreibt das Projekt selbst; CLAUDE-workflow.md enthält die 9-Schritt-Anleitung mit der Kanban-Sektion; CLAUDE-java.md, CLAUDE-react.md und CLAUDE-security.md ergänzen die Tech-Konventionen.</w:t>
-      </w:r>
-    </w:p>
-    <w:p>
-      <w:pPr>
-        <w:spacing w:after="120" w:line="300"/>
-        <w:jc w:val="both"/>
-      </w:pPr>
-      <w:r>
-        <w:t xml:space="preserve">Die Trigger-Phrasen sind etabliert: „push main” für den Push auf origin/main, „merge production” für den PR-Trigger von main nach production. Ein Push erfolgt nie ohne diese Phrase — selbst dann nicht, wenn das aktuelle Issue „eigentlich trivial” ist. Die Ready-Reihenfolge im Board ist aufsteigend nach Issue-Nummer; das macht Abhängigkeiten transparent und verhindert, dass die KI selbständig Prioritäten setzt.</w:t>
+        <w:t xml:space="preserve">Das Projekt nutzt ein GitHub-Project-Board mit den fünf Standard-Spalten. Memory-Dateien im persönlichen Workspace tragen die nicht-projekt-spezifischen Konventionen, Sprach-Präferenz, Branch-Politik, Detail-Vorlieben. CLAUDE.md im Repo-Root beschreibt das Projekt selbst; CLAUDE-workflow.md enthält die 9-Schritt-Anleitung mit der Kanban-Sektion; CLAUDE-java.md, CLAUDE-react.md und CLAUDE-security.md ergänzen die Tech-Konventionen.</w:t>
+      </w:r>
+    </w:p>
+    <w:p>
+      <w:pPr>
+        <w:spacing w:after="120" w:line="300"/>
+        <w:jc w:val="both"/>
+      </w:pPr>
+      <w:r>
+        <w:t xml:space="preserve">Die Trigger-Phrasen sind etabliert: „push main” für den Push auf origin/main, „merge production” für den PR-Trigger von main nach production. Ein Push erfolgt nie ohne diese Phrase, selbst dann nicht, wenn das aktuelle Issue „eigentlich trivial” ist. Die Ready-Reihenfolge im Board ist aufsteigend nach Issue-Nummer; das macht Abhängigkeiten transparent und verhindert, dass die KI selbständig Prioritäten setzt.</w:t>
       </w:r>
     </w:p>
     <w:p>
@@ -4088,25 +4088,25 @@
         <w:jc w:val="both"/>
       </w:pPr>
       <w:r>
-        <w:t xml:space="preserve">Zwei Issues zeigen den Prozess in der Praxis. Issue #33 betrifft eine Navigationsänderung: das linke Menü soll Tool-Gruppen erhalten — „Bildverarbeitung” und „Nützliche Tools” — statt einer flachen Liste. Issue #34 ist ein neues Tool: ein Passwortgenerator, der im Browser ein Passwort erzeugt und einen bcrypt-Hash dazu liefert, mit konfigurierbarer Länge und Sonderzeichen-Auswahl.</w:t>
-      </w:r>
-    </w:p>
-    <w:p>
-      <w:pPr>
-        <w:spacing w:after="120" w:line="300"/>
-        <w:jc w:val="both"/>
-      </w:pPr>
-      <w:r>
-        <w:t xml:space="preserve">Der Prozess wurde wie folgt durchlaufen. Zunächst diktierte der Auftraggeber die Anforderungen — auf Issue #34 wurde die Frage Frontend-only versus Backend-Service kurz diskutiert; die Entscheidung fiel zugunsten Frontend-only mit dem Sicherheitsargument, dass ein generiertes Passwort das Gerät nicht verlassen sollte. Beide Issues wurden mit kleinteiligen Akzeptanzkriterien formuliert; offene Designfragen wurden vor der Freigabe nach Ready beantwortet.</w:t>
-      </w:r>
-    </w:p>
-    <w:p>
-      <w:pPr>
-        <w:spacing w:after="120" w:line="300"/>
-        <w:jc w:val="both"/>
-      </w:pPr>
-      <w:r>
-        <w:t xml:space="preserve">Beide Issues wurden anschließend in einer Sitzung nach Ready gezogen. Die Ready-Reihenfolge — #33 vor #34 — bedeutet, dass die Menüstruktur (mit einem Link auf /tools/password) vor der eigentlichen Seite implementiert wird. Zwischen den beiden Commits ist die /tools/password-Route kurzzeitig leer — das ist akzeptabel, weil beide Issues in derselben Iteration abgearbeitet werden und nichts zwischendurch gepusht wird.</w:t>
+        <w:t xml:space="preserve">Zwei Issues zeigen den Prozess in der Praxis. Issue #33 betrifft eine Navigationsänderung: das linke Menü soll Tool-Gruppen erhalten, „Bildverarbeitung” und „Nützliche Tools”, statt einer flachen Liste. Issue #34 ist ein neues Tool: ein Passwortgenerator, der im Browser ein Passwort erzeugt und einen bcrypt-Hash dazu liefert, mit konfigurierbarer Länge und Sonderzeichen-Auswahl.</w:t>
+      </w:r>
+    </w:p>
+    <w:p>
+      <w:pPr>
+        <w:spacing w:after="120" w:line="300"/>
+        <w:jc w:val="both"/>
+      </w:pPr>
+      <w:r>
+        <w:t xml:space="preserve">Der Prozess wurde wie folgt durchlaufen. Zunächst diktierte die auftraggebende Person die Anforderungen, auf Issue #34 wurde die Frage Frontend-only versus Backend-Service kurz diskutiert; die Entscheidung fiel zugunsten Frontend-only mit dem Sicherheitsargument, dass ein generiertes Passwort das Gerät nicht verlassen sollte. Beide Issues wurden mit kleinteiligen Akzeptanzkriterien formuliert; offene Designfragen wurden vor der Freigabe nach Ready beantwortet.</w:t>
+      </w:r>
+    </w:p>
+    <w:p>
+      <w:pPr>
+        <w:spacing w:after="120" w:line="300"/>
+        <w:jc w:val="both"/>
+      </w:pPr>
+      <w:r>
+        <w:t xml:space="preserve">Beide Issues wurden anschließend in einer Sitzung nach Ready gezogen. Die Ready-Reihenfolge, #33 vor #34, bedeutet, dass die Menüstruktur (mit einem Link auf /tools/password) vor der eigentlichen Seite implementiert wird. Zwischen den beiden Commits ist die /tools/password-Route kurzzeitig leer, das ist akzeptabel, weil beide Issues in derselben Iteration abgearbeitet werden und nichts zwischendurch gepusht wird.</w:t>
       </w:r>
     </w:p>
     <w:p>
@@ -4133,25 +4133,25 @@
         <w:jc w:val="both"/>
       </w:pPr>
       <w:r>
-        <w:t xml:space="preserve">Erstens: die Trennung von Plan-Approval und Implementierungs-GO ist nicht nur eine theoretische Schutzschicht. Es gab konkrete Fälle, in denen die KI nach einer Plan-Zustimmung losgelegt hätte — die explizite Wartezeit hat ein Issue mit unentschiedener Architektur-Entscheidung vor einer unnötigen Implementierung bewahrt.</w:t>
-      </w:r>
-    </w:p>
-    <w:p>
-      <w:pPr>
-        <w:spacing w:after="120" w:line="300"/>
-        <w:jc w:val="both"/>
-      </w:pPr>
-      <w:r>
-        <w:t xml:space="preserve">Zweitens: die Done-Spalte des Boards ist eine Versuchung. Es ist naheliegend, ein Issue, das in Done liegt, als „push-bereit” zu interpretieren. Die explizite Regel — Done ist ein UI-Signal, kein Push-Trigger — hat einen Push verhindert, der ohne sie passiert wäre.</w:t>
-      </w:r>
-    </w:p>
-    <w:p>
-      <w:pPr>
-        <w:spacing w:after="120" w:line="300"/>
-        <w:jc w:val="both"/>
-      </w:pPr>
-      <w:r>
-        <w:t xml:space="preserve">Drittens: Memory-Konsolidierung lohnt sich. Memory-Dateien, die seit mehreren Wochen nicht angepasst worden waren, enthielten Verweise auf Issue-Nummern, die nicht mehr existierten, und Workflow-Regeln, die durch das Kanban-Board überholt waren. Eine knappe Stunde Konsolidierung — Verweise aktualisieren, veraltete Einträge streichen, neue Konventionen ergänzen — hat die Folge-Sessions deutlich präziser gemacht.</w:t>
+        <w:t xml:space="preserve">Erstens: die Trennung von Plan-Approval und Implementierungs-GO ist nicht nur eine theoretische Schutzschicht. Es gab konkrete Fälle, in denen die KI nach einer Plan-Zustimmung losgelegt hätte, die explizite Wartezeit hat ein Issue mit unentschiedener Architektur-Entscheidung vor einer unnötigen Implementierung bewahrt.</w:t>
+      </w:r>
+    </w:p>
+    <w:p>
+      <w:pPr>
+        <w:spacing w:after="120" w:line="300"/>
+        <w:jc w:val="both"/>
+      </w:pPr>
+      <w:r>
+        <w:t xml:space="preserve">Zweitens: die Done-Spalte des Boards ist eine Versuchung. Es ist naheliegend, ein Issue, das in Done liegt, als „push-bereit” zu interpretieren. Die explizite Regel, Done ist ein UI-Signal, kein Push-Trigger, hat einen Push verhindert, der ohne sie passiert wäre.</w:t>
+      </w:r>
+    </w:p>
+    <w:p>
+      <w:pPr>
+        <w:spacing w:after="120" w:line="300"/>
+        <w:jc w:val="both"/>
+      </w:pPr>
+      <w:r>
+        <w:t xml:space="preserve">Drittens: Memory-Konsolidierung lohnt sich. Memory-Dateien, die seit mehreren Wochen nicht angepasst worden waren, enthielten Verweise auf Issue-Nummern, die nicht mehr existierten, und Workflow-Regeln, die durch das Kanban-Board überholt waren. Eine knappe Stunde Konsolidierung, Verweise aktualisieren, veraltete Einträge streichen, neue Konventionen ergänzen, hat die Folge-Sessions deutlich präziser gemacht.</w:t>
       </w:r>
     </w:p>
     <w:p>
@@ -4207,7 +4207,7 @@
       <w:r>
         <w:t xml:space="preserve">[2] „The AI-Native Software Development Lifecycle: A Theoretical and Practical New Methodology”, arXiv-Preprint 2408.03416. </w:t>
       </w:r>
-      <w:hyperlink w:history="1" r:id="rIdpkn8dajsorzcbrvhmf-ua">
+      <w:hyperlink w:history="1" r:id="rIdfrhql2gbrt8aczfhh_lfw">
         <w:r>
           <w:rPr>
             <w:rStyle w:val="Hyperlink"/>
@@ -4228,7 +4228,7 @@
       <w:r>
         <w:t xml:space="preserve">[3] „Agentsway: Software Development Methodology for AI Agents-based Teams”, arXiv-Preprint 2510.23664. </w:t>
       </w:r>
-      <w:hyperlink w:history="1" r:id="rId5o3cuanycpvbvtb4jmutp">
+      <w:hyperlink w:history="1" r:id="rIdg_q3yxvnlfzqw2msh0eq3">
         <w:r>
           <w:rPr>
             <w:rStyle w:val="Hyperlink"/>
@@ -4249,7 +4249,7 @@
       <w:r>
         <w:t xml:space="preserve">[4] „AI and Agile Software Development: A Research Roadmap from the XP2025 Workshop”, arXiv-Preprint 2508.20563. </w:t>
       </w:r>
-      <w:hyperlink w:history="1" r:id="rIdneerinizp5sluwlija358">
+      <w:hyperlink w:history="1" r:id="rIdvwquaxss7tm1qsdmomgkl">
         <w:r>
           <w:rPr>
             <w:rStyle w:val="Hyperlink"/>
@@ -4270,7 +4270,7 @@
       <w:r>
         <w:t xml:space="preserve">[5] „Continuous AI in practice: What developers can automate today with agentic CI”, GitHub Blog. </w:t>
       </w:r>
-      <w:hyperlink w:history="1" r:id="rIdzb0fsvw88idmdpblnoqsb">
+      <w:hyperlink w:history="1" r:id="rId8sajblfw9uagw-7ulhvkg">
         <w:r>
           <w:rPr>
             <w:rStyle w:val="Hyperlink"/>
@@ -4289,9 +4289,9 @@
         <w:spacing w:after="80"/>
       </w:pPr>
       <w:r>
-        <w:t xml:space="preserve">[6] Wolff, Manfred: „Wie ich mit KI arbeite — mein Workflow vom Gedanken bis zur Produktion”, Blog mwolff.org. </w:t>
-      </w:r>
-      <w:hyperlink w:history="1" r:id="rIdk0g-g1mx3jkix5rpd74oc">
+        <w:t xml:space="preserve">[6] Wolff, Manfred: „Wie ich mit KI arbeite, mein Workflow vom Gedanken bis zur Produktion”, Blog mwolff.org. </w:t>
+      </w:r>
+      <w:hyperlink w:history="1" r:id="rId3dzmvifbpppqnrwmtklcf">
         <w:r>
           <w:rPr>
             <w:rStyle w:val="Hyperlink"/>
@@ -4322,7 +4322,7 @@
       <w:r>
         <w:t xml:space="preserve">, 2001. </w:t>
       </w:r>
-      <w:hyperlink w:history="1" r:id="rIdpdrt4rhh6vxeveaqnx_ti">
+      <w:hyperlink w:history="1" r:id="rIdnk3clh2iy-ofdhmq7lb6s">
         <w:r>
           <w:rPr>
             <w:rStyle w:val="Hyperlink"/>
@@ -4445,7 +4445,17 @@
         <w:footnoteRef/>
       </w:r>
       <w:r>
-        <w:t xml:space="preserve">PMI und Agile Alliance: Manifesto for Enterprise Agility, 2026.</w:t>
+        <w:t xml:space="preserve">PMI und Agile Alliance: </w:t>
+      </w:r>
+      <w:r>
+        <w:rPr>
+          <w:i/>
+          <w:iCs/>
+        </w:rPr>
+        <w:t xml:space="preserve">Manifesto for Enterprise Agility</w:t>
+      </w:r>
+      <w:r>
+        <w:t xml:space="preserve">, 2026.</w:t>
       </w:r>
     </w:p>
   </w:footnote>
@@ -4458,8 +4468,16 @@
         <w:footnoteRef/>
       </w:r>
       <w:r>
-        <w:t xml:space="preserve">„The AI-Native Software Development Lifecycle”, arXiv 2408.03416.</w:t>
-      </w:r>
+        <w:t xml:space="preserve">„The AI-Native Software Development Lifecycle: A Theoretical and Practical New Methodology”, arXiv-Preprint 2408.03416, 2024. </w:t>
+      </w:r>
+      <w:hyperlink w:history="1" r:id="rId9zpap1ieautckfczdg2am">
+        <w:r>
+          <w:rPr>
+            <w:rStyle w:val="Hyperlink"/>
+          </w:rPr>
+          <w:t xml:space="preserve">arxiv.org/abs/2408.03416</w:t>
+        </w:r>
+      </w:hyperlink>
     </w:p>
   </w:footnote>
   <w:footnote w:id="3">
@@ -4471,8 +4489,16 @@
         <w:footnoteRef/>
       </w:r>
       <w:r>
-        <w:t xml:space="preserve">„Agentsway: Software Development Methodology for AI Agents-based Teams”, arXiv 2510.23664.</w:t>
-      </w:r>
+        <w:t xml:space="preserve">„Agentsway: Software Development Methodology for AI Agents-based Teams”, arXiv-Preprint 2510.23664, 2025. </w:t>
+      </w:r>
+      <w:hyperlink w:history="1" r:id="rIdiqrx8tbugqxq2ndmskifh">
+        <w:r>
+          <w:rPr>
+            <w:rStyle w:val="Hyperlink"/>
+          </w:rPr>
+          <w:t xml:space="preserve">arxiv.org/abs/2510.23664</w:t>
+        </w:r>
+      </w:hyperlink>
     </w:p>
   </w:footnote>
   <w:footnote w:id="4">
@@ -4484,8 +4510,16 @@
         <w:footnoteRef/>
       </w:r>
       <w:r>
-        <w:t xml:space="preserve">„AI and Agile Software Development: Research Roadmap from XP2025”, arXiv 2508.20563.</w:t>
-      </w:r>
+        <w:t xml:space="preserve">„AI and Agile Software Development: A Research Roadmap from the XP2025 Workshop”, arXiv-Preprint 2508.20563, 2025. </w:t>
+      </w:r>
+      <w:hyperlink w:history="1" r:id="rIdlel_3wh4dlole5zli-em7">
+        <w:r>
+          <w:rPr>
+            <w:rStyle w:val="Hyperlink"/>
+          </w:rPr>
+          <w:t xml:space="preserve">arxiv.org/abs/2508.20563</w:t>
+        </w:r>
+      </w:hyperlink>
     </w:p>
   </w:footnote>
   <w:footnote w:id="5">
@@ -4497,8 +4531,68 @@
         <w:footnoteRef/>
       </w:r>
       <w:r>
-        <w:t xml:space="preserve">„Continuous AI in practice”, GitHub Blog, 2026.</w:t>
-      </w:r>
+        <w:t xml:space="preserve">„Continuous AI in practice: What developers can automate today with agentic CI”, GitHub Blog, 2026. </w:t>
+      </w:r>
+      <w:hyperlink w:history="1" r:id="rIdbpjrdu9hrcjitgy-bzjh9">
+        <w:r>
+          <w:rPr>
+            <w:rStyle w:val="Hyperlink"/>
+          </w:rPr>
+          <w:t xml:space="preserve">github.blog/.../continuous-ai-in-practice</w:t>
+        </w:r>
+      </w:hyperlink>
+    </w:p>
+  </w:footnote>
+  <w:footnote w:id="6">
+    <w:p>
+      <w:r>
+        <w:rPr>
+          <w:rStyle w:val="FootnoteReference"/>
+        </w:rPr>
+        <w:footnoteRef/>
+      </w:r>
+      <w:r>
+        <w:t xml:space="preserve">Wolff, Manfred: „Wie ich mit KI arbeite, mein Workflow vom Gedanken bis zur Produktion”, Blog mwolff.org. </w:t>
+      </w:r>
+      <w:hyperlink w:history="1" r:id="rIdpjh-2pbmgs60kne8rlnk7">
+        <w:r>
+          <w:rPr>
+            <w:rStyle w:val="Hyperlink"/>
+          </w:rPr>
+          <w:t xml:space="preserve">blog.mwolff.org/wie-ich-mit-ki-arbeite</w:t>
+        </w:r>
+      </w:hyperlink>
+    </w:p>
+  </w:footnote>
+  <w:footnote w:id="7">
+    <w:p>
+      <w:r>
+        <w:rPr>
+          <w:rStyle w:val="FootnoteReference"/>
+        </w:rPr>
+        <w:footnoteRef/>
+      </w:r>
+      <w:r>
+        <w:t xml:space="preserve">Beck, Kent et al.: </w:t>
+      </w:r>
+      <w:r>
+        <w:rPr>
+          <w:i/>
+          <w:iCs/>
+        </w:rPr>
+        <w:t xml:space="preserve">Manifesto for Agile Software Development</w:t>
+      </w:r>
+      <w:r>
+        <w:t xml:space="preserve">, 2001. </w:t>
+      </w:r>
+      <w:hyperlink w:history="1" r:id="rIdo3ncmwlvcrid8drzgxmei">
+        <w:r>
+          <w:rPr>
+            <w:rStyle w:val="Hyperlink"/>
+          </w:rPr>
+          <w:t xml:space="preserve">agilemanifesto.org</w:t>
+        </w:r>
+      </w:hyperlink>
     </w:p>
   </w:footnote>
 </w:footnotes>

</xml_diff>

<commit_message>
Drop personal appendix, fix unresolved footnote placeholders
- Removes the Toolbox case study appendix (chapter 14) and the now
  orphaned bibliography entry for the personal blog post; the article
  is shorter and stays on the abstract methodology level.
- Renumbers the references chapter to 14, the Manifesto 2001 entry to
  [6], and the corresponding footnote id from 7 to 6 (in definition and
  in-text reference).
- Fixes a generator bug in chapter 1 where the helper received both a
  raw string with [Fußnote N] placeholders and a children array; the
  string variant won, so Word displayed the placeholders as literal
  text instead of resolving the four footnotes. Now only the children
  array is passed.

Co-Authored-By: Claude Opus 4.7 <noreply@anthropic.com>
</commit_message>
<xml_diff>
--- a/docs/ki-entwicklungsprozess.docx
+++ b/docs/ki-entwicklungsprozess.docx
@@ -136,7 +136,50 @@
         <w:jc w:val="both"/>
       </w:pPr>
       <w:r>
-        <w:t xml:space="preserve">Dieses Papier schlägt einen Prozess vor, der diese Werte erhält, sie aber für KI-augmentierte Entwicklung neu instrumentiert. Er entlehnt aus mehreren aktuellen Strömungen: dem Manifesto for Enterprise Agility 2026 [Fußnote 1], dem V-Bounce-Modell der AI-Native SDLC-Forschung [Fußnote 2], der Agentsway-Methodik [Fußnote 3] und der XP2025-Roadmap [Fußnote 4]. Er bündelt diese Strömungen mit konkreter Praxis-Erfahrung aus einem laufenden Projekt zu einem kohärenten Vorgehen, das ein Team an einem Tag einführen kann.</w:t>
+        <w:t xml:space="preserve">Dieses Papier schlägt einen Prozess vor, der diese Werte erhält, sie aber für KI-augmentierte Entwicklung neu instrumentiert. Er entlehnt aus mehreren aktuellen Strömungen: dem </w:t>
+      </w:r>
+      <w:r>
+        <w:rPr>
+          <w:i/>
+          <w:iCs/>
+        </w:rPr>
+        <w:t xml:space="preserve">Manifesto for Enterprise Agility 2026</w:t>
+      </w:r>
+      <w:r>
+        <w:rPr>
+          <w:rStyle w:val="FootnoteReference"/>
+        </w:rPr>
+        <w:footnoteReference w:id="1"/>
+      </w:r>
+      <w:r>
+        <w:t xml:space="preserve">, dem V-Bounce-Modell der AI-Native-SDLC-Forschung</w:t>
+      </w:r>
+      <w:r>
+        <w:rPr>
+          <w:rStyle w:val="FootnoteReference"/>
+        </w:rPr>
+        <w:footnoteReference w:id="2"/>
+      </w:r>
+      <w:r>
+        <w:t xml:space="preserve">, der Agentsway-Methodik</w:t>
+      </w:r>
+      <w:r>
+        <w:rPr>
+          <w:rStyle w:val="FootnoteReference"/>
+        </w:rPr>
+        <w:footnoteReference w:id="3"/>
+      </w:r>
+      <w:r>
+        <w:t xml:space="preserve"> und der XP2025-Roadmap</w:t>
+      </w:r>
+      <w:r>
+        <w:rPr>
+          <w:rStyle w:val="FootnoteReference"/>
+        </w:rPr>
+        <w:footnoteReference w:id="4"/>
+      </w:r>
+      <w:r>
+        <w:t xml:space="preserve">. Er bündelt diese Strömungen mit konkreter Praxis-Erfahrung aus einem laufenden Projekt zu einem kohärenten Vorgehen, das ein Team an einem Tag einführen kann.</w:t>
       </w:r>
     </w:p>
     <w:p>
@@ -495,7 +538,7 @@
         <w:rPr>
           <w:rStyle w:val="FootnoteReference"/>
         </w:rPr>
-        <w:footnoteReference w:id="7"/>
+        <w:footnoteReference w:id="6"/>
       </w:r>
       <w:r>
         <w:t xml:space="preserve">. Sie sind 2001 als operative Konkretisierung der vier Wertepaare entstanden und haben sich über zwei Jahrzehnte gehalten. Dieses Kapitel formuliert keine neuen Prinzipien und beansprucht auch keine Aktualisierung des Manifests. Es nimmt die zwölf originalen Sätze, einen nach dem anderen, und fragt: was verlangen sie weiterhin, was wird in der KI-augmentierten Praxis bei ihrer Umsetzung leichter, und wo ist eine neue Vorsicht nötig? Das Ergebnis: die Prinzipien sind nicht nur weiterhin gültig, ihre Umsetzung ist heute oft deutlich leichter als 2001. Wer sie schon damals ernst genommen hat, hat im KI-Zeitalter einen guten Startpunkt.</w:t>
@@ -4007,160 +4050,7 @@
         <w:pageBreakBefore/>
       </w:pPr>
       <w:r>
-        <w:t xml:space="preserve">14. Anhang: Praxisbeispiel „Toolbox”</w:t>
-      </w:r>
-    </w:p>
-    <w:p>
-      <w:pPr>
-        <w:spacing w:after="120" w:line="300"/>
-        <w:jc w:val="both"/>
-      </w:pPr>
-      <w:r>
-        <w:t xml:space="preserve">Der hier beschriebene Prozess ist nicht theoretisch. Er wird in einem konkreten Projekt gelebt, das im Folgenden als Fallstudie skizziert ist. Das Projekt ist überschaubar, eine einzelne entwickelnde Person mit KI-Pair, und damit eine gute Testumgebung für den Prozess. Wo der Prozess in einem solchen Setup nicht hält, hält er in größeren Setups erst recht nicht.</w:t>
-      </w:r>
-    </w:p>
-    <w:p>
-      <w:pPr>
-        <w:pStyle w:val="Heading2"/>
-        <w:spacing w:after="120" w:before="240"/>
-      </w:pPr>
-      <w:r>
-        <w:t xml:space="preserve">14.1 Domäne und Stack</w:t>
-      </w:r>
-    </w:p>
-    <w:p>
-      <w:pPr>
-        <w:spacing w:after="120" w:line="300"/>
-        <w:jc w:val="both"/>
-      </w:pPr>
-      <w:r>
-        <w:t xml:space="preserve">Die Toolbox ist eine persönliche Tool-Sammlung, primär im Bereich Bildverarbeitung: ein Hintergrund-Entferner auf Basis von rembg, ein Beitragsbild-Crop für OpenGraph-Formate auf Basis von Pillow, ein Bild-Verkleinerer mit Lanczos-Resampling. Die Web-Anwendung läuft auf einer Subdomain und ist über das Netz erreichbar.</w:t>
-      </w:r>
-    </w:p>
-    <w:p>
-      <w:pPr>
-        <w:spacing w:after="120" w:line="300"/>
-        <w:jc w:val="both"/>
-      </w:pPr>
-      <w:r>
-        <w:t xml:space="preserve">Der Stack besteht aus drei Komponenten. Ein Java-21-Spring-Boot-Backend liefert die REST-API und stellt das gebaute Frontend aus. Ein React-Frontend (Vite, TypeScript, MUI) bietet die Bedienoberfläche. Ein FastAPI-basierter Python-Service (python-tools) kapselt die schweren Bildverarbeitungs-Abhängigkeiten, Pillow, rembg mit Numba-JIT, colorthief. Spring proxyt die Anfragen an den Python-Service über HTTP/1.1.</w:t>
-      </w:r>
-    </w:p>
-    <w:p>
-      <w:pPr>
-        <w:pStyle w:val="Heading2"/>
-        <w:spacing w:after="120" w:before="240"/>
-      </w:pPr>
-      <w:r>
-        <w:t xml:space="preserve">14.2 Workflow-Praxis</w:t>
-      </w:r>
-    </w:p>
-    <w:p>
-      <w:pPr>
-        <w:spacing w:after="120" w:line="300"/>
-        <w:jc w:val="both"/>
-      </w:pPr>
-      <w:r>
-        <w:t xml:space="preserve">Das Projekt nutzt ein GitHub-Project-Board mit den fünf Standard-Spalten. Memory-Dateien im persönlichen Workspace tragen die nicht-projekt-spezifischen Konventionen, Sprach-Präferenz, Branch-Politik, Detail-Vorlieben. CLAUDE.md im Repo-Root beschreibt das Projekt selbst; CLAUDE-workflow.md enthält die 9-Schritt-Anleitung mit der Kanban-Sektion; CLAUDE-java.md, CLAUDE-react.md und CLAUDE-security.md ergänzen die Tech-Konventionen.</w:t>
-      </w:r>
-    </w:p>
-    <w:p>
-      <w:pPr>
-        <w:spacing w:after="120" w:line="300"/>
-        <w:jc w:val="both"/>
-      </w:pPr>
-      <w:r>
-        <w:t xml:space="preserve">Die Trigger-Phrasen sind etabliert: „push main” für den Push auf origin/main, „merge production” für den PR-Trigger von main nach production. Ein Push erfolgt nie ohne diese Phrase, selbst dann nicht, wenn das aktuelle Issue „eigentlich trivial” ist. Die Ready-Reihenfolge im Board ist aufsteigend nach Issue-Nummer; das macht Abhängigkeiten transparent und verhindert, dass die KI selbständig Prioritäten setzt.</w:t>
-      </w:r>
-    </w:p>
-    <w:p>
-      <w:pPr>
-        <w:pStyle w:val="Heading2"/>
-        <w:spacing w:after="120" w:before="240"/>
-      </w:pPr>
-      <w:r>
-        <w:t xml:space="preserve">14.3 Konkretes Beispiel: Issues #33 und #34</w:t>
-      </w:r>
-    </w:p>
-    <w:p>
-      <w:pPr>
-        <w:spacing w:after="120" w:line="300"/>
-        <w:jc w:val="both"/>
-      </w:pPr>
-      <w:r>
-        <w:t xml:space="preserve">Zwei Issues zeigen den Prozess in der Praxis. Issue #33 betrifft eine Navigationsänderung: das linke Menü soll Tool-Gruppen erhalten, „Bildverarbeitung” und „Nützliche Tools”, statt einer flachen Liste. Issue #34 ist ein neues Tool: ein Passwortgenerator, der im Browser ein Passwort erzeugt und einen bcrypt-Hash dazu liefert, mit konfigurierbarer Länge und Sonderzeichen-Auswahl.</w:t>
-      </w:r>
-    </w:p>
-    <w:p>
-      <w:pPr>
-        <w:spacing w:after="120" w:line="300"/>
-        <w:jc w:val="both"/>
-      </w:pPr>
-      <w:r>
-        <w:t xml:space="preserve">Der Prozess wurde wie folgt durchlaufen. Zunächst diktierte die auftraggebende Person die Anforderungen, auf Issue #34 wurde die Frage Frontend-only versus Backend-Service kurz diskutiert; die Entscheidung fiel zugunsten Frontend-only mit dem Sicherheitsargument, dass ein generiertes Passwort das Gerät nicht verlassen sollte. Beide Issues wurden mit kleinteiligen Akzeptanzkriterien formuliert; offene Designfragen wurden vor der Freigabe nach Ready beantwortet.</w:t>
-      </w:r>
-    </w:p>
-    <w:p>
-      <w:pPr>
-        <w:spacing w:after="120" w:line="300"/>
-        <w:jc w:val="both"/>
-      </w:pPr>
-      <w:r>
-        <w:t xml:space="preserve">Beide Issues wurden anschließend in einer Sitzung nach Ready gezogen. Die Ready-Reihenfolge, #33 vor #34, bedeutet, dass die Menüstruktur (mit einem Link auf /tools/password) vor der eigentlichen Seite implementiert wird. Zwischen den beiden Commits ist die /tools/password-Route kurzzeitig leer, das ist akzeptabel, weil beide Issues in derselben Iteration abgearbeitet werden und nichts zwischendurch gepusht wird.</w:t>
-      </w:r>
-    </w:p>
-    <w:p>
-      <w:pPr>
-        <w:pStyle w:val="Heading2"/>
-        <w:spacing w:after="120" w:before="240"/>
-      </w:pPr>
-      <w:r>
-        <w:t xml:space="preserve">14.4 Lessons Learned</w:t>
-      </w:r>
-    </w:p>
-    <w:p>
-      <w:pPr>
-        <w:spacing w:after="120" w:line="300"/>
-        <w:jc w:val="both"/>
-      </w:pPr>
-      <w:r>
-        <w:t xml:space="preserve">Drei Lehren haben sich aus der Praxis ergeben.</w:t>
-      </w:r>
-    </w:p>
-    <w:p>
-      <w:pPr>
-        <w:spacing w:after="120" w:line="300"/>
-        <w:jc w:val="both"/>
-      </w:pPr>
-      <w:r>
-        <w:t xml:space="preserve">Erstens: die Trennung von Plan-Approval und Implementierungs-GO ist nicht nur eine theoretische Schutzschicht. Es gab konkrete Fälle, in denen die KI nach einer Plan-Zustimmung losgelegt hätte, die explizite Wartezeit hat ein Issue mit unentschiedener Architektur-Entscheidung vor einer unnötigen Implementierung bewahrt.</w:t>
-      </w:r>
-    </w:p>
-    <w:p>
-      <w:pPr>
-        <w:spacing w:after="120" w:line="300"/>
-        <w:jc w:val="both"/>
-      </w:pPr>
-      <w:r>
-        <w:t xml:space="preserve">Zweitens: die Done-Spalte des Boards ist eine Versuchung. Es ist naheliegend, ein Issue, das in Done liegt, als „push-bereit” zu interpretieren. Die explizite Regel, Done ist ein UI-Signal, kein Push-Trigger, hat einen Push verhindert, der ohne sie passiert wäre.</w:t>
-      </w:r>
-    </w:p>
-    <w:p>
-      <w:pPr>
-        <w:spacing w:after="120" w:line="300"/>
-        <w:jc w:val="both"/>
-      </w:pPr>
-      <w:r>
-        <w:t xml:space="preserve">Drittens: Memory-Konsolidierung lohnt sich. Memory-Dateien, die seit mehreren Wochen nicht angepasst worden waren, enthielten Verweise auf Issue-Nummern, die nicht mehr existierten, und Workflow-Regeln, die durch das Kanban-Board überholt waren. Eine knappe Stunde Konsolidierung, Verweise aktualisieren, veraltete Einträge streichen, neue Konventionen ergänzen, hat die Folge-Sessions deutlich präziser gemacht.</w:t>
-      </w:r>
-    </w:p>
-    <w:p>
-      <w:pPr>
-        <w:pStyle w:val="Heading1"/>
-        <w:pageBreakBefore/>
-      </w:pPr>
-      <w:r>
-        <w:t xml:space="preserve">15. Quellenverzeichnis</w:t>
+        <w:t xml:space="preserve">14. Quellenverzeichnis</w:t>
       </w:r>
     </w:p>
     <w:p>
@@ -4207,7 +4097,7 @@
       <w:r>
         <w:t xml:space="preserve">[2] „The AI-Native Software Development Lifecycle: A Theoretical and Practical New Methodology”, arXiv-Preprint 2408.03416. </w:t>
       </w:r>
-      <w:hyperlink w:history="1" r:id="rIdfrhql2gbrt8aczfhh_lfw">
+      <w:hyperlink w:history="1" r:id="rId4upazoqe3hkkyrp3jop9u">
         <w:r>
           <w:rPr>
             <w:rStyle w:val="Hyperlink"/>
@@ -4228,7 +4118,7 @@
       <w:r>
         <w:t xml:space="preserve">[3] „Agentsway: Software Development Methodology for AI Agents-based Teams”, arXiv-Preprint 2510.23664. </w:t>
       </w:r>
-      <w:hyperlink w:history="1" r:id="rIdg_q3yxvnlfzqw2msh0eq3">
+      <w:hyperlink w:history="1" r:id="rIdyv8o9qhblbhelqiczafup">
         <w:r>
           <w:rPr>
             <w:rStyle w:val="Hyperlink"/>
@@ -4249,7 +4139,7 @@
       <w:r>
         <w:t xml:space="preserve">[4] „AI and Agile Software Development: A Research Roadmap from the XP2025 Workshop”, arXiv-Preprint 2508.20563. </w:t>
       </w:r>
-      <w:hyperlink w:history="1" r:id="rIdvwquaxss7tm1qsdmomgkl">
+      <w:hyperlink w:history="1" r:id="rIdogl8td2-mb0mcmr2ns7m4">
         <w:r>
           <w:rPr>
             <w:rStyle w:val="Hyperlink"/>
@@ -4270,7 +4160,7 @@
       <w:r>
         <w:t xml:space="preserve">[5] „Continuous AI in practice: What developers can automate today with agentic CI”, GitHub Blog. </w:t>
       </w:r>
-      <w:hyperlink w:history="1" r:id="rId8sajblfw9uagw-7ulhvkg">
+      <w:hyperlink w:history="1" r:id="rIdwzaqwkgooqjkcejyyhvey">
         <w:r>
           <w:rPr>
             <w:rStyle w:val="Hyperlink"/>
@@ -4289,28 +4179,7 @@
         <w:spacing w:after="80"/>
       </w:pPr>
       <w:r>
-        <w:t xml:space="preserve">[6] Wolff, Manfred: „Wie ich mit KI arbeite, mein Workflow vom Gedanken bis zur Produktion”, Blog mwolff.org. </w:t>
-      </w:r>
-      <w:hyperlink w:history="1" r:id="rId3dzmvifbpppqnrwmtklcf">
-        <w:r>
-          <w:rPr>
-            <w:rStyle w:val="Hyperlink"/>
-          </w:rPr>
-          <w:t xml:space="preserve">blog.mwolff.org/wie-ich-mit-ki-arbeite</w:t>
-        </w:r>
-      </w:hyperlink>
-    </w:p>
-    <w:p>
-      <w:pPr>
-        <w:pStyle w:val="ListParagraph"/>
-        <w:numPr>
-          <w:ilvl w:val="0"/>
-          <w:numId w:val="2"/>
-        </w:numPr>
-        <w:spacing w:after="80"/>
-      </w:pPr>
-      <w:r>
-        <w:t xml:space="preserve">[7] Beck, Kent et al.: </w:t>
+        <w:t xml:space="preserve">[6] Beck, Kent et al.: </w:t>
       </w:r>
       <w:r>
         <w:rPr>
@@ -4322,7 +4191,7 @@
       <w:r>
         <w:t xml:space="preserve">, 2001. </w:t>
       </w:r>
-      <w:hyperlink w:history="1" r:id="rIdnk3clh2iy-ofdhmq7lb6s">
+      <w:hyperlink w:history="1" r:id="rIdrj4nrwrrw9glx_eoa1ahq">
         <w:r>
           <w:rPr>
             <w:rStyle w:val="Hyperlink"/>
@@ -4470,7 +4339,7 @@
       <w:r>
         <w:t xml:space="preserve">„The AI-Native Software Development Lifecycle: A Theoretical and Practical New Methodology”, arXiv-Preprint 2408.03416, 2024. </w:t>
       </w:r>
-      <w:hyperlink w:history="1" r:id="rId9zpap1ieautckfczdg2am">
+      <w:hyperlink w:history="1" r:id="rIdlfo5pmbxpoocl-axvyli5">
         <w:r>
           <w:rPr>
             <w:rStyle w:val="Hyperlink"/>
@@ -4491,7 +4360,7 @@
       <w:r>
         <w:t xml:space="preserve">„Agentsway: Software Development Methodology for AI Agents-based Teams”, arXiv-Preprint 2510.23664, 2025. </w:t>
       </w:r>
-      <w:hyperlink w:history="1" r:id="rIdiqrx8tbugqxq2ndmskifh">
+      <w:hyperlink w:history="1" r:id="rId9jevxzvyoezuzae4_7vme">
         <w:r>
           <w:rPr>
             <w:rStyle w:val="Hyperlink"/>
@@ -4512,7 +4381,7 @@
       <w:r>
         <w:t xml:space="preserve">„AI and Agile Software Development: A Research Roadmap from the XP2025 Workshop”, arXiv-Preprint 2508.20563, 2025. </w:t>
       </w:r>
-      <w:hyperlink w:history="1" r:id="rIdlel_3wh4dlole5zli-em7">
+      <w:hyperlink w:history="1" r:id="rIdmun3h6dxhc8mbi7qs834f">
         <w:r>
           <w:rPr>
             <w:rStyle w:val="Hyperlink"/>
@@ -4533,7 +4402,7 @@
       <w:r>
         <w:t xml:space="preserve">„Continuous AI in practice: What developers can automate today with agentic CI”, GitHub Blog, 2026. </w:t>
       </w:r>
-      <w:hyperlink w:history="1" r:id="rIdbpjrdu9hrcjitgy-bzjh9">
+      <w:hyperlink w:history="1" r:id="rIdchz6lblv2m5mxlm29gnt4">
         <w:r>
           <w:rPr>
             <w:rStyle w:val="Hyperlink"/>
@@ -4552,27 +4421,6 @@
         <w:footnoteRef/>
       </w:r>
       <w:r>
-        <w:t xml:space="preserve">Wolff, Manfred: „Wie ich mit KI arbeite, mein Workflow vom Gedanken bis zur Produktion”, Blog mwolff.org. </w:t>
-      </w:r>
-      <w:hyperlink w:history="1" r:id="rIdpjh-2pbmgs60kne8rlnk7">
-        <w:r>
-          <w:rPr>
-            <w:rStyle w:val="Hyperlink"/>
-          </w:rPr>
-          <w:t xml:space="preserve">blog.mwolff.org/wie-ich-mit-ki-arbeite</w:t>
-        </w:r>
-      </w:hyperlink>
-    </w:p>
-  </w:footnote>
-  <w:footnote w:id="7">
-    <w:p>
-      <w:r>
-        <w:rPr>
-          <w:rStyle w:val="FootnoteReference"/>
-        </w:rPr>
-        <w:footnoteRef/>
-      </w:r>
-      <w:r>
         <w:t xml:space="preserve">Beck, Kent et al.: </w:t>
       </w:r>
       <w:r>
@@ -4585,7 +4433,7 @@
       <w:r>
         <w:t xml:space="preserve">, 2001. </w:t>
       </w:r>
-      <w:hyperlink w:history="1" r:id="rIdo3ncmwlvcrid8drzgxmei">
+      <w:hyperlink w:history="1" r:id="rId8kagpruzdeid-ubefqc9j">
         <w:r>
           <w:rPr>
             <w:rStyle w:val="Hyperlink"/>

</xml_diff>

<commit_message>
Fix footnote numbering, replace Cadence with Takt, add Whitepaper label
Three editorial passes via direct XML edit on the docx (since the
generator script was lost to the /tmp cleanup):

- Footnotes: 14 standalone definitions in body order, IDs 1-14. The
  earlier setup reused six definition IDs across fourteen body
  references, which made Word renumber them 1..14 anyway while
  showing only the first six source texts. Now each reference has its
  own correct source text.
- "Cadence(s)" replaced by "Takt"/"Takte" throughout. A handful of
  other anglicisms and inflated phrases smoothed at the same time
  (Sustainable Pace, purpose-driven alignment, shared outcomes,
  human-centric adaptability, Mehr-Agenten-Konstellationen, drastisch,
  absurd, operative Konkretisierung).
- "WHITEPAPER" label added above the title on the cover page.

Co-Authored-By: Claude Opus 4.7 <noreply@anthropic.com>
</commit_message>
<xml_diff>
--- a/docs/ki-entwicklungsprozess.docx
+++ b/docs/ki-entwicklungsprozess.docx
@@ -4,7 +4,23 @@
   <w:body>
     <w:p>
       <w:pPr>
-        <w:spacing w:after="240" w:before="2400"/>
+        <w:spacing w:before="2400" w:after="120"/>
+        <w:jc w:val="center"/>
+      </w:pPr>
+      <w:r>
+        <w:rPr>
+          <w:caps/>
+          <w:sz w:val="22"/>
+          <w:szCs w:val="22"/>
+          <w:color w:val="666666"/>
+          <w:spacing w:val="60"/>
+        </w:rPr>
+        <w:t xml:space="preserve">Whitepaper</w:t>
+      </w:r>
+    </w:p>
+    <w:p>
+      <w:pPr>
+        <w:spacing w:after="240" w:before="0"/>
         <w:jc w:val="center"/>
       </w:pPr>
       <w:r>
@@ -29,7 +45,7 @@
           <w:sz w:val="28"/>
           <w:szCs w:val="28"/>
         </w:rPr>
-        <w:t xml:space="preserve">Werte, Rollen, Cadences und Praxis</w:t>
+        <w:t xml:space="preserve">Werte, Rollen, Takte und Praxis</w:t>
       </w:r>
     </w:p>
     <w:p>
@@ -109,7 +125,7 @@
         <w:jc w:val="both"/>
       </w:pPr>
       <w:r>
-        <w:t xml:space="preserve">Die Softwareentwicklung hat in den letzten Jahren eine Verschiebung erlebt, die sich nicht in der Sprache klassischer agiler Methoden beschreiben lässt. Generative Sprachmodelle und agentenbasierte Werkzeuge haben die Frage, wer im Team eigentlich Code schreibt, neu aufgeworfen. Eine entwickelnde Person, die mit einem solchen Werkzeug arbeitet, ist nicht mehr nur Autor:in ihres Codes; sie ist gleichzeitig erste Review-Instanz, verantwortet die Architektur und trägt die Endverantwortung. Das ist keine kleine Anpassung des Tagesgeschäfts, sondern eine andere Art zu arbeiten.</w:t>
+        <w:t xml:space="preserve">Die Softwareentwicklung hat in den letzten Jahren eine Verschiebung erlebt, die sich nicht in der Sprache klassischer agiler Methoden beschreiben lässt. Generative Sprachmodelle und agenten-basierte Werkzeuge haben die Frage, wer im Team eigentlich Code schreibt, neu aufgeworfen. Eine entwickelnde Person, die mit einem solchen Werkzeug arbeitet, ist nicht mehr nur Autor:in ihres Codes; sie ist gleichzeitig erste Review-Instanz, verantwortet die Architektur und trägt die Endverantwortung. Das ist keine kleine Anpassung des Tagesgeschäfts, sondern eine andere Art zu arbeiten.</w:t>
       </w:r>
     </w:p>
     <w:p>
@@ -258,10 +274,10 @@
         <w:rPr>
           <w:rStyle w:val="FootnoteReference"/>
         </w:rPr>
-        <w:footnoteReference w:id="1"/>
-      </w:r>
-      <w:r>
-        <w:t xml:space="preserve">. Es verschiebt den Fokus weg von der Team-Ebene und hin zur organisatorischen Fähigkeit. Drei Punkte sind für unsere Frage relevant: erstens die Betonung von purpose-driven alignment, also einer geteilten Richtung über Team-Grenzen hinweg; zweitens die Idee shared outcomes, die mehr zählen als individuelle Story-Punkte; drittens die explizite Aufnahme von human-centric adaptability als Wert. Letzteres ist im KI-Kontext nicht trivial: es ist eine Erinnerung, dass die Anpassungsleistung beim Menschen bleibt, auch wenn das Werkzeug schneller adaptiert.</w:t>
+        <w:footnoteReference w:id="5"/>
+      </w:r>
+      <w:r>
+        <w:t xml:space="preserve">. Es verschiebt den Fokus weg von der Team-Ebene und hin zur organisatorischen Fähigkeit. Drei Punkte sind für unsere Frage relevant: erstens die Betonung von gemeinsame Ausrichtung, also einer geteilten Richtung über Team-Grenzen hinweg; zweitens die Idee gemeinsame Ergebnisse, die mehr zählen als individuelle Story-Punkte; drittens die explizite Aufnahme von menschlich getragene Anpassungsfähigkeit als Wert. Letzteres ist im KI-Kontext nicht trivial: es ist eine Erinnerung, dass die Anpassungsleistung beim Menschen bleibt, auch wenn das Werkzeug schneller adaptiert.</w:t>
       </w:r>
     </w:p>
     <w:p>
@@ -285,7 +301,7 @@
         <w:rPr>
           <w:rStyle w:val="FootnoteReference"/>
         </w:rPr>
-        <w:footnoteReference w:id="2"/>
+        <w:footnoteReference w:id="6"/>
       </w:r>
       <w:r>
         <w:t xml:space="preserve"> ist eine Variante des klassischen V-Modells, in der die Implementierungsphase durch die KI dramatisch verkürzt wird. Was übrig bleibt, und damit aufgewertet wird, sind die Phasen davor und danach: Anforderungsklärung, Architektur, Validierung. Die Rolle des Menschen verschiebt sich vom primären Implementieren zum primären Validieren. Die KI wird zur Implementations-Engine. Dieser Begriff ist im Folgenden konsistent verwendet, weil er die Beziehung zwischen Mensch und Werkzeug am treffendsten beschreibt: ein leistungsstarker Motor, der eine Hand am Steuer braucht.</w:t>
@@ -312,7 +328,7 @@
         <w:rPr>
           <w:rStyle w:val="FootnoteReference"/>
         </w:rPr>
-        <w:footnoteReference w:id="3"/>
+        <w:footnoteReference w:id="7"/>
       </w:r>
       <w:r>
         <w:t xml:space="preserve"> ist eine 2025 vorgeschlagene Methodik für Teams, in denen mehrere KI-Agenten parallel arbeiten. Ihre wichtigste konzeptionelle Neuerung ist die Rolle des </w:t>
@@ -349,7 +365,7 @@
         <w:rPr>
           <w:rStyle w:val="FootnoteReference"/>
         </w:rPr>
-        <w:footnoteReference w:id="4"/>
+        <w:footnoteReference w:id="8"/>
       </w:r>
       <w:r>
         <w:t xml:space="preserve"> hat eine Forschungsagenda für AI-augmented Agile formuliert. Drei konkrete Vorschläge prägen den hier formulierten Prozess: erstens die Idee von KI-Assistenzrollen (AI Product Owner Assistant, AI Quality Assurance Partner, AI Pair Programming Partner), die als ergänzende Werkzeuge benutzt werden können, ohne dass sie als Teammitglieder verstanden werden müssen. Zweitens der Vorschlag einer eigenständigen KI-Retrospektive, die getrennt von der klassischen Team-Retrospektive die Mensch-KI-Zusammenarbeit reflektiert. Drittens das Konzept von Prompt-Bibliotheken als lebende Dokumentation, die im Repository gepflegt werden.</w:t>
@@ -376,7 +392,7 @@
         <w:rPr>
           <w:rStyle w:val="FootnoteReference"/>
         </w:rPr>
-        <w:footnoteReference w:id="5"/>
+        <w:footnoteReference w:id="9"/>
       </w:r>
       <w:r>
         <w:t xml:space="preserve"> beschreibt Hintergrund-Loops, in denen Agenten täglich kleine Pull Requests erzeugen, für Triage, Dokumentationspflege, kleine Qualitätsverbesserungen. Diese Idee ist die Ergänzung des hier vorgeschlagenen Prozesses, nicht sein Ersatz. Continuous-AI-Loops eignen sich für klar abgegrenzte Aufgaben, die kein menschliches Urteil im Moment der Entstehung brauchen. Alles, was Architektur-Entscheidungen, Sicherheitsabwägungen oder Stakeholder-Kommunikation berührt, gehört in die menschlich getaktete Iteration.</w:t>
@@ -460,7 +476,7 @@
         <w:jc w:val="both"/>
       </w:pPr>
       <w:r>
-        <w:t xml:space="preserve">Drittens: die Erwartungen der Auftraggebenden haben sich angepasst. Wer einen sichtbaren Prototyp innerhalb von Tagen erwarten kann, wird Wochen oder Monate nicht mehr tolerieren. Diese Erwartung ist nicht unrealistisch, sie ist eine direkte Folge dessen, was möglich geworden ist. Sie verlangt Cadences, die in klassischen Modellen nicht vorgesehen waren.</w:t>
+        <w:t xml:space="preserve">Drittens: die Erwartungen der Auftraggebenden haben sich angepasst. Wer einen sichtbaren Prototyp innerhalb von Tagen erwarten kann, wird Wochen oder Monate nicht mehr tolerieren. Diese Erwartung ist nicht unrealistisch, sie ist eine direkte Folge dessen, was möglich geworden ist. Sie verlangt Takte, die in klassischen Modellen nicht vorgesehen waren.</w:t>
       </w:r>
     </w:p>
     <w:p>
@@ -505,7 +521,7 @@
         <w:jc w:val="both"/>
       </w:pPr>
       <w:r>
-        <w:t xml:space="preserve">Einiges am ursprünglichen Manifest fühlt sich beim Wiederlesen historisch an. Die Annahme, dass alle Teammitglieder im selben Raum sitzen sollten, fünfzes Prinzip, passt nicht in eine Welt mit Remote-Arbeit und KI-Werkzeugen. Die Schätzung, dass funktionierende Software in Wochen bis Monaten ausgeliefert werden soll, drittes Prinzip, wirkt langsam, wenn die KI-Cadence Tage zulässt. Diese Verschiebungen verlangen aber keine Ersetzung der Prinzipien, sondern eine Neukalibrierung ihrer Skala.</w:t>
+        <w:t xml:space="preserve">Einiges am ursprünglichen Manifest fühlt sich beim Wiederlesen historisch an. Die Annahme, dass alle Teammitglieder im selben Raum sitzen sollten, fünfzes Prinzip, passt nicht in eine Welt mit Remote-Arbeit und KI-Werkzeugen. Die Schätzung, dass funktionierende Software in Wochen bis Monaten ausgeliefert werden soll, drittes Prinzip, wirkt langsam, wenn die KI-Takt Tage zulässt. Diese Verschiebungen verlangen aber keine Ersetzung der Prinzipien, sondern eine Neukalibrierung ihrer Skala.</w:t>
       </w:r>
     </w:p>
     <w:p>
@@ -538,10 +554,10 @@
         <w:rPr>
           <w:rStyle w:val="FootnoteReference"/>
         </w:rPr>
-        <w:footnoteReference w:id="6"/>
-      </w:r>
-      <w:r>
-        <w:t xml:space="preserve">. Sie sind 2001 als operative Konkretisierung der vier Wertepaare entstanden und haben sich über zwei Jahrzehnte gehalten. Dieses Kapitel formuliert keine neuen Prinzipien und beansprucht auch keine Aktualisierung des Manifests. Es nimmt die zwölf originalen Sätze, einen nach dem anderen, und fragt: was verlangen sie weiterhin, was wird in der KI-augmentierten Praxis bei ihrer Umsetzung leichter, und wo ist eine neue Vorsicht nötig? Das Ergebnis: die Prinzipien sind nicht nur weiterhin gültig, ihre Umsetzung ist heute oft deutlich leichter als 2001. Wer sie schon damals ernst genommen hat, hat im KI-Zeitalter einen guten Startpunkt.</w:t>
+        <w:footnoteReference w:id="10"/>
+      </w:r>
+      <w:r>
+        <w:t xml:space="preserve">. Sie sind 2001 als praktische Konkretisierung der vier Wertepaare entstanden und haben sich über zwei Jahrzehnte gehalten. Dieses Kapitel formuliert keine neuen Prinzipien und beansprucht auch keine Aktualisierung des Manifests. Es nimmt die zwölf originalen Sätze, einen nach dem anderen, und fragt: was verlangen sie weiterhin, was wird in der KI-augmentierten Praxis bei ihrer Umsetzung leichter, und wo ist eine neue Vorsicht nötig? Das Ergebnis: die Prinzipien sind nicht nur weiterhin gültig, ihre Umsetzung ist heute oft deutlich leichter als 2001. Wer sie schon damals ernst genommen hat, hat im KI-Zeitalter einen guten Startpunkt.</w:t>
       </w:r>
     </w:p>
     <w:p>
@@ -568,7 +584,7 @@
         <w:jc w:val="both"/>
       </w:pPr>
       <w:r>
-        <w:t xml:space="preserve">In der KI-Ära wird die Umsetzung dieses Prinzips drastisch leichter. Was früher Sprint-Cadences mit zweiwöchigen Releases bedeutete, kann heute tägliche Auslieferung sein. Ein Issue, das morgens geklärt wird, kann nachmittags auf dem Test-Server stehen. Die Maschinerie aus Build-Pipeline und Continuous Delivery, die schon vor der KI existierte, bekommt nun einen Implementierungsmotor an die Spitze gestellt, der das Tempo annimmt, das die Pipeline ohnehin verkraftet hätte. Die Voraussetzung dafür ist Disziplin: kontinuierliche Auslieferung darf nicht zu unverstandener Auslieferung werden. Push und Deploy bleiben menschlich freigegebene Schritte, kein Automatismus.</w:t>
+        <w:t xml:space="preserve">In der KI-Ära wird die Umsetzung dieses Prinzips deutlich leichter. Was früher Sprint-Takte mit zweiwöchigen Releases bedeutete, kann heute tägliche Auslieferung sein. Ein Issue, das morgens geklärt wird, kann nachmittags auf dem Test-Server stehen. Die Maschinerie aus Build-Pipeline und Continuous Delivery, die schon vor der KI existierte, bekommt nun einen Implementierungsmotor an die Spitze gestellt, der das Tempo annimmt, das die Pipeline ohnehin verkraftet hätte. Die Voraussetzung dafür ist Disziplin: kontinuierliche Auslieferung darf nicht zu unverstandener Auslieferung werden. Push und Deploy bleiben menschlich freigegebene Schritte, kein Automatismus.</w:t>
       </w:r>
     </w:p>
     <w:p>
@@ -613,16 +629,16 @@
         <w:jc w:val="both"/>
       </w:pPr>
       <w:r>
-        <w:t xml:space="preserve">Das dritte Prinzip nennt ursprünglich Wochen bis Monate als Cadence, mit Vorzug für die kürzeren Skalen. Der Kern ist: häufig liefern, damit Feedback früh ist und Korrekturen klein. Dieser Kern gilt weiterhin.</w:t>
-      </w:r>
-    </w:p>
-    <w:p>
-      <w:pPr>
-        <w:spacing w:after="120" w:line="300"/>
-        <w:jc w:val="both"/>
-      </w:pPr>
-      <w:r>
-        <w:t xml:space="preserve">Was sich verschiebt, ist die Skala. Daily-Iterationen sind die neue Norm, Vier-Stunden-Iterationen sind für klar abgegrenzte Aufgaben realistisch. Was 2001 als ambitionierte Cadence galt, ist heute ein Default. Eine ganze Klasse von Verzögerungen, Build-Zeiten, manuelle Tests, Hand-Offs zwischen Rollen, ist durch Automatisierung und KI-Unterstützung in den Hintergrund gerückt. Das Risiko ist die andere Seite: häufige Auslieferung ohne Disziplin produziert eine Folge halbgarer Releases. Test-First, manuelle UI-Verifikation, Security-Gates sind kein optionaler Zusatzaufwand, sondern die Bedingung, unter der häufige Auslieferung verantwortbar ist.</w:t>
+        <w:t xml:space="preserve">Das dritte Prinzip nennt ursprünglich Wochen bis Monate als Takt, mit Vorzug für die kürzeren Skalen. Der Kern ist: häufig liefern, damit Feedback früh ist und Korrekturen klein. Dieser Kern gilt weiterhin.</w:t>
+      </w:r>
+    </w:p>
+    <w:p>
+      <w:pPr>
+        <w:spacing w:after="120" w:line="300"/>
+        <w:jc w:val="both"/>
+      </w:pPr>
+      <w:r>
+        <w:t xml:space="preserve">Was sich verschiebt, ist die Skala. Daily-Iterationen sind die neue Norm, Vier-Stunden-Iterationen sind für klar abgegrenzte Aufgaben realistisch. Was 2001 als ambitionierte Takt galt, ist heute ein Default. Eine ganze Klasse von Verzögerungen, Build-Zeiten, manuelle Tests, Hand-Offs zwischen Rollen, ist durch Automatisierung und KI-Unterstützung in den Hintergrund gerückt. Das Risiko ist die andere Seite: häufige Auslieferung ohne Disziplin produziert eine Folge halbgarer Releases. Test-First, manuelle UI-Verifikation, Security-Gates sind kein optionaler Zusatzaufwand, sondern die Bedingung, unter der häufige Auslieferung verantwortbar ist.</w:t>
       </w:r>
     </w:p>
     <w:p>
@@ -757,7 +773,7 @@
         <w:jc w:val="both"/>
       </w:pPr>
       <w:r>
-        <w:t xml:space="preserve">Die KI verändert die Dynamik dieses Prinzips. Auf der einen Seite ist Sustainable Pace leichter, weil viele lästige Tätigkeiten (Boilerplate, Tests-Schreiben für offensichtliche Fälle, Dokumentation) der KI übergeben werden können. Auf der anderen Seite ist die Versuchung größer, weil die KI nie müde wird. Wer sich von der KI tempotreiben lässt, läuft schneller in den Burnout als ohne sie. Die menschliche Review-Kapazität wird zur knappen Ressource. Eine Daily-Iteration, in der die KI zwölf Issues abarbeitet und ein Mensch alle zwölf reviewen soll, ist nicht nachhaltig. Sustainable Pace heißt im KI-Modus: die Cadence wird vom langsamsten menschlichen Schritt bestimmt, nicht vom schnellsten Werkzeug-Schritt.</w:t>
+        <w:t xml:space="preserve">Die KI verändert die Dynamik dieses Prinzips. Auf der einen Seite ist nachhaltiges Tempo leichter, weil viele lästige Tätigkeiten (Boilerplate, Tests-Schreiben für offensichtliche Fälle, Dokumentation) der KI übergeben werden können. Auf der anderen Seite ist die Versuchung größer, weil die KI nie müde wird. Wer sich von der KI tempotreiben lässt, läuft schneller in den Burnout als ohne sie. Die menschliche Review-Kapazität wird zur knappen Ressource. Eine Daily-Iteration, in der die KI zwölf Issues abarbeitet und ein Mensch alle zwölf reviewen soll, ist nicht nachhaltig. nachhaltiges Tempo heißt im KI-Modus: die Takt wird vom langsamsten menschlichen Schritt bestimmt, nicht vom schnellsten Werkzeug-Schritt.</w:t>
       </w:r>
     </w:p>
     <w:p>
@@ -928,7 +944,7 @@
         <w:jc w:val="both"/>
       </w:pPr>
       <w:r>
-        <w:t xml:space="preserve">In klassischem Scrum würde diese Rolle weitere Aufgaben tragen: Sprint Planning, Stakeholder-Management, Release-Strategie. Diese Aufgaben verschwinden im KI-augmentierten Modus nicht; sie werden nur möglicherweise auf engere Cadences verteilt. Ein PO in diesem Modus kann pro Tag mehrere Mikro-Plannings durchführen und mehrere Releases freigeben, weil die KI die operative Last reduziert.</w:t>
+        <w:t xml:space="preserve">In klassischem Scrum würde diese Rolle weitere Aufgaben tragen: Sprint Planning, Stakeholder-Management, Release-Strategie. Diese Aufgaben verschwinden im KI-augmentierten Modus nicht; sie werden nur möglicherweise auf engere Takte verteilt. Ein PO in diesem Modus kann pro Tag mehrere Mikro-Plannings durchführen und mehrere Releases freigeben, weil die KI die operative Last reduziert.</w:t>
       </w:r>
     </w:p>
     <w:p>
@@ -1352,7 +1368,7 @@
         <w:rPr>
           <w:rStyle w:val="FootnoteReference"/>
         </w:rPr>
-        <w:footnoteReference w:id="4"/>
+        <w:footnoteReference w:id="11"/>
       </w:r>
       <w:r>
         <w:t xml:space="preserve"> schlägt drei KI-Assistenzrollen vor: AI Product Owner Assistant, AI Quality Assurance Partner, AI Pair Programming Partner. Diese können im hier vorgeschlagenen Prozess als spezialisierte Werkzeuge eingesetzt werden, beispielsweise als Hilfsmittel beim Backlog-Refinement oder bei der Test-Generierung. Wichtig ist, dass sie als Werkzeuge sichtbar bleiben. Sobald ein AI PO Assistant beginnt, eigenständig Tickets zu schreiben, ohne dass ein Mensch sie freigibt, wird aus dem Werkzeug eine Rolle, und die Verantwortungskette bricht.</w:t>
@@ -2140,7 +2156,7 @@
         <w:pageBreakBefore/>
       </w:pPr>
       <w:r>
-        <w:t xml:space="preserve">7. Cadences und Events</w:t>
+        <w:t xml:space="preserve">7. Takt und Events</w:t>
       </w:r>
     </w:p>
     <w:p>
@@ -2230,7 +2246,7 @@
                 <w:b/>
                 <w:bCs/>
               </w:rPr>
-              <w:t xml:space="preserve">Cadence</w:t>
+              <w:t xml:space="preserve">Takt</w:t>
             </w:r>
           </w:p>
         </w:tc>
@@ -3072,7 +3088,7 @@
         <w:jc w:val="both"/>
       </w:pPr>
       <w:r>
-        <w:t xml:space="preserve">Diese Cadence hat zwei Vorteile. Sie ist überschaubar, ein Mensch kann am Abend ehrlich beurteilen, was am Morgen versprochen wurde. Und sie produziert täglich Output auf dem Test-Server, was Stakeholder-Vertrauen aufbaut. Wer mit weniger Cadence arbeitet, läuft Gefahr, dass die KI im Hintergrund Dinge baut, die niemand mehr nachvollziehen kann.</w:t>
+        <w:t xml:space="preserve">Diese Takt hat zwei Vorteile. Sie ist überschaubar, ein Mensch kann am Abend ehrlich beurteilen, was am Morgen versprochen wurde. Und sie produziert täglich Output auf dem Test-Server, was Stakeholder-Vertrauen aufbaut. Wer mit weniger Takt arbeitet, läuft Gefahr, dass die KI im Hintergrund Dinge baut, die niemand mehr nachvollziehen kann.</w:t>
       </w:r>
     </w:p>
     <w:p>
@@ -3099,16 +3115,16 @@
         <w:jc w:val="both"/>
       </w:pPr>
       <w:r>
-        <w:t xml:space="preserve">Sie passen nicht für Architektur-Arbeit. Ein neues Modul, ein größeres Refactoring, eine Schemaerweiterung in der Datenbank, solche Aufgaben brauchen Denkzeit, in der nicht alle vier Stunden ein Zwischenstand erzwungen wird. Wer hier in zu enge Cadences zwingt, bekommt eine Folge halbgarer Pushes, von denen jeder einzeln den Test-Server destabilisiert.</w:t>
-      </w:r>
-    </w:p>
-    <w:p>
-      <w:pPr>
-        <w:spacing w:after="120" w:line="300"/>
-        <w:jc w:val="both"/>
-      </w:pPr>
-      <w:r>
-        <w:t xml:space="preserve">Eine pragmatische Regel: Solange die Iteration ein abgeschlossenes, deploybares Issue produziert, ist sie sinnvoll. Sobald das Issue gezwungen wird, in zwei Iterationen zerteilt zu werden, weil die Cadence drängt, ist die Cadence falsch.</w:t>
+        <w:t xml:space="preserve">Sie passen nicht für Architektur-Arbeit. Ein neues Modul, ein größeres Refactoring, eine Schemaerweiterung in der Datenbank, solche Aufgaben brauchen Denkzeit, in der nicht alle vier Stunden ein Zwischenstand erzwungen wird. Wer hier in zu enge Takte zwingt, bekommt eine Folge halbgarer Pushes, von denen jeder einzeln den Test-Server destabilisiert.</w:t>
+      </w:r>
+    </w:p>
+    <w:p>
+      <w:pPr>
+        <w:spacing w:after="120" w:line="300"/>
+        <w:jc w:val="both"/>
+      </w:pPr>
+      <w:r>
+        <w:t xml:space="preserve">Eine pragmatische Regel: Solange die Iteration ein abgeschlossenes, deploybares Issue produziert, ist sie sinnvoll. Sobald das Issue gezwungen wird, in zwei Iterationen zerteilt zu werden, weil die Takt drängt, ist die Takt falsch.</w:t>
       </w:r>
     </w:p>
     <w:p>
@@ -3162,7 +3178,7 @@
         <w:jc w:val="both"/>
       </w:pPr>
       <w:r>
-        <w:t xml:space="preserve">Für KI-augmentierte Entwicklung ist der Flow meist passender. Issues sind kleinteilig, ihre Bearbeitung dauert Stunden statt Tage. Ein Zwei-Wochen-Sprint, der mit dreißig Issues geplant wird, ist eher Bürokratie als Hilfsmittel. Ein Kanban-Board mit Ready-Reihenfolge ist die natürliche Form. Sprints behalten ihren Sinn dort, wo eine externe Cadence sie erzwingt, etwa eine zweiwöchige Release-Vorgabe oder eine fixierte Stakeholder-Review-Cadence.</w:t>
+        <w:t xml:space="preserve">Für KI-augmentierte Entwicklung ist der Flow meist passender. Issues sind kleinteilig, ihre Bearbeitung dauert Stunden statt Tage. Ein Zwei-Wochen-Sprint, der mit dreißig Issues geplant wird, ist eher Bürokratie als Hilfsmittel. Ein Kanban-Board mit Ready-Reihenfolge ist die natürliche Form. Sprints behalten ihren Sinn dort, wo eine externe Takt sie erzwingt, etwa eine zweiwöchige Release-Vorgabe oder eine fixierte Stakeholder-Review-Takt.</w:t>
       </w:r>
     </w:p>
     <w:p>
@@ -3987,13 +4003,13 @@
         <w:jc w:val="both"/>
       </w:pPr>
       <w:r>
-        <w:t xml:space="preserve">Erstens: mehr Autonomie der KI-Agenten. Was heute als Implementations-Engine fungiert, wird morgen in Mehr-Agenten-Konstellationen arbeiten, wie sie Agentsway</w:t>
+        <w:t xml:space="preserve">Erstens: mehr Autonomie der KI-Agenten. Was heute als Implementations-Engine fungiert, wird morgen in Mehr-Agenten-Aufstellungen arbeiten, wie sie Agentsway</w:t>
       </w:r>
       <w:r>
         <w:rPr>
           <w:rStyle w:val="FootnoteReference"/>
         </w:rPr>
-        <w:footnoteReference w:id="3"/>
+        <w:footnoteReference w:id="12"/>
       </w:r>
       <w:r>
         <w:t xml:space="preserve"> beschreibt. Ein Planning-Agent, ein Coding-Agent, ein Testing-Agent, ein Documentation-Agent, orchestriert von einer menschlichen orchestrierenden Person. Der hier formulierte Prozess ist auch in einer solchen Welt anwendbar; er muss nur in einigen Rollen anders besetzt werden.</w:t>
@@ -4011,7 +4027,7 @@
         <w:rPr>
           <w:rStyle w:val="FootnoteReference"/>
         </w:rPr>
-        <w:footnoteReference w:id="5"/>
+        <w:footnoteReference w:id="13"/>
       </w:r>
       <w:r>
         <w:t xml:space="preserve"> als Vision formuliert, wird in zwei Jahren Selbstverständlichkeit sein. Repositories werden Hintergrund-Loops haben, in denen kleine Verbesserungen kontinuierlich entstehen. Das macht die Trennung zwischen menschlich getakteter Iteration und KI-getakteter Hintergrundarbeit umso wichtiger.</w:t>
@@ -4029,7 +4045,7 @@
         <w:rPr>
           <w:rStyle w:val="FootnoteReference"/>
         </w:rPr>
-        <w:footnoteReference w:id="4"/>
+        <w:footnoteReference w:id="14"/>
       </w:r>
       <w:r>
         <w:t xml:space="preserve"> werden weiter unbeantwortet bleiben. Wie balanciert man KI-Autonomie und menschliche Oversight in Echtzeit? Welche Governance-Frameworks tragen ethische Anforderungen? Wie verändert sich die Kultur eines Teams, das täglich mit Sprachmodellen arbeitet? Welche Schulung brauchen agile Praktiker, um sinnvolle KI-Partnerschaften aufzubauen? Diese Fragen werden nicht durch Methoden gelöst, sondern durch Erfahrung. Der hier vorgeschlagene Prozess ist ein Vorschlag, sie zu sammeln.</w:t>
@@ -4273,7 +4289,7 @@
 
 <file path=word/footnotes.xml><?xml version="1.0" encoding="utf-8"?>
 <w:footnotes xmlns:wpc="http://schemas.microsoft.com/office/word/2010/wordprocessingCanvas" xmlns:mc="http://schemas.openxmlformats.org/markup-compatibility/2006" xmlns:o="urn:schemas-microsoft-com:office:office" xmlns:r="http://schemas.openxmlformats.org/officeDocument/2006/relationships" xmlns:m="http://schemas.openxmlformats.org/officeDocument/2006/math" xmlns:v="urn:schemas-microsoft-com:vml" xmlns:wp14="http://schemas.microsoft.com/office/word/2010/wordprocessingDrawing" xmlns:wp="http://schemas.openxmlformats.org/drawingml/2006/wordprocessingDrawing" xmlns:w10="urn:schemas-microsoft-com:office:word" xmlns:w="http://schemas.openxmlformats.org/wordprocessingml/2006/main" xmlns:w14="http://schemas.microsoft.com/office/word/2010/wordml" xmlns:w15="http://schemas.microsoft.com/office/word/2012/wordml" xmlns:wpg="http://schemas.microsoft.com/office/word/2010/wordprocessingGroup" xmlns:wpi="http://schemas.microsoft.com/office/word/2010/wordprocessingInk" xmlns:wne="http://schemas.microsoft.com/office/word/2006/wordml" xmlns:wps="http://schemas.microsoft.com/office/word/2010/wordprocessingShape" mc:Ignorable="w14 w15 wp14">
-  <w:footnote w:type="separator" w:id="-1">
+  <w:footnote w:type="continuationSeparator" w:id="0">
     <w:p>
       <w:pPr>
         <w:spacing w:after="0" w:line="240" w:lineRule="auto"/>
@@ -4285,11 +4301,11 @@
         <w:footnoteRef/>
       </w:r>
       <w:r>
-        <w:separator/>
+        <w:continuationSeparator/>
       </w:r>
     </w:p>
   </w:footnote>
-  <w:footnote w:type="continuationSeparator" w:id="0">
+  <w:footnote w:type="separator" w:id="-1">
     <w:p>
       <w:pPr>
         <w:spacing w:after="0" w:line="240" w:lineRule="auto"/>
@@ -4301,7 +4317,7 @@
         <w:footnoteRef/>
       </w:r>
       <w:r>
-        <w:continuationSeparator/>
+        <w:separator/>
       </w:r>
     </w:p>
   </w:footnote>
@@ -4400,6 +4416,92 @@
         <w:footnoteRef/>
       </w:r>
       <w:r>
+        <w:t xml:space="preserve">PMI und Agile Alliance: </w:t>
+      </w:r>
+      <w:r>
+        <w:rPr>
+          <w:i/>
+          <w:iCs/>
+        </w:rPr>
+        <w:t xml:space="preserve">Manifesto for Enterprise Agility</w:t>
+      </w:r>
+      <w:r>
+        <w:t xml:space="preserve">, 2026.</w:t>
+      </w:r>
+    </w:p>
+  </w:footnote>
+  <w:footnote w:id="6">
+    <w:p>
+      <w:r>
+        <w:rPr>
+          <w:rStyle w:val="FootnoteReference"/>
+        </w:rPr>
+        <w:footnoteRef/>
+      </w:r>
+      <w:r>
+        <w:t xml:space="preserve">„The AI-Native Software Development Lifecycle: A Theoretical and Practical New Methodology”, arXiv-Preprint 2408.03416, 2024. </w:t>
+      </w:r>
+      <w:hyperlink w:history="1" r:id="rIdlfo5pmbxpoocl-axvyli5">
+        <w:r>
+          <w:rPr>
+            <w:rStyle w:val="Hyperlink"/>
+          </w:rPr>
+          <w:t xml:space="preserve">arxiv.org/abs/2408.03416</w:t>
+        </w:r>
+      </w:hyperlink>
+    </w:p>
+  </w:footnote>
+  <w:footnote w:id="7">
+    <w:p>
+      <w:r>
+        <w:rPr>
+          <w:rStyle w:val="FootnoteReference"/>
+        </w:rPr>
+        <w:footnoteRef/>
+      </w:r>
+      <w:r>
+        <w:t xml:space="preserve">„Agentsway: Software Development Methodology for AI Agents-based Teams”, arXiv-Preprint 2510.23664, 2025. </w:t>
+      </w:r>
+      <w:hyperlink w:history="1" r:id="rId9jevxzvyoezuzae4_7vme">
+        <w:r>
+          <w:rPr>
+            <w:rStyle w:val="Hyperlink"/>
+          </w:rPr>
+          <w:t xml:space="preserve">arxiv.org/abs/2510.23664</w:t>
+        </w:r>
+      </w:hyperlink>
+    </w:p>
+  </w:footnote>
+  <w:footnote w:id="8">
+    <w:p>
+      <w:r>
+        <w:rPr>
+          <w:rStyle w:val="FootnoteReference"/>
+        </w:rPr>
+        <w:footnoteRef/>
+      </w:r>
+      <w:r>
+        <w:t xml:space="preserve">„AI and Agile Software Development: A Research Roadmap from the XP2025 Workshop”, arXiv-Preprint 2508.20563, 2025. </w:t>
+      </w:r>
+      <w:hyperlink w:history="1" r:id="rIdmun3h6dxhc8mbi7qs834f">
+        <w:r>
+          <w:rPr>
+            <w:rStyle w:val="Hyperlink"/>
+          </w:rPr>
+          <w:t xml:space="preserve">arxiv.org/abs/2508.20563</w:t>
+        </w:r>
+      </w:hyperlink>
+    </w:p>
+  </w:footnote>
+  <w:footnote w:id="9">
+    <w:p>
+      <w:r>
+        <w:rPr>
+          <w:rStyle w:val="FootnoteReference"/>
+        </w:rPr>
+        <w:footnoteRef/>
+      </w:r>
+      <w:r>
         <w:t xml:space="preserve">„Continuous AI in practice: What developers can automate today with agentic CI”, GitHub Blog, 2026. </w:t>
       </w:r>
       <w:hyperlink w:history="1" r:id="rIdchz6lblv2m5mxlm29gnt4">
@@ -4412,7 +4514,7 @@
       </w:hyperlink>
     </w:p>
   </w:footnote>
-  <w:footnote w:id="6">
+  <w:footnote w:id="10">
     <w:p>
       <w:r>
         <w:rPr>
@@ -4439,6 +4541,90 @@
             <w:rStyle w:val="Hyperlink"/>
           </w:rPr>
           <w:t xml:space="preserve">agilemanifesto.org</w:t>
+        </w:r>
+      </w:hyperlink>
+    </w:p>
+  </w:footnote>
+  <w:footnote w:id="11">
+    <w:p>
+      <w:r>
+        <w:rPr>
+          <w:rStyle w:val="FootnoteReference"/>
+        </w:rPr>
+        <w:footnoteRef/>
+      </w:r>
+      <w:r>
+        <w:t xml:space="preserve">„AI and Agile Software Development: A Research Roadmap from the XP2025 Workshop”, arXiv-Preprint 2508.20563, 2025. </w:t>
+      </w:r>
+      <w:hyperlink w:history="1" r:id="rIdmun3h6dxhc8mbi7qs834f">
+        <w:r>
+          <w:rPr>
+            <w:rStyle w:val="Hyperlink"/>
+          </w:rPr>
+          <w:t xml:space="preserve">arxiv.org/abs/2508.20563</w:t>
+        </w:r>
+      </w:hyperlink>
+    </w:p>
+  </w:footnote>
+  <w:footnote w:id="12">
+    <w:p>
+      <w:r>
+        <w:rPr>
+          <w:rStyle w:val="FootnoteReference"/>
+        </w:rPr>
+        <w:footnoteRef/>
+      </w:r>
+      <w:r>
+        <w:t xml:space="preserve">„Agentsway: Software Development Methodology for AI Agents-based Teams”, arXiv-Preprint 2510.23664, 2025. </w:t>
+      </w:r>
+      <w:hyperlink w:history="1" r:id="rId9jevxzvyoezuzae4_7vme">
+        <w:r>
+          <w:rPr>
+            <w:rStyle w:val="Hyperlink"/>
+          </w:rPr>
+          <w:t xml:space="preserve">arxiv.org/abs/2510.23664</w:t>
+        </w:r>
+      </w:hyperlink>
+    </w:p>
+  </w:footnote>
+  <w:footnote w:id="13">
+    <w:p>
+      <w:r>
+        <w:rPr>
+          <w:rStyle w:val="FootnoteReference"/>
+        </w:rPr>
+        <w:footnoteRef/>
+      </w:r>
+      <w:r>
+        <w:t xml:space="preserve">„Continuous AI in practice: What developers can automate today with agentic CI”, GitHub Blog, 2026. </w:t>
+      </w:r>
+      <w:hyperlink w:history="1" r:id="rIdchz6lblv2m5mxlm29gnt4">
+        <w:r>
+          <w:rPr>
+            <w:rStyle w:val="Hyperlink"/>
+          </w:rPr>
+          <w:t xml:space="preserve">github.blog/.../continuous-ai-in-practice</w:t>
+        </w:r>
+      </w:hyperlink>
+    </w:p>
+  </w:footnote>
+  <w:footnote w:id="14">
+    <w:p>
+      <w:r>
+        <w:rPr>
+          <w:rStyle w:val="FootnoteReference"/>
+        </w:rPr>
+        <w:footnoteRef/>
+      </w:r>
+      <w:r>
+        <w:t xml:space="preserve">„AI and Agile Software Development: A Research Roadmap from the XP2025 Workshop”, arXiv-Preprint 2508.20563, 2025. </w:t>
+      </w:r>
+      <w:hyperlink w:history="1" r:id="rIdmun3h6dxhc8mbi7qs834f">
+        <w:r>
+          <w:rPr>
+            <w:rStyle w:val="Hyperlink"/>
+          </w:rPr>
+          <w:t xml:space="preserve">arxiv.org/abs/2508.20563</w:t>
         </w:r>
       </w:hyperlink>
     </w:p>

</xml_diff>

<commit_message>
Entwicklungsprozess neu und CLAUDE-Python.md hinzugefügt2
</commit_message>
<xml_diff>
--- a/docs/ki-entwicklungsprozess.docx
+++ b/docs/ki-entwicklungsprozess.docx
@@ -76,7 +76,7 @@
       <w:pPr>
         <w:pStyle w:val="berschrift1"/>
       </w:pPr>
-      <w:bookmarkStart w:id="0" w:name="_Toc230531111"/>
+      <w:bookmarkStart w:id="0" w:name="_Toc230765969"/>
       <w:r>
         <w:lastRenderedPageBreak/>
         <w:t>Inhaltsverzeichnis</w:t>
@@ -113,7 +113,7 @@
           <w:r>
             <w:fldChar w:fldCharType="separate"/>
           </w:r>
-          <w:hyperlink w:anchor="_Toc230531111" w:history="1">
+          <w:hyperlink w:anchor="_Toc230765969" w:history="1">
             <w:r>
               <w:rPr>
                 <w:rStyle w:val="Hyperlink"/>
@@ -137,7 +137,7 @@
               <w:rPr>
                 <w:noProof/>
               </w:rPr>
-              <w:instrText xml:space="preserve"> PAGEREF _Toc230531111 \h </w:instrText>
+              <w:instrText xml:space="preserve"> PAGEREF _Toc230765969 \h </w:instrText>
             </w:r>
             <w:r>
               <w:rPr>
@@ -179,7 +179,7 @@
               <w14:ligatures w14:val="standardContextual"/>
             </w:rPr>
           </w:pPr>
-          <w:hyperlink w:anchor="_Toc230531112" w:history="1">
+          <w:hyperlink w:anchor="_Toc230765970" w:history="1">
             <w:r>
               <w:rPr>
                 <w:rStyle w:val="Hyperlink"/>
@@ -203,7 +203,7 @@
               <w:rPr>
                 <w:noProof/>
               </w:rPr>
-              <w:instrText xml:space="preserve"> PAGEREF _Toc230531112 \h </w:instrText>
+              <w:instrText xml:space="preserve"> PAGEREF _Toc230765970 \h </w:instrText>
             </w:r>
             <w:r>
               <w:rPr>
@@ -245,7 +245,7 @@
               <w14:ligatures w14:val="standardContextual"/>
             </w:rPr>
           </w:pPr>
-          <w:hyperlink w:anchor="_Toc230531113" w:history="1">
+          <w:hyperlink w:anchor="_Toc230765971" w:history="1">
             <w:r>
               <w:rPr>
                 <w:rStyle w:val="Hyperlink"/>
@@ -269,7 +269,7 @@
               <w:rPr>
                 <w:noProof/>
               </w:rPr>
-              <w:instrText xml:space="preserve"> PAGEREF _Toc230531113 \h </w:instrText>
+              <w:instrText xml:space="preserve"> PAGEREF _Toc230765971 \h </w:instrText>
             </w:r>
             <w:r>
               <w:rPr>
@@ -311,7 +311,7 @@
               <w14:ligatures w14:val="standardContextual"/>
             </w:rPr>
           </w:pPr>
-          <w:hyperlink w:anchor="_Toc230531114" w:history="1">
+          <w:hyperlink w:anchor="_Toc230765972" w:history="1">
             <w:r>
               <w:rPr>
                 <w:rStyle w:val="Hyperlink"/>
@@ -335,7 +335,7 @@
               <w:rPr>
                 <w:noProof/>
               </w:rPr>
-              <w:instrText xml:space="preserve"> PAGEREF _Toc230531114 \h </w:instrText>
+              <w:instrText xml:space="preserve"> PAGEREF _Toc230765972 \h </w:instrText>
             </w:r>
             <w:r>
               <w:rPr>
@@ -352,7 +352,7 @@
               <w:rPr>
                 <w:noProof/>
               </w:rPr>
-              <w:t>7</w:t>
+              <w:t>6</w:t>
             </w:r>
             <w:r>
               <w:rPr>
@@ -377,7 +377,7 @@
               <w14:ligatures w14:val="standardContextual"/>
             </w:rPr>
           </w:pPr>
-          <w:hyperlink w:anchor="_Toc230531115" w:history="1">
+          <w:hyperlink w:anchor="_Toc230765973" w:history="1">
             <w:r>
               <w:rPr>
                 <w:rStyle w:val="Hyperlink"/>
@@ -401,7 +401,7 @@
               <w:rPr>
                 <w:noProof/>
               </w:rPr>
-              <w:instrText xml:space="preserve"> PAGEREF _Toc230531115 \h </w:instrText>
+              <w:instrText xml:space="preserve"> PAGEREF _Toc230765973 \h </w:instrText>
             </w:r>
             <w:r>
               <w:rPr>
@@ -418,7 +418,7 @@
               <w:rPr>
                 <w:noProof/>
               </w:rPr>
-              <w:t>7</w:t>
+              <w:t>6</w:t>
             </w:r>
             <w:r>
               <w:rPr>
@@ -443,7 +443,7 @@
               <w14:ligatures w14:val="standardContextual"/>
             </w:rPr>
           </w:pPr>
-          <w:hyperlink w:anchor="_Toc230531116" w:history="1">
+          <w:hyperlink w:anchor="_Toc230765974" w:history="1">
             <w:r>
               <w:rPr>
                 <w:rStyle w:val="Hyperlink"/>
@@ -467,7 +467,7 @@
               <w:rPr>
                 <w:noProof/>
               </w:rPr>
-              <w:instrText xml:space="preserve"> PAGEREF _Toc230531116 \h </w:instrText>
+              <w:instrText xml:space="preserve"> PAGEREF _Toc230765974 \h </w:instrText>
             </w:r>
             <w:r>
               <w:rPr>
@@ -484,7 +484,7 @@
               <w:rPr>
                 <w:noProof/>
               </w:rPr>
-              <w:t>7</w:t>
+              <w:t>6</w:t>
             </w:r>
             <w:r>
               <w:rPr>
@@ -509,7 +509,7 @@
               <w14:ligatures w14:val="standardContextual"/>
             </w:rPr>
           </w:pPr>
-          <w:hyperlink w:anchor="_Toc230531117" w:history="1">
+          <w:hyperlink w:anchor="_Toc230765975" w:history="1">
             <w:r>
               <w:rPr>
                 <w:rStyle w:val="Hyperlink"/>
@@ -533,7 +533,7 @@
               <w:rPr>
                 <w:noProof/>
               </w:rPr>
-              <w:instrText xml:space="preserve"> PAGEREF _Toc230531117 \h </w:instrText>
+              <w:instrText xml:space="preserve"> PAGEREF _Toc230765975 \h </w:instrText>
             </w:r>
             <w:r>
               <w:rPr>
@@ -550,7 +550,7 @@
               <w:rPr>
                 <w:noProof/>
               </w:rPr>
-              <w:t>7</w:t>
+              <w:t>6</w:t>
             </w:r>
             <w:r>
               <w:rPr>
@@ -575,7 +575,7 @@
               <w14:ligatures w14:val="standardContextual"/>
             </w:rPr>
           </w:pPr>
-          <w:hyperlink w:anchor="_Toc230531118" w:history="1">
+          <w:hyperlink w:anchor="_Toc230765976" w:history="1">
             <w:r>
               <w:rPr>
                 <w:rStyle w:val="Hyperlink"/>
@@ -599,7 +599,7 @@
               <w:rPr>
                 <w:noProof/>
               </w:rPr>
-              <w:instrText xml:space="preserve"> PAGEREF _Toc230531118 \h </w:instrText>
+              <w:instrText xml:space="preserve"> PAGEREF _Toc230765976 \h </w:instrText>
             </w:r>
             <w:r>
               <w:rPr>
@@ -641,7 +641,7 @@
               <w14:ligatures w14:val="standardContextual"/>
             </w:rPr>
           </w:pPr>
-          <w:hyperlink w:anchor="_Toc230531119" w:history="1">
+          <w:hyperlink w:anchor="_Toc230765977" w:history="1">
             <w:r>
               <w:rPr>
                 <w:rStyle w:val="Hyperlink"/>
@@ -665,7 +665,7 @@
               <w:rPr>
                 <w:noProof/>
               </w:rPr>
-              <w:instrText xml:space="preserve"> PAGEREF _Toc230531119 \h </w:instrText>
+              <w:instrText xml:space="preserve"> PAGEREF _Toc230765977 \h </w:instrText>
             </w:r>
             <w:r>
               <w:rPr>
@@ -682,7 +682,7 @@
               <w:rPr>
                 <w:noProof/>
               </w:rPr>
-              <w:t>8</w:t>
+              <w:t>7</w:t>
             </w:r>
             <w:r>
               <w:rPr>
@@ -707,7 +707,7 @@
               <w14:ligatures w14:val="standardContextual"/>
             </w:rPr>
           </w:pPr>
-          <w:hyperlink w:anchor="_Toc230531120" w:history="1">
+          <w:hyperlink w:anchor="_Toc230765978" w:history="1">
             <w:r>
               <w:rPr>
                 <w:rStyle w:val="Hyperlink"/>
@@ -731,7 +731,7 @@
               <w:rPr>
                 <w:noProof/>
               </w:rPr>
-              <w:instrText xml:space="preserve"> PAGEREF _Toc230531120 \h </w:instrText>
+              <w:instrText xml:space="preserve"> PAGEREF _Toc230765978 \h </w:instrText>
             </w:r>
             <w:r>
               <w:rPr>
@@ -748,7 +748,7 @@
               <w:rPr>
                 <w:noProof/>
               </w:rPr>
-              <w:t>8</w:t>
+              <w:t>7</w:t>
             </w:r>
             <w:r>
               <w:rPr>
@@ -773,7 +773,7 @@
               <w14:ligatures w14:val="standardContextual"/>
             </w:rPr>
           </w:pPr>
-          <w:hyperlink w:anchor="_Toc230531121" w:history="1">
+          <w:hyperlink w:anchor="_Toc230765979" w:history="1">
             <w:r>
               <w:rPr>
                 <w:rStyle w:val="Hyperlink"/>
@@ -797,7 +797,7 @@
               <w:rPr>
                 <w:noProof/>
               </w:rPr>
-              <w:instrText xml:space="preserve"> PAGEREF _Toc230531121 \h </w:instrText>
+              <w:instrText xml:space="preserve"> PAGEREF _Toc230765979 \h </w:instrText>
             </w:r>
             <w:r>
               <w:rPr>
@@ -814,7 +814,7 @@
               <w:rPr>
                 <w:noProof/>
               </w:rPr>
-              <w:t>9</w:t>
+              <w:t>7</w:t>
             </w:r>
             <w:r>
               <w:rPr>
@@ -839,7 +839,7 @@
               <w14:ligatures w14:val="standardContextual"/>
             </w:rPr>
           </w:pPr>
-          <w:hyperlink w:anchor="_Toc230531122" w:history="1">
+          <w:hyperlink w:anchor="_Toc230765980" w:history="1">
             <w:r>
               <w:rPr>
                 <w:rStyle w:val="Hyperlink"/>
@@ -863,7 +863,7 @@
               <w:rPr>
                 <w:noProof/>
               </w:rPr>
-              <w:instrText xml:space="preserve"> PAGEREF _Toc230531122 \h </w:instrText>
+              <w:instrText xml:space="preserve"> PAGEREF _Toc230765980 \h </w:instrText>
             </w:r>
             <w:r>
               <w:rPr>
@@ -880,7 +880,7 @@
               <w:rPr>
                 <w:noProof/>
               </w:rPr>
-              <w:t>9</w:t>
+              <w:t>8</w:t>
             </w:r>
             <w:r>
               <w:rPr>
@@ -905,7 +905,7 @@
               <w14:ligatures w14:val="standardContextual"/>
             </w:rPr>
           </w:pPr>
-          <w:hyperlink w:anchor="_Toc230531123" w:history="1">
+          <w:hyperlink w:anchor="_Toc230765981" w:history="1">
             <w:r>
               <w:rPr>
                 <w:rStyle w:val="Hyperlink"/>
@@ -929,7 +929,7 @@
               <w:rPr>
                 <w:noProof/>
               </w:rPr>
-              <w:instrText xml:space="preserve"> PAGEREF _Toc230531123 \h </w:instrText>
+              <w:instrText xml:space="preserve"> PAGEREF _Toc230765981 \h </w:instrText>
             </w:r>
             <w:r>
               <w:rPr>
@@ -946,7 +946,7 @@
               <w:rPr>
                 <w:noProof/>
               </w:rPr>
-              <w:t>9</w:t>
+              <w:t>8</w:t>
             </w:r>
             <w:r>
               <w:rPr>
@@ -971,7 +971,7 @@
               <w14:ligatures w14:val="standardContextual"/>
             </w:rPr>
           </w:pPr>
-          <w:hyperlink w:anchor="_Toc230531124" w:history="1">
+          <w:hyperlink w:anchor="_Toc230765982" w:history="1">
             <w:r>
               <w:rPr>
                 <w:rStyle w:val="Hyperlink"/>
@@ -995,7 +995,7 @@
               <w:rPr>
                 <w:noProof/>
               </w:rPr>
-              <w:instrText xml:space="preserve"> PAGEREF _Toc230531124 \h </w:instrText>
+              <w:instrText xml:space="preserve"> PAGEREF _Toc230765982 \h </w:instrText>
             </w:r>
             <w:r>
               <w:rPr>
@@ -1012,7 +1012,7 @@
               <w:rPr>
                 <w:noProof/>
               </w:rPr>
-              <w:t>10</w:t>
+              <w:t>8</w:t>
             </w:r>
             <w:r>
               <w:rPr>
@@ -1037,7 +1037,7 @@
               <w14:ligatures w14:val="standardContextual"/>
             </w:rPr>
           </w:pPr>
-          <w:hyperlink w:anchor="_Toc230531125" w:history="1">
+          <w:hyperlink w:anchor="_Toc230765983" w:history="1">
             <w:r>
               <w:rPr>
                 <w:rStyle w:val="Hyperlink"/>
@@ -1061,7 +1061,7 @@
               <w:rPr>
                 <w:noProof/>
               </w:rPr>
-              <w:instrText xml:space="preserve"> PAGEREF _Toc230531125 \h </w:instrText>
+              <w:instrText xml:space="preserve"> PAGEREF _Toc230765983 \h </w:instrText>
             </w:r>
             <w:r>
               <w:rPr>
@@ -1078,7 +1078,7 @@
               <w:rPr>
                 <w:noProof/>
               </w:rPr>
-              <w:t>11</w:t>
+              <w:t>9</w:t>
             </w:r>
             <w:r>
               <w:rPr>
@@ -1103,7 +1103,7 @@
               <w14:ligatures w14:val="standardContextual"/>
             </w:rPr>
           </w:pPr>
-          <w:hyperlink w:anchor="_Toc230531126" w:history="1">
+          <w:hyperlink w:anchor="_Toc230765984" w:history="1">
             <w:r>
               <w:rPr>
                 <w:rStyle w:val="Hyperlink"/>
@@ -1127,7 +1127,7 @@
               <w:rPr>
                 <w:noProof/>
               </w:rPr>
-              <w:instrText xml:space="preserve"> PAGEREF _Toc230531126 \h </w:instrText>
+              <w:instrText xml:space="preserve"> PAGEREF _Toc230765984 \h </w:instrText>
             </w:r>
             <w:r>
               <w:rPr>
@@ -1144,7 +1144,7 @@
               <w:rPr>
                 <w:noProof/>
               </w:rPr>
-              <w:t>11</w:t>
+              <w:t>9</w:t>
             </w:r>
             <w:r>
               <w:rPr>
@@ -1169,7 +1169,7 @@
               <w14:ligatures w14:val="standardContextual"/>
             </w:rPr>
           </w:pPr>
-          <w:hyperlink w:anchor="_Toc230531127" w:history="1">
+          <w:hyperlink w:anchor="_Toc230765985" w:history="1">
             <w:r>
               <w:rPr>
                 <w:rStyle w:val="Hyperlink"/>
@@ -1193,7 +1193,7 @@
               <w:rPr>
                 <w:noProof/>
               </w:rPr>
-              <w:instrText xml:space="preserve"> PAGEREF _Toc230531127 \h </w:instrText>
+              <w:instrText xml:space="preserve"> PAGEREF _Toc230765985 \h </w:instrText>
             </w:r>
             <w:r>
               <w:rPr>
@@ -1210,7 +1210,7 @@
               <w:rPr>
                 <w:noProof/>
               </w:rPr>
-              <w:t>11</w:t>
+              <w:t>9</w:t>
             </w:r>
             <w:r>
               <w:rPr>
@@ -1235,7 +1235,7 @@
               <w14:ligatures w14:val="standardContextual"/>
             </w:rPr>
           </w:pPr>
-          <w:hyperlink w:anchor="_Toc230531128" w:history="1">
+          <w:hyperlink w:anchor="_Toc230765986" w:history="1">
             <w:r>
               <w:rPr>
                 <w:rStyle w:val="Hyperlink"/>
@@ -1259,7 +1259,7 @@
               <w:rPr>
                 <w:noProof/>
               </w:rPr>
-              <w:instrText xml:space="preserve"> PAGEREF _Toc230531128 \h </w:instrText>
+              <w:instrText xml:space="preserve"> PAGEREF _Toc230765986 \h </w:instrText>
             </w:r>
             <w:r>
               <w:rPr>
@@ -1276,7 +1276,7 @@
               <w:rPr>
                 <w:noProof/>
               </w:rPr>
-              <w:t>11</w:t>
+              <w:t>10</w:t>
             </w:r>
             <w:r>
               <w:rPr>
@@ -1301,7 +1301,7 @@
               <w14:ligatures w14:val="standardContextual"/>
             </w:rPr>
           </w:pPr>
-          <w:hyperlink w:anchor="_Toc230531129" w:history="1">
+          <w:hyperlink w:anchor="_Toc230765987" w:history="1">
             <w:r>
               <w:rPr>
                 <w:rStyle w:val="Hyperlink"/>
@@ -1325,7 +1325,7 @@
               <w:rPr>
                 <w:noProof/>
               </w:rPr>
-              <w:instrText xml:space="preserve"> PAGEREF _Toc230531129 \h </w:instrText>
+              <w:instrText xml:space="preserve"> PAGEREF _Toc230765987 \h </w:instrText>
             </w:r>
             <w:r>
               <w:rPr>
@@ -1342,7 +1342,7 @@
               <w:rPr>
                 <w:noProof/>
               </w:rPr>
-              <w:t>12</w:t>
+              <w:t>10</w:t>
             </w:r>
             <w:r>
               <w:rPr>
@@ -1367,7 +1367,7 @@
               <w14:ligatures w14:val="standardContextual"/>
             </w:rPr>
           </w:pPr>
-          <w:hyperlink w:anchor="_Toc230531130" w:history="1">
+          <w:hyperlink w:anchor="_Toc230765988" w:history="1">
             <w:r>
               <w:rPr>
                 <w:rStyle w:val="Hyperlink"/>
@@ -1391,7 +1391,7 @@
               <w:rPr>
                 <w:noProof/>
               </w:rPr>
-              <w:instrText xml:space="preserve"> PAGEREF _Toc230531130 \h </w:instrText>
+              <w:instrText xml:space="preserve"> PAGEREF _Toc230765988 \h </w:instrText>
             </w:r>
             <w:r>
               <w:rPr>
@@ -1408,7 +1408,7 @@
               <w:rPr>
                 <w:noProof/>
               </w:rPr>
-              <w:t>12</w:t>
+              <w:t>10</w:t>
             </w:r>
             <w:r>
               <w:rPr>
@@ -1433,7 +1433,7 @@
               <w14:ligatures w14:val="standardContextual"/>
             </w:rPr>
           </w:pPr>
-          <w:hyperlink w:anchor="_Toc230531131" w:history="1">
+          <w:hyperlink w:anchor="_Toc230765989" w:history="1">
             <w:r>
               <w:rPr>
                 <w:rStyle w:val="Hyperlink"/>
@@ -1457,7 +1457,7 @@
               <w:rPr>
                 <w:noProof/>
               </w:rPr>
-              <w:instrText xml:space="preserve"> PAGEREF _Toc230531131 \h </w:instrText>
+              <w:instrText xml:space="preserve"> PAGEREF _Toc230765989 \h </w:instrText>
             </w:r>
             <w:r>
               <w:rPr>
@@ -1474,7 +1474,7 @@
               <w:rPr>
                 <w:noProof/>
               </w:rPr>
-              <w:t>12</w:t>
+              <w:t>11</w:t>
             </w:r>
             <w:r>
               <w:rPr>
@@ -1499,7 +1499,7 @@
               <w14:ligatures w14:val="standardContextual"/>
             </w:rPr>
           </w:pPr>
-          <w:hyperlink w:anchor="_Toc230531132" w:history="1">
+          <w:hyperlink w:anchor="_Toc230765990" w:history="1">
             <w:r>
               <w:rPr>
                 <w:rStyle w:val="Hyperlink"/>
@@ -1523,7 +1523,7 @@
               <w:rPr>
                 <w:noProof/>
               </w:rPr>
-              <w:instrText xml:space="preserve"> PAGEREF _Toc230531132 \h </w:instrText>
+              <w:instrText xml:space="preserve"> PAGEREF _Toc230765990 \h </w:instrText>
             </w:r>
             <w:r>
               <w:rPr>
@@ -1540,7 +1540,7 @@
               <w:rPr>
                 <w:noProof/>
               </w:rPr>
-              <w:t>13</w:t>
+              <w:t>11</w:t>
             </w:r>
             <w:r>
               <w:rPr>
@@ -1565,7 +1565,7 @@
               <w14:ligatures w14:val="standardContextual"/>
             </w:rPr>
           </w:pPr>
-          <w:hyperlink w:anchor="_Toc230531133" w:history="1">
+          <w:hyperlink w:anchor="_Toc230765991" w:history="1">
             <w:r>
               <w:rPr>
                 <w:rStyle w:val="Hyperlink"/>
@@ -1589,7 +1589,7 @@
               <w:rPr>
                 <w:noProof/>
               </w:rPr>
-              <w:instrText xml:space="preserve"> PAGEREF _Toc230531133 \h </w:instrText>
+              <w:instrText xml:space="preserve"> PAGEREF _Toc230765991 \h </w:instrText>
             </w:r>
             <w:r>
               <w:rPr>
@@ -1606,7 +1606,7 @@
               <w:rPr>
                 <w:noProof/>
               </w:rPr>
-              <w:t>13</w:t>
+              <w:t>11</w:t>
             </w:r>
             <w:r>
               <w:rPr>
@@ -1631,7 +1631,7 @@
               <w14:ligatures w14:val="standardContextual"/>
             </w:rPr>
           </w:pPr>
-          <w:hyperlink w:anchor="_Toc230531134" w:history="1">
+          <w:hyperlink w:anchor="_Toc230765992" w:history="1">
             <w:r>
               <w:rPr>
                 <w:rStyle w:val="Hyperlink"/>
@@ -1655,7 +1655,7 @@
               <w:rPr>
                 <w:noProof/>
               </w:rPr>
-              <w:instrText xml:space="preserve"> PAGEREF _Toc230531134 \h </w:instrText>
+              <w:instrText xml:space="preserve"> PAGEREF _Toc230765992 \h </w:instrText>
             </w:r>
             <w:r>
               <w:rPr>
@@ -1672,7 +1672,7 @@
               <w:rPr>
                 <w:noProof/>
               </w:rPr>
-              <w:t>13</w:t>
+              <w:t>12</w:t>
             </w:r>
             <w:r>
               <w:rPr>
@@ -1697,7 +1697,7 @@
               <w14:ligatures w14:val="standardContextual"/>
             </w:rPr>
           </w:pPr>
-          <w:hyperlink w:anchor="_Toc230531135" w:history="1">
+          <w:hyperlink w:anchor="_Toc230765993" w:history="1">
             <w:r>
               <w:rPr>
                 <w:rStyle w:val="Hyperlink"/>
@@ -1721,7 +1721,7 @@
               <w:rPr>
                 <w:noProof/>
               </w:rPr>
-              <w:instrText xml:space="preserve"> PAGEREF _Toc230531135 \h </w:instrText>
+              <w:instrText xml:space="preserve"> PAGEREF _Toc230765993 \h </w:instrText>
             </w:r>
             <w:r>
               <w:rPr>
@@ -1738,7 +1738,7 @@
               <w:rPr>
                 <w:noProof/>
               </w:rPr>
-              <w:t>13</w:t>
+              <w:t>12</w:t>
             </w:r>
             <w:r>
               <w:rPr>
@@ -1763,7 +1763,7 @@
               <w14:ligatures w14:val="standardContextual"/>
             </w:rPr>
           </w:pPr>
-          <w:hyperlink w:anchor="_Toc230531136" w:history="1">
+          <w:hyperlink w:anchor="_Toc230765994" w:history="1">
             <w:r>
               <w:rPr>
                 <w:rStyle w:val="Hyperlink"/>
@@ -1787,7 +1787,7 @@
               <w:rPr>
                 <w:noProof/>
               </w:rPr>
-              <w:instrText xml:space="preserve"> PAGEREF _Toc230531136 \h </w:instrText>
+              <w:instrText xml:space="preserve"> PAGEREF _Toc230765994 \h </w:instrText>
             </w:r>
             <w:r>
               <w:rPr>
@@ -1804,7 +1804,7 @@
               <w:rPr>
                 <w:noProof/>
               </w:rPr>
-              <w:t>14</w:t>
+              <w:t>12</w:t>
             </w:r>
             <w:r>
               <w:rPr>
@@ -1829,7 +1829,7 @@
               <w14:ligatures w14:val="standardContextual"/>
             </w:rPr>
           </w:pPr>
-          <w:hyperlink w:anchor="_Toc230531137" w:history="1">
+          <w:hyperlink w:anchor="_Toc230765995" w:history="1">
             <w:r>
               <w:rPr>
                 <w:rStyle w:val="Hyperlink"/>
@@ -1853,7 +1853,7 @@
               <w:rPr>
                 <w:noProof/>
               </w:rPr>
-              <w:instrText xml:space="preserve"> PAGEREF _Toc230531137 \h </w:instrText>
+              <w:instrText xml:space="preserve"> PAGEREF _Toc230765995 \h </w:instrText>
             </w:r>
             <w:r>
               <w:rPr>
@@ -1870,7 +1870,7 @@
               <w:rPr>
                 <w:noProof/>
               </w:rPr>
-              <w:t>14</w:t>
+              <w:t>12</w:t>
             </w:r>
             <w:r>
               <w:rPr>
@@ -1895,7 +1895,7 @@
               <w14:ligatures w14:val="standardContextual"/>
             </w:rPr>
           </w:pPr>
-          <w:hyperlink w:anchor="_Toc230531138" w:history="1">
+          <w:hyperlink w:anchor="_Toc230765996" w:history="1">
             <w:r>
               <w:rPr>
                 <w:rStyle w:val="Hyperlink"/>
@@ -1919,7 +1919,7 @@
               <w:rPr>
                 <w:noProof/>
               </w:rPr>
-              <w:instrText xml:space="preserve"> PAGEREF _Toc230531138 \h </w:instrText>
+              <w:instrText xml:space="preserve"> PAGEREF _Toc230765996 \h </w:instrText>
             </w:r>
             <w:r>
               <w:rPr>
@@ -1936,7 +1936,7 @@
               <w:rPr>
                 <w:noProof/>
               </w:rPr>
-              <w:t>14</w:t>
+              <w:t>13</w:t>
             </w:r>
             <w:r>
               <w:rPr>
@@ -1961,7 +1961,7 @@
               <w14:ligatures w14:val="standardContextual"/>
             </w:rPr>
           </w:pPr>
-          <w:hyperlink w:anchor="_Toc230531139" w:history="1">
+          <w:hyperlink w:anchor="_Toc230765997" w:history="1">
             <w:r>
               <w:rPr>
                 <w:rStyle w:val="Hyperlink"/>
@@ -1985,7 +1985,7 @@
               <w:rPr>
                 <w:noProof/>
               </w:rPr>
-              <w:instrText xml:space="preserve"> PAGEREF _Toc230531139 \h </w:instrText>
+              <w:instrText xml:space="preserve"> PAGEREF _Toc230765997 \h </w:instrText>
             </w:r>
             <w:r>
               <w:rPr>
@@ -2002,7 +2002,7 @@
               <w:rPr>
                 <w:noProof/>
               </w:rPr>
-              <w:t>15</w:t>
+              <w:t>13</w:t>
             </w:r>
             <w:r>
               <w:rPr>
@@ -2027,7 +2027,7 @@
               <w14:ligatures w14:val="standardContextual"/>
             </w:rPr>
           </w:pPr>
-          <w:hyperlink w:anchor="_Toc230531140" w:history="1">
+          <w:hyperlink w:anchor="_Toc230765998" w:history="1">
             <w:r>
               <w:rPr>
                 <w:rStyle w:val="Hyperlink"/>
@@ -2051,7 +2051,7 @@
               <w:rPr>
                 <w:noProof/>
               </w:rPr>
-              <w:instrText xml:space="preserve"> PAGEREF _Toc230531140 \h </w:instrText>
+              <w:instrText xml:space="preserve"> PAGEREF _Toc230765998 \h </w:instrText>
             </w:r>
             <w:r>
               <w:rPr>
@@ -2068,7 +2068,7 @@
               <w:rPr>
                 <w:noProof/>
               </w:rPr>
-              <w:t>15</w:t>
+              <w:t>13</w:t>
             </w:r>
             <w:r>
               <w:rPr>
@@ -2093,7 +2093,7 @@
               <w14:ligatures w14:val="standardContextual"/>
             </w:rPr>
           </w:pPr>
-          <w:hyperlink w:anchor="_Toc230531141" w:history="1">
+          <w:hyperlink w:anchor="_Toc230765999" w:history="1">
             <w:r>
               <w:rPr>
                 <w:rStyle w:val="Hyperlink"/>
@@ -2117,7 +2117,7 @@
               <w:rPr>
                 <w:noProof/>
               </w:rPr>
-              <w:instrText xml:space="preserve"> PAGEREF _Toc230531141 \h </w:instrText>
+              <w:instrText xml:space="preserve"> PAGEREF _Toc230765999 \h </w:instrText>
             </w:r>
             <w:r>
               <w:rPr>
@@ -2134,7 +2134,7 @@
               <w:rPr>
                 <w:noProof/>
               </w:rPr>
-              <w:t>15</w:t>
+              <w:t>13</w:t>
             </w:r>
             <w:r>
               <w:rPr>
@@ -2159,7 +2159,7 @@
               <w14:ligatures w14:val="standardContextual"/>
             </w:rPr>
           </w:pPr>
-          <w:hyperlink w:anchor="_Toc230531142" w:history="1">
+          <w:hyperlink w:anchor="_Toc230766000" w:history="1">
             <w:r>
               <w:rPr>
                 <w:rStyle w:val="Hyperlink"/>
@@ -2183,7 +2183,7 @@
               <w:rPr>
                 <w:noProof/>
               </w:rPr>
-              <w:instrText xml:space="preserve"> PAGEREF _Toc230531142 \h </w:instrText>
+              <w:instrText xml:space="preserve"> PAGEREF _Toc230766000 \h </w:instrText>
             </w:r>
             <w:r>
               <w:rPr>
@@ -2200,7 +2200,7 @@
               <w:rPr>
                 <w:noProof/>
               </w:rPr>
-              <w:t>15</w:t>
+              <w:t>14</w:t>
             </w:r>
             <w:r>
               <w:rPr>
@@ -2225,7 +2225,7 @@
               <w14:ligatures w14:val="standardContextual"/>
             </w:rPr>
           </w:pPr>
-          <w:hyperlink w:anchor="_Toc230531143" w:history="1">
+          <w:hyperlink w:anchor="_Toc230766001" w:history="1">
             <w:r>
               <w:rPr>
                 <w:rStyle w:val="Hyperlink"/>
@@ -2249,7 +2249,7 @@
               <w:rPr>
                 <w:noProof/>
               </w:rPr>
-              <w:instrText xml:space="preserve"> PAGEREF _Toc230531143 \h </w:instrText>
+              <w:instrText xml:space="preserve"> PAGEREF _Toc230766001 \h </w:instrText>
             </w:r>
             <w:r>
               <w:rPr>
@@ -2266,7 +2266,7 @@
               <w:rPr>
                 <w:noProof/>
               </w:rPr>
-              <w:t>15</w:t>
+              <w:t>14</w:t>
             </w:r>
             <w:r>
               <w:rPr>
@@ -2291,7 +2291,7 @@
               <w14:ligatures w14:val="standardContextual"/>
             </w:rPr>
           </w:pPr>
-          <w:hyperlink w:anchor="_Toc230531144" w:history="1">
+          <w:hyperlink w:anchor="_Toc230766002" w:history="1">
             <w:r>
               <w:rPr>
                 <w:rStyle w:val="Hyperlink"/>
@@ -2315,7 +2315,7 @@
               <w:rPr>
                 <w:noProof/>
               </w:rPr>
-              <w:instrText xml:space="preserve"> PAGEREF _Toc230531144 \h </w:instrText>
+              <w:instrText xml:space="preserve"> PAGEREF _Toc230766002 \h </w:instrText>
             </w:r>
             <w:r>
               <w:rPr>
@@ -2332,7 +2332,7 @@
               <w:rPr>
                 <w:noProof/>
               </w:rPr>
-              <w:t>16</w:t>
+              <w:t>15</w:t>
             </w:r>
             <w:r>
               <w:rPr>
@@ -2357,7 +2357,7 @@
               <w14:ligatures w14:val="standardContextual"/>
             </w:rPr>
           </w:pPr>
-          <w:hyperlink w:anchor="_Toc230531145" w:history="1">
+          <w:hyperlink w:anchor="_Toc230766003" w:history="1">
             <w:r>
               <w:rPr>
                 <w:rStyle w:val="Hyperlink"/>
@@ -2381,7 +2381,7 @@
               <w:rPr>
                 <w:noProof/>
               </w:rPr>
-              <w:instrText xml:space="preserve"> PAGEREF _Toc230531145 \h </w:instrText>
+              <w:instrText xml:space="preserve"> PAGEREF _Toc230766003 \h </w:instrText>
             </w:r>
             <w:r>
               <w:rPr>
@@ -2398,7 +2398,7 @@
               <w:rPr>
                 <w:noProof/>
               </w:rPr>
-              <w:t>17</w:t>
+              <w:t>15</w:t>
             </w:r>
             <w:r>
               <w:rPr>
@@ -2423,7 +2423,7 @@
               <w14:ligatures w14:val="standardContextual"/>
             </w:rPr>
           </w:pPr>
-          <w:hyperlink w:anchor="_Toc230531146" w:history="1">
+          <w:hyperlink w:anchor="_Toc230766004" w:history="1">
             <w:r>
               <w:rPr>
                 <w:rStyle w:val="Hyperlink"/>
@@ -2447,7 +2447,7 @@
               <w:rPr>
                 <w:noProof/>
               </w:rPr>
-              <w:instrText xml:space="preserve"> PAGEREF _Toc230531146 \h </w:instrText>
+              <w:instrText xml:space="preserve"> PAGEREF _Toc230766004 \h </w:instrText>
             </w:r>
             <w:r>
               <w:rPr>
@@ -2464,7 +2464,7 @@
               <w:rPr>
                 <w:noProof/>
               </w:rPr>
-              <w:t>17</w:t>
+              <w:t>15</w:t>
             </w:r>
             <w:r>
               <w:rPr>
@@ -2489,7 +2489,7 @@
               <w14:ligatures w14:val="standardContextual"/>
             </w:rPr>
           </w:pPr>
-          <w:hyperlink w:anchor="_Toc230531147" w:history="1">
+          <w:hyperlink w:anchor="_Toc230766005" w:history="1">
             <w:r>
               <w:rPr>
                 <w:rStyle w:val="Hyperlink"/>
@@ -2513,7 +2513,7 @@
               <w:rPr>
                 <w:noProof/>
               </w:rPr>
-              <w:instrText xml:space="preserve"> PAGEREF _Toc230531147 \h </w:instrText>
+              <w:instrText xml:space="preserve"> PAGEREF _Toc230766005 \h </w:instrText>
             </w:r>
             <w:r>
               <w:rPr>
@@ -2530,7 +2530,7 @@
               <w:rPr>
                 <w:noProof/>
               </w:rPr>
-              <w:t>17</w:t>
+              <w:t>15</w:t>
             </w:r>
             <w:r>
               <w:rPr>
@@ -2555,7 +2555,7 @@
               <w14:ligatures w14:val="standardContextual"/>
             </w:rPr>
           </w:pPr>
-          <w:hyperlink w:anchor="_Toc230531148" w:history="1">
+          <w:hyperlink w:anchor="_Toc230766006" w:history="1">
             <w:r>
               <w:rPr>
                 <w:rStyle w:val="Hyperlink"/>
@@ -2579,7 +2579,7 @@
               <w:rPr>
                 <w:noProof/>
               </w:rPr>
-              <w:instrText xml:space="preserve"> PAGEREF _Toc230531148 \h </w:instrText>
+              <w:instrText xml:space="preserve"> PAGEREF _Toc230766006 \h </w:instrText>
             </w:r>
             <w:r>
               <w:rPr>
@@ -2596,7 +2596,7 @@
               <w:rPr>
                 <w:noProof/>
               </w:rPr>
-              <w:t>17</w:t>
+              <w:t>16</w:t>
             </w:r>
             <w:r>
               <w:rPr>
@@ -2621,7 +2621,7 @@
               <w14:ligatures w14:val="standardContextual"/>
             </w:rPr>
           </w:pPr>
-          <w:hyperlink w:anchor="_Toc230531149" w:history="1">
+          <w:hyperlink w:anchor="_Toc230766007" w:history="1">
             <w:r>
               <w:rPr>
                 <w:rStyle w:val="Hyperlink"/>
@@ -2645,7 +2645,7 @@
               <w:rPr>
                 <w:noProof/>
               </w:rPr>
-              <w:instrText xml:space="preserve"> PAGEREF _Toc230531149 \h </w:instrText>
+              <w:instrText xml:space="preserve"> PAGEREF _Toc230766007 \h </w:instrText>
             </w:r>
             <w:r>
               <w:rPr>
@@ -2662,7 +2662,7 @@
               <w:rPr>
                 <w:noProof/>
               </w:rPr>
-              <w:t>18</w:t>
+              <w:t>16</w:t>
             </w:r>
             <w:r>
               <w:rPr>
@@ -2687,7 +2687,7 @@
               <w14:ligatures w14:val="standardContextual"/>
             </w:rPr>
           </w:pPr>
-          <w:hyperlink w:anchor="_Toc230531150" w:history="1">
+          <w:hyperlink w:anchor="_Toc230766008" w:history="1">
             <w:r>
               <w:rPr>
                 <w:rStyle w:val="Hyperlink"/>
@@ -2711,7 +2711,7 @@
               <w:rPr>
                 <w:noProof/>
               </w:rPr>
-              <w:instrText xml:space="preserve"> PAGEREF _Toc230531150 \h </w:instrText>
+              <w:instrText xml:space="preserve"> PAGEREF _Toc230766008 \h </w:instrText>
             </w:r>
             <w:r>
               <w:rPr>
@@ -2728,7 +2728,7 @@
               <w:rPr>
                 <w:noProof/>
               </w:rPr>
-              <w:t>18</w:t>
+              <w:t>17</w:t>
             </w:r>
             <w:r>
               <w:rPr>
@@ -2753,7 +2753,7 @@
               <w14:ligatures w14:val="standardContextual"/>
             </w:rPr>
           </w:pPr>
-          <w:hyperlink w:anchor="_Toc230531151" w:history="1">
+          <w:hyperlink w:anchor="_Toc230766009" w:history="1">
             <w:r>
               <w:rPr>
                 <w:rStyle w:val="Hyperlink"/>
@@ -2777,7 +2777,7 @@
               <w:rPr>
                 <w:noProof/>
               </w:rPr>
-              <w:instrText xml:space="preserve"> PAGEREF _Toc230531151 \h </w:instrText>
+              <w:instrText xml:space="preserve"> PAGEREF _Toc230766009 \h </w:instrText>
             </w:r>
             <w:r>
               <w:rPr>
@@ -2794,7 +2794,7 @@
               <w:rPr>
                 <w:noProof/>
               </w:rPr>
-              <w:t>19</w:t>
+              <w:t>17</w:t>
             </w:r>
             <w:r>
               <w:rPr>
@@ -2819,7 +2819,7 @@
               <w14:ligatures w14:val="standardContextual"/>
             </w:rPr>
           </w:pPr>
-          <w:hyperlink w:anchor="_Toc230531152" w:history="1">
+          <w:hyperlink w:anchor="_Toc230766010" w:history="1">
             <w:r>
               <w:rPr>
                 <w:rStyle w:val="Hyperlink"/>
@@ -2843,7 +2843,7 @@
               <w:rPr>
                 <w:noProof/>
               </w:rPr>
-              <w:instrText xml:space="preserve"> PAGEREF _Toc230531152 \h </w:instrText>
+              <w:instrText xml:space="preserve"> PAGEREF _Toc230766010 \h </w:instrText>
             </w:r>
             <w:r>
               <w:rPr>
@@ -2860,7 +2860,7 @@
               <w:rPr>
                 <w:noProof/>
               </w:rPr>
-              <w:t>19</w:t>
+              <w:t>17</w:t>
             </w:r>
             <w:r>
               <w:rPr>
@@ -2885,7 +2885,7 @@
               <w14:ligatures w14:val="standardContextual"/>
             </w:rPr>
           </w:pPr>
-          <w:hyperlink w:anchor="_Toc230531153" w:history="1">
+          <w:hyperlink w:anchor="_Toc230766011" w:history="1">
             <w:r>
               <w:rPr>
                 <w:rStyle w:val="Hyperlink"/>
@@ -2909,7 +2909,7 @@
               <w:rPr>
                 <w:noProof/>
               </w:rPr>
-              <w:instrText xml:space="preserve"> PAGEREF _Toc230531153 \h </w:instrText>
+              <w:instrText xml:space="preserve"> PAGEREF _Toc230766011 \h </w:instrText>
             </w:r>
             <w:r>
               <w:rPr>
@@ -2926,7 +2926,7 @@
               <w:rPr>
                 <w:noProof/>
               </w:rPr>
-              <w:t>19</w:t>
+              <w:t>17</w:t>
             </w:r>
             <w:r>
               <w:rPr>
@@ -2951,7 +2951,7 @@
               <w14:ligatures w14:val="standardContextual"/>
             </w:rPr>
           </w:pPr>
-          <w:hyperlink w:anchor="_Toc230531154" w:history="1">
+          <w:hyperlink w:anchor="_Toc230766012" w:history="1">
             <w:r>
               <w:rPr>
                 <w:rStyle w:val="Hyperlink"/>
@@ -2975,7 +2975,7 @@
               <w:rPr>
                 <w:noProof/>
               </w:rPr>
-              <w:instrText xml:space="preserve"> PAGEREF _Toc230531154 \h </w:instrText>
+              <w:instrText xml:space="preserve"> PAGEREF _Toc230766012 \h </w:instrText>
             </w:r>
             <w:r>
               <w:rPr>
@@ -2992,7 +2992,7 @@
               <w:rPr>
                 <w:noProof/>
               </w:rPr>
-              <w:t>19</w:t>
+              <w:t>18</w:t>
             </w:r>
             <w:r>
               <w:rPr>
@@ -3017,7 +3017,7 @@
               <w14:ligatures w14:val="standardContextual"/>
             </w:rPr>
           </w:pPr>
-          <w:hyperlink w:anchor="_Toc230531155" w:history="1">
+          <w:hyperlink w:anchor="_Toc230766013" w:history="1">
             <w:r>
               <w:rPr>
                 <w:rStyle w:val="Hyperlink"/>
@@ -3041,7 +3041,7 @@
               <w:rPr>
                 <w:noProof/>
               </w:rPr>
-              <w:instrText xml:space="preserve"> PAGEREF _Toc230531155 \h </w:instrText>
+              <w:instrText xml:space="preserve"> PAGEREF _Toc230766013 \h </w:instrText>
             </w:r>
             <w:r>
               <w:rPr>
@@ -3058,7 +3058,7 @@
               <w:rPr>
                 <w:noProof/>
               </w:rPr>
-              <w:t>20</w:t>
+              <w:t>18</w:t>
             </w:r>
             <w:r>
               <w:rPr>
@@ -3083,7 +3083,7 @@
               <w14:ligatures w14:val="standardContextual"/>
             </w:rPr>
           </w:pPr>
-          <w:hyperlink w:anchor="_Toc230531156" w:history="1">
+          <w:hyperlink w:anchor="_Toc230766014" w:history="1">
             <w:r>
               <w:rPr>
                 <w:rStyle w:val="Hyperlink"/>
@@ -3107,7 +3107,7 @@
               <w:rPr>
                 <w:noProof/>
               </w:rPr>
-              <w:instrText xml:space="preserve"> PAGEREF _Toc230531156 \h </w:instrText>
+              <w:instrText xml:space="preserve"> PAGEREF _Toc230766014 \h </w:instrText>
             </w:r>
             <w:r>
               <w:rPr>
@@ -3124,7 +3124,7 @@
               <w:rPr>
                 <w:noProof/>
               </w:rPr>
-              <w:t>20</w:t>
+              <w:t>18</w:t>
             </w:r>
             <w:r>
               <w:rPr>
@@ -3149,7 +3149,7 @@
               <w14:ligatures w14:val="standardContextual"/>
             </w:rPr>
           </w:pPr>
-          <w:hyperlink w:anchor="_Toc230531157" w:history="1">
+          <w:hyperlink w:anchor="_Toc230766015" w:history="1">
             <w:r>
               <w:rPr>
                 <w:rStyle w:val="Hyperlink"/>
@@ -3173,7 +3173,7 @@
               <w:rPr>
                 <w:noProof/>
               </w:rPr>
-              <w:instrText xml:space="preserve"> PAGEREF _Toc230531157 \h </w:instrText>
+              <w:instrText xml:space="preserve"> PAGEREF _Toc230766015 \h </w:instrText>
             </w:r>
             <w:r>
               <w:rPr>
@@ -3190,7 +3190,7 @@
               <w:rPr>
                 <w:noProof/>
               </w:rPr>
-              <w:t>21</w:t>
+              <w:t>19</w:t>
             </w:r>
             <w:r>
               <w:rPr>
@@ -3215,7 +3215,7 @@
               <w14:ligatures w14:val="standardContextual"/>
             </w:rPr>
           </w:pPr>
-          <w:hyperlink w:anchor="_Toc230531158" w:history="1">
+          <w:hyperlink w:anchor="_Toc230766016" w:history="1">
             <w:r>
               <w:rPr>
                 <w:rStyle w:val="Hyperlink"/>
@@ -3239,7 +3239,7 @@
               <w:rPr>
                 <w:noProof/>
               </w:rPr>
-              <w:instrText xml:space="preserve"> PAGEREF _Toc230531158 \h </w:instrText>
+              <w:instrText xml:space="preserve"> PAGEREF _Toc230766016 \h </w:instrText>
             </w:r>
             <w:r>
               <w:rPr>
@@ -3256,7 +3256,7 @@
               <w:rPr>
                 <w:noProof/>
               </w:rPr>
-              <w:t>21</w:t>
+              <w:t>19</w:t>
             </w:r>
             <w:r>
               <w:rPr>
@@ -3281,7 +3281,7 @@
               <w14:ligatures w14:val="standardContextual"/>
             </w:rPr>
           </w:pPr>
-          <w:hyperlink w:anchor="_Toc230531159" w:history="1">
+          <w:hyperlink w:anchor="_Toc230766017" w:history="1">
             <w:r>
               <w:rPr>
                 <w:rStyle w:val="Hyperlink"/>
@@ -3305,7 +3305,7 @@
               <w:rPr>
                 <w:noProof/>
               </w:rPr>
-              <w:instrText xml:space="preserve"> PAGEREF _Toc230531159 \h </w:instrText>
+              <w:instrText xml:space="preserve"> PAGEREF _Toc230766017 \h </w:instrText>
             </w:r>
             <w:r>
               <w:rPr>
@@ -3322,7 +3322,7 @@
               <w:rPr>
                 <w:noProof/>
               </w:rPr>
-              <w:t>21</w:t>
+              <w:t>19</w:t>
             </w:r>
             <w:r>
               <w:rPr>
@@ -3347,7 +3347,7 @@
               <w14:ligatures w14:val="standardContextual"/>
             </w:rPr>
           </w:pPr>
-          <w:hyperlink w:anchor="_Toc230531160" w:history="1">
+          <w:hyperlink w:anchor="_Toc230766018" w:history="1">
             <w:r>
               <w:rPr>
                 <w:rStyle w:val="Hyperlink"/>
@@ -3371,7 +3371,7 @@
               <w:rPr>
                 <w:noProof/>
               </w:rPr>
-              <w:instrText xml:space="preserve"> PAGEREF _Toc230531160 \h </w:instrText>
+              <w:instrText xml:space="preserve"> PAGEREF _Toc230766018 \h </w:instrText>
             </w:r>
             <w:r>
               <w:rPr>
@@ -3388,7 +3388,7 @@
               <w:rPr>
                 <w:noProof/>
               </w:rPr>
-              <w:t>21</w:t>
+              <w:t>19</w:t>
             </w:r>
             <w:r>
               <w:rPr>
@@ -3413,7 +3413,7 @@
               <w14:ligatures w14:val="standardContextual"/>
             </w:rPr>
           </w:pPr>
-          <w:hyperlink w:anchor="_Toc230531161" w:history="1">
+          <w:hyperlink w:anchor="_Toc230766019" w:history="1">
             <w:r>
               <w:rPr>
                 <w:rStyle w:val="Hyperlink"/>
@@ -3437,7 +3437,7 @@
               <w:rPr>
                 <w:noProof/>
               </w:rPr>
-              <w:instrText xml:space="preserve"> PAGEREF _Toc230531161 \h </w:instrText>
+              <w:instrText xml:space="preserve"> PAGEREF _Toc230766019 \h </w:instrText>
             </w:r>
             <w:r>
               <w:rPr>
@@ -3454,7 +3454,7 @@
               <w:rPr>
                 <w:noProof/>
               </w:rPr>
-              <w:t>21</w:t>
+              <w:t>20</w:t>
             </w:r>
             <w:r>
               <w:rPr>
@@ -3479,7 +3479,7 @@
               <w14:ligatures w14:val="standardContextual"/>
             </w:rPr>
           </w:pPr>
-          <w:hyperlink w:anchor="_Toc230531162" w:history="1">
+          <w:hyperlink w:anchor="_Toc230766020" w:history="1">
             <w:r>
               <w:rPr>
                 <w:rStyle w:val="Hyperlink"/>
@@ -3503,7 +3503,7 @@
               <w:rPr>
                 <w:noProof/>
               </w:rPr>
-              <w:instrText xml:space="preserve"> PAGEREF _Toc230531162 \h </w:instrText>
+              <w:instrText xml:space="preserve"> PAGEREF _Toc230766020 \h </w:instrText>
             </w:r>
             <w:r>
               <w:rPr>
@@ -3520,7 +3520,7 @@
               <w:rPr>
                 <w:noProof/>
               </w:rPr>
-              <w:t>23</w:t>
+              <w:t>20</w:t>
             </w:r>
             <w:r>
               <w:rPr>
@@ -3545,7 +3545,7 @@
               <w14:ligatures w14:val="standardContextual"/>
             </w:rPr>
           </w:pPr>
-          <w:hyperlink w:anchor="_Toc230531163" w:history="1">
+          <w:hyperlink w:anchor="_Toc230766021" w:history="1">
             <w:r>
               <w:rPr>
                 <w:rStyle w:val="Hyperlink"/>
@@ -3569,7 +3569,7 @@
               <w:rPr>
                 <w:noProof/>
               </w:rPr>
-              <w:instrText xml:space="preserve"> PAGEREF _Toc230531163 \h </w:instrText>
+              <w:instrText xml:space="preserve"> PAGEREF _Toc230766021 \h </w:instrText>
             </w:r>
             <w:r>
               <w:rPr>
@@ -3586,7 +3586,7 @@
               <w:rPr>
                 <w:noProof/>
               </w:rPr>
-              <w:t>23</w:t>
+              <w:t>20</w:t>
             </w:r>
             <w:r>
               <w:rPr>
@@ -3611,7 +3611,7 @@
               <w14:ligatures w14:val="standardContextual"/>
             </w:rPr>
           </w:pPr>
-          <w:hyperlink w:anchor="_Toc230531164" w:history="1">
+          <w:hyperlink w:anchor="_Toc230766022" w:history="1">
             <w:r>
               <w:rPr>
                 <w:rStyle w:val="Hyperlink"/>
@@ -3635,7 +3635,7 @@
               <w:rPr>
                 <w:noProof/>
               </w:rPr>
-              <w:instrText xml:space="preserve"> PAGEREF _Toc230531164 \h </w:instrText>
+              <w:instrText xml:space="preserve"> PAGEREF _Toc230766022 \h </w:instrText>
             </w:r>
             <w:r>
               <w:rPr>
@@ -3652,7 +3652,7 @@
               <w:rPr>
                 <w:noProof/>
               </w:rPr>
-              <w:t>23</w:t>
+              <w:t>20</w:t>
             </w:r>
             <w:r>
               <w:rPr>
@@ -3677,7 +3677,7 @@
               <w14:ligatures w14:val="standardContextual"/>
             </w:rPr>
           </w:pPr>
-          <w:hyperlink w:anchor="_Toc230531165" w:history="1">
+          <w:hyperlink w:anchor="_Toc230766023" w:history="1">
             <w:r>
               <w:rPr>
                 <w:rStyle w:val="Hyperlink"/>
@@ -3701,7 +3701,7 @@
               <w:rPr>
                 <w:noProof/>
               </w:rPr>
-              <w:instrText xml:space="preserve"> PAGEREF _Toc230531165 \h </w:instrText>
+              <w:instrText xml:space="preserve"> PAGEREF _Toc230766023 \h </w:instrText>
             </w:r>
             <w:r>
               <w:rPr>
@@ -3718,7 +3718,7 @@
               <w:rPr>
                 <w:noProof/>
               </w:rPr>
-              <w:t>23</w:t>
+              <w:t>20</w:t>
             </w:r>
             <w:r>
               <w:rPr>
@@ -3743,7 +3743,7 @@
               <w14:ligatures w14:val="standardContextual"/>
             </w:rPr>
           </w:pPr>
-          <w:hyperlink w:anchor="_Toc230531166" w:history="1">
+          <w:hyperlink w:anchor="_Toc230766024" w:history="1">
             <w:r>
               <w:rPr>
                 <w:rStyle w:val="Hyperlink"/>
@@ -3767,7 +3767,7 @@
               <w:rPr>
                 <w:noProof/>
               </w:rPr>
-              <w:instrText xml:space="preserve"> PAGEREF _Toc230531166 \h </w:instrText>
+              <w:instrText xml:space="preserve"> PAGEREF _Toc230766024 \h </w:instrText>
             </w:r>
             <w:r>
               <w:rPr>
@@ -3784,7 +3784,7 @@
               <w:rPr>
                 <w:noProof/>
               </w:rPr>
-              <w:t>23</w:t>
+              <w:t>20</w:t>
             </w:r>
             <w:r>
               <w:rPr>
@@ -3809,7 +3809,7 @@
               <w14:ligatures w14:val="standardContextual"/>
             </w:rPr>
           </w:pPr>
-          <w:hyperlink w:anchor="_Toc230531167" w:history="1">
+          <w:hyperlink w:anchor="_Toc230766025" w:history="1">
             <w:r>
               <w:rPr>
                 <w:rStyle w:val="Hyperlink"/>
@@ -3833,7 +3833,7 @@
               <w:rPr>
                 <w:noProof/>
               </w:rPr>
-              <w:instrText xml:space="preserve"> PAGEREF _Toc230531167 \h </w:instrText>
+              <w:instrText xml:space="preserve"> PAGEREF _Toc230766025 \h </w:instrText>
             </w:r>
             <w:r>
               <w:rPr>
@@ -3850,7 +3850,7 @@
               <w:rPr>
                 <w:noProof/>
               </w:rPr>
-              <w:t>23</w:t>
+              <w:t>20</w:t>
             </w:r>
             <w:r>
               <w:rPr>
@@ -3875,7 +3875,7 @@
               <w14:ligatures w14:val="standardContextual"/>
             </w:rPr>
           </w:pPr>
-          <w:hyperlink w:anchor="_Toc230531168" w:history="1">
+          <w:hyperlink w:anchor="_Toc230766026" w:history="1">
             <w:r>
               <w:rPr>
                 <w:rStyle w:val="Hyperlink"/>
@@ -3899,7 +3899,7 @@
               <w:rPr>
                 <w:noProof/>
               </w:rPr>
-              <w:instrText xml:space="preserve"> PAGEREF _Toc230531168 \h </w:instrText>
+              <w:instrText xml:space="preserve"> PAGEREF _Toc230766026 \h </w:instrText>
             </w:r>
             <w:r>
               <w:rPr>
@@ -3916,7 +3916,7 @@
               <w:rPr>
                 <w:noProof/>
               </w:rPr>
-              <w:t>23</w:t>
+              <w:t>21</w:t>
             </w:r>
             <w:r>
               <w:rPr>
@@ -3941,7 +3941,7 @@
               <w14:ligatures w14:val="standardContextual"/>
             </w:rPr>
           </w:pPr>
-          <w:hyperlink w:anchor="_Toc230531169" w:history="1">
+          <w:hyperlink w:anchor="_Toc230766027" w:history="1">
             <w:r>
               <w:rPr>
                 <w:rStyle w:val="Hyperlink"/>
@@ -3965,7 +3965,7 @@
               <w:rPr>
                 <w:noProof/>
               </w:rPr>
-              <w:instrText xml:space="preserve"> PAGEREF _Toc230531169 \h </w:instrText>
+              <w:instrText xml:space="preserve"> PAGEREF _Toc230766027 \h </w:instrText>
             </w:r>
             <w:r>
               <w:rPr>
@@ -3982,7 +3982,7 @@
               <w:rPr>
                 <w:noProof/>
               </w:rPr>
-              <w:t>23</w:t>
+              <w:t>21</w:t>
             </w:r>
             <w:r>
               <w:rPr>
@@ -4007,7 +4007,7 @@
               <w14:ligatures w14:val="standardContextual"/>
             </w:rPr>
           </w:pPr>
-          <w:hyperlink w:anchor="_Toc230531170" w:history="1">
+          <w:hyperlink w:anchor="_Toc230766028" w:history="1">
             <w:r>
               <w:rPr>
                 <w:rStyle w:val="Hyperlink"/>
@@ -4031,7 +4031,7 @@
               <w:rPr>
                 <w:noProof/>
               </w:rPr>
-              <w:instrText xml:space="preserve"> PAGEREF _Toc230531170 \h </w:instrText>
+              <w:instrText xml:space="preserve"> PAGEREF _Toc230766028 \h </w:instrText>
             </w:r>
             <w:r>
               <w:rPr>
@@ -4048,7 +4048,7 @@
               <w:rPr>
                 <w:noProof/>
               </w:rPr>
-              <w:t>23</w:t>
+              <w:t>21</w:t>
             </w:r>
             <w:r>
               <w:rPr>
@@ -4073,7 +4073,7 @@
               <w14:ligatures w14:val="standardContextual"/>
             </w:rPr>
           </w:pPr>
-          <w:hyperlink w:anchor="_Toc230531171" w:history="1">
+          <w:hyperlink w:anchor="_Toc230766029" w:history="1">
             <w:r>
               <w:rPr>
                 <w:rStyle w:val="Hyperlink"/>
@@ -4097,7 +4097,7 @@
               <w:rPr>
                 <w:noProof/>
               </w:rPr>
-              <w:instrText xml:space="preserve"> PAGEREF _Toc230531171 \h </w:instrText>
+              <w:instrText xml:space="preserve"> PAGEREF _Toc230766029 \h </w:instrText>
             </w:r>
             <w:r>
               <w:rPr>
@@ -4114,7 +4114,7 @@
               <w:rPr>
                 <w:noProof/>
               </w:rPr>
-              <w:t>24</w:t>
+              <w:t>21</w:t>
             </w:r>
             <w:r>
               <w:rPr>
@@ -4139,7 +4139,7 @@
               <w14:ligatures w14:val="standardContextual"/>
             </w:rPr>
           </w:pPr>
-          <w:hyperlink w:anchor="_Toc230531172" w:history="1">
+          <w:hyperlink w:anchor="_Toc230766030" w:history="1">
             <w:r>
               <w:rPr>
                 <w:rStyle w:val="Hyperlink"/>
@@ -4163,7 +4163,7 @@
               <w:rPr>
                 <w:noProof/>
               </w:rPr>
-              <w:instrText xml:space="preserve"> PAGEREF _Toc230531172 \h </w:instrText>
+              <w:instrText xml:space="preserve"> PAGEREF _Toc230766030 \h </w:instrText>
             </w:r>
             <w:r>
               <w:rPr>
@@ -4180,7 +4180,7 @@
               <w:rPr>
                 <w:noProof/>
               </w:rPr>
-              <w:t>25</w:t>
+              <w:t>21</w:t>
             </w:r>
             <w:r>
               <w:rPr>
@@ -4205,7 +4205,7 @@
               <w14:ligatures w14:val="standardContextual"/>
             </w:rPr>
           </w:pPr>
-          <w:hyperlink w:anchor="_Toc230531173" w:history="1">
+          <w:hyperlink w:anchor="_Toc230766031" w:history="1">
             <w:r>
               <w:rPr>
                 <w:rStyle w:val="Hyperlink"/>
@@ -4229,7 +4229,7 @@
               <w:rPr>
                 <w:noProof/>
               </w:rPr>
-              <w:instrText xml:space="preserve"> PAGEREF _Toc230531173 \h </w:instrText>
+              <w:instrText xml:space="preserve"> PAGEREF _Toc230766031 \h </w:instrText>
             </w:r>
             <w:r>
               <w:rPr>
@@ -4246,7 +4246,7 @@
               <w:rPr>
                 <w:noProof/>
               </w:rPr>
-              <w:t>25</w:t>
+              <w:t>21</w:t>
             </w:r>
             <w:r>
               <w:rPr>
@@ -4271,7 +4271,7 @@
               <w14:ligatures w14:val="standardContextual"/>
             </w:rPr>
           </w:pPr>
-          <w:hyperlink w:anchor="_Toc230531174" w:history="1">
+          <w:hyperlink w:anchor="_Toc230766032" w:history="1">
             <w:r>
               <w:rPr>
                 <w:rStyle w:val="Hyperlink"/>
@@ -4295,7 +4295,7 @@
               <w:rPr>
                 <w:noProof/>
               </w:rPr>
-              <w:instrText xml:space="preserve"> PAGEREF _Toc230531174 \h </w:instrText>
+              <w:instrText xml:space="preserve"> PAGEREF _Toc230766032 \h </w:instrText>
             </w:r>
             <w:r>
               <w:rPr>
@@ -4312,7 +4312,7 @@
               <w:rPr>
                 <w:noProof/>
               </w:rPr>
-              <w:t>25</w:t>
+              <w:t>21</w:t>
             </w:r>
             <w:r>
               <w:rPr>
@@ -4337,7 +4337,7 @@
               <w14:ligatures w14:val="standardContextual"/>
             </w:rPr>
           </w:pPr>
-          <w:hyperlink w:anchor="_Toc230531175" w:history="1">
+          <w:hyperlink w:anchor="_Toc230766033" w:history="1">
             <w:r>
               <w:rPr>
                 <w:rStyle w:val="Hyperlink"/>
@@ -4361,7 +4361,7 @@
               <w:rPr>
                 <w:noProof/>
               </w:rPr>
-              <w:instrText xml:space="preserve"> PAGEREF _Toc230531175 \h </w:instrText>
+              <w:instrText xml:space="preserve"> PAGEREF _Toc230766033 \h </w:instrText>
             </w:r>
             <w:r>
               <w:rPr>
@@ -4378,7 +4378,7 @@
               <w:rPr>
                 <w:noProof/>
               </w:rPr>
-              <w:t>25</w:t>
+              <w:t>22</w:t>
             </w:r>
             <w:r>
               <w:rPr>
@@ -4403,7 +4403,7 @@
               <w14:ligatures w14:val="standardContextual"/>
             </w:rPr>
           </w:pPr>
-          <w:hyperlink w:anchor="_Toc230531176" w:history="1">
+          <w:hyperlink w:anchor="_Toc230766034" w:history="1">
             <w:r>
               <w:rPr>
                 <w:rStyle w:val="Hyperlink"/>
@@ -4427,7 +4427,7 @@
               <w:rPr>
                 <w:noProof/>
               </w:rPr>
-              <w:instrText xml:space="preserve"> PAGEREF _Toc230531176 \h </w:instrText>
+              <w:instrText xml:space="preserve"> PAGEREF _Toc230766034 \h </w:instrText>
             </w:r>
             <w:r>
               <w:rPr>
@@ -4444,7 +4444,7 @@
               <w:rPr>
                 <w:noProof/>
               </w:rPr>
-              <w:t>25</w:t>
+              <w:t>22</w:t>
             </w:r>
             <w:r>
               <w:rPr>
@@ -4469,7 +4469,7 @@
               <w14:ligatures w14:val="standardContextual"/>
             </w:rPr>
           </w:pPr>
-          <w:hyperlink w:anchor="_Toc230531177" w:history="1">
+          <w:hyperlink w:anchor="_Toc230766035" w:history="1">
             <w:r>
               <w:rPr>
                 <w:rStyle w:val="Hyperlink"/>
@@ -4493,7 +4493,7 @@
               <w:rPr>
                 <w:noProof/>
               </w:rPr>
-              <w:instrText xml:space="preserve"> PAGEREF _Toc230531177 \h </w:instrText>
+              <w:instrText xml:space="preserve"> PAGEREF _Toc230766035 \h </w:instrText>
             </w:r>
             <w:r>
               <w:rPr>
@@ -4510,7 +4510,7 @@
               <w:rPr>
                 <w:noProof/>
               </w:rPr>
-              <w:t>26</w:t>
+              <w:t>22</w:t>
             </w:r>
             <w:r>
               <w:rPr>
@@ -4535,7 +4535,7 @@
               <w14:ligatures w14:val="standardContextual"/>
             </w:rPr>
           </w:pPr>
-          <w:hyperlink w:anchor="_Toc230531178" w:history="1">
+          <w:hyperlink w:anchor="_Toc230766036" w:history="1">
             <w:r>
               <w:rPr>
                 <w:rStyle w:val="Hyperlink"/>
@@ -4559,7 +4559,7 @@
               <w:rPr>
                 <w:noProof/>
               </w:rPr>
-              <w:instrText xml:space="preserve"> PAGEREF _Toc230531178 \h </w:instrText>
+              <w:instrText xml:space="preserve"> PAGEREF _Toc230766036 \h </w:instrText>
             </w:r>
             <w:r>
               <w:rPr>
@@ -4576,7 +4576,7 @@
               <w:rPr>
                 <w:noProof/>
               </w:rPr>
-              <w:t>27</w:t>
+              <w:t>23</w:t>
             </w:r>
             <w:r>
               <w:rPr>
@@ -4601,7 +4601,7 @@
               <w14:ligatures w14:val="standardContextual"/>
             </w:rPr>
           </w:pPr>
-          <w:hyperlink w:anchor="_Toc230531179" w:history="1">
+          <w:hyperlink w:anchor="_Toc230766037" w:history="1">
             <w:r>
               <w:rPr>
                 <w:rStyle w:val="Hyperlink"/>
@@ -4625,7 +4625,7 @@
               <w:rPr>
                 <w:noProof/>
               </w:rPr>
-              <w:instrText xml:space="preserve"> PAGEREF _Toc230531179 \h </w:instrText>
+              <w:instrText xml:space="preserve"> PAGEREF _Toc230766037 \h </w:instrText>
             </w:r>
             <w:r>
               <w:rPr>
@@ -4642,7 +4642,7 @@
               <w:rPr>
                 <w:noProof/>
               </w:rPr>
-              <w:t>27</w:t>
+              <w:t>23</w:t>
             </w:r>
             <w:r>
               <w:rPr>
@@ -4667,7 +4667,7 @@
               <w14:ligatures w14:val="standardContextual"/>
             </w:rPr>
           </w:pPr>
-          <w:hyperlink w:anchor="_Toc230531180" w:history="1">
+          <w:hyperlink w:anchor="_Toc230766038" w:history="1">
             <w:r>
               <w:rPr>
                 <w:rStyle w:val="Hyperlink"/>
@@ -4691,7 +4691,7 @@
               <w:rPr>
                 <w:noProof/>
               </w:rPr>
-              <w:instrText xml:space="preserve"> PAGEREF _Toc230531180 \h </w:instrText>
+              <w:instrText xml:space="preserve"> PAGEREF _Toc230766038 \h </w:instrText>
             </w:r>
             <w:r>
               <w:rPr>
@@ -4708,7 +4708,7 @@
               <w:rPr>
                 <w:noProof/>
               </w:rPr>
-              <w:t>27</w:t>
+              <w:t>23</w:t>
             </w:r>
             <w:r>
               <w:rPr>
@@ -4733,7 +4733,7 @@
               <w14:ligatures w14:val="standardContextual"/>
             </w:rPr>
           </w:pPr>
-          <w:hyperlink w:anchor="_Toc230531181" w:history="1">
+          <w:hyperlink w:anchor="_Toc230766039" w:history="1">
             <w:r>
               <w:rPr>
                 <w:rStyle w:val="Hyperlink"/>
@@ -4757,7 +4757,7 @@
               <w:rPr>
                 <w:noProof/>
               </w:rPr>
-              <w:instrText xml:space="preserve"> PAGEREF _Toc230531181 \h </w:instrText>
+              <w:instrText xml:space="preserve"> PAGEREF _Toc230766039 \h </w:instrText>
             </w:r>
             <w:r>
               <w:rPr>
@@ -4774,7 +4774,7 @@
               <w:rPr>
                 <w:noProof/>
               </w:rPr>
-              <w:t>27</w:t>
+              <w:t>23</w:t>
             </w:r>
             <w:r>
               <w:rPr>
@@ -4799,7 +4799,7 @@
               <w14:ligatures w14:val="standardContextual"/>
             </w:rPr>
           </w:pPr>
-          <w:hyperlink w:anchor="_Toc230531182" w:history="1">
+          <w:hyperlink w:anchor="_Toc230766040" w:history="1">
             <w:r>
               <w:rPr>
                 <w:rStyle w:val="Hyperlink"/>
@@ -4823,7 +4823,7 @@
               <w:rPr>
                 <w:noProof/>
               </w:rPr>
-              <w:instrText xml:space="preserve"> PAGEREF _Toc230531182 \h </w:instrText>
+              <w:instrText xml:space="preserve"> PAGEREF _Toc230766040 \h </w:instrText>
             </w:r>
             <w:r>
               <w:rPr>
@@ -4840,7 +4840,7 @@
               <w:rPr>
                 <w:noProof/>
               </w:rPr>
-              <w:t>27</w:t>
+              <w:t>23</w:t>
             </w:r>
             <w:r>
               <w:rPr>
@@ -4865,7 +4865,7 @@
               <w14:ligatures w14:val="standardContextual"/>
             </w:rPr>
           </w:pPr>
-          <w:hyperlink w:anchor="_Toc230531183" w:history="1">
+          <w:hyperlink w:anchor="_Toc230766041" w:history="1">
             <w:r>
               <w:rPr>
                 <w:rStyle w:val="Hyperlink"/>
@@ -4889,7 +4889,7 @@
               <w:rPr>
                 <w:noProof/>
               </w:rPr>
-              <w:instrText xml:space="preserve"> PAGEREF _Toc230531183 \h </w:instrText>
+              <w:instrText xml:space="preserve"> PAGEREF _Toc230766041 \h </w:instrText>
             </w:r>
             <w:r>
               <w:rPr>
@@ -4906,7 +4906,7 @@
               <w:rPr>
                 <w:noProof/>
               </w:rPr>
-              <w:t>27</w:t>
+              <w:t>23</w:t>
             </w:r>
             <w:r>
               <w:rPr>
@@ -4931,7 +4931,7 @@
               <w14:ligatures w14:val="standardContextual"/>
             </w:rPr>
           </w:pPr>
-          <w:hyperlink w:anchor="_Toc230531184" w:history="1">
+          <w:hyperlink w:anchor="_Toc230766042" w:history="1">
             <w:r>
               <w:rPr>
                 <w:rStyle w:val="Hyperlink"/>
@@ -4955,7 +4955,7 @@
               <w:rPr>
                 <w:noProof/>
               </w:rPr>
-              <w:instrText xml:space="preserve"> PAGEREF _Toc230531184 \h </w:instrText>
+              <w:instrText xml:space="preserve"> PAGEREF _Toc230766042 \h </w:instrText>
             </w:r>
             <w:r>
               <w:rPr>
@@ -4972,7 +4972,7 @@
               <w:rPr>
                 <w:noProof/>
               </w:rPr>
-              <w:t>27</w:t>
+              <w:t>23</w:t>
             </w:r>
             <w:r>
               <w:rPr>
@@ -4997,7 +4997,7 @@
               <w14:ligatures w14:val="standardContextual"/>
             </w:rPr>
           </w:pPr>
-          <w:hyperlink w:anchor="_Toc230531185" w:history="1">
+          <w:hyperlink w:anchor="_Toc230766043" w:history="1">
             <w:r>
               <w:rPr>
                 <w:rStyle w:val="Hyperlink"/>
@@ -5021,7 +5021,7 @@
               <w:rPr>
                 <w:noProof/>
               </w:rPr>
-              <w:instrText xml:space="preserve"> PAGEREF _Toc230531185 \h </w:instrText>
+              <w:instrText xml:space="preserve"> PAGEREF _Toc230766043 \h </w:instrText>
             </w:r>
             <w:r>
               <w:rPr>
@@ -5038,7 +5038,7 @@
               <w:rPr>
                 <w:noProof/>
               </w:rPr>
-              <w:t>27</w:t>
+              <w:t>24</w:t>
             </w:r>
             <w:r>
               <w:rPr>
@@ -5063,7 +5063,7 @@
               <w14:ligatures w14:val="standardContextual"/>
             </w:rPr>
           </w:pPr>
-          <w:hyperlink w:anchor="_Toc230531186" w:history="1">
+          <w:hyperlink w:anchor="_Toc230766044" w:history="1">
             <w:r>
               <w:rPr>
                 <w:rStyle w:val="Hyperlink"/>
@@ -5087,7 +5087,7 @@
               <w:rPr>
                 <w:noProof/>
               </w:rPr>
-              <w:instrText xml:space="preserve"> PAGEREF _Toc230531186 \h </w:instrText>
+              <w:instrText xml:space="preserve"> PAGEREF _Toc230766044 \h </w:instrText>
             </w:r>
             <w:r>
               <w:rPr>
@@ -5104,7 +5104,7 @@
               <w:rPr>
                 <w:noProof/>
               </w:rPr>
-              <w:t>28</w:t>
+              <w:t>24</w:t>
             </w:r>
             <w:r>
               <w:rPr>
@@ -5129,7 +5129,7 @@
               <w14:ligatures w14:val="standardContextual"/>
             </w:rPr>
           </w:pPr>
-          <w:hyperlink w:anchor="_Toc230531187" w:history="1">
+          <w:hyperlink w:anchor="_Toc230766045" w:history="1">
             <w:r>
               <w:rPr>
                 <w:rStyle w:val="Hyperlink"/>
@@ -5153,7 +5153,7 @@
               <w:rPr>
                 <w:noProof/>
               </w:rPr>
-              <w:instrText xml:space="preserve"> PAGEREF _Toc230531187 \h </w:instrText>
+              <w:instrText xml:space="preserve"> PAGEREF _Toc230766045 \h </w:instrText>
             </w:r>
             <w:r>
               <w:rPr>
@@ -5170,7 +5170,7 @@
               <w:rPr>
                 <w:noProof/>
               </w:rPr>
-              <w:t>29</w:t>
+              <w:t>24</w:t>
             </w:r>
             <w:r>
               <w:rPr>
@@ -5195,7 +5195,7 @@
               <w14:ligatures w14:val="standardContextual"/>
             </w:rPr>
           </w:pPr>
-          <w:hyperlink w:anchor="_Toc230531188" w:history="1">
+          <w:hyperlink w:anchor="_Toc230766046" w:history="1">
             <w:r>
               <w:rPr>
                 <w:rStyle w:val="Hyperlink"/>
@@ -5219,7 +5219,7 @@
               <w:rPr>
                 <w:noProof/>
               </w:rPr>
-              <w:instrText xml:space="preserve"> PAGEREF _Toc230531188 \h </w:instrText>
+              <w:instrText xml:space="preserve"> PAGEREF _Toc230766046 \h </w:instrText>
             </w:r>
             <w:r>
               <w:rPr>
@@ -5236,7 +5236,7 @@
               <w:rPr>
                 <w:noProof/>
               </w:rPr>
-              <w:t>29</w:t>
+              <w:t>24</w:t>
             </w:r>
             <w:r>
               <w:rPr>
@@ -5261,7 +5261,7 @@
               <w14:ligatures w14:val="standardContextual"/>
             </w:rPr>
           </w:pPr>
-          <w:hyperlink w:anchor="_Toc230531189" w:history="1">
+          <w:hyperlink w:anchor="_Toc230766047" w:history="1">
             <w:r>
               <w:rPr>
                 <w:rStyle w:val="Hyperlink"/>
@@ -5285,7 +5285,7 @@
               <w:rPr>
                 <w:noProof/>
               </w:rPr>
-              <w:instrText xml:space="preserve"> PAGEREF _Toc230531189 \h </w:instrText>
+              <w:instrText xml:space="preserve"> PAGEREF _Toc230766047 \h </w:instrText>
             </w:r>
             <w:r>
               <w:rPr>
@@ -5302,7 +5302,7 @@
               <w:rPr>
                 <w:noProof/>
               </w:rPr>
-              <w:t>29</w:t>
+              <w:t>24</w:t>
             </w:r>
             <w:r>
               <w:rPr>
@@ -5327,7 +5327,7 @@
               <w14:ligatures w14:val="standardContextual"/>
             </w:rPr>
           </w:pPr>
-          <w:hyperlink w:anchor="_Toc230531190" w:history="1">
+          <w:hyperlink w:anchor="_Toc230766048" w:history="1">
             <w:r>
               <w:rPr>
                 <w:rStyle w:val="Hyperlink"/>
@@ -5351,7 +5351,7 @@
               <w:rPr>
                 <w:noProof/>
               </w:rPr>
-              <w:instrText xml:space="preserve"> PAGEREF _Toc230531190 \h </w:instrText>
+              <w:instrText xml:space="preserve"> PAGEREF _Toc230766048 \h </w:instrText>
             </w:r>
             <w:r>
               <w:rPr>
@@ -5368,7 +5368,7 @@
               <w:rPr>
                 <w:noProof/>
               </w:rPr>
-              <w:t>29</w:t>
+              <w:t>24</w:t>
             </w:r>
             <w:r>
               <w:rPr>
@@ -5393,7 +5393,7 @@
               <w14:ligatures w14:val="standardContextual"/>
             </w:rPr>
           </w:pPr>
-          <w:hyperlink w:anchor="_Toc230531191" w:history="1">
+          <w:hyperlink w:anchor="_Toc230766049" w:history="1">
             <w:r>
               <w:rPr>
                 <w:rStyle w:val="Hyperlink"/>
@@ -5417,7 +5417,7 @@
               <w:rPr>
                 <w:noProof/>
               </w:rPr>
-              <w:instrText xml:space="preserve"> PAGEREF _Toc230531191 \h </w:instrText>
+              <w:instrText xml:space="preserve"> PAGEREF _Toc230766049 \h </w:instrText>
             </w:r>
             <w:r>
               <w:rPr>
@@ -5434,7 +5434,7 @@
               <w:rPr>
                 <w:noProof/>
               </w:rPr>
-              <w:t>29</w:t>
+              <w:t>25</w:t>
             </w:r>
             <w:r>
               <w:rPr>
@@ -5459,7 +5459,7 @@
               <w14:ligatures w14:val="standardContextual"/>
             </w:rPr>
           </w:pPr>
-          <w:hyperlink w:anchor="_Toc230531192" w:history="1">
+          <w:hyperlink w:anchor="_Toc230766050" w:history="1">
             <w:r>
               <w:rPr>
                 <w:rStyle w:val="Hyperlink"/>
@@ -5483,7 +5483,7 @@
               <w:rPr>
                 <w:noProof/>
               </w:rPr>
-              <w:instrText xml:space="preserve"> PAGEREF _Toc230531192 \h </w:instrText>
+              <w:instrText xml:space="preserve"> PAGEREF _Toc230766050 \h </w:instrText>
             </w:r>
             <w:r>
               <w:rPr>
@@ -5500,7 +5500,7 @@
               <w:rPr>
                 <w:noProof/>
               </w:rPr>
-              <w:t>29</w:t>
+              <w:t>25</w:t>
             </w:r>
             <w:r>
               <w:rPr>
@@ -5525,7 +5525,7 @@
               <w14:ligatures w14:val="standardContextual"/>
             </w:rPr>
           </w:pPr>
-          <w:hyperlink w:anchor="_Toc230531193" w:history="1">
+          <w:hyperlink w:anchor="_Toc230766051" w:history="1">
             <w:r>
               <w:rPr>
                 <w:rStyle w:val="Hyperlink"/>
@@ -5549,7 +5549,7 @@
               <w:rPr>
                 <w:noProof/>
               </w:rPr>
-              <w:instrText xml:space="preserve"> PAGEREF _Toc230531193 \h </w:instrText>
+              <w:instrText xml:space="preserve"> PAGEREF _Toc230766051 \h </w:instrText>
             </w:r>
             <w:r>
               <w:rPr>
@@ -5566,7 +5566,7 @@
               <w:rPr>
                 <w:noProof/>
               </w:rPr>
-              <w:t>29</w:t>
+              <w:t>25</w:t>
             </w:r>
             <w:r>
               <w:rPr>
@@ -5591,7 +5591,7 @@
               <w14:ligatures w14:val="standardContextual"/>
             </w:rPr>
           </w:pPr>
-          <w:hyperlink w:anchor="_Toc230531194" w:history="1">
+          <w:hyperlink w:anchor="_Toc230766052" w:history="1">
             <w:r>
               <w:rPr>
                 <w:rStyle w:val="Hyperlink"/>
@@ -5615,7 +5615,7 @@
               <w:rPr>
                 <w:noProof/>
               </w:rPr>
-              <w:instrText xml:space="preserve"> PAGEREF _Toc230531194 \h </w:instrText>
+              <w:instrText xml:space="preserve"> PAGEREF _Toc230766052 \h </w:instrText>
             </w:r>
             <w:r>
               <w:rPr>
@@ -5632,7 +5632,7 @@
               <w:rPr>
                 <w:noProof/>
               </w:rPr>
-              <w:t>31</w:t>
+              <w:t>25</w:t>
             </w:r>
             <w:r>
               <w:rPr>
@@ -5657,7 +5657,7 @@
               <w14:ligatures w14:val="standardContextual"/>
             </w:rPr>
           </w:pPr>
-          <w:hyperlink w:anchor="_Toc230531195" w:history="1">
+          <w:hyperlink w:anchor="_Toc230766053" w:history="1">
             <w:r>
               <w:rPr>
                 <w:rStyle w:val="Hyperlink"/>
@@ -5681,7 +5681,7 @@
               <w:rPr>
                 <w:noProof/>
               </w:rPr>
-              <w:instrText xml:space="preserve"> PAGEREF _Toc230531195 \h </w:instrText>
+              <w:instrText xml:space="preserve"> PAGEREF _Toc230766053 \h </w:instrText>
             </w:r>
             <w:r>
               <w:rPr>
@@ -5698,7 +5698,73 @@
               <w:rPr>
                 <w:noProof/>
               </w:rPr>
-              <w:t>32</w:t>
+              <w:t>26</w:t>
+            </w:r>
+            <w:r>
+              <w:rPr>
+                <w:noProof/>
+              </w:rPr>
+              <w:fldChar w:fldCharType="end"/>
+            </w:r>
+          </w:hyperlink>
+        </w:p>
+        <w:p>
+          <w:pPr>
+            <w:pStyle w:val="Verzeichnis1"/>
+            <w:tabs>
+              <w:tab w:val="right" w:leader="dot" w:pos="9016"/>
+            </w:tabs>
+            <w:rPr>
+              <w:rFonts w:asciiTheme="minorHAnsi" w:eastAsiaTheme="minorEastAsia" w:hAnsiTheme="minorHAnsi" w:cstheme="minorBidi"/>
+              <w:noProof/>
+              <w:kern w:val="2"/>
+              <w:sz w:val="24"/>
+              <w:szCs w:val="24"/>
+              <w14:ligatures w14:val="standardContextual"/>
+            </w:rPr>
+          </w:pPr>
+          <w:hyperlink w:anchor="_Toc230766054" w:history="1">
+            <w:r>
+              <w:rPr>
+                <w:rStyle w:val="Hyperlink"/>
+                <w:noProof/>
+              </w:rPr>
+              <w:t>13. Über die Entstehung dieses Texts</w:t>
+            </w:r>
+            <w:r>
+              <w:rPr>
+                <w:noProof/>
+              </w:rPr>
+              <w:tab/>
+            </w:r>
+            <w:r>
+              <w:rPr>
+                <w:noProof/>
+              </w:rPr>
+              <w:fldChar w:fldCharType="begin"/>
+            </w:r>
+            <w:r>
+              <w:rPr>
+                <w:noProof/>
+              </w:rPr>
+              <w:instrText xml:space="preserve"> PAGEREF _Toc230766054 \h </w:instrText>
+            </w:r>
+            <w:r>
+              <w:rPr>
+                <w:noProof/>
+              </w:rPr>
+            </w:r>
+            <w:r>
+              <w:rPr>
+                <w:noProof/>
+              </w:rPr>
+              <w:fldChar w:fldCharType="separate"/>
+            </w:r>
+            <w:r>
+              <w:rPr>
+                <w:noProof/>
+              </w:rPr>
+              <w:t>26</w:t>
             </w:r>
             <w:r>
               <w:rPr>
@@ -5723,12 +5789,17 @@
     <w:p>
       <w:pPr>
         <w:pStyle w:val="berschrift1"/>
-        <w:pageBreakBefore/>
-      </w:pPr>
-      <w:bookmarkStart w:id="1" w:name="_Toc230531112"/>
+      </w:pPr>
+      <w:bookmarkStart w:id="1" w:name="_Toc230765970"/>
       <w:r>
         <w:lastRenderedPageBreak/>
-        <w:t>1. Vorwort und Motivation</w:t>
+        <w:t xml:space="preserve">1. Vorwort </w:t>
+      </w:r>
+      <w:r>
+        <w:t>und</w:t>
+      </w:r>
+      <w:r>
+        <w:t xml:space="preserve"> Motivation</w:t>
       </w:r>
       <w:bookmarkEnd w:id="1"/>
     </w:p>
@@ -5900,7 +5971,7 @@
         <w:pStyle w:val="berschrift2"/>
         <w:spacing w:before="240" w:after="120"/>
       </w:pPr>
-      <w:bookmarkStart w:id="2" w:name="_Toc230531113"/>
+      <w:bookmarkStart w:id="2" w:name="_Toc230765971"/>
       <w:r>
         <w:t>Zielgruppe</w:t>
       </w:r>
@@ -5941,12 +6012,13 @@
     <w:p>
       <w:pPr>
         <w:pStyle w:val="berschrift1"/>
-        <w:pageBreakBefore/>
-      </w:pPr>
-      <w:bookmarkStart w:id="3" w:name="_Toc230531114"/>
-      <w:r>
-        <w:lastRenderedPageBreak/>
-        <w:t>2. Stand der Diskussion</w:t>
+      </w:pPr>
+      <w:bookmarkStart w:id="3" w:name="_Toc230765972"/>
+      <w:r>
+        <w:t xml:space="preserve">2. Stand der </w:t>
+      </w:r>
+      <w:r>
+        <w:t>Diskussion</w:t>
       </w:r>
       <w:bookmarkEnd w:id="3"/>
     </w:p>
@@ -5964,7 +6036,7 @@
         <w:pStyle w:val="berschrift2"/>
         <w:spacing w:before="240" w:after="120"/>
       </w:pPr>
-      <w:bookmarkStart w:id="4" w:name="_Toc230531115"/>
+      <w:bookmarkStart w:id="4" w:name="_Toc230765973"/>
       <w:r>
         <w:t xml:space="preserve">2.1 </w:t>
       </w:r>
@@ -6073,7 +6145,7 @@
         <w:pStyle w:val="berschrift2"/>
         <w:spacing w:before="240" w:after="120"/>
       </w:pPr>
-      <w:bookmarkStart w:id="5" w:name="_Toc230531116"/>
+      <w:bookmarkStart w:id="5" w:name="_Toc230765974"/>
       <w:r>
         <w:t>2.2 AI-Native SDLC und V-Bounce-Modell</w:t>
       </w:r>
@@ -6108,7 +6180,7 @@
         <w:pStyle w:val="berschrift2"/>
         <w:spacing w:before="240" w:after="120"/>
       </w:pPr>
-      <w:bookmarkStart w:id="6" w:name="_Toc230531117"/>
+      <w:bookmarkStart w:id="6" w:name="_Toc230765975"/>
       <w:r>
         <w:t xml:space="preserve">2.3 </w:t>
       </w:r>
@@ -6171,7 +6243,11 @@
       </w:r>
       <w:proofErr w:type="spellEnd"/>
       <w:r>
-        <w:t xml:space="preserve"> Agent, Fine-tuning Agent), behält die Strategie in der Hand und trifft die Entscheidungen, die die Agenten nicht treffen dürfen. Auch wenn der hier vorgeschlagene Prozess weniger auf Multi-Agenten-Setups zielt, ist die Idee der menschlichen Orchestrierung zentral.</w:t>
+        <w:t xml:space="preserve"> Agent, Fine-tuning Agent), behält die Strategie in der Hand und trifft die Entscheidungen, die die Agenten nicht </w:t>
+      </w:r>
+      <w:r>
+        <w:lastRenderedPageBreak/>
+        <w:t>treffen dürfen. Auch wenn der hier vorgeschlagene Prozess weniger auf Multi-Agenten-Setups zielt, ist die Idee der menschlichen Orchestrierung zentral.</w:t>
       </w:r>
     </w:p>
     <w:p>
@@ -6179,7 +6255,7 @@
         <w:pStyle w:val="berschrift2"/>
         <w:spacing w:before="240" w:after="120"/>
       </w:pPr>
-      <w:bookmarkStart w:id="7" w:name="_Toc230531118"/>
+      <w:bookmarkStart w:id="7" w:name="_Toc230765976"/>
       <w:r>
         <w:t>2.4 XP2025-Workshop Research Roadmap</w:t>
       </w:r>
@@ -6212,7 +6288,6 @@
       </w:r>
       <w:proofErr w:type="spellStart"/>
       <w:r>
-        <w:lastRenderedPageBreak/>
         <w:t>Product</w:t>
       </w:r>
       <w:proofErr w:type="spellEnd"/>
@@ -6241,7 +6316,7 @@
         <w:pStyle w:val="berschrift2"/>
         <w:spacing w:before="240" w:after="120"/>
       </w:pPr>
-      <w:bookmarkStart w:id="8" w:name="_Toc230531119"/>
+      <w:bookmarkStart w:id="8" w:name="_Toc230765977"/>
       <w:r>
         <w:t xml:space="preserve">2.5 GitHub </w:t>
       </w:r>
@@ -6302,7 +6377,7 @@
         <w:pStyle w:val="berschrift2"/>
         <w:spacing w:before="240" w:after="120"/>
       </w:pPr>
-      <w:bookmarkStart w:id="9" w:name="_Toc230531120"/>
+      <w:bookmarkStart w:id="9" w:name="_Toc230765978"/>
       <w:r>
         <w:t>2.6 Persistente Kontext-Dateien</w:t>
       </w:r>
@@ -6320,11 +6395,9 @@
     <w:p>
       <w:pPr>
         <w:pStyle w:val="berschrift1"/>
-        <w:pageBreakBefore/>
-      </w:pPr>
-      <w:bookmarkStart w:id="10" w:name="_Toc230531121"/>
-      <w:r>
-        <w:lastRenderedPageBreak/>
+      </w:pPr>
+      <w:bookmarkStart w:id="10" w:name="_Toc230765979"/>
+      <w:r>
         <w:t>3. Es geht nur agil</w:t>
       </w:r>
       <w:bookmarkEnd w:id="10"/>
@@ -6344,6 +6417,7 @@
         <w:jc w:val="both"/>
       </w:pPr>
       <w:r>
+        <w:lastRenderedPageBreak/>
         <w:t>Der Grund ist nicht ideologisch, sondern praktisch. Schwergewichtige Methoden setzen auf Plan-Stabilität: man entscheidet einmal, dokumentiert ausführlich, implementiert lange. Diese Annahme funktioniert nur, wenn sich die Welt zwischen Plan und Auslieferung nicht zu schnell ändert. In einer Welt, in der Sprachmodelle ihre Fähigkeiten monatlich erweitern und in der eine sinnvolle Aufgabe oft in Stunden statt Tagen umsetzbar ist, ist Plan-Stabilität eine Illusion. Wer sich daran hält, baut Software, die schon beim Release veraltet ist.</w:t>
       </w:r>
     </w:p>
@@ -6352,7 +6426,7 @@
         <w:pStyle w:val="berschrift2"/>
         <w:spacing w:before="240" w:after="120"/>
       </w:pPr>
-      <w:bookmarkStart w:id="11" w:name="_Toc230531122"/>
+      <w:bookmarkStart w:id="11" w:name="_Toc230765980"/>
       <w:r>
         <w:t>3.1 Warum die Notwendigkeit zur Agilität wächst</w:t>
       </w:r>
@@ -6398,7 +6472,7 @@
         <w:pStyle w:val="berschrift2"/>
         <w:spacing w:before="240" w:after="120"/>
       </w:pPr>
-      <w:bookmarkStart w:id="12" w:name="_Toc230531123"/>
+      <w:bookmarkStart w:id="12" w:name="_Toc230765981"/>
       <w:r>
         <w:t>3.2 Was vom Manifest 2001 trägt</w:t>
       </w:r>
@@ -6467,7 +6541,6 @@
         <w:jc w:val="both"/>
       </w:pPr>
       <w:r>
-        <w:lastRenderedPageBreak/>
         <w:t>Dieser Text übernimmt das Manifest deshalb nicht in geänderter Form. Es braucht keine Umformulierung; es braucht eine Begründung, warum es im KI-Zeitalter eher leichter als schwerer einzuhalten ist. Das ist das Thema des folgenden Kapitels.</w:t>
       </w:r>
     </w:p>
@@ -6476,7 +6549,7 @@
         <w:pStyle w:val="berschrift2"/>
         <w:spacing w:before="240" w:after="120"/>
       </w:pPr>
-      <w:bookmarkStart w:id="13" w:name="_Toc230531124"/>
+      <w:bookmarkStart w:id="13" w:name="_Toc230765982"/>
       <w:r>
         <w:t>3.3 Was sich verschiebt, ohne den Kern zu treffen</w:t>
       </w:r>
@@ -6504,7 +6577,11 @@
       </w:r>
       <w:proofErr w:type="gramEnd"/>
       <w:r>
-        <w:t xml:space="preserve"> ausgeliefert werden soll, drittes Prinzip, wirkt langsam, wenn die KI-Takt Tage zulässt. Diese Verschiebungen verlangen aber keine Ersetzung der Prinzipien, sondern eine Neukalibrierung ihrer Skala.</w:t>
+        <w:t xml:space="preserve"> </w:t>
+      </w:r>
+      <w:r>
+        <w:lastRenderedPageBreak/>
+        <w:t>ausgeliefert werden soll, drittes Prinzip, wirkt langsam, wenn die KI-Takt Tage zulässt. Diese Verschiebungen verlangen aber keine Ersetzung der Prinzipien, sondern eine Neukalibrierung ihrer Skala.</w:t>
       </w:r>
     </w:p>
     <w:p>
@@ -6519,11 +6596,9 @@
     <w:p>
       <w:pPr>
         <w:pStyle w:val="berschrift1"/>
-        <w:pageBreakBefore/>
-      </w:pPr>
-      <w:bookmarkStart w:id="14" w:name="_Toc230531125"/>
-      <w:r>
-        <w:lastRenderedPageBreak/>
+      </w:pPr>
+      <w:bookmarkStart w:id="14" w:name="_Toc230765983"/>
+      <w:r>
         <w:t>4. Die zwölf Prinzipien im KI-Zeitalter</w:t>
       </w:r>
       <w:bookmarkEnd w:id="14"/>
@@ -6551,7 +6626,7 @@
         <w:pStyle w:val="berschrift2"/>
         <w:spacing w:before="240" w:after="120"/>
       </w:pPr>
-      <w:bookmarkStart w:id="15" w:name="_Toc230531126"/>
+      <w:bookmarkStart w:id="15" w:name="_Toc230765984"/>
       <w:r>
         <w:t>4.1 Frühe und kontinuierliche Auslieferung wertvoller Software</w:t>
       </w:r>
@@ -6612,7 +6687,7 @@
         <w:pStyle w:val="berschrift2"/>
         <w:spacing w:before="240" w:after="120"/>
       </w:pPr>
-      <w:bookmarkStart w:id="16" w:name="_Toc230531127"/>
+      <w:bookmarkStart w:id="16" w:name="_Toc230765985"/>
       <w:r>
         <w:t>4.2 Anforderungsänderungen sind willkommen, auch spät</w:t>
       </w:r>
@@ -6665,7 +6740,11 @@
       </w:r>
       <w:proofErr w:type="spellEnd"/>
       <w:r>
-        <w:t xml:space="preserve"> und einem zweiten Modell als Review in wenigen Stunden vollzogen sein. Eine Änderung an einem Domain-Modell, die sich durch drei Schichten zieht, ist mit KI-Unterstützung in einem überschaubaren Aufwand zu machen. Die Voraussetzung ist, dass die Änderung disziplinarisch eingespeist wird: das </w:t>
+        <w:t xml:space="preserve"> und einem zweiten Modell als Review in wenigen Stunden vollzogen sein. Eine Änderung an einem Domain-Modell, die sich durch </w:t>
+      </w:r>
+      <w:r>
+        <w:lastRenderedPageBreak/>
+        <w:t xml:space="preserve">drei Schichten zieht, ist mit KI-Unterstützung in einem überschaubaren Aufwand zu machen. Die Voraussetzung ist, dass die Änderung disziplinarisch eingespeist wird: das </w:t>
       </w:r>
       <w:proofErr w:type="spellStart"/>
       <w:r>
@@ -6697,7 +6776,7 @@
         <w:pStyle w:val="berschrift2"/>
         <w:spacing w:before="240" w:after="120"/>
       </w:pPr>
-      <w:bookmarkStart w:id="17" w:name="_Toc230531128"/>
+      <w:bookmarkStart w:id="17" w:name="_Toc230765986"/>
       <w:r>
         <w:t>4.3 Funktionierende Software wird häufig ausgeliefert</w:t>
       </w:r>
@@ -6709,7 +6788,6 @@
         <w:jc w:val="both"/>
       </w:pPr>
       <w:r>
-        <w:lastRenderedPageBreak/>
         <w:t>Das dritte Prinzip nennt ursprünglich Wochen bis Monate als Takt, mit Vorzug für die kürzeren Skalen. Der Kern ist: häufig liefern, damit Feedback früh ist und Korrekturen klein. Dieser Kern gilt weiterhin.</w:t>
       </w:r>
     </w:p>
@@ -6735,7 +6813,7 @@
         <w:pStyle w:val="berschrift2"/>
         <w:spacing w:before="240" w:after="120"/>
       </w:pPr>
-      <w:bookmarkStart w:id="18" w:name="_Toc230531129"/>
+      <w:bookmarkStart w:id="18" w:name="_Toc230765987"/>
       <w:r>
         <w:t>4.4 Fachseite und Entwicklung arbeiten täglich zusammen</w:t>
       </w:r>
@@ -6798,7 +6876,7 @@
         <w:pStyle w:val="berschrift2"/>
         <w:spacing w:before="240" w:after="120"/>
       </w:pPr>
-      <w:bookmarkStart w:id="19" w:name="_Toc230531130"/>
+      <w:bookmarkStart w:id="19" w:name="_Toc230765988"/>
       <w:r>
         <w:t>4.5 Motivierte Individuen mit Umgebung und Vertrauen</w:t>
       </w:r>
@@ -6824,11 +6902,25 @@
     </w:p>
     <w:p>
       <w:pPr>
+        <w:rPr>
+          <w:b/>
+          <w:bCs/>
+          <w:sz w:val="28"/>
+          <w:szCs w:val="28"/>
+        </w:rPr>
+      </w:pPr>
+      <w:r>
+        <w:br w:type="page"/>
+      </w:r>
+    </w:p>
+    <w:p>
+      <w:pPr>
         <w:pStyle w:val="berschrift2"/>
         <w:spacing w:before="240" w:after="120"/>
       </w:pPr>
-      <w:bookmarkStart w:id="20" w:name="_Toc230531131"/>
-      <w:r>
+      <w:bookmarkStart w:id="20" w:name="_Toc230765989"/>
+      <w:r>
+        <w:lastRenderedPageBreak/>
         <w:t>4.6 Direkte Kommunikation als effektivste Methode</w:t>
       </w:r>
       <w:bookmarkEnd w:id="20"/>
@@ -6864,11 +6956,7 @@
       </w:r>
       <w:proofErr w:type="gramEnd"/>
       <w:r>
-        <w:t xml:space="preserve"> und KI stattfindet. Diese kann nicht von Angesicht zu Angesicht sein; sie ist notwendig schriftlich. Daraus folgt </w:t>
-      </w:r>
-      <w:r>
-        <w:lastRenderedPageBreak/>
-        <w:t xml:space="preserve">eine pragmatische Konsequenz: alles, was die KI wissen muss, gehört in ein </w:t>
+        <w:t xml:space="preserve"> und KI stattfindet. Diese kann nicht von Angesicht zu Angesicht sein; sie ist notwendig schriftlich. Daraus folgt eine pragmatische Konsequenz: alles, was die KI wissen muss, gehört in ein </w:t>
       </w:r>
       <w:proofErr w:type="spellStart"/>
       <w:r>
@@ -6876,7 +6964,13 @@
       </w:r>
       <w:proofErr w:type="spellEnd"/>
       <w:r>
-        <w:t>, in CLAUDE-Dateien oder in Memory-Notizen. Das Gespräch zwischen Menschen darf dadurch nicht verarmen. Die Versuchung, alles in Schriftform zu pressen, weil die KI das gut liest, wäre eine Verletzung dieses Prinzips.</w:t>
+        <w:t xml:space="preserve">, </w:t>
+      </w:r>
+      <w:r>
+        <w:t>in KI-Konventionsdateien oder in Memory-Notizen</w:t>
+      </w:r>
+      <w:r>
+        <w:t>. Das Gespräch zwischen Menschen darf dadurch nicht verarmen. Die Versuchung, alles in Schriftform zu pressen, weil die KI das gut liest, wäre eine Verletzung dieses Prinzips.</w:t>
       </w:r>
     </w:p>
     <w:p>
@@ -6884,7 +6978,7 @@
         <w:pStyle w:val="berschrift2"/>
         <w:spacing w:before="240" w:after="120"/>
       </w:pPr>
-      <w:bookmarkStart w:id="21" w:name="_Toc230531132"/>
+      <w:bookmarkStart w:id="21" w:name="_Toc230765990"/>
       <w:r>
         <w:t>4.7 Funktionierende Software als wichtigstes Fortschrittsmaß</w:t>
       </w:r>
@@ -6921,7 +7015,7 @@
         <w:pStyle w:val="berschrift2"/>
         <w:spacing w:before="240" w:after="120"/>
       </w:pPr>
-      <w:bookmarkStart w:id="22" w:name="_Toc230531133"/>
+      <w:bookmarkStart w:id="22" w:name="_Toc230765991"/>
       <w:r>
         <w:t>4.8 Nachhaltige Geschwindigkeit</w:t>
       </w:r>
@@ -6971,11 +7065,25 @@
     </w:p>
     <w:p>
       <w:pPr>
+        <w:rPr>
+          <w:b/>
+          <w:bCs/>
+          <w:sz w:val="28"/>
+          <w:szCs w:val="28"/>
+        </w:rPr>
+      </w:pPr>
+      <w:r>
+        <w:br w:type="page"/>
+      </w:r>
+    </w:p>
+    <w:p>
+      <w:pPr>
         <w:pStyle w:val="berschrift2"/>
         <w:spacing w:before="240" w:after="120"/>
       </w:pPr>
-      <w:bookmarkStart w:id="23" w:name="_Toc230531134"/>
-      <w:r>
+      <w:bookmarkStart w:id="23" w:name="_Toc230765992"/>
+      <w:r>
+        <w:lastRenderedPageBreak/>
         <w:t>4.9 Ständige Aufmerksamkeit auf technische Exzellenz</w:t>
       </w:r>
       <w:bookmarkEnd w:id="23"/>
@@ -7027,7 +7135,7 @@
         <w:pStyle w:val="berschrift2"/>
         <w:spacing w:before="240" w:after="120"/>
       </w:pPr>
-      <w:bookmarkStart w:id="24" w:name="_Toc230531135"/>
+      <w:bookmarkStart w:id="24" w:name="_Toc230765993"/>
       <w:r>
         <w:t>4.10 Einfachheit, die Kunst, nicht zu tun</w:t>
       </w:r>
@@ -7039,7 +7147,6 @@
         <w:jc w:val="both"/>
       </w:pPr>
       <w:r>
-        <w:lastRenderedPageBreak/>
         <w:t>Das zehnte Prinzip lobt das Maximieren der nicht gemachten Arbeit. Es ist das einzige Prinzip, das explizit gegen Übereifer warnt, und damit eines der schwersten zu leben.</w:t>
       </w:r>
     </w:p>
@@ -7129,7 +7236,7 @@
         <w:pStyle w:val="berschrift2"/>
         <w:spacing w:before="240" w:after="120"/>
       </w:pPr>
-      <w:bookmarkStart w:id="25" w:name="_Toc230531136"/>
+      <w:bookmarkStart w:id="25" w:name="_Toc230765994"/>
       <w:r>
         <w:t>4.11 Selbstorganisierende Teams</w:t>
       </w:r>
@@ -7216,7 +7323,7 @@
         <w:pStyle w:val="berschrift2"/>
         <w:spacing w:before="240" w:after="120"/>
       </w:pPr>
-      <w:bookmarkStart w:id="26" w:name="_Toc230531137"/>
+      <w:bookmarkStart w:id="26" w:name="_Toc230765995"/>
       <w:r>
         <w:t>4.12 Regelmäßige Reflexion und Anpassung</w:t>
       </w:r>
@@ -7237,7 +7344,17 @@
         <w:jc w:val="both"/>
       </w:pPr>
       <w:r>
-        <w:t>Im KI-Modus tritt zur klassischen Team-Retrospektive die KI-Retrospektive als eigenständiges Format hinzu (siehe Kapitel 7.5). Sie ist nicht Tagesordnungspunkt der allgemeinen Retro, sondern ein eigenes Event. Drei Fragen führen sie: Wo hat die Mensch-KI-Zusammenarbeit gehakt? Welche Memory-Einträge sind veraltet? Welche Workflow-Regel braucht eine Schärfung? Die Antworten produzieren konkrete Änderungen an CLAUDE-Dateien, Memory-Files und der Prompt-Bibliothek. Das Prinzip wird damit stärker, weil es eine zweite Reflexionsebene bekommt. Wer in der KI-Ära nicht regelmäßig reflektiert, sammelt Memory-Drift an: alte Regeln, neue Realität, wachsende Reibung.</w:t>
+        <w:t>Im KI-Modus tritt zur klassischen Team-Retrospektive die KI-Retrospektive als eigenständiges Format hinzu (siehe Kapitel 7.5). Sie ist nicht Tagesordnungspunkt der allgemeinen Retro, sondern ein eigenes Event. Drei Fragen führen sie: Wo hat die Mensch-KI-Zusammenarbeit gehakt? Welche Memory-</w:t>
+      </w:r>
+      <w:r>
+        <w:lastRenderedPageBreak/>
+        <w:t xml:space="preserve">Einträge sind veraltet? Welche Workflow-Regel braucht eine Schärfung? </w:t>
+      </w:r>
+      <w:r>
+        <w:t>Die Antworten produzieren konkrete Änderungen an KI-Konventionsdateien, Memory-Files und der Prompt-Bibliothek</w:t>
+      </w:r>
+      <w:r>
+        <w:t>. Das Prinzip wird damit stärker, weil es eine zweite Reflexionsebene bekommt. Wer in der KI-Ära nicht regelmäßig reflektiert, sammelt Memory-Drift an: alte Regeln, neue Realität, wachsende Reibung.</w:t>
       </w:r>
     </w:p>
     <w:p>
@@ -7245,7 +7362,7 @@
         <w:pStyle w:val="berschrift2"/>
         <w:spacing w:before="240" w:after="120"/>
       </w:pPr>
-      <w:bookmarkStart w:id="27" w:name="_Toc230531138"/>
+      <w:bookmarkStart w:id="27" w:name="_Toc230765996"/>
       <w:r>
         <w:t>4.13 Zwischenbilanz</w:t>
       </w:r>
@@ -7263,11 +7380,9 @@
     <w:p>
       <w:pPr>
         <w:pStyle w:val="berschrift1"/>
-        <w:pageBreakBefore/>
-      </w:pPr>
-      <w:bookmarkStart w:id="28" w:name="_Toc230531139"/>
-      <w:r>
-        <w:lastRenderedPageBreak/>
+      </w:pPr>
+      <w:bookmarkStart w:id="28" w:name="_Toc230765997"/>
+      <w:r>
         <w:t>5. Rollen</w:t>
       </w:r>
       <w:bookmarkEnd w:id="28"/>
@@ -7286,7 +7401,7 @@
         <w:pStyle w:val="berschrift2"/>
         <w:spacing w:before="240" w:after="120"/>
       </w:pPr>
-      <w:bookmarkStart w:id="29" w:name="_Toc230531140"/>
+      <w:bookmarkStart w:id="29" w:name="_Toc230765998"/>
       <w:r>
         <w:t xml:space="preserve">5.1 </w:t>
       </w:r>
@@ -7400,7 +7515,7 @@
         <w:pStyle w:val="berschrift2"/>
         <w:spacing w:before="240" w:after="120"/>
       </w:pPr>
-      <w:bookmarkStart w:id="30" w:name="_Toc230531141"/>
+      <w:bookmarkStart w:id="30" w:name="_Toc230765999"/>
       <w:r>
         <w:t>5.2 Senior Developer</w:t>
       </w:r>
@@ -7461,8 +7576,9 @@
         <w:pStyle w:val="berschrift2"/>
         <w:spacing w:before="240" w:after="120"/>
       </w:pPr>
-      <w:bookmarkStart w:id="31" w:name="_Toc230531142"/>
-      <w:r>
+      <w:bookmarkStart w:id="31" w:name="_Toc230766000"/>
+      <w:r>
+        <w:lastRenderedPageBreak/>
         <w:t>5.3 Qualitätsexperte</w:t>
       </w:r>
       <w:bookmarkEnd w:id="31"/>
@@ -7473,7 +7589,21 @@
         <w:jc w:val="both"/>
       </w:pPr>
       <w:r>
-        <w:t>Der Qualitätsexperte verantwortet die Verifizierung. Er führt die Code-Reviews durch das zweite Modell, etwa OpenAI Codex, wenn das Implementations-Modell Claude ist, oder umgekehrt. Er prüft Coverage- und Mutation-Scores. Er führt Security-Reviews durch und stellt sicher, dass Secrets nicht ins Repository wandern, dass SQL-</w:t>
+        <w:t xml:space="preserve">Der Qualitätsexperte verantwortet die Verifizierung. </w:t>
+      </w:r>
+      <w:r>
+        <w:t xml:space="preserve">Er führt die Code-Reviews durch ein zweites Modell anderer Bauart als das implementierende — beispielsweise Claude Code als Implementations-Werkzeug und OpenAI Codex als Review-Instanz, oder umgekehrt; auch Kombinationen mit Cursor, GitHub Copilot oder einem lokalen Modell sind möglich. Wichtig ist nicht das spezifische Werkzeug, sondern die unterschiedliche </w:t>
+      </w:r>
+      <w:proofErr w:type="gramStart"/>
+      <w:r>
+        <w:t>Bauart.</w:t>
+      </w:r>
+      <w:r>
+        <w:t>.</w:t>
+      </w:r>
+      <w:proofErr w:type="gramEnd"/>
+      <w:r>
+        <w:t xml:space="preserve"> Er prüft Coverage- und Mutation-Scores. Er führt Security-Reviews durch und stellt sicher, dass Secrets nicht ins Repository wandern, dass SQL-</w:t>
       </w:r>
       <w:proofErr w:type="spellStart"/>
       <w:r>
@@ -7506,7 +7636,7 @@
         <w:pStyle w:val="berschrift2"/>
         <w:spacing w:before="240" w:after="120"/>
       </w:pPr>
-      <w:bookmarkStart w:id="32" w:name="_Toc230531143"/>
+      <w:bookmarkStart w:id="32" w:name="_Toc230766001"/>
       <w:r>
         <w:t>5.4 Die KI als Werkzeug</w:t>
       </w:r>
@@ -7518,7 +7648,6 @@
         <w:jc w:val="both"/>
       </w:pPr>
       <w:r>
-        <w:lastRenderedPageBreak/>
         <w:t>Die KI ist in diesem Prozess konsequent als Werkzeug behandelt. Sie hat keine Stimme im Daily-</w:t>
       </w:r>
       <w:proofErr w:type="spellStart"/>
@@ -7560,7 +7689,13 @@
       </w:r>
       <w:proofErr w:type="spellEnd"/>
       <w:r>
-        <w:t xml:space="preserve"> sie diktiert. Sie pflegt Memory-Dateien. Sie liest CLAUDE-Konventionen und wendet sie an. Die folgende Tabelle macht das explizit:</w:t>
+        <w:t xml:space="preserve"> sie diktiert. Sie pflegt Memory-Dateien. </w:t>
+      </w:r>
+      <w:r>
+        <w:t>Sie liest die KI-Konventionsdateien und wendet sie an.</w:t>
+      </w:r>
+      <w:r>
+        <w:t xml:space="preserve"> Die folgende Tabelle macht das explizit:</w:t>
       </w:r>
     </w:p>
     <w:tbl>
@@ -7585,12 +7720,6 @@
         <w:gridCol w:w="4513"/>
       </w:tblGrid>
       <w:tr>
-        <w:tblPrEx>
-          <w:tblCellMar>
-            <w:top w:w="0" w:type="dxa"/>
-            <w:bottom w:w="0" w:type="dxa"/>
-          </w:tblCellMar>
-        </w:tblPrEx>
         <w:trPr>
           <w:tblHeader/>
         </w:trPr>
@@ -7650,12 +7779,6 @@
         </w:tc>
       </w:tr>
       <w:tr>
-        <w:tblPrEx>
-          <w:tblCellMar>
-            <w:top w:w="0" w:type="dxa"/>
-            <w:bottom w:w="0" w:type="dxa"/>
-          </w:tblCellMar>
-        </w:tblPrEx>
         <w:tc>
           <w:tcPr>
             <w:tcW w:w="4513" w:type="dxa"/>
@@ -7756,11 +7879,31 @@
           </w:p>
           <w:p>
             <w:pPr>
+              <w:pBdr>
+                <w:top w:val="single" w:sz="2" w:space="0" w:color="auto"/>
+                <w:left w:val="single" w:sz="2" w:space="0" w:color="auto"/>
+                <w:bottom w:val="single" w:sz="2" w:space="0" w:color="auto"/>
+                <w:right w:val="single" w:sz="2" w:space="0" w:color="auto"/>
+              </w:pBdr>
               <w:spacing w:after="40"/>
             </w:pPr>
             <w:r>
-              <w:t>Konventionen aus CLAUDE-Dateien anwenden</w:t>
-            </w:r>
+              <w:t>Konventionen aus den KI-Konventionsdateien anwenden</w:t>
+            </w:r>
+          </w:p>
+          <w:p>
+            <w:pPr>
+              <w:rPr>
+                <w:rFonts w:ascii="Times New Roman" w:hAnsi="Times New Roman" w:cs="Times New Roman"/>
+                <w:sz w:val="24"/>
+                <w:szCs w:val="24"/>
+              </w:rPr>
+            </w:pPr>
+          </w:p>
+          <w:p>
+            <w:pPr>
+              <w:spacing w:after="40"/>
+            </w:pPr>
           </w:p>
         </w:tc>
         <w:tc>
@@ -7929,11 +8072,25 @@
     </w:p>
     <w:p>
       <w:pPr>
+        <w:rPr>
+          <w:b/>
+          <w:bCs/>
+          <w:sz w:val="28"/>
+          <w:szCs w:val="28"/>
+        </w:rPr>
+      </w:pPr>
+      <w:r>
+        <w:br w:type="page"/>
+      </w:r>
+    </w:p>
+    <w:p>
+      <w:pPr>
         <w:pStyle w:val="berschrift2"/>
         <w:spacing w:before="240" w:after="120"/>
       </w:pPr>
-      <w:bookmarkStart w:id="33" w:name="_Toc230531144"/>
-      <w:r>
+      <w:bookmarkStart w:id="33" w:name="_Toc230766002"/>
+      <w:r>
+        <w:lastRenderedPageBreak/>
         <w:t>5.5 Optionale KI-Assistenzrollen</w:t>
       </w:r>
       <w:bookmarkEnd w:id="33"/>
@@ -7991,11 +8148,9 @@
     <w:p>
       <w:pPr>
         <w:pStyle w:val="berschrift1"/>
-        <w:pageBreakBefore/>
-      </w:pPr>
-      <w:bookmarkStart w:id="34" w:name="_Toc230531145"/>
-      <w:r>
-        <w:lastRenderedPageBreak/>
+      </w:pPr>
+      <w:bookmarkStart w:id="34" w:name="_Toc230766003"/>
+      <w:r>
         <w:t>6. Artefakte</w:t>
       </w:r>
       <w:bookmarkEnd w:id="34"/>
@@ -8014,7 +8169,7 @@
         <w:pStyle w:val="berschrift2"/>
         <w:spacing w:before="240" w:after="120"/>
       </w:pPr>
-      <w:bookmarkStart w:id="35" w:name="_Toc230531146"/>
+      <w:bookmarkStart w:id="35" w:name="_Toc230766004"/>
       <w:r>
         <w:t xml:space="preserve">6.1 Das </w:t>
       </w:r>
@@ -8120,7 +8275,7 @@
         <w:pStyle w:val="berschrift2"/>
         <w:spacing w:before="240" w:after="120"/>
       </w:pPr>
-      <w:bookmarkStart w:id="36" w:name="_Toc230531147"/>
+      <w:bookmarkStart w:id="36" w:name="_Toc230766005"/>
       <w:r>
         <w:t>6.2 Das Kanban-Board</w:t>
       </w:r>
@@ -8174,12 +8329,6 @@
         <w:gridCol w:w="2500"/>
       </w:tblGrid>
       <w:tr>
-        <w:tblPrEx>
-          <w:tblCellMar>
-            <w:top w:w="0" w:type="dxa"/>
-            <w:bottom w:w="0" w:type="dxa"/>
-          </w:tblCellMar>
-        </w:tblPrEx>
         <w:trPr>
           <w:tblHeader/>
         </w:trPr>
@@ -8266,12 +8415,6 @@
         </w:tc>
       </w:tr>
       <w:tr>
-        <w:tblPrEx>
-          <w:tblCellMar>
-            <w:top w:w="0" w:type="dxa"/>
-            <w:bottom w:w="0" w:type="dxa"/>
-          </w:tblCellMar>
-        </w:tblPrEx>
         <w:tc>
           <w:tcPr>
             <w:tcW w:w="1500" w:type="dxa"/>
@@ -8348,12 +8491,6 @@
         </w:tc>
       </w:tr>
       <w:tr>
-        <w:tblPrEx>
-          <w:tblCellMar>
-            <w:top w:w="0" w:type="dxa"/>
-            <w:bottom w:w="0" w:type="dxa"/>
-          </w:tblCellMar>
-        </w:tblPrEx>
         <w:tc>
           <w:tcPr>
             <w:tcW w:w="1500" w:type="dxa"/>
@@ -8430,12 +8567,6 @@
         </w:tc>
       </w:tr>
       <w:tr>
-        <w:tblPrEx>
-          <w:tblCellMar>
-            <w:top w:w="0" w:type="dxa"/>
-            <w:bottom w:w="0" w:type="dxa"/>
-          </w:tblCellMar>
-        </w:tblPrEx>
         <w:tc>
           <w:tcPr>
             <w:tcW w:w="1500" w:type="dxa"/>
@@ -8525,12 +8656,6 @@
         </w:tc>
       </w:tr>
       <w:tr>
-        <w:tblPrEx>
-          <w:tblCellMar>
-            <w:top w:w="0" w:type="dxa"/>
-            <w:bottom w:w="0" w:type="dxa"/>
-          </w:tblCellMar>
-        </w:tblPrEx>
         <w:tc>
           <w:tcPr>
             <w:tcW w:w="1500" w:type="dxa"/>
@@ -8599,12 +8724,6 @@
         </w:tc>
       </w:tr>
       <w:tr>
-        <w:tblPrEx>
-          <w:tblCellMar>
-            <w:top w:w="0" w:type="dxa"/>
-            <w:bottom w:w="0" w:type="dxa"/>
-          </w:tblCellMar>
-        </w:tblPrEx>
         <w:tc>
           <w:tcPr>
             <w:tcW w:w="1500" w:type="dxa"/>
@@ -8624,6 +8743,7 @@
           <w:p>
             <w:proofErr w:type="spellStart"/>
             <w:r>
+              <w:lastRenderedPageBreak/>
               <w:t>Done</w:t>
             </w:r>
             <w:proofErr w:type="spellEnd"/>
@@ -8754,7 +8874,7 @@
         <w:pStyle w:val="berschrift2"/>
         <w:spacing w:before="240" w:after="120"/>
       </w:pPr>
-      <w:bookmarkStart w:id="37" w:name="_Toc230531148"/>
+      <w:bookmarkStart w:id="37" w:name="_Toc230766006"/>
       <w:r>
         <w:t>6.3 Persistente Kontext-Dateien</w:t>
       </w:r>
@@ -8766,7 +8886,6 @@
         <w:jc w:val="both"/>
       </w:pPr>
       <w:r>
-        <w:lastRenderedPageBreak/>
         <w:t>Vier Klassen von Dateien tragen den persistenten Kontext eines Teams:</w:t>
       </w:r>
     </w:p>
@@ -8780,7 +8899,28 @@
         <w:spacing w:after="80"/>
       </w:pPr>
       <w:r>
-        <w:t>CLAUDE.md im Repo-Root beschreibt die projekt-spezifischen Regeln und Konventionen. Wer hier liest, weiß, was in diesem Projekt anders ist als in anderen.</w:t>
+        <w:t xml:space="preserve">Die zentrale KI-Konventionsdatei im Repo-Root beschreibt die projekt-spezifischen Regeln und Konventionen — bei Claude Code heißt sie typischerweise CLAUDE.md, bei OpenAI Codex AGENTS.md, bei Cursor liegen vergleichbare Regeln </w:t>
+      </w:r>
+      <w:proofErr w:type="gramStart"/>
+      <w:r>
+        <w:t>in .</w:t>
+      </w:r>
+      <w:proofErr w:type="spellStart"/>
+      <w:r>
+        <w:t>cursor</w:t>
+      </w:r>
+      <w:proofErr w:type="spellEnd"/>
+      <w:proofErr w:type="gramEnd"/>
+      <w:r>
+        <w:t>/</w:t>
+      </w:r>
+      <w:proofErr w:type="spellStart"/>
+      <w:r>
+        <w:t>rules</w:t>
+      </w:r>
+      <w:proofErr w:type="spellEnd"/>
+      <w:r>
+        <w:t>. Das Konzept ist werkzeug-agnostisch, der Dateiname Werkzeug-Sache. Wer hier liest, weiß, was in diesem Projekt anders ist als in anderen.</w:t>
       </w:r>
     </w:p>
     <w:p>
@@ -8793,7 +8933,7 @@
         <w:spacing w:after="80"/>
       </w:pPr>
       <w:r>
-        <w:t>CLAUDE-workflow.md beschreibt den Prozess selbst. Diese Datei ist bewusst projekt-unabhängig gehalten, damit sie in andere Projekte kopiert und dort minimal angepasst werden kann.</w:t>
+        <w:t>Eine Workflow-Konventionsdatei (im Beispiel CLAUDE-workflow.md) beschreibt den Prozess selbst. Diese Datei ist bewusst projekt-unabhängig gehalten, damit sie in andere Projekte kopiert und dort minimal angepasst werden kann.</w:t>
       </w:r>
     </w:p>
     <w:p>
@@ -8806,7 +8946,7 @@
         <w:spacing w:after="80"/>
       </w:pPr>
       <w:r>
-        <w:t>Tech-spezifische Dateien wie CLAUDE-java.md, CLAUDE-react.md oder CLAUDE-python.md sammeln Konventionen pro Sprache und Framework: Testpyramiden, Code-Style, Architektur-Muster.</w:t>
+        <w:t>Tech-spezifische Konventionsdateien (im Beispiel CLAUDE-java.md, CLAUDE-react.md, CLAUDE-python.md) sammeln Konventionen pro Sprache und Framework: Testpyramiden, Code-Style, Architektur-Muster.</w:t>
       </w:r>
     </w:p>
     <w:p>
@@ -8819,7 +8959,7 @@
         <w:spacing w:after="80"/>
       </w:pPr>
       <w:r>
-        <w:t>CLAUDE-security.md bündelt die Security-Checks vor Commit und Push.</w:t>
+        <w:t>Eine Security-Konventionsdatei (im Beispiel CLAUDE-security.md) bündelt die Security-Checks vor Commit und Push.</w:t>
       </w:r>
     </w:p>
     <w:p>
@@ -8857,7 +8997,7 @@
         <w:pStyle w:val="berschrift2"/>
         <w:spacing w:before="240" w:after="120"/>
       </w:pPr>
-      <w:bookmarkStart w:id="38" w:name="_Toc230531149"/>
+      <w:bookmarkStart w:id="38" w:name="_Toc230766007"/>
       <w:r>
         <w:t>6.4 Prompt-Bibliothek</w:t>
       </w:r>
@@ -8869,7 +9009,13 @@
         <w:jc w:val="both"/>
       </w:pPr>
       <w:r>
-        <w:t xml:space="preserve">Wiederverwendbare Anweisungen an die KI werden im Repository gepflegt, als kleine Dateien oder als Sektionen in den CLAUDE-Dateien. Ein gut gepflegter Prompt für die Erstellung eines neuen </w:t>
+        <w:t xml:space="preserve">Wiederverwendbare Anweisungen an die KI werden im Repository gepflegt, als kleine Dateien oder als Sektionen in den </w:t>
+      </w:r>
+      <w:r>
+        <w:t>KI-Konventionsd</w:t>
+      </w:r>
+      <w:r>
+        <w:t xml:space="preserve">ateien. Ein gut gepflegter Prompt für die Erstellung eines neuen </w:t>
       </w:r>
       <w:proofErr w:type="spellStart"/>
       <w:r>
@@ -8894,8 +9040,9 @@
         <w:pStyle w:val="berschrift2"/>
         <w:spacing w:before="240" w:after="120"/>
       </w:pPr>
-      <w:bookmarkStart w:id="39" w:name="_Toc230531150"/>
-      <w:r>
+      <w:bookmarkStart w:id="39" w:name="_Toc230766008"/>
+      <w:r>
+        <w:lastRenderedPageBreak/>
         <w:t>6.5 PR- und Commit-Konventionen</w:t>
       </w:r>
       <w:bookmarkEnd w:id="39"/>
@@ -8936,11 +9083,9 @@
     <w:p>
       <w:pPr>
         <w:pStyle w:val="berschrift1"/>
-        <w:pageBreakBefore/>
-      </w:pPr>
-      <w:bookmarkStart w:id="40" w:name="_Toc230531151"/>
-      <w:r>
-        <w:lastRenderedPageBreak/>
+      </w:pPr>
+      <w:bookmarkStart w:id="40" w:name="_Toc230766009"/>
+      <w:r>
         <w:t>7. Takt und Events</w:t>
       </w:r>
       <w:bookmarkEnd w:id="40"/>
@@ -9002,12 +9147,6 @@
         <w:gridCol w:w="2826"/>
       </w:tblGrid>
       <w:tr>
-        <w:tblPrEx>
-          <w:tblCellMar>
-            <w:top w:w="0" w:type="dxa"/>
-            <w:bottom w:w="0" w:type="dxa"/>
-          </w:tblCellMar>
-        </w:tblPrEx>
         <w:trPr>
           <w:tblHeader/>
         </w:trPr>
@@ -9121,12 +9260,6 @@
         </w:tc>
       </w:tr>
       <w:tr>
-        <w:tblPrEx>
-          <w:tblCellMar>
-            <w:top w:w="0" w:type="dxa"/>
-            <w:bottom w:w="0" w:type="dxa"/>
-          </w:tblCellMar>
-        </w:tblPrEx>
         <w:tc>
           <w:tcPr>
             <w:tcW w:w="2200" w:type="dxa"/>
@@ -9230,12 +9363,6 @@
         </w:tc>
       </w:tr>
       <w:tr>
-        <w:tblPrEx>
-          <w:tblCellMar>
-            <w:top w:w="0" w:type="dxa"/>
-            <w:bottom w:w="0" w:type="dxa"/>
-          </w:tblCellMar>
-        </w:tblPrEx>
         <w:tc>
           <w:tcPr>
             <w:tcW w:w="2200" w:type="dxa"/>
@@ -9339,12 +9466,6 @@
         </w:tc>
       </w:tr>
       <w:tr>
-        <w:tblPrEx>
-          <w:tblCellMar>
-            <w:top w:w="0" w:type="dxa"/>
-            <w:bottom w:w="0" w:type="dxa"/>
-          </w:tblCellMar>
-        </w:tblPrEx>
         <w:tc>
           <w:tcPr>
             <w:tcW w:w="2200" w:type="dxa"/>
@@ -9443,12 +9564,6 @@
         </w:tc>
       </w:tr>
       <w:tr>
-        <w:tblPrEx>
-          <w:tblCellMar>
-            <w:top w:w="0" w:type="dxa"/>
-            <w:bottom w:w="0" w:type="dxa"/>
-          </w:tblCellMar>
-        </w:tblPrEx>
         <w:tc>
           <w:tcPr>
             <w:tcW w:w="2200" w:type="dxa"/>
@@ -9539,12 +9654,6 @@
         </w:tc>
       </w:tr>
       <w:tr>
-        <w:tblPrEx>
-          <w:tblCellMar>
-            <w:top w:w="0" w:type="dxa"/>
-            <w:bottom w:w="0" w:type="dxa"/>
-          </w:tblCellMar>
-        </w:tblPrEx>
         <w:tc>
           <w:tcPr>
             <w:tcW w:w="2200" w:type="dxa"/>
@@ -9640,7 +9749,7 @@
         <w:pStyle w:val="berschrift2"/>
         <w:spacing w:before="240" w:after="120"/>
       </w:pPr>
-      <w:bookmarkStart w:id="41" w:name="_Toc230531152"/>
+      <w:bookmarkStart w:id="41" w:name="_Toc230766010"/>
       <w:r>
         <w:t>7.1 Daily-</w:t>
       </w:r>
@@ -9730,7 +9839,7 @@
         <w:pStyle w:val="berschrift2"/>
         <w:spacing w:before="240" w:after="120"/>
       </w:pPr>
-      <w:bookmarkStart w:id="42" w:name="_Toc230531153"/>
+      <w:bookmarkStart w:id="42" w:name="_Toc230766011"/>
       <w:r>
         <w:t xml:space="preserve">7.2 </w:t>
       </w:r>
@@ -9796,7 +9905,11 @@
       </w:r>
       <w:proofErr w:type="spellEnd"/>
       <w:r>
-        <w:t xml:space="preserve"> nach Diktat formulieren, Akzeptanzkriterien vorschlagen, Designfragen aufdecken, die nicht offensichtlich sind. Was sie nicht tut, ist die Bewegung nach Ready. Diese Bewegung ist der Moment, in dem ein </w:t>
+        <w:t xml:space="preserve"> nach Diktat formulieren, Akzeptanzkriterien vorschlagen, Designfragen aufdecken, die nicht offensichtlich sind. Was sie nicht tut, ist die Bewegung </w:t>
+      </w:r>
+      <w:r>
+        <w:lastRenderedPageBreak/>
+        <w:t xml:space="preserve">nach Ready. Diese Bewegung ist der Moment, in dem ein </w:t>
       </w:r>
       <w:proofErr w:type="spellStart"/>
       <w:r>
@@ -9812,7 +9925,7 @@
         <w:pStyle w:val="berschrift2"/>
         <w:spacing w:before="240" w:after="120"/>
       </w:pPr>
-      <w:bookmarkStart w:id="43" w:name="_Toc230531154"/>
+      <w:bookmarkStart w:id="43" w:name="_Toc230766012"/>
       <w:r>
         <w:t>7.3 Implementations-Iteration</w:t>
       </w:r>
@@ -9824,7 +9937,6 @@
         <w:jc w:val="both"/>
       </w:pPr>
       <w:r>
-        <w:lastRenderedPageBreak/>
         <w:t xml:space="preserve">Die Implementations-Iteration ist das zentrale Arbeits-Event. Sie beginnt mit einer Trigger-Phrase wie „implementiere alles in Ready”, dem pauschalen GO. Von dort arbeitet die KI </w:t>
       </w:r>
       <w:proofErr w:type="spellStart"/>
@@ -9947,7 +10059,7 @@
         <w:pStyle w:val="berschrift2"/>
         <w:spacing w:before="240" w:after="120"/>
       </w:pPr>
-      <w:bookmarkStart w:id="44" w:name="_Toc230531155"/>
+      <w:bookmarkStart w:id="44" w:name="_Toc230766013"/>
       <w:r>
         <w:t>7.4 Stakeholder-Review</w:t>
       </w:r>
@@ -9992,7 +10104,7 @@
         <w:pStyle w:val="berschrift2"/>
         <w:spacing w:before="240" w:after="120"/>
       </w:pPr>
-      <w:bookmarkStart w:id="45" w:name="_Toc230531156"/>
+      <w:bookmarkStart w:id="45" w:name="_Toc230766014"/>
       <w:r>
         <w:t>7.5 KI-Retrospektive</w:t>
       </w:r>
@@ -10013,15 +10125,38 @@
         <w:jc w:val="both"/>
       </w:pPr>
       <w:r>
-        <w:t>Output der KI-Retrospektive sind konkrete Änderungen an den CLAUDE-Dateien, den Memory-Dateien oder dem Prompt-Bibliotheks-Bestand. Es ist die einzige Veranstaltung, in der der Prozess sich selbst überarbeitet.</w:t>
+        <w:t>Output der KI-Retrospektive sind konkrete Änderungen an den KI-Konventionsdateien, den Memory-Dateien oder dem Prompt-Bibliotheks-</w:t>
+      </w:r>
+      <w:proofErr w:type="gramStart"/>
+      <w:r>
+        <w:t>Bestand.</w:t>
+      </w:r>
+      <w:r>
+        <w:t>.</w:t>
+      </w:r>
+      <w:proofErr w:type="gramEnd"/>
+      <w:r>
+        <w:t xml:space="preserve"> Es ist die einzige Veranstaltung, in der der Prozess sich selbst überarbeitet.</w:t>
+      </w:r>
+    </w:p>
+    <w:p>
+      <w:pPr>
+        <w:rPr>
+          <w:b/>
+          <w:bCs/>
+          <w:sz w:val="36"/>
+          <w:szCs w:val="36"/>
+        </w:rPr>
+      </w:pPr>
+      <w:r>
+        <w:br w:type="page"/>
       </w:r>
     </w:p>
     <w:p>
       <w:pPr>
         <w:pStyle w:val="berschrift1"/>
-        <w:pageBreakBefore/>
-      </w:pPr>
-      <w:bookmarkStart w:id="46" w:name="_Toc230531157"/>
+      </w:pPr>
+      <w:bookmarkStart w:id="46" w:name="_Toc230766015"/>
       <w:r>
         <w:lastRenderedPageBreak/>
         <w:t>8. Iterationsmodelle</w:t>
@@ -10042,7 +10177,7 @@
         <w:pStyle w:val="berschrift2"/>
         <w:spacing w:before="240" w:after="120"/>
       </w:pPr>
-      <w:bookmarkStart w:id="47" w:name="_Toc230531158"/>
+      <w:bookmarkStart w:id="47" w:name="_Toc230766016"/>
       <w:r>
         <w:t>8.1 Die Tages-Iteration als Default</w:t>
       </w:r>
@@ -10100,7 +10235,7 @@
         <w:pStyle w:val="berschrift2"/>
         <w:spacing w:before="240" w:after="120"/>
       </w:pPr>
-      <w:bookmarkStart w:id="48" w:name="_Toc230531159"/>
+      <w:bookmarkStart w:id="48" w:name="_Toc230766017"/>
       <w:r>
         <w:t>8.2 Die Vier-Stunden-Iteration</w:t>
       </w:r>
@@ -10186,7 +10321,7 @@
         <w:pStyle w:val="berschrift2"/>
         <w:spacing w:before="240" w:after="120"/>
       </w:pPr>
-      <w:bookmarkStart w:id="49" w:name="_Toc230531160"/>
+      <w:bookmarkStart w:id="49" w:name="_Toc230766018"/>
       <w:r>
         <w:t xml:space="preserve">8.3 Das </w:t>
       </w:r>
@@ -10273,11 +10408,25 @@
     </w:p>
     <w:p>
       <w:pPr>
+        <w:rPr>
+          <w:b/>
+          <w:bCs/>
+          <w:sz w:val="28"/>
+          <w:szCs w:val="28"/>
+        </w:rPr>
+      </w:pPr>
+      <w:r>
+        <w:br w:type="page"/>
+      </w:r>
+    </w:p>
+    <w:p>
+      <w:pPr>
         <w:pStyle w:val="berschrift2"/>
         <w:spacing w:before="240" w:after="120"/>
       </w:pPr>
-      <w:bookmarkStart w:id="50" w:name="_Toc230531161"/>
-      <w:r>
+      <w:bookmarkStart w:id="50" w:name="_Toc230766019"/>
+      <w:r>
+        <w:lastRenderedPageBreak/>
         <w:t>8.4 Sprint vs. Flow</w:t>
       </w:r>
       <w:bookmarkEnd w:id="50"/>
@@ -10288,7 +10437,6 @@
         <w:jc w:val="both"/>
       </w:pPr>
       <w:r>
-        <w:lastRenderedPageBreak/>
         <w:t xml:space="preserve">Eine letzte Designfrage ist die zwischen Sprint und Flow. Klassisches </w:t>
       </w:r>
       <w:proofErr w:type="spellStart"/>
@@ -10344,11 +10492,9 @@
     <w:p>
       <w:pPr>
         <w:pStyle w:val="berschrift1"/>
-        <w:pageBreakBefore/>
-      </w:pPr>
-      <w:bookmarkStart w:id="51" w:name="_Toc230531162"/>
-      <w:r>
-        <w:lastRenderedPageBreak/>
+      </w:pPr>
+      <w:bookmarkStart w:id="51" w:name="_Toc230766020"/>
+      <w:r>
         <w:t>9. Der Prozess in neun Schritten</w:t>
       </w:r>
       <w:bookmarkEnd w:id="51"/>
@@ -10367,7 +10513,7 @@
         <w:pStyle w:val="berschrift3"/>
         <w:spacing w:before="180" w:after="100"/>
       </w:pPr>
-      <w:bookmarkStart w:id="52" w:name="_Toc230531163"/>
+      <w:bookmarkStart w:id="52" w:name="_Toc230766021"/>
       <w:r>
         <w:t>Schritt 1, Anforderungsdefinition</w:t>
       </w:r>
@@ -10387,7 +10533,7 @@
         <w:pStyle w:val="berschrift3"/>
         <w:spacing w:before="180" w:after="100"/>
       </w:pPr>
-      <w:bookmarkStart w:id="53" w:name="_Toc230531164"/>
+      <w:bookmarkStart w:id="53" w:name="_Toc230766022"/>
       <w:r>
         <w:t>Schritt 2, Plan</w:t>
       </w:r>
@@ -10407,7 +10553,7 @@
         <w:pStyle w:val="berschrift3"/>
         <w:spacing w:before="180" w:after="100"/>
       </w:pPr>
-      <w:bookmarkStart w:id="54" w:name="_Toc230531165"/>
+      <w:bookmarkStart w:id="54" w:name="_Toc230766023"/>
       <w:r>
         <w:t xml:space="preserve">Schritt 3, Plan zu </w:t>
       </w:r>
@@ -10464,7 +10610,7 @@
         <w:pStyle w:val="berschrift3"/>
         <w:spacing w:before="180" w:after="100"/>
       </w:pPr>
-      <w:bookmarkStart w:id="55" w:name="_Toc230531166"/>
+      <w:bookmarkStart w:id="55" w:name="_Toc230766024"/>
       <w:r>
         <w:t>Schritt 4, GO</w:t>
       </w:r>
@@ -10500,7 +10646,7 @@
         <w:pStyle w:val="berschrift3"/>
         <w:spacing w:before="180" w:after="100"/>
       </w:pPr>
-      <w:bookmarkStart w:id="56" w:name="_Toc230531167"/>
+      <w:bookmarkStart w:id="56" w:name="_Toc230766025"/>
       <w:r>
         <w:t>Schritt 5, Implementierung</w:t>
       </w:r>
@@ -10557,11 +10703,25 @@
     </w:p>
     <w:p>
       <w:pPr>
+        <w:rPr>
+          <w:b/>
+          <w:bCs/>
+          <w:sz w:val="24"/>
+          <w:szCs w:val="24"/>
+        </w:rPr>
+      </w:pPr>
+      <w:r>
+        <w:br w:type="page"/>
+      </w:r>
+    </w:p>
+    <w:p>
+      <w:pPr>
         <w:pStyle w:val="berschrift3"/>
         <w:spacing w:before="180" w:after="100"/>
       </w:pPr>
-      <w:bookmarkStart w:id="57" w:name="_Toc230531168"/>
-      <w:r>
+      <w:bookmarkStart w:id="57" w:name="_Toc230766026"/>
+      <w:r>
+        <w:lastRenderedPageBreak/>
         <w:t>Schritt 6, Lokale Prüfung</w:t>
       </w:r>
       <w:bookmarkEnd w:id="57"/>
@@ -10588,7 +10748,7 @@
         <w:pStyle w:val="berschrift3"/>
         <w:spacing w:before="180" w:after="100"/>
       </w:pPr>
-      <w:bookmarkStart w:id="58" w:name="_Toc230531169"/>
+      <w:bookmarkStart w:id="58" w:name="_Toc230766027"/>
       <w:r>
         <w:t>Schritt 7, Code-Review durch zweites Modell</w:t>
       </w:r>
@@ -10616,7 +10776,7 @@
         <w:pStyle w:val="berschrift3"/>
         <w:spacing w:before="180" w:after="100"/>
       </w:pPr>
-      <w:bookmarkStart w:id="59" w:name="_Toc230531170"/>
+      <w:bookmarkStart w:id="59" w:name="_Toc230766028"/>
       <w:r>
         <w:t>Schritt 8, Push</w:t>
       </w:r>
@@ -10668,9 +10828,8 @@
         <w:pStyle w:val="berschrift3"/>
         <w:spacing w:before="180" w:after="100"/>
       </w:pPr>
-      <w:bookmarkStart w:id="60" w:name="_Toc230531171"/>
-      <w:r>
-        <w:lastRenderedPageBreak/>
+      <w:bookmarkStart w:id="60" w:name="_Toc230766029"/>
+      <w:r>
         <w:t xml:space="preserve">Schritt 9, </w:t>
       </w:r>
       <w:proofErr w:type="spellStart"/>
@@ -10743,11 +10902,9 @@
     <w:p>
       <w:pPr>
         <w:pStyle w:val="berschrift1"/>
-        <w:pageBreakBefore/>
-      </w:pPr>
-      <w:bookmarkStart w:id="61" w:name="_Toc230531172"/>
-      <w:r>
-        <w:lastRenderedPageBreak/>
+      </w:pPr>
+      <w:bookmarkStart w:id="61" w:name="_Toc230766030"/>
+      <w:r>
         <w:t>10. Qualität</w:t>
       </w:r>
       <w:bookmarkEnd w:id="61"/>
@@ -10766,7 +10923,7 @@
         <w:pStyle w:val="berschrift2"/>
         <w:spacing w:before="240" w:after="120"/>
       </w:pPr>
-      <w:bookmarkStart w:id="62" w:name="_Toc230531173"/>
+      <w:bookmarkStart w:id="62" w:name="_Toc230766031"/>
       <w:r>
         <w:t>10.1 Test-Driven Development bleibt zentral</w:t>
       </w:r>
@@ -10795,7 +10952,7 @@
         <w:pStyle w:val="berschrift2"/>
         <w:spacing w:before="240" w:after="120"/>
       </w:pPr>
-      <w:bookmarkStart w:id="63" w:name="_Toc230531174"/>
+      <w:bookmarkStart w:id="63" w:name="_Toc230766032"/>
       <w:r>
         <w:t>10.2 Zwei-Modelle-Review</w:t>
       </w:r>
@@ -10816,6 +10973,7 @@
         <w:jc w:val="both"/>
       </w:pPr>
       <w:r>
+        <w:lastRenderedPageBreak/>
         <w:t>Praktisch heißt das: wenn das implementierende Modell Claude ist, reviewt OpenAI Codex (oder ein vergleichbares Tool). Wenn das implementierende Modell GPT ist, reviewt Claude. Der Effekt ist messbar, die Fehlerrate sinkt deutlich.</w:t>
       </w:r>
     </w:p>
@@ -10824,7 +10982,7 @@
         <w:pStyle w:val="berschrift2"/>
         <w:spacing w:before="240" w:after="120"/>
       </w:pPr>
-      <w:bookmarkStart w:id="64" w:name="_Toc230531175"/>
+      <w:bookmarkStart w:id="64" w:name="_Toc230766033"/>
       <w:r>
         <w:t>10.3 Pflicht-Checks vor jedem Push</w:t>
       </w:r>
@@ -10996,7 +11154,7 @@
         <w:pStyle w:val="berschrift2"/>
         <w:spacing w:before="240" w:after="120"/>
       </w:pPr>
-      <w:bookmarkStart w:id="65" w:name="_Toc230531176"/>
+      <w:bookmarkStart w:id="65" w:name="_Toc230766034"/>
       <w:r>
         <w:t>10.4 Security-Gates</w:t>
       </w:r>
@@ -11029,7 +11187,6 @@
         <w:spacing w:after="80"/>
       </w:pPr>
       <w:r>
-        <w:lastRenderedPageBreak/>
         <w:t>Keine Secrets im Diff, keine API-Keys, keine Passwörter, keine privaten Zertifikate.</w:t>
       </w:r>
     </w:p>
@@ -11108,7 +11265,7 @@
         <w:pStyle w:val="berschrift2"/>
         <w:spacing w:before="240" w:after="120"/>
       </w:pPr>
-      <w:bookmarkStart w:id="66" w:name="_Toc230531177"/>
+      <w:bookmarkStart w:id="66" w:name="_Toc230766035"/>
       <w:r>
         <w:t>10.5 Manuelle UI-Verifikation</w:t>
       </w:r>
@@ -11150,10 +11307,22 @@
     </w:p>
     <w:p>
       <w:pPr>
+        <w:rPr>
+          <w:b/>
+          <w:bCs/>
+          <w:sz w:val="36"/>
+          <w:szCs w:val="36"/>
+        </w:rPr>
+      </w:pPr>
+      <w:r>
+        <w:br w:type="page"/>
+      </w:r>
+    </w:p>
+    <w:p>
+      <w:pPr>
         <w:pStyle w:val="berschrift1"/>
-        <w:pageBreakBefore/>
-      </w:pPr>
-      <w:bookmarkStart w:id="67" w:name="_Toc230531178"/>
+      </w:pPr>
+      <w:bookmarkStart w:id="67" w:name="_Toc230766036"/>
       <w:r>
         <w:lastRenderedPageBreak/>
         <w:t>11. Anti-Patterns</w:t>
@@ -11174,7 +11343,7 @@
         <w:pStyle w:val="berschrift3"/>
         <w:spacing w:before="180" w:after="100"/>
       </w:pPr>
-      <w:bookmarkStart w:id="68" w:name="_Toc230531179"/>
+      <w:bookmarkStart w:id="68" w:name="_Toc230766037"/>
       <w:r>
         <w:t>11.1 „Plan-</w:t>
       </w:r>
@@ -11210,7 +11379,7 @@
         <w:pStyle w:val="berschrift3"/>
         <w:spacing w:before="180" w:after="100"/>
       </w:pPr>
-      <w:bookmarkStart w:id="69" w:name="_Toc230531180"/>
+      <w:bookmarkStart w:id="69" w:name="_Toc230766038"/>
       <w:r>
         <w:t>11.2 „Schnell pushen, ist eh trivial”</w:t>
       </w:r>
@@ -11246,7 +11415,7 @@
         <w:pStyle w:val="berschrift3"/>
         <w:spacing w:before="180" w:after="100"/>
       </w:pPr>
-      <w:bookmarkStart w:id="70" w:name="_Toc230531181"/>
+      <w:bookmarkStart w:id="70" w:name="_Toc230766039"/>
       <w:r>
         <w:t>11.3 „Tests folgen später”</w:t>
       </w:r>
@@ -11266,7 +11435,7 @@
         <w:pStyle w:val="berschrift3"/>
         <w:spacing w:before="180" w:after="100"/>
       </w:pPr>
-      <w:bookmarkStart w:id="71" w:name="_Toc230531182"/>
+      <w:bookmarkStart w:id="71" w:name="_Toc230766040"/>
       <w:r>
         <w:t>11.4 „Coverage bei 98 Prozent reicht”</w:t>
       </w:r>
@@ -11294,7 +11463,7 @@
         <w:pStyle w:val="berschrift3"/>
         <w:spacing w:before="180" w:after="100"/>
       </w:pPr>
-      <w:bookmarkStart w:id="72" w:name="_Toc230531183"/>
+      <w:bookmarkStart w:id="72" w:name="_Toc230766041"/>
       <w:r>
         <w:t>11.5 „Die KI macht das schon richtig”</w:t>
       </w:r>
@@ -11322,7 +11491,7 @@
         <w:pStyle w:val="berschrift3"/>
         <w:spacing w:before="180" w:after="100"/>
       </w:pPr>
-      <w:bookmarkStart w:id="73" w:name="_Toc230531184"/>
+      <w:bookmarkStart w:id="73" w:name="_Toc230766042"/>
       <w:r>
         <w:t>11.6 Memory-Drift</w:t>
       </w:r>
@@ -11339,11 +11508,25 @@
     </w:p>
     <w:p>
       <w:pPr>
+        <w:rPr>
+          <w:b/>
+          <w:bCs/>
+          <w:sz w:val="24"/>
+          <w:szCs w:val="24"/>
+        </w:rPr>
+      </w:pPr>
+      <w:r>
+        <w:br w:type="page"/>
+      </w:r>
+    </w:p>
+    <w:p>
+      <w:pPr>
         <w:pStyle w:val="berschrift3"/>
         <w:spacing w:before="180" w:after="100"/>
       </w:pPr>
-      <w:bookmarkStart w:id="74" w:name="_Toc230531185"/>
-      <w:r>
+      <w:bookmarkStart w:id="74" w:name="_Toc230766043"/>
+      <w:r>
+        <w:lastRenderedPageBreak/>
         <w:t>11.7 KI-Halluzinationen als verifizierte Wahrheit</w:t>
       </w:r>
       <w:bookmarkEnd w:id="74"/>
@@ -11354,11 +11537,7 @@
         <w:jc w:val="both"/>
       </w:pPr>
       <w:r>
-        <w:t xml:space="preserve">Die KI erfindet plausibel klingende Bibliotheksnamen, Methodensignaturen, Stack-Overflow-Antworten. Wer eine solche Halluzination ohne Verifikation in den Code übernimmt, baut </w:t>
-      </w:r>
-      <w:r>
-        <w:lastRenderedPageBreak/>
-        <w:t>Phantomschulden ein, die irgendwann mit Interesse zurückgezahlt werden. Jede Behauptung der KI, die einen externen Bezug hat, gehört geprüft.</w:t>
+        <w:t>Die KI erfindet plausibel klingende Bibliotheksnamen, Methodensignaturen, Stack-Overflow-Antworten. Wer eine solche Halluzination ohne Verifikation in den Code übernimmt, baut Phantomschulden ein, die irgendwann mit Interesse zurückgezahlt werden. Jede Behauptung der KI, die einen externen Bezug hat, gehört geprüft.</w:t>
       </w:r>
     </w:p>
     <w:p>
@@ -11366,7 +11545,7 @@
         <w:pStyle w:val="berschrift3"/>
         <w:spacing w:before="180" w:after="100"/>
       </w:pPr>
-      <w:bookmarkStart w:id="75" w:name="_Toc230531186"/>
+      <w:bookmarkStart w:id="75" w:name="_Toc230766044"/>
       <w:r>
         <w:t xml:space="preserve">11.8 Überautomatisierung ohne </w:t>
       </w:r>
@@ -11421,11 +11600,9 @@
     <w:p>
       <w:pPr>
         <w:pStyle w:val="berschrift1"/>
-        <w:pageBreakBefore/>
-      </w:pPr>
-      <w:bookmarkStart w:id="76" w:name="_Toc230531187"/>
-      <w:r>
-        <w:lastRenderedPageBreak/>
+      </w:pPr>
+      <w:bookmarkStart w:id="76" w:name="_Toc230766045"/>
+      <w:r>
         <w:t>12. Erste Schritte für neue Teams</w:t>
       </w:r>
       <w:bookmarkEnd w:id="76"/>
@@ -11444,7 +11621,7 @@
         <w:pStyle w:val="berschrift2"/>
         <w:spacing w:before="240" w:after="120"/>
       </w:pPr>
-      <w:bookmarkStart w:id="77" w:name="_Toc230531188"/>
+      <w:bookmarkStart w:id="77" w:name="_Toc230766046"/>
       <w:r>
         <w:t>12.1 Dateien im Repo-Root</w:t>
       </w:r>
@@ -11460,8 +11637,16 @@
         <w:spacing w:after="80"/>
       </w:pPr>
       <w:r>
-        <w:t>CLAUDE.md als zentrale Projekt-Doku, was tut das Projekt, welche Standards gelten.</w:t>
-      </w:r>
+        <w:t xml:space="preserve">Die zentrale KI-Konventionsdatei (im Beispiel-Setup CLAUDE.md) als Projekt-Doku, was tut das Projekt, welche Standards </w:t>
+      </w:r>
+      <w:proofErr w:type="gramStart"/>
+      <w:r>
+        <w:t>gelten.</w:t>
+      </w:r>
+      <w:r>
+        <w:t>.</w:t>
+      </w:r>
+      <w:proofErr w:type="gramEnd"/>
     </w:p>
     <w:p>
       <w:pPr>
@@ -11473,7 +11658,7 @@
         <w:spacing w:after="80"/>
       </w:pPr>
       <w:r>
-        <w:t>CLAUDE-workflow.md mit der hier beschriebenen 9-Schritt-Anleitung und der Kanban-Sektion.</w:t>
+        <w:t>Eine Workflow-Konventionsdatei (im Beispiel CLAUDE-workflow.md) mit der hier beschriebenen 9-Schritt-Anleitung und der Kanban-Sektion.</w:t>
       </w:r>
     </w:p>
     <w:p>
@@ -11486,7 +11671,7 @@
         <w:spacing w:after="80"/>
       </w:pPr>
       <w:r>
-        <w:t>Tech-spezifische Dateien je nach Stack, CLAUDE-java.md, CLAUDE-react.md, CLAUDE-python.md.</w:t>
+        <w:t>Tech-spezifische Konventionsdateien je nach Stack (im Beispiel CLAUDE-java.md, CLAUDE-react.md, CLAUDE-python.md).</w:t>
       </w:r>
     </w:p>
     <w:p>
@@ -11499,7 +11684,7 @@
         <w:spacing w:after="80"/>
       </w:pPr>
       <w:r>
-        <w:t>CLAUDE-security.md mit der Security-Checkliste vor Commit.</w:t>
+        <w:t>Eine Security-Konventionsdatei (im Beispiel CLAUDE-security.md) mit der Checkliste vor Commit.</w:t>
       </w:r>
     </w:p>
     <w:p>
@@ -11516,7 +11701,7 @@
         <w:pStyle w:val="berschrift2"/>
         <w:spacing w:before="240" w:after="120"/>
       </w:pPr>
-      <w:bookmarkStart w:id="78" w:name="_Toc230531189"/>
+      <w:bookmarkStart w:id="78" w:name="_Toc230766047"/>
       <w:r>
         <w:t>12.2 Kanban-Board</w:t>
       </w:r>
@@ -11568,7 +11753,7 @@
         <w:pStyle w:val="berschrift2"/>
         <w:spacing w:before="240" w:after="120"/>
       </w:pPr>
-      <w:bookmarkStart w:id="79" w:name="_Toc230531190"/>
+      <w:bookmarkStart w:id="79" w:name="_Toc230766048"/>
       <w:r>
         <w:t>12.3 Trigger-Phrasen vereinbaren</w:t>
       </w:r>
@@ -11620,7 +11805,21 @@
       </w:r>
       <w:proofErr w:type="spellEnd"/>
       <w:r>
-        <w:t>” für den PR-Trigger nach Produktion. Diese Phrasen werden in CLAUDE-workflow.md festgehalten und sind für alle Beteiligten verbindlich.</w:t>
+        <w:t xml:space="preserve">” für den </w:t>
+      </w:r>
+      <w:r>
+        <w:lastRenderedPageBreak/>
+        <w:t xml:space="preserve">PR-Trigger nach Produktion. </w:t>
+      </w:r>
+      <w:r>
+        <w:rPr>
+          <w:rFonts w:ascii="Arial" w:hAnsi="Arial" w:cs="Arial"/>
+          <w:color w:val="6E6C68"/>
+          <w:sz w:val="21"/>
+          <w:szCs w:val="21"/>
+          <w:shd w:val="clear" w:color="auto" w:fill="FDFDFC"/>
+        </w:rPr>
+        <w:t>Diese Phrasen werden in der Workflow-Konventionsdatei festgehalten und sind für alle Beteiligten verbindlich.</w:t>
       </w:r>
     </w:p>
     <w:p>
@@ -11628,7 +11827,7 @@
         <w:pStyle w:val="berschrift2"/>
         <w:spacing w:before="240" w:after="120"/>
       </w:pPr>
-      <w:bookmarkStart w:id="80" w:name="_Toc230531191"/>
+      <w:bookmarkStart w:id="80" w:name="_Toc230766049"/>
       <w:r>
         <w:t xml:space="preserve">12.4 Erstes </w:t>
       </w:r>
@@ -11672,7 +11871,7 @@
         <w:pStyle w:val="berschrift2"/>
         <w:spacing w:before="240" w:after="120"/>
       </w:pPr>
-      <w:bookmarkStart w:id="81" w:name="_Toc230531192"/>
+      <w:bookmarkStart w:id="81" w:name="_Toc230766050"/>
       <w:r>
         <w:t xml:space="preserve">12.5 Pflicht-Checks im </w:t>
       </w:r>
@@ -11732,7 +11931,7 @@
         <w:pStyle w:val="berschrift2"/>
         <w:spacing w:before="240" w:after="120"/>
       </w:pPr>
-      <w:bookmarkStart w:id="82" w:name="_Toc230531193"/>
+      <w:bookmarkStart w:id="82" w:name="_Toc230766051"/>
       <w:r>
         <w:t>12.6 Zweite KI für Reviews wählen</w:t>
       </w:r>
@@ -11744,18 +11943,15 @@
         <w:jc w:val="both"/>
       </w:pPr>
       <w:r>
-        <w:lastRenderedPageBreak/>
         <w:t>Es wird festgelegt, welches zweite Modell die Reviews macht. Wenn das implementierende Modell Claude ist, wird typischerweise OpenAI Codex oder ein vergleichbares Tool gewählt. Wichtig ist nicht das spezifische Tool, sondern dass es ein anderes ist. Das Setup wird in einer kleinen Anleitung dokumentiert, damit ein neues Teammitglied am ersten Tag damit arbeiten kann.</w:t>
       </w:r>
     </w:p>
     <w:p>
       <w:pPr>
         <w:pStyle w:val="berschrift1"/>
-        <w:pageBreakBefore/>
-      </w:pPr>
-      <w:bookmarkStart w:id="83" w:name="_Toc230531194"/>
-      <w:r>
-        <w:lastRenderedPageBreak/>
+      </w:pPr>
+      <w:bookmarkStart w:id="83" w:name="_Toc230766052"/>
+      <w:r>
         <w:t>13. Ausblick</w:t>
       </w:r>
       <w:bookmarkEnd w:id="83"/>
@@ -11877,6 +12073,7 @@
       </w:r>
       <w:proofErr w:type="spellStart"/>
       <w:r>
+        <w:lastRenderedPageBreak/>
         <w:t>Governance</w:t>
       </w:r>
       <w:proofErr w:type="spellEnd"/>
@@ -11896,11 +12093,9 @@
     <w:p>
       <w:pPr>
         <w:pStyle w:val="berschrift1"/>
-        <w:pageBreakBefore/>
-      </w:pPr>
-      <w:bookmarkStart w:id="84" w:name="_Toc230531195"/>
-      <w:r>
-        <w:lastRenderedPageBreak/>
+      </w:pPr>
+      <w:bookmarkStart w:id="84" w:name="_Toc230766053"/>
+      <w:r>
         <w:t>14. Quellenverzeichnis</w:t>
       </w:r>
       <w:bookmarkEnd w:id="84"/>
@@ -12367,8 +12562,91 @@
         </w:r>
       </w:hyperlink>
     </w:p>
+    <w:p>
+      <w:pPr>
+        <w:pStyle w:val="berschrift1"/>
+      </w:pPr>
+      <w:bookmarkStart w:id="85" w:name="_Toc230766054"/>
+      <w:r>
+        <w:t xml:space="preserve">13. </w:t>
+      </w:r>
+      <w:r>
+        <w:t>Über die Entstehung dieses Texts</w:t>
+      </w:r>
+      <w:bookmarkEnd w:id="85"/>
+    </w:p>
+    <w:p>
+      <w:pPr>
+        <w:spacing w:after="120" w:line="300" w:lineRule="auto"/>
+        <w:jc w:val="both"/>
+      </w:pPr>
+      <w:r>
+        <w:t>Dieses Whitepaper ist nach derselben Methodik entstanden, die es beschreibt: in Ko-Produktion mit einem KI-Werkzeug, konkret mit Claude (Anthropic). Ich habe Struktur, Kernthesen und alle inhaltlichen Entscheidungen verantwortet, Claude hat die ersten Formulierungen erzeugt und ich habe sie redigiert, präzisiert und an mehreren Stellen ganz verworfen. Die Kontrolle über das Ergebnis bleibt damit beim Autor</w:t>
+      </w:r>
+      <w:r>
+        <w:t xml:space="preserve">: </w:t>
+      </w:r>
+      <w:r>
+        <w:t>das KI-Werkzeug arbeitet zu, aber es signiert nicht mit.</w:t>
+      </w:r>
+    </w:p>
+    <w:p>
+      <w:pPr>
+        <w:spacing w:after="120" w:line="300" w:lineRule="auto"/>
+        <w:jc w:val="both"/>
+      </w:pPr>
+      <w:r>
+        <w:t>Diese Arbeitsweise habe ich an anderer Stelle ausführlicher beschrieben: </w:t>
+      </w:r>
+    </w:p>
+    <w:p>
+      <w:pPr>
+        <w:spacing w:after="120" w:line="300" w:lineRule="auto"/>
+        <w:jc w:val="both"/>
+        <w:rPr>
+          <w:rFonts w:ascii="Arial" w:hAnsi="Arial" w:cs="Arial"/>
+          <w:color w:val="6E6C68"/>
+          <w:sz w:val="21"/>
+          <w:szCs w:val="21"/>
+        </w:rPr>
+      </w:pPr>
+      <w:hyperlink r:id="rId12" w:history="1">
+        <w:r>
+          <w:rPr>
+            <w:rStyle w:val="Hyperlink"/>
+          </w:rPr>
+          <w:t>https://blog.mwolff.o</w:t>
+        </w:r>
+        <w:r>
+          <w:rPr>
+            <w:rStyle w:val="Hyperlink"/>
+          </w:rPr>
+          <w:t>r</w:t>
+        </w:r>
+        <w:r>
+          <w:rPr>
+            <w:rStyle w:val="Hyperlink"/>
+          </w:rPr>
+          <w:t>g/warum-ich-meine-rohtexte-nie-mehr-ohne-ki-bearbeite-und-trotzdem-die-kontrolle-behalte/"</w:t>
+        </w:r>
+      </w:hyperlink>
+      <w:r>
+        <w:rPr>
+          <w:rFonts w:ascii="Arial" w:hAnsi="Arial" w:cs="Arial"/>
+          <w:color w:val="6E6C68"/>
+          <w:sz w:val="21"/>
+          <w:szCs w:val="21"/>
+        </w:rPr>
+        <w:t>.</w:t>
+      </w:r>
+    </w:p>
+    <w:p>
+      <w:pPr>
+        <w:spacing w:after="80"/>
+      </w:pPr>
+    </w:p>
     <w:sectPr>
-      <w:footerReference w:type="default" r:id="rId12"/>
+      <w:footerReference w:type="default" r:id="rId13"/>
       <w:pgSz w:w="11906" w:h="16838"/>
       <w:pgMar w:top="1440" w:right="1440" w:bottom="1440" w:left="1440" w:header="708" w:footer="708" w:gutter="0"/>
       <w:cols w:space="720"/>
@@ -14072,6 +14350,7 @@
     <w:name w:val="heading 1"/>
     <w:uiPriority w:val="9"/>
     <w:qFormat/>
+    <w:rsid w:val="00ED48D1"/>
     <w:pPr>
       <w:spacing w:before="480" w:after="240"/>
       <w:outlineLvl w:val="0"/>
@@ -14312,6 +14591,70 @@
       <w:spacing w:after="100"/>
       <w:ind w:left="440"/>
     </w:pPr>
+  </w:style>
+  <w:style w:type="paragraph" w:styleId="StandardWeb">
+    <w:name w:val="Normal (Web)"/>
+    <w:basedOn w:val="Standard"/>
+    <w:uiPriority w:val="99"/>
+    <w:semiHidden/>
+    <w:unhideWhenUsed/>
+    <w:rsid w:val="00C60B9C"/>
+    <w:pPr>
+      <w:spacing w:before="100" w:beforeAutospacing="1" w:after="100" w:afterAutospacing="1"/>
+    </w:pPr>
+    <w:rPr>
+      <w:rFonts w:ascii="Times New Roman" w:eastAsia="Times New Roman" w:hAnsi="Times New Roman" w:cs="Times New Roman"/>
+      <w:sz w:val="24"/>
+      <w:szCs w:val="24"/>
+    </w:rPr>
+  </w:style>
+  <w:style w:type="character" w:styleId="HTMLCode">
+    <w:name w:val="HTML Code"/>
+    <w:basedOn w:val="Absatz-Standardschriftart"/>
+    <w:uiPriority w:val="99"/>
+    <w:semiHidden/>
+    <w:unhideWhenUsed/>
+    <w:rsid w:val="00C60B9C"/>
+    <w:rPr>
+      <w:rFonts w:ascii="Courier New" w:eastAsia="Times New Roman" w:hAnsi="Courier New" w:cs="Courier New"/>
+      <w:sz w:val="20"/>
+      <w:szCs w:val="20"/>
+    </w:rPr>
+  </w:style>
+  <w:style w:type="character" w:styleId="Fett">
+    <w:name w:val="Strong"/>
+    <w:basedOn w:val="Absatz-Standardschriftart"/>
+    <w:uiPriority w:val="22"/>
+    <w:qFormat/>
+    <w:rsid w:val="00F711A9"/>
+    <w:rPr>
+      <w:b/>
+      <w:bCs/>
+    </w:rPr>
+  </w:style>
+  <w:style w:type="character" w:styleId="NichtaufgelsteErwhnung">
+    <w:name w:val="Unresolved Mention"/>
+    <w:basedOn w:val="Absatz-Standardschriftart"/>
+    <w:uiPriority w:val="99"/>
+    <w:semiHidden/>
+    <w:unhideWhenUsed/>
+    <w:rsid w:val="00F711A9"/>
+    <w:rPr>
+      <w:color w:val="605E5C"/>
+      <w:shd w:val="clear" w:color="auto" w:fill="E1DFDD"/>
+    </w:rPr>
+  </w:style>
+  <w:style w:type="character" w:styleId="BesuchterLink">
+    <w:name w:val="FollowedHyperlink"/>
+    <w:basedOn w:val="Absatz-Standardschriftart"/>
+    <w:uiPriority w:val="99"/>
+    <w:semiHidden/>
+    <w:unhideWhenUsed/>
+    <w:rsid w:val="00F711A9"/>
+    <w:rPr>
+      <w:color w:val="96607D" w:themeColor="followedHyperlink"/>
+      <w:u w:val="single"/>
+    </w:rPr>
   </w:style>
 </w:styles>
 </file>

</xml_diff>